<commit_message>
Kılavuz: ekran görüntüleri yeni sade görünümle yeniden çekildi (44 sayfa)
Görüntüler docs/kaynak/ekran/cek.sh ile örnek bir sitede programın gerçek
çalışmasından alındı: ana sayfa (Sorunlu belge kutusu, yeni rapor düğmeleri),
adım sayfaları, çalışırken, son çalışma, hatalar, ayarlar, yeni site, karanlık tema,
kurulum uyarısı; yeni: kırık link raporu ve belge raporu şekilleri.

Co-Authored-By: Claude Opus 5.5 <noreply@anthropic.com>
Claude-Session: https://claude.ai/code/session_01Y7HA7zWrzagZQyqvydG6xL
</commit_message>
<xml_diff>
--- a/docs/KULLANIM_KILAVUZU.docx
+++ b/docs/KULLANIM_KILAVUZU.docx
@@ -1335,7 +1335,7 @@
             <w:szCs w:val="20"/>
           </w:rPr>
           <w:tab/>
-          <w:t xml:space="preserve">26</w:t>
+          <w:t xml:space="preserve">27</w:t>
         </w:r>
       </w:hyperlink>
     </w:p>
@@ -1365,7 +1365,7 @@
             <w:szCs w:val="20"/>
           </w:rPr>
           <w:tab/>
-          <w:t xml:space="preserve">27</w:t>
+          <w:t xml:space="preserve">28</w:t>
         </w:r>
       </w:hyperlink>
     </w:p>
@@ -1395,7 +1395,7 @@
             <w:szCs w:val="20"/>
           </w:rPr>
           <w:tab/>
-          <w:t xml:space="preserve">27</w:t>
+          <w:t xml:space="preserve">29</w:t>
         </w:r>
       </w:hyperlink>
     </w:p>
@@ -1425,7 +1425,7 @@
             <w:szCs w:val="20"/>
           </w:rPr>
           <w:tab/>
-          <w:t xml:space="preserve">27</w:t>
+          <w:t xml:space="preserve">29</w:t>
         </w:r>
       </w:hyperlink>
     </w:p>
@@ -1455,7 +1455,7 @@
             <w:szCs w:val="20"/>
           </w:rPr>
           <w:tab/>
-          <w:t xml:space="preserve">28</w:t>
+          <w:t xml:space="preserve">29</w:t>
         </w:r>
       </w:hyperlink>
     </w:p>
@@ -1485,7 +1485,7 @@
             <w:szCs w:val="20"/>
           </w:rPr>
           <w:tab/>
-          <w:t xml:space="preserve">28</w:t>
+          <w:t xml:space="preserve">29</w:t>
         </w:r>
       </w:hyperlink>
     </w:p>
@@ -1515,7 +1515,7 @@
             <w:szCs w:val="20"/>
           </w:rPr>
           <w:tab/>
-          <w:t xml:space="preserve">28</w:t>
+          <w:t xml:space="preserve">30</w:t>
         </w:r>
       </w:hyperlink>
     </w:p>
@@ -1545,7 +1545,7 @@
             <w:szCs w:val="20"/>
           </w:rPr>
           <w:tab/>
-          <w:t xml:space="preserve">29</w:t>
+          <w:t xml:space="preserve">30</w:t>
         </w:r>
       </w:hyperlink>
     </w:p>
@@ -1575,7 +1575,7 @@
             <w:szCs w:val="20"/>
           </w:rPr>
           <w:tab/>
-          <w:t xml:space="preserve">30</w:t>
+          <w:t xml:space="preserve">31</w:t>
         </w:r>
       </w:hyperlink>
     </w:p>
@@ -1605,7 +1605,7 @@
             <w:szCs w:val="20"/>
           </w:rPr>
           <w:tab/>
-          <w:t xml:space="preserve">30</w:t>
+          <w:t xml:space="preserve">31</w:t>
         </w:r>
       </w:hyperlink>
     </w:p>
@@ -1635,7 +1635,7 @@
             <w:szCs w:val="20"/>
           </w:rPr>
           <w:tab/>
-          <w:t xml:space="preserve">31</w:t>
+          <w:t xml:space="preserve">32</w:t>
         </w:r>
       </w:hyperlink>
     </w:p>
@@ -1665,7 +1665,7 @@
             <w:szCs w:val="20"/>
           </w:rPr>
           <w:tab/>
-          <w:t xml:space="preserve">31</w:t>
+          <w:t xml:space="preserve">32</w:t>
         </w:r>
       </w:hyperlink>
     </w:p>
@@ -1695,7 +1695,7 @@
             <w:szCs w:val="20"/>
           </w:rPr>
           <w:tab/>
-          <w:t xml:space="preserve">31</w:t>
+          <w:t xml:space="preserve">32</w:t>
         </w:r>
       </w:hyperlink>
     </w:p>
@@ -1725,7 +1725,7 @@
             <w:szCs w:val="20"/>
           </w:rPr>
           <w:tab/>
-          <w:t xml:space="preserve">31</w:t>
+          <w:t xml:space="preserve">32</w:t>
         </w:r>
       </w:hyperlink>
     </w:p>
@@ -1755,7 +1755,7 @@
             <w:szCs w:val="20"/>
           </w:rPr>
           <w:tab/>
-          <w:t xml:space="preserve">32</w:t>
+          <w:t xml:space="preserve">33</w:t>
         </w:r>
       </w:hyperlink>
     </w:p>
@@ -1785,7 +1785,7 @@
             <w:szCs w:val="20"/>
           </w:rPr>
           <w:tab/>
-          <w:t xml:space="preserve">32</w:t>
+          <w:t xml:space="preserve">33</w:t>
         </w:r>
       </w:hyperlink>
     </w:p>
@@ -1815,7 +1815,7 @@
             <w:szCs w:val="20"/>
           </w:rPr>
           <w:tab/>
-          <w:t xml:space="preserve">34</w:t>
+          <w:t xml:space="preserve">35</w:t>
         </w:r>
       </w:hyperlink>
     </w:p>
@@ -1845,7 +1845,7 @@
             <w:szCs w:val="20"/>
           </w:rPr>
           <w:tab/>
-          <w:t xml:space="preserve">37</w:t>
+          <w:t xml:space="preserve">38</w:t>
         </w:r>
       </w:hyperlink>
     </w:p>
@@ -1875,7 +1875,7 @@
             <w:szCs w:val="20"/>
           </w:rPr>
           <w:tab/>
-          <w:t xml:space="preserve">38</w:t>
+          <w:t xml:space="preserve">39</w:t>
         </w:r>
       </w:hyperlink>
     </w:p>
@@ -1905,7 +1905,7 @@
             <w:szCs w:val="20"/>
           </w:rPr>
           <w:tab/>
-          <w:t xml:space="preserve">39</w:t>
+          <w:t xml:space="preserve">40</w:t>
         </w:r>
       </w:hyperlink>
     </w:p>
@@ -1935,7 +1935,7 @@
             <w:szCs w:val="20"/>
           </w:rPr>
           <w:tab/>
-          <w:t xml:space="preserve">41</w:t>
+          <w:t xml:space="preserve">42</w:t>
         </w:r>
       </w:hyperlink>
     </w:p>
@@ -1965,7 +1965,7 @@
             <w:szCs w:val="20"/>
           </w:rPr>
           <w:tab/>
-          <w:t xml:space="preserve">42</w:t>
+          <w:t xml:space="preserve">43</w:t>
         </w:r>
       </w:hyperlink>
     </w:p>
@@ -1995,7 +1995,7 @@
             <w:szCs w:val="20"/>
           </w:rPr>
           <w:tab/>
-          <w:t xml:space="preserve">43</w:t>
+          <w:t xml:space="preserve">44</w:t>
         </w:r>
       </w:hyperlink>
     </w:p>
@@ -4384,7 +4384,7 @@
       <w:r>
         <w:drawing>
           <wp:inline distT="0" distB="0" distL="0" distR="0">
-            <wp:extent cx="5905500" cy="1476375"/>
+            <wp:extent cx="5905500" cy="4029075"/>
             <wp:effectExtent t="0" r="0" b="0" l="0"/>
             <wp:docPr id="1" name="16_kurulum_uyarisi.png" descr="Kurulum eksikse ana sayfada çıkan uyarı ve &quot;Bağımlılıkları kur&quot; düğmesi" title="Kurulum eksikse ana sayfada çıkan uyarı ve &quot;Bağımlılıkları kur&quot; düğmesi"/>
             <wp:cNvGraphicFramePr>
@@ -4409,7 +4409,7 @@
                   <pic:spPr bwMode="auto">
                     <a:xfrm>
                       <a:off x="0" y="0"/>
-                      <a:ext cx="5905500" cy="1476375"/>
+                      <a:ext cx="5905500" cy="4029075"/>
                     </a:xfrm>
                     <a:prstGeom prst="rect">
                       <a:avLst/>
@@ -6147,7 +6147,37 @@
         <w:spacing w:after="120"/>
       </w:pPr>
       <w:r>
-        <w:t xml:space="preserve">Sol alttaki düğme açık ve karanlık tema arasında geçiş yapar. Görünüm </w:t>
+        <w:t xml:space="preserve">Sol alttaki düğme açık ve karanlık tema arasında geçiş yapar. Varsayılan </w:t>
+      </w:r>
+      <w:r>
+        <w:rPr>
+          <w:b/>
+          <w:bCs/>
+        </w:rPr>
+        <w:t xml:space="preserve">sade görünüm</w:t>
+      </w:r>
+      <w:r>
+        <w:t xml:space="preserve"> hızlı çizilir. İsteyen </w:t>
+      </w:r>
+      <w:r>
+        <w:rPr>
+          <w:b/>
+          <w:bCs/>
+        </w:rPr>
+        <w:t xml:space="preserve">Ayarlar → Genel → Arayüz görünümü</w:t>
+      </w:r>
+      <w:r>
+        <w:t xml:space="preserve"> ile Windows 11 tarzı </w:t>
+      </w:r>
+      <w:r>
+        <w:rPr>
+          <w:b/>
+          <w:bCs/>
+        </w:rPr>
+        <w:t xml:space="preserve">modern</w:t>
+      </w:r>
+      <w:r>
+        <w:t xml:space="preserve"> görünümü (</w:t>
       </w:r>
       <w:r>
         <w:rPr>
@@ -6158,7 +6188,7 @@
         <w:t xml:space="preserve">sv-ttk</w:t>
       </w:r>
       <w:r>
-        <w:t xml:space="preserve"> paketiyle Windows 11 tarzındadır; paket yoksa aynı renklerle temel tema kullanılır.</w:t>
+        <w:t xml:space="preserve">) seçebilir; ancak bu tema her öğeyi resimle çizdiği için Windows'ta sayfa geçişleri ve tema değişimi belirgin yavaşlar (ölçümde 5–7 kat). Değişiklik program yeniden açılınca geçerli olur.</w:t>
       </w:r>
     </w:p>
     <w:p>
@@ -16141,70 +16171,6 @@
     </w:p>
     <w:p>
       <w:pPr>
-        <w:spacing w:after="120"/>
-      </w:pPr>
-      <w:r>
-        <w:rPr>
-          <w:rFonts w:ascii="Courier New" w:cs="Courier New" w:eastAsia="Courier New" w:hAnsi="Courier New"/>
-          <w:sz w:val="19"/>
-          <w:szCs w:val="19"/>
-        </w:rPr>
-        <w:t xml:space="preserve">linkdenetim/broken_links.csv</w:t>
-      </w:r>
-      <w:r>
-        <w:t xml:space="preserve"> kırık bağlantıları, bulunduğu sayfayı (</w:t>
-      </w:r>
-      <w:r>
-        <w:rPr>
-          <w:rFonts w:ascii="Courier New" w:cs="Courier New" w:eastAsia="Courier New" w:hAnsi="Courier New"/>
-          <w:sz w:val="19"/>
-          <w:szCs w:val="19"/>
-        </w:rPr>
-        <w:t xml:space="preserve">kaynak_sayfa</w:t>
-      </w:r>
-      <w:r>
-        <w:t xml:space="preserve">) ve butonun metnini (</w:t>
-      </w:r>
-      <w:r>
-        <w:rPr>
-          <w:rFonts w:ascii="Courier New" w:cs="Courier New" w:eastAsia="Courier New" w:hAnsi="Courier New"/>
-          <w:sz w:val="19"/>
-          <w:szCs w:val="19"/>
-        </w:rPr>
-        <w:t xml:space="preserve">buton_metni</w:t>
-      </w:r>
-      <w:r>
-        <w:t xml:space="preserve">) verir; düzeltme için hangi sayfada hangi linkin değişmesi gerektiği buradan okunur.</w:t>
-      </w:r>
-    </w:p>
-    <w:p>
-      <w:pPr>
-        <w:pStyle w:val="Heading2"/>
-      </w:pPr>
-      <w:bookmarkStart w:name="b49" w:id="49"/>
-      <w:r>
-        <w:t xml:space="preserve">7.3 Görsel/UI kusur raporu</w:t>
-      </w:r>
-      <w:bookmarkEnd w:id="49"/>
-    </w:p>
-    <w:p>
-      <w:pPr>
-        <w:spacing w:after="120"/>
-      </w:pPr>
-      <w:r>
-        <w:rPr>
-          <w:rFonts w:ascii="Courier New" w:cs="Courier New" w:eastAsia="Courier New" w:hAnsi="Courier New"/>
-          <w:sz w:val="19"/>
-          <w:szCs w:val="19"/>
-        </w:rPr>
-        <w:t xml:space="preserve">gorsel/gorsel_rapor.html</w:t>
-      </w:r>
-      <w:r>
-        <w:t xml:space="preserve"> şablon özetlidir: bir kusur "bu düzen ≈N sayfayı etkiliyor" diye bir kez raporlanır, kusurlu bölge ekran görüntüsünde kırmızı kutuyla işaretlenir.</w:t>
-      </w:r>
-    </w:p>
-    <w:p>
-      <w:pPr>
         <w:keepNext/>
         <w:spacing w:after="40" w:before="80"/>
         <w:jc w:val="center"/>
@@ -16212,9 +16178,9 @@
       <w:r>
         <w:drawing>
           <wp:inline distT="0" distB="0" distL="0" distR="0">
-            <wp:extent cx="5905500" cy="3848100"/>
+            <wp:extent cx="5905500" cy="3667125"/>
             <wp:effectExtent t="0" r="0" b="0" l="0"/>
-            <wp:docPr id="1" name="18_gorsel_rapor.png" descr="Görsel/UI kusur raporu: şablon özeti ve işaretli kanıt" title="Görsel/UI kusur raporu: şablon özeti ve işaretli kanıt"/>
+            <wp:docPr id="1" name="20_belge_raporu.png" descr="Kırık belge raporu: varsayılan olarak yalnız sorunlu belgeler" title="Kırık belge raporu: varsayılan olarak yalnız sorunlu belgeler"/>
             <wp:cNvGraphicFramePr>
               <a:graphicFrameLocks xmlns:a="http://schemas.openxmlformats.org/drawingml/2006/main" noChangeAspect="1"/>
             </wp:cNvGraphicFramePr>
@@ -16237,6 +16203,216 @@
                   <pic:spPr bwMode="auto">
                     <a:xfrm>
                       <a:off x="0" y="0"/>
+                      <a:ext cx="5905500" cy="3667125"/>
+                    </a:xfrm>
+                    <a:prstGeom prst="rect">
+                      <a:avLst/>
+                    </a:prstGeom>
+                  </pic:spPr>
+                </pic:pic>
+              </a:graphicData>
+            </a:graphic>
+          </wp:inline>
+        </w:drawing>
+      </w:r>
+    </w:p>
+    <w:p>
+      <w:pPr>
+        <w:spacing w:after="200"/>
+        <w:jc w:val="center"/>
+      </w:pPr>
+      <w:r>
+        <w:rPr>
+          <w:b/>
+          <w:bCs/>
+          <w:color w:val="595959"/>
+          <w:sz w:val="18"/>
+          <w:szCs w:val="18"/>
+        </w:rPr>
+        <w:t xml:space="preserve">Şekil 13. </w:t>
+      </w:r>
+      <w:r>
+        <w:rPr>
+          <w:i/>
+          <w:iCs/>
+          <w:color w:val="595959"/>
+          <w:sz w:val="18"/>
+          <w:szCs w:val="18"/>
+        </w:rPr>
+        <w:t xml:space="preserve">Kırık belge raporu: varsayılan olarak yalnız sorunlu belgeler</w:t>
+      </w:r>
+    </w:p>
+    <w:p>
+      <w:pPr>
+        <w:keepNext/>
+        <w:spacing w:after="40" w:before="80"/>
+        <w:jc w:val="center"/>
+      </w:pPr>
+      <w:r>
+        <w:drawing>
+          <wp:inline distT="0" distB="0" distL="0" distR="0">
+            <wp:extent cx="5905500" cy="3667125"/>
+            <wp:effectExtent t="0" r="0" b="0" l="0"/>
+            <wp:docPr id="1" name="19_kirik_link_raporu.png" descr="Kırık link raporu: sorun türü, site içi/dış ve en çok kırık alan adları" title="Kırık link raporu: sorun türü, site içi/dış ve en çok kırık alan adları"/>
+            <wp:cNvGraphicFramePr>
+              <a:graphicFrameLocks xmlns:a="http://schemas.openxmlformats.org/drawingml/2006/main" noChangeAspect="1"/>
+            </wp:cNvGraphicFramePr>
+            <a:graphic xmlns:a="http://schemas.openxmlformats.org/drawingml/2006/main">
+              <a:graphicData uri="http://schemas.openxmlformats.org/drawingml/2006/picture">
+                <pic:pic xmlns:pic="http://schemas.openxmlformats.org/drawingml/2006/picture">
+                  <pic:nvPicPr>
+                    <pic:cNvPr id="0" name="" descr=""/>
+                    <pic:cNvPicPr>
+                      <a:picLocks noChangeAspect="1" noChangeArrowheads="1"/>
+                    </pic:cNvPicPr>
+                  </pic:nvPicPr>
+                  <pic:blipFill>
+                    <a:blip r:embed="rId22" cstate="none"/>
+                    <a:srcRect/>
+                    <a:stretch>
+                      <a:fillRect/>
+                    </a:stretch>
+                  </pic:blipFill>
+                  <pic:spPr bwMode="auto">
+                    <a:xfrm>
+                      <a:off x="0" y="0"/>
+                      <a:ext cx="5905500" cy="3667125"/>
+                    </a:xfrm>
+                    <a:prstGeom prst="rect">
+                      <a:avLst/>
+                    </a:prstGeom>
+                  </pic:spPr>
+                </pic:pic>
+              </a:graphicData>
+            </a:graphic>
+          </wp:inline>
+        </w:drawing>
+      </w:r>
+    </w:p>
+    <w:p>
+      <w:pPr>
+        <w:spacing w:after="200"/>
+        <w:jc w:val="center"/>
+      </w:pPr>
+      <w:r>
+        <w:rPr>
+          <w:b/>
+          <w:bCs/>
+          <w:color w:val="595959"/>
+          <w:sz w:val="18"/>
+          <w:szCs w:val="18"/>
+        </w:rPr>
+        <w:t xml:space="preserve">Şekil 14. </w:t>
+      </w:r>
+      <w:r>
+        <w:rPr>
+          <w:i/>
+          <w:iCs/>
+          <w:color w:val="595959"/>
+          <w:sz w:val="18"/>
+          <w:szCs w:val="18"/>
+        </w:rPr>
+        <w:t xml:space="preserve">Kırık link raporu: sorun türü, site içi/dış ve en çok kırık alan adları</w:t>
+      </w:r>
+    </w:p>
+    <w:p>
+      <w:pPr>
+        <w:spacing w:after="120"/>
+      </w:pPr>
+      <w:r>
+        <w:rPr>
+          <w:rFonts w:ascii="Courier New" w:cs="Courier New" w:eastAsia="Courier New" w:hAnsi="Courier New"/>
+          <w:sz w:val="19"/>
+          <w:szCs w:val="19"/>
+        </w:rPr>
+        <w:t xml:space="preserve">linkdenetim/broken_links.csv</w:t>
+      </w:r>
+      <w:r>
+        <w:t xml:space="preserve"> kırık bağlantıları, bulunduğu sayfayı (</w:t>
+      </w:r>
+      <w:r>
+        <w:rPr>
+          <w:rFonts w:ascii="Courier New" w:cs="Courier New" w:eastAsia="Courier New" w:hAnsi="Courier New"/>
+          <w:sz w:val="19"/>
+          <w:szCs w:val="19"/>
+        </w:rPr>
+        <w:t xml:space="preserve">kaynak_sayfa</w:t>
+      </w:r>
+      <w:r>
+        <w:t xml:space="preserve">) ve butonun metnini (</w:t>
+      </w:r>
+      <w:r>
+        <w:rPr>
+          <w:rFonts w:ascii="Courier New" w:cs="Courier New" w:eastAsia="Courier New" w:hAnsi="Courier New"/>
+          <w:sz w:val="19"/>
+          <w:szCs w:val="19"/>
+        </w:rPr>
+        <w:t xml:space="preserve">buton_metni</w:t>
+      </w:r>
+      <w:r>
+        <w:t xml:space="preserve">) verir; düzeltme için hangi sayfada hangi linkin değişmesi gerektiği buradan okunur.</w:t>
+      </w:r>
+    </w:p>
+    <w:p>
+      <w:pPr>
+        <w:pStyle w:val="Heading2"/>
+      </w:pPr>
+      <w:bookmarkStart w:name="b49" w:id="49"/>
+      <w:r>
+        <w:t xml:space="preserve">7.3 Görsel/UI kusur raporu</w:t>
+      </w:r>
+      <w:bookmarkEnd w:id="49"/>
+    </w:p>
+    <w:p>
+      <w:pPr>
+        <w:spacing w:after="120"/>
+      </w:pPr>
+      <w:r>
+        <w:rPr>
+          <w:rFonts w:ascii="Courier New" w:cs="Courier New" w:eastAsia="Courier New" w:hAnsi="Courier New"/>
+          <w:sz w:val="19"/>
+          <w:szCs w:val="19"/>
+        </w:rPr>
+        <w:t xml:space="preserve">gorsel/gorsel_rapor.html</w:t>
+      </w:r>
+      <w:r>
+        <w:t xml:space="preserve"> şablon özetlidir: bir kusur "bu düzen ≈N sayfayı etkiliyor" diye bir kez raporlanır, kusurlu bölge ekran görüntüsünde kırmızı kutuyla işaretlenir.</w:t>
+      </w:r>
+    </w:p>
+    <w:p>
+      <w:pPr>
+        <w:keepNext/>
+        <w:spacing w:after="40" w:before="80"/>
+        <w:jc w:val="center"/>
+      </w:pPr>
+      <w:r>
+        <w:drawing>
+          <wp:inline distT="0" distB="0" distL="0" distR="0">
+            <wp:extent cx="5905500" cy="3848100"/>
+            <wp:effectExtent t="0" r="0" b="0" l="0"/>
+            <wp:docPr id="1" name="18_gorsel_rapor.png" descr="Görsel/UI kusur raporu: şablon özeti ve işaretli kanıt" title="Görsel/UI kusur raporu: şablon özeti ve işaretli kanıt"/>
+            <wp:cNvGraphicFramePr>
+              <a:graphicFrameLocks xmlns:a="http://schemas.openxmlformats.org/drawingml/2006/main" noChangeAspect="1"/>
+            </wp:cNvGraphicFramePr>
+            <a:graphic xmlns:a="http://schemas.openxmlformats.org/drawingml/2006/main">
+              <a:graphicData uri="http://schemas.openxmlformats.org/drawingml/2006/picture">
+                <pic:pic xmlns:pic="http://schemas.openxmlformats.org/drawingml/2006/picture">
+                  <pic:nvPicPr>
+                    <pic:cNvPr id="0" name="" descr=""/>
+                    <pic:cNvPicPr>
+                      <a:picLocks noChangeAspect="1" noChangeArrowheads="1"/>
+                    </pic:cNvPicPr>
+                  </pic:nvPicPr>
+                  <pic:blipFill>
+                    <a:blip r:embed="rId23" cstate="none"/>
+                    <a:srcRect/>
+                    <a:stretch>
+                      <a:fillRect/>
+                    </a:stretch>
+                  </pic:blipFill>
+                  <pic:spPr bwMode="auto">
+                    <a:xfrm>
+                      <a:off x="0" y="0"/>
                       <a:ext cx="5905500" cy="3848100"/>
                     </a:xfrm>
                     <a:prstGeom prst="rect">
@@ -16263,7 +16439,7 @@
           <w:sz w:val="18"/>
           <w:szCs w:val="18"/>
         </w:rPr>
-        <w:t xml:space="preserve">Şekil 13. </w:t>
+        <w:t xml:space="preserve">Şekil 15. </w:t>
       </w:r>
       <w:r>
         <w:rPr>
@@ -18359,1524 +18535,6 @@
             <wp:extent cx="5905500" cy="4029075"/>
             <wp:effectExtent t="0" r="0" b="0" l="0"/>
             <wp:docPr id="1" name="11_raporlar.png" descr="Raporlar ve özet sayfası" title="Raporlar ve özet sayfası"/>
-            <wp:cNvGraphicFramePr>
-              <a:graphicFrameLocks xmlns:a="http://schemas.openxmlformats.org/drawingml/2006/main" noChangeAspect="1"/>
-            </wp:cNvGraphicFramePr>
-            <a:graphic xmlns:a="http://schemas.openxmlformats.org/drawingml/2006/main">
-              <a:graphicData uri="http://schemas.openxmlformats.org/drawingml/2006/picture">
-                <pic:pic xmlns:pic="http://schemas.openxmlformats.org/drawingml/2006/picture">
-                  <pic:nvPicPr>
-                    <pic:cNvPr id="0" name="" descr=""/>
-                    <pic:cNvPicPr>
-                      <a:picLocks noChangeAspect="1" noChangeArrowheads="1"/>
-                    </pic:cNvPicPr>
-                  </pic:nvPicPr>
-                  <pic:blipFill>
-                    <a:blip r:embed="rId22" cstate="none"/>
-                    <a:srcRect/>
-                    <a:stretch>
-                      <a:fillRect/>
-                    </a:stretch>
-                  </pic:blipFill>
-                  <pic:spPr bwMode="auto">
-                    <a:xfrm>
-                      <a:off x="0" y="0"/>
-                      <a:ext cx="5905500" cy="4029075"/>
-                    </a:xfrm>
-                    <a:prstGeom prst="rect">
-                      <a:avLst/>
-                    </a:prstGeom>
-                  </pic:spPr>
-                </pic:pic>
-              </a:graphicData>
-            </a:graphic>
-          </wp:inline>
-        </w:drawing>
-      </w:r>
-    </w:p>
-    <w:p>
-      <w:pPr>
-        <w:spacing w:after="200"/>
-        <w:jc w:val="center"/>
-      </w:pPr>
-      <w:r>
-        <w:rPr>
-          <w:b/>
-          <w:bCs/>
-          <w:color w:val="595959"/>
-          <w:sz w:val="18"/>
-          <w:szCs w:val="18"/>
-        </w:rPr>
-        <w:t xml:space="preserve">Şekil 14. </w:t>
-      </w:r>
-      <w:r>
-        <w:rPr>
-          <w:i/>
-          <w:iCs/>
-          <w:color w:val="595959"/>
-          <w:sz w:val="18"/>
-          <w:szCs w:val="18"/>
-        </w:rPr>
-        <w:t xml:space="preserve">Raporlar ve özet sayfası</w:t>
-      </w:r>
-    </w:p>
-    <w:p>
-      <w:pPr>
-        <w:pStyle w:val="Heading2"/>
-      </w:pPr>
-      <w:bookmarkStart w:name="b56" w:id="56"/>
-      <w:r>
-        <w:t xml:space="preserve">7.10 Teslim paketi</w:t>
-      </w:r>
-      <w:bookmarkEnd w:id="56"/>
-    </w:p>
-    <w:p>
-      <w:pPr>
-        <w:spacing w:after="120"/>
-      </w:pPr>
-      <w:r>
-        <w:rPr>
-          <w:rFonts w:ascii="Courier New" w:cs="Courier New" w:eastAsia="Courier New" w:hAnsi="Courier New"/>
-          <w:sz w:val="19"/>
-          <w:szCs w:val="19"/>
-        </w:rPr>
-        <w:t xml:space="preserve">TESLIM/</w:t>
-      </w:r>
-      <w:r>
-        <w:t xml:space="preserve"> klasöründe </w:t>
-      </w:r>
-      <w:r>
-        <w:rPr>
-          <w:rFonts w:ascii="Courier New" w:cs="Courier New" w:eastAsia="Courier New" w:hAnsi="Courier New"/>
-          <w:sz w:val="19"/>
-          <w:szCs w:val="19"/>
-        </w:rPr>
-        <w:t xml:space="preserve">raporlar/</w:t>
-      </w:r>
-      <w:r>
-        <w:t xml:space="preserve"> (HTML raporlar, CSS önerisi, son görsel denetim raporu, önce/sonra görüntüleri) ve </w:t>
-      </w:r>
-      <w:r>
-        <w:rPr>
-          <w:rFonts w:ascii="Courier New" w:cs="Courier New" w:eastAsia="Courier New" w:hAnsi="Courier New"/>
-          <w:sz w:val="19"/>
-          <w:szCs w:val="19"/>
-        </w:rPr>
-        <w:t xml:space="preserve">veri/</w:t>
-      </w:r>
-      <w:r>
-        <w:t xml:space="preserve"> (bütün CSV/XLSX/JSON çıktılar) bulunur; </w:t>
-      </w:r>
-      <w:r>
-        <w:rPr>
-          <w:rFonts w:ascii="Courier New" w:cs="Courier New" w:eastAsia="Courier New" w:hAnsi="Courier New"/>
-          <w:sz w:val="19"/>
-          <w:szCs w:val="19"/>
-        </w:rPr>
-        <w:t xml:space="preserve">index.html</w:t>
-      </w:r>
-      <w:r>
-        <w:t xml:space="preserve"> bunların açıklamalı listesidir. Ekran görüntüleri büyük olduğu için pakete kopyalanmaz; gerekirse </w:t>
-      </w:r>
-      <w:r>
-        <w:rPr>
-          <w:rFonts w:ascii="Courier New" w:cs="Courier New" w:eastAsia="Courier New" w:hAnsi="Courier New"/>
-          <w:sz w:val="19"/>
-          <w:szCs w:val="19"/>
-        </w:rPr>
-        <w:t xml:space="preserve">test_output/screenshots/</w:t>
-      </w:r>
-      <w:r>
-        <w:t xml:space="preserve"> ayrıca ZIP'lenir.</w:t>
-      </w:r>
-    </w:p>
-    <w:p>
-      <w:pPr>
-        <w:pStyle w:val="Heading1"/>
-        <w:pageBreakBefore/>
-      </w:pPr>
-      <w:bookmarkStart w:name="b57" w:id="57"/>
-      <w:r>
-        <w:t xml:space="preserve">8. Yapay zekâ ayarları</w:t>
-      </w:r>
-      <w:bookmarkEnd w:id="57"/>
-    </w:p>
-    <w:p>
-      <w:pPr>
-        <w:pStyle w:val="Heading2"/>
-      </w:pPr>
-      <w:bookmarkStart w:name="b58" w:id="58"/>
-      <w:r>
-        <w:t xml:space="preserve">8.1 Sağlayıcılar ve model yazımı</w:t>
-      </w:r>
-      <w:bookmarkEnd w:id="58"/>
-    </w:p>
-    <w:p>
-      <w:pPr>
-        <w:keepNext/>
-        <w:spacing w:after="40" w:before="80"/>
-        <w:jc w:val="center"/>
-      </w:pPr>
-      <w:r>
-        <w:drawing>
-          <wp:inline distT="0" distB="0" distL="0" distR="0">
-            <wp:extent cx="5905500" cy="4029075"/>
-            <wp:effectExtent t="0" r="0" b="0" l="0"/>
-            <wp:docPr id="1" name="13_ayarlar_genel.png" descr="Ayarlar: yapay zekâ sağlayıcıları ve modeller" title="Ayarlar: yapay zekâ sağlayıcıları ve modeller"/>
-            <wp:cNvGraphicFramePr>
-              <a:graphicFrameLocks xmlns:a="http://schemas.openxmlformats.org/drawingml/2006/main" noChangeAspect="1"/>
-            </wp:cNvGraphicFramePr>
-            <a:graphic xmlns:a="http://schemas.openxmlformats.org/drawingml/2006/main">
-              <a:graphicData uri="http://schemas.openxmlformats.org/drawingml/2006/picture">
-                <pic:pic xmlns:pic="http://schemas.openxmlformats.org/drawingml/2006/picture">
-                  <pic:nvPicPr>
-                    <pic:cNvPr id="0" name="" descr=""/>
-                    <pic:cNvPicPr>
-                      <a:picLocks noChangeAspect="1" noChangeArrowheads="1"/>
-                    </pic:cNvPicPr>
-                  </pic:nvPicPr>
-                  <pic:blipFill>
-                    <a:blip r:embed="rId23" cstate="none"/>
-                    <a:srcRect/>
-                    <a:stretch>
-                      <a:fillRect/>
-                    </a:stretch>
-                  </pic:blipFill>
-                  <pic:spPr bwMode="auto">
-                    <a:xfrm>
-                      <a:off x="0" y="0"/>
-                      <a:ext cx="5905500" cy="4029075"/>
-                    </a:xfrm>
-                    <a:prstGeom prst="rect">
-                      <a:avLst/>
-                    </a:prstGeom>
-                  </pic:spPr>
-                </pic:pic>
-              </a:graphicData>
-            </a:graphic>
-          </wp:inline>
-        </w:drawing>
-      </w:r>
-    </w:p>
-    <w:p>
-      <w:pPr>
-        <w:spacing w:after="200"/>
-        <w:jc w:val="center"/>
-      </w:pPr>
-      <w:r>
-        <w:rPr>
-          <w:b/>
-          <w:bCs/>
-          <w:color w:val="595959"/>
-          <w:sz w:val="18"/>
-          <w:szCs w:val="18"/>
-        </w:rPr>
-        <w:t xml:space="preserve">Şekil 15. </w:t>
-      </w:r>
-      <w:r>
-        <w:rPr>
-          <w:i/>
-          <w:iCs/>
-          <w:color w:val="595959"/>
-          <w:sz w:val="18"/>
-          <w:szCs w:val="18"/>
-        </w:rPr>
-        <w:t xml:space="preserve">Ayarlar: yapay zekâ sağlayıcıları ve modeller</w:t>
-      </w:r>
-    </w:p>
-    <w:p>
-      <w:pPr>
-        <w:spacing w:after="120"/>
-      </w:pPr>
-      <w:r>
-        <w:t xml:space="preserve">Ayarlar &gt; </w:t>
-      </w:r>
-      <w:r>
-        <w:rPr>
-          <w:b/>
-          <w:bCs/>
-        </w:rPr>
-        <w:t xml:space="preserve">Yapay zekâ, Bologna, genel</w:t>
-      </w:r>
-      <w:r>
-        <w:t xml:space="preserve"> sekmesinde her sağlayıcının anahtarı, adresi ve varsayılan modeli girilir. </w:t>
-      </w:r>
-      <w:r>
-        <w:rPr>
-          <w:b/>
-          <w:bCs/>
-        </w:rPr>
-        <w:t xml:space="preserve">Tarayan modeller</w:t>
-      </w:r>
-      <w:r>
-        <w:t xml:space="preserve"> (virgülle birden fazla) ve </w:t>
-      </w:r>
-      <w:r>
-        <w:rPr>
-          <w:b/>
-          <w:bCs/>
-        </w:rPr>
-        <w:t xml:space="preserve">Hakem modeli</w:t>
-      </w:r>
-      <w:r>
-        <w:t xml:space="preserve"> alanları şu yazımları kabul eder:</w:t>
-      </w:r>
-    </w:p>
-    <w:tbl>
-      <w:tblPr>
-        <w:tblW w:type="dxa" w:w="9638"/>
-        <w:tblBorders>
-          <w:top w:val="single" w:color="auto" w:sz="4"/>
-          <w:left w:val="single" w:color="auto" w:sz="4"/>
-          <w:bottom w:val="single" w:color="auto" w:sz="4"/>
-          <w:right w:val="single" w:color="auto" w:sz="4"/>
-          <w:insideH w:val="single" w:color="auto" w:sz="4"/>
-          <w:insideV w:val="single" w:color="auto" w:sz="4"/>
-        </w:tblBorders>
-        <w:tblLayout w:type="fixed"/>
-      </w:tblPr>
-      <w:tblGrid>
-        <w:gridCol w:w="2570"/>
-        <w:gridCol w:w="3855"/>
-        <w:gridCol w:w="3213"/>
-      </w:tblGrid>
-      <w:tr>
-        <w:trPr>
-          <w:cantSplit/>
-          <w:tblHeader/>
-        </w:trPr>
-        <w:tc>
-          <w:tcPr>
-            <w:tcW w:type="dxa" w:w="2570"/>
-            <w:tcBorders>
-              <w:top w:val="single" w:color="BFBFBF" w:sz="4"/>
-              <w:left w:val="single" w:color="BFBFBF" w:sz="4"/>
-              <w:bottom w:val="single" w:color="BFBFBF" w:sz="4"/>
-              <w:right w:val="single" w:color="BFBFBF" w:sz="4"/>
-            </w:tcBorders>
-            <w:shd w:fill="1F4E79" w:color="auto" w:val="clear"/>
-            <w:tcMar>
-              <w:top w:type="dxa" w:w="60"/>
-              <w:left w:type="dxa" w:w="100"/>
-              <w:bottom w:type="dxa" w:w="60"/>
-              <w:right w:type="dxa" w:w="100"/>
-            </w:tcMar>
-          </w:tcPr>
-          <w:p>
-            <w:pPr>
-              <w:spacing w:after="20"/>
-            </w:pPr>
-            <w:r>
-              <w:rPr>
-                <w:b/>
-                <w:bCs/>
-                <w:color w:val="FFFFFF"/>
-                <w:sz w:val="19"/>
-                <w:szCs w:val="19"/>
-              </w:rPr>
-              <w:t xml:space="preserve">Yazım</w:t>
-            </w:r>
-          </w:p>
-        </w:tc>
-        <w:tc>
-          <w:tcPr>
-            <w:tcW w:type="dxa" w:w="3855"/>
-            <w:tcBorders>
-              <w:top w:val="single" w:color="BFBFBF" w:sz="4"/>
-              <w:left w:val="single" w:color="BFBFBF" w:sz="4"/>
-              <w:bottom w:val="single" w:color="BFBFBF" w:sz="4"/>
-              <w:right w:val="single" w:color="BFBFBF" w:sz="4"/>
-            </w:tcBorders>
-            <w:shd w:fill="1F4E79" w:color="auto" w:val="clear"/>
-            <w:tcMar>
-              <w:top w:type="dxa" w:w="60"/>
-              <w:left w:type="dxa" w:w="100"/>
-              <w:bottom w:type="dxa" w:w="60"/>
-              <w:right w:type="dxa" w:w="100"/>
-            </w:tcMar>
-          </w:tcPr>
-          <w:p>
-            <w:pPr>
-              <w:spacing w:after="20"/>
-            </w:pPr>
-            <w:r>
-              <w:rPr>
-                <w:b/>
-                <w:bCs/>
-                <w:color w:val="FFFFFF"/>
-                <w:sz w:val="19"/>
-                <w:szCs w:val="19"/>
-              </w:rPr>
-              <w:t xml:space="preserve">Sağlayıcı</w:t>
-            </w:r>
-          </w:p>
-        </w:tc>
-        <w:tc>
-          <w:tcPr>
-            <w:tcW w:type="dxa" w:w="3213"/>
-            <w:tcBorders>
-              <w:top w:val="single" w:color="BFBFBF" w:sz="4"/>
-              <w:left w:val="single" w:color="BFBFBF" w:sz="4"/>
-              <w:bottom w:val="single" w:color="BFBFBF" w:sz="4"/>
-              <w:right w:val="single" w:color="BFBFBF" w:sz="4"/>
-            </w:tcBorders>
-            <w:shd w:fill="1F4E79" w:color="auto" w:val="clear"/>
-            <w:tcMar>
-              <w:top w:type="dxa" w:w="60"/>
-              <w:left w:type="dxa" w:w="100"/>
-              <w:bottom w:type="dxa" w:w="60"/>
-              <w:right w:type="dxa" w:w="100"/>
-            </w:tcMar>
-          </w:tcPr>
-          <w:p>
-            <w:pPr>
-              <w:spacing w:after="20"/>
-            </w:pPr>
-            <w:r>
-              <w:rPr>
-                <w:b/>
-                <w:bCs/>
-                <w:color w:val="FFFFFF"/>
-                <w:sz w:val="19"/>
-                <w:szCs w:val="19"/>
-              </w:rPr>
-              <w:t xml:space="preserve">Gerekenler</w:t>
-            </w:r>
-          </w:p>
-        </w:tc>
-      </w:tr>
-      <w:tr>
-        <w:trPr>
-          <w:cantSplit/>
-        </w:trPr>
-        <w:tc>
-          <w:tcPr>
-            <w:tcW w:type="dxa" w:w="2570"/>
-            <w:tcBorders>
-              <w:top w:val="single" w:color="BFBFBF" w:sz="4"/>
-              <w:left w:val="single" w:color="BFBFBF" w:sz="4"/>
-              <w:bottom w:val="single" w:color="BFBFBF" w:sz="4"/>
-              <w:right w:val="single" w:color="BFBFBF" w:sz="4"/>
-            </w:tcBorders>
-            <w:tcMar>
-              <w:top w:type="dxa" w:w="60"/>
-              <w:left w:type="dxa" w:w="100"/>
-              <w:bottom w:type="dxa" w:w="60"/>
-              <w:right w:type="dxa" w:w="100"/>
-            </w:tcMar>
-          </w:tcPr>
-          <w:p>
-            <w:pPr>
-              <w:spacing w:after="20"/>
-            </w:pPr>
-            <w:r>
-              <w:rPr>
-                <w:rFonts w:ascii="Courier New" w:cs="Courier New" w:eastAsia="Courier New" w:hAnsi="Courier New"/>
-                <w:sz w:val="19"/>
-                <w:szCs w:val="19"/>
-              </w:rPr>
-              <w:t xml:space="preserve">claude</w:t>
-            </w:r>
-            <w:r>
-              <w:rPr>
-                <w:sz w:val="19"/>
-                <w:szCs w:val="19"/>
-              </w:rPr>
-              <w:t xml:space="preserve"> veya </w:t>
-            </w:r>
-            <w:r>
-              <w:rPr>
-                <w:rFonts w:ascii="Courier New" w:cs="Courier New" w:eastAsia="Courier New" w:hAnsi="Courier New"/>
-                <w:sz w:val="19"/>
-                <w:szCs w:val="19"/>
-              </w:rPr>
-              <w:t xml:space="preserve">claude:&lt;model&gt;</w:t>
-            </w:r>
-          </w:p>
-        </w:tc>
-        <w:tc>
-          <w:tcPr>
-            <w:tcW w:type="dxa" w:w="3855"/>
-            <w:tcBorders>
-              <w:top w:val="single" w:color="BFBFBF" w:sz="4"/>
-              <w:left w:val="single" w:color="BFBFBF" w:sz="4"/>
-              <w:bottom w:val="single" w:color="BFBFBF" w:sz="4"/>
-              <w:right w:val="single" w:color="BFBFBF" w:sz="4"/>
-            </w:tcBorders>
-            <w:tcMar>
-              <w:top w:type="dxa" w:w="60"/>
-              <w:left w:type="dxa" w:w="100"/>
-              <w:bottom w:type="dxa" w:w="60"/>
-              <w:right w:type="dxa" w:w="100"/>
-            </w:tcMar>
-          </w:tcPr>
-          <w:p>
-            <w:pPr>
-              <w:spacing w:after="20"/>
-            </w:pPr>
-            <w:r>
-              <w:rPr>
-                <w:sz w:val="19"/>
-                <w:szCs w:val="19"/>
-              </w:rPr>
-              <w:t xml:space="preserve">Anthropic</w:t>
-            </w:r>
-          </w:p>
-        </w:tc>
-        <w:tc>
-          <w:tcPr>
-            <w:tcW w:type="dxa" w:w="3213"/>
-            <w:tcBorders>
-              <w:top w:val="single" w:color="BFBFBF" w:sz="4"/>
-              <w:left w:val="single" w:color="BFBFBF" w:sz="4"/>
-              <w:bottom w:val="single" w:color="BFBFBF" w:sz="4"/>
-              <w:right w:val="single" w:color="BFBFBF" w:sz="4"/>
-            </w:tcBorders>
-            <w:tcMar>
-              <w:top w:type="dxa" w:w="60"/>
-              <w:left w:type="dxa" w:w="100"/>
-              <w:bottom w:type="dxa" w:w="60"/>
-              <w:right w:type="dxa" w:w="100"/>
-            </w:tcMar>
-          </w:tcPr>
-          <w:p>
-            <w:pPr>
-              <w:spacing w:after="20"/>
-            </w:pPr>
-            <w:r>
-              <w:rPr>
-                <w:sz w:val="19"/>
-                <w:szCs w:val="19"/>
-              </w:rPr>
-              <w:t xml:space="preserve">Anthropic API anahtarı</w:t>
-            </w:r>
-          </w:p>
-        </w:tc>
-      </w:tr>
-      <w:tr>
-        <w:trPr>
-          <w:cantSplit/>
-        </w:trPr>
-        <w:tc>
-          <w:tcPr>
-            <w:tcW w:type="dxa" w:w="2570"/>
-            <w:tcBorders>
-              <w:top w:val="single" w:color="BFBFBF" w:sz="4"/>
-              <w:left w:val="single" w:color="BFBFBF" w:sz="4"/>
-              <w:bottom w:val="single" w:color="BFBFBF" w:sz="4"/>
-              <w:right w:val="single" w:color="BFBFBF" w:sz="4"/>
-            </w:tcBorders>
-            <w:tcMar>
-              <w:top w:type="dxa" w:w="60"/>
-              <w:left w:type="dxa" w:w="100"/>
-              <w:bottom w:type="dxa" w:w="60"/>
-              <w:right w:type="dxa" w:w="100"/>
-            </w:tcMar>
-          </w:tcPr>
-          <w:p>
-            <w:pPr>
-              <w:spacing w:after="20"/>
-            </w:pPr>
-            <w:r>
-              <w:rPr>
-                <w:rFonts w:ascii="Courier New" w:cs="Courier New" w:eastAsia="Courier New" w:hAnsi="Courier New"/>
-                <w:sz w:val="19"/>
-                <w:szCs w:val="19"/>
-              </w:rPr>
-              <w:t xml:space="preserve">gemini</w:t>
-            </w:r>
-            <w:r>
-              <w:rPr>
-                <w:sz w:val="19"/>
-                <w:szCs w:val="19"/>
-              </w:rPr>
-              <w:t xml:space="preserve"> veya </w:t>
-            </w:r>
-            <w:r>
-              <w:rPr>
-                <w:rFonts w:ascii="Courier New" w:cs="Courier New" w:eastAsia="Courier New" w:hAnsi="Courier New"/>
-                <w:sz w:val="19"/>
-                <w:szCs w:val="19"/>
-              </w:rPr>
-              <w:t xml:space="preserve">gemini:&lt;model&gt;</w:t>
-            </w:r>
-          </w:p>
-        </w:tc>
-        <w:tc>
-          <w:tcPr>
-            <w:tcW w:type="dxa" w:w="3855"/>
-            <w:tcBorders>
-              <w:top w:val="single" w:color="BFBFBF" w:sz="4"/>
-              <w:left w:val="single" w:color="BFBFBF" w:sz="4"/>
-              <w:bottom w:val="single" w:color="BFBFBF" w:sz="4"/>
-              <w:right w:val="single" w:color="BFBFBF" w:sz="4"/>
-            </w:tcBorders>
-            <w:tcMar>
-              <w:top w:type="dxa" w:w="60"/>
-              <w:left w:type="dxa" w:w="100"/>
-              <w:bottom w:type="dxa" w:w="60"/>
-              <w:right w:type="dxa" w:w="100"/>
-            </w:tcMar>
-          </w:tcPr>
-          <w:p>
-            <w:pPr>
-              <w:spacing w:after="20"/>
-            </w:pPr>
-            <w:r>
-              <w:rPr>
-                <w:sz w:val="19"/>
-                <w:szCs w:val="19"/>
-              </w:rPr>
-              <w:t xml:space="preserve">Google Gemini / Gemma</w:t>
-            </w:r>
-          </w:p>
-        </w:tc>
-        <w:tc>
-          <w:tcPr>
-            <w:tcW w:type="dxa" w:w="3213"/>
-            <w:tcBorders>
-              <w:top w:val="single" w:color="BFBFBF" w:sz="4"/>
-              <w:left w:val="single" w:color="BFBFBF" w:sz="4"/>
-              <w:bottom w:val="single" w:color="BFBFBF" w:sz="4"/>
-              <w:right w:val="single" w:color="BFBFBF" w:sz="4"/>
-            </w:tcBorders>
-            <w:tcMar>
-              <w:top w:type="dxa" w:w="60"/>
-              <w:left w:type="dxa" w:w="100"/>
-              <w:bottom w:type="dxa" w:w="60"/>
-              <w:right w:type="dxa" w:w="100"/>
-            </w:tcMar>
-          </w:tcPr>
-          <w:p>
-            <w:pPr>
-              <w:spacing w:after="20"/>
-            </w:pPr>
-            <w:r>
-              <w:rPr>
-                <w:sz w:val="19"/>
-                <w:szCs w:val="19"/>
-              </w:rPr>
-              <w:t xml:space="preserve">Gemini API anahtarı (ücretsiz katman yeterli)</w:t>
-            </w:r>
-          </w:p>
-        </w:tc>
-      </w:tr>
-      <w:tr>
-        <w:trPr>
-          <w:cantSplit/>
-        </w:trPr>
-        <w:tc>
-          <w:tcPr>
-            <w:tcW w:type="dxa" w:w="2570"/>
-            <w:tcBorders>
-              <w:top w:val="single" w:color="BFBFBF" w:sz="4"/>
-              <w:left w:val="single" w:color="BFBFBF" w:sz="4"/>
-              <w:bottom w:val="single" w:color="BFBFBF" w:sz="4"/>
-              <w:right w:val="single" w:color="BFBFBF" w:sz="4"/>
-            </w:tcBorders>
-            <w:tcMar>
-              <w:top w:type="dxa" w:w="60"/>
-              <w:left w:type="dxa" w:w="100"/>
-              <w:bottom w:type="dxa" w:w="60"/>
-              <w:right w:type="dxa" w:w="100"/>
-            </w:tcMar>
-          </w:tcPr>
-          <w:p>
-            <w:pPr>
-              <w:spacing w:after="20"/>
-            </w:pPr>
-            <w:r>
-              <w:rPr>
-                <w:rFonts w:ascii="Courier New" w:cs="Courier New" w:eastAsia="Courier New" w:hAnsi="Courier New"/>
-                <w:sz w:val="19"/>
-                <w:szCs w:val="19"/>
-              </w:rPr>
-              <w:t xml:space="preserve">openai:&lt;model&gt;</w:t>
-            </w:r>
-          </w:p>
-        </w:tc>
-        <w:tc>
-          <w:tcPr>
-            <w:tcW w:type="dxa" w:w="3855"/>
-            <w:tcBorders>
-              <w:top w:val="single" w:color="BFBFBF" w:sz="4"/>
-              <w:left w:val="single" w:color="BFBFBF" w:sz="4"/>
-              <w:bottom w:val="single" w:color="BFBFBF" w:sz="4"/>
-              <w:right w:val="single" w:color="BFBFBF" w:sz="4"/>
-            </w:tcBorders>
-            <w:tcMar>
-              <w:top w:type="dxa" w:w="60"/>
-              <w:left w:type="dxa" w:w="100"/>
-              <w:bottom w:type="dxa" w:w="60"/>
-              <w:right w:type="dxa" w:w="100"/>
-            </w:tcMar>
-          </w:tcPr>
-          <w:p>
-            <w:pPr>
-              <w:spacing w:after="20"/>
-            </w:pPr>
-            <w:r>
-              <w:rPr>
-                <w:sz w:val="19"/>
-                <w:szCs w:val="19"/>
-              </w:rPr>
-              <w:t xml:space="preserve">OpenAI uyumlu her servis: OpenAI, OpenRouter, Groq, Mistral, Together, LM Studio, vLLM, Ollama'nın OpenAI ucu</w:t>
-            </w:r>
-          </w:p>
-        </w:tc>
-        <w:tc>
-          <w:tcPr>
-            <w:tcW w:type="dxa" w:w="3213"/>
-            <w:tcBorders>
-              <w:top w:val="single" w:color="BFBFBF" w:sz="4"/>
-              <w:left w:val="single" w:color="BFBFBF" w:sz="4"/>
-              <w:bottom w:val="single" w:color="BFBFBF" w:sz="4"/>
-              <w:right w:val="single" w:color="BFBFBF" w:sz="4"/>
-            </w:tcBorders>
-            <w:tcMar>
-              <w:top w:type="dxa" w:w="60"/>
-              <w:left w:type="dxa" w:w="100"/>
-              <w:bottom w:type="dxa" w:w="60"/>
-              <w:right w:type="dxa" w:w="100"/>
-            </w:tcMar>
-          </w:tcPr>
-          <w:p>
-            <w:pPr>
-              <w:spacing w:after="20"/>
-            </w:pPr>
-            <w:r>
-              <w:rPr>
-                <w:sz w:val="19"/>
-                <w:szCs w:val="19"/>
-              </w:rPr>
-              <w:t xml:space="preserve">Adres (listeden seçilir) ve gerekirse anahtar</w:t>
-            </w:r>
-          </w:p>
-        </w:tc>
-      </w:tr>
-      <w:tr>
-        <w:trPr>
-          <w:cantSplit/>
-        </w:trPr>
-        <w:tc>
-          <w:tcPr>
-            <w:tcW w:type="dxa" w:w="2570"/>
-            <w:tcBorders>
-              <w:top w:val="single" w:color="BFBFBF" w:sz="4"/>
-              <w:left w:val="single" w:color="BFBFBF" w:sz="4"/>
-              <w:bottom w:val="single" w:color="BFBFBF" w:sz="4"/>
-              <w:right w:val="single" w:color="BFBFBF" w:sz="4"/>
-            </w:tcBorders>
-            <w:tcMar>
-              <w:top w:type="dxa" w:w="60"/>
-              <w:left w:type="dxa" w:w="100"/>
-              <w:bottom w:type="dxa" w:w="60"/>
-              <w:right w:type="dxa" w:w="100"/>
-            </w:tcMar>
-          </w:tcPr>
-          <w:p>
-            <w:pPr>
-              <w:spacing w:after="20"/>
-            </w:pPr>
-            <w:r>
-              <w:rPr>
-                <w:rFonts w:ascii="Courier New" w:cs="Courier New" w:eastAsia="Courier New" w:hAnsi="Courier New"/>
-                <w:sz w:val="19"/>
-                <w:szCs w:val="19"/>
-              </w:rPr>
-              <w:t xml:space="preserve">ollama:&lt;model&gt;</w:t>
-            </w:r>
-          </w:p>
-        </w:tc>
-        <w:tc>
-          <w:tcPr>
-            <w:tcW w:type="dxa" w:w="3855"/>
-            <w:tcBorders>
-              <w:top w:val="single" w:color="BFBFBF" w:sz="4"/>
-              <w:left w:val="single" w:color="BFBFBF" w:sz="4"/>
-              <w:bottom w:val="single" w:color="BFBFBF" w:sz="4"/>
-              <w:right w:val="single" w:color="BFBFBF" w:sz="4"/>
-            </w:tcBorders>
-            <w:tcMar>
-              <w:top w:type="dxa" w:w="60"/>
-              <w:left w:type="dxa" w:w="100"/>
-              <w:bottom w:type="dxa" w:w="60"/>
-              <w:right w:type="dxa" w:w="100"/>
-            </w:tcMar>
-          </w:tcPr>
-          <w:p>
-            <w:pPr>
-              <w:spacing w:after="20"/>
-            </w:pPr>
-            <w:r>
-              <w:rPr>
-                <w:sz w:val="19"/>
-                <w:szCs w:val="19"/>
-              </w:rPr>
-              <w:t xml:space="preserve">Yerel Ollama</w:t>
-            </w:r>
-          </w:p>
-        </w:tc>
-        <w:tc>
-          <w:tcPr>
-            <w:tcW w:type="dxa" w:w="3213"/>
-            <w:tcBorders>
-              <w:top w:val="single" w:color="BFBFBF" w:sz="4"/>
-              <w:left w:val="single" w:color="BFBFBF" w:sz="4"/>
-              <w:bottom w:val="single" w:color="BFBFBF" w:sz="4"/>
-              <w:right w:val="single" w:color="BFBFBF" w:sz="4"/>
-            </w:tcBorders>
-            <w:tcMar>
-              <w:top w:type="dxa" w:w="60"/>
-              <w:left w:type="dxa" w:w="100"/>
-              <w:bottom w:type="dxa" w:w="60"/>
-              <w:right w:type="dxa" w:w="100"/>
-            </w:tcMar>
-          </w:tcPr>
-          <w:p>
-            <w:pPr>
-              <w:spacing w:after="20"/>
-            </w:pPr>
-            <w:r>
-              <w:rPr>
-                <w:sz w:val="19"/>
-                <w:szCs w:val="19"/>
-              </w:rPr>
-              <w:t xml:space="preserve">Ollama kurulu ve model indirilmiş olmalı (</w:t>
-            </w:r>
-            <w:r>
-              <w:rPr>
-                <w:rFonts w:ascii="Courier New" w:cs="Courier New" w:eastAsia="Courier New" w:hAnsi="Courier New"/>
-                <w:sz w:val="19"/>
-                <w:szCs w:val="19"/>
-              </w:rPr>
-              <w:t xml:space="preserve">ollama pull &lt;model&gt;</w:t>
-            </w:r>
-            <w:r>
-              <w:rPr>
-                <w:sz w:val="19"/>
-                <w:szCs w:val="19"/>
-              </w:rPr>
-              <w:t xml:space="preserve">)</w:t>
-            </w:r>
-          </w:p>
-        </w:tc>
-      </w:tr>
-    </w:tbl>
-    <w:p>
-      <w:pPr>
-        <w:spacing w:after="100"/>
-      </w:pPr>
-    </w:p>
-    <w:p>
-      <w:pPr>
-        <w:spacing w:after="120"/>
-      </w:pPr>
-      <w:r>
-        <w:rPr>
-          <w:b/>
-          <w:bCs/>
-        </w:rPr>
-        <w:t xml:space="preserve">Hazırlık &gt; Yapay zekâ sağlayıcılarını dene</w:t>
-      </w:r>
-      <w:r>
-        <w:t xml:space="preserve"> her sağlayıcıya bağlanır, kullanılabilir modelleri listeler ve ayarlardaki model adının listede olup olmadığını söyler. Yeni bir servis için kod değişikliği gerekmez.</w:t>
-      </w:r>
-    </w:p>
-    <w:p>
-      <w:pPr>
-        <w:pStyle w:val="Heading2"/>
-      </w:pPr>
-      <w:bookmarkStart w:name="b59" w:id="59"/>
-      <w:r>
-        <w:t xml:space="preserve">8.2 Varsayılan modeller</w:t>
-      </w:r>
-      <w:bookmarkEnd w:id="59"/>
-    </w:p>
-    <w:tbl>
-      <w:tblPr>
-        <w:tblW w:type="dxa" w:w="9638"/>
-        <w:tblBorders>
-          <w:top w:val="single" w:color="auto" w:sz="4"/>
-          <w:left w:val="single" w:color="auto" w:sz="4"/>
-          <w:bottom w:val="single" w:color="auto" w:sz="4"/>
-          <w:right w:val="single" w:color="auto" w:sz="4"/>
-          <w:insideH w:val="single" w:color="auto" w:sz="4"/>
-          <w:insideV w:val="single" w:color="auto" w:sz="4"/>
-        </w:tblBorders>
-        <w:tblLayout w:type="fixed"/>
-      </w:tblPr>
-      <w:tblGrid>
-        <w:gridCol w:w="1633"/>
-        <w:gridCol w:w="3103"/>
-        <w:gridCol w:w="4902"/>
-      </w:tblGrid>
-      <w:tr>
-        <w:trPr>
-          <w:cantSplit/>
-          <w:tblHeader/>
-        </w:trPr>
-        <w:tc>
-          <w:tcPr>
-            <w:tcW w:type="dxa" w:w="1633"/>
-            <w:tcBorders>
-              <w:top w:val="single" w:color="BFBFBF" w:sz="4"/>
-              <w:left w:val="single" w:color="BFBFBF" w:sz="4"/>
-              <w:bottom w:val="single" w:color="BFBFBF" w:sz="4"/>
-              <w:right w:val="single" w:color="BFBFBF" w:sz="4"/>
-            </w:tcBorders>
-            <w:shd w:fill="1F4E79" w:color="auto" w:val="clear"/>
-            <w:tcMar>
-              <w:top w:type="dxa" w:w="60"/>
-              <w:left w:type="dxa" w:w="100"/>
-              <w:bottom w:type="dxa" w:w="60"/>
-              <w:right w:type="dxa" w:w="100"/>
-            </w:tcMar>
-          </w:tcPr>
-          <w:p>
-            <w:pPr>
-              <w:spacing w:after="20"/>
-            </w:pPr>
-            <w:r>
-              <w:rPr>
-                <w:b/>
-                <w:bCs/>
-                <w:color w:val="FFFFFF"/>
-                <w:sz w:val="19"/>
-                <w:szCs w:val="19"/>
-              </w:rPr>
-              <w:t xml:space="preserve">Görev</w:t>
-            </w:r>
-          </w:p>
-        </w:tc>
-        <w:tc>
-          <w:tcPr>
-            <w:tcW w:type="dxa" w:w="3103"/>
-            <w:tcBorders>
-              <w:top w:val="single" w:color="BFBFBF" w:sz="4"/>
-              <w:left w:val="single" w:color="BFBFBF" w:sz="4"/>
-              <w:bottom w:val="single" w:color="BFBFBF" w:sz="4"/>
-              <w:right w:val="single" w:color="BFBFBF" w:sz="4"/>
-            </w:tcBorders>
-            <w:shd w:fill="1F4E79" w:color="auto" w:val="clear"/>
-            <w:tcMar>
-              <w:top w:type="dxa" w:w="60"/>
-              <w:left w:type="dxa" w:w="100"/>
-              <w:bottom w:type="dxa" w:w="60"/>
-              <w:right w:type="dxa" w:w="100"/>
-            </w:tcMar>
-          </w:tcPr>
-          <w:p>
-            <w:pPr>
-              <w:spacing w:after="20"/>
-            </w:pPr>
-            <w:r>
-              <w:rPr>
-                <w:b/>
-                <w:bCs/>
-                <w:color w:val="FFFFFF"/>
-                <w:sz w:val="19"/>
-                <w:szCs w:val="19"/>
-              </w:rPr>
-              <w:t xml:space="preserve">Model</w:t>
-            </w:r>
-          </w:p>
-        </w:tc>
-        <w:tc>
-          <w:tcPr>
-            <w:tcW w:type="dxa" w:w="4902"/>
-            <w:tcBorders>
-              <w:top w:val="single" w:color="BFBFBF" w:sz="4"/>
-              <w:left w:val="single" w:color="BFBFBF" w:sz="4"/>
-              <w:bottom w:val="single" w:color="BFBFBF" w:sz="4"/>
-              <w:right w:val="single" w:color="BFBFBF" w:sz="4"/>
-            </w:tcBorders>
-            <w:shd w:fill="1F4E79" w:color="auto" w:val="clear"/>
-            <w:tcMar>
-              <w:top w:type="dxa" w:w="60"/>
-              <w:left w:type="dxa" w:w="100"/>
-              <w:bottom w:type="dxa" w:w="60"/>
-              <w:right w:type="dxa" w:w="100"/>
-            </w:tcMar>
-          </w:tcPr>
-          <w:p>
-            <w:pPr>
-              <w:spacing w:after="20"/>
-            </w:pPr>
-            <w:r>
-              <w:rPr>
-                <w:b/>
-                <w:bCs/>
-                <w:color w:val="FFFFFF"/>
-                <w:sz w:val="19"/>
-                <w:szCs w:val="19"/>
-              </w:rPr>
-              <w:t xml:space="preserve">Not</w:t>
-            </w:r>
-          </w:p>
-        </w:tc>
-      </w:tr>
-      <w:tr>
-        <w:trPr>
-          <w:cantSplit/>
-        </w:trPr>
-        <w:tc>
-          <w:tcPr>
-            <w:tcW w:type="dxa" w:w="1633"/>
-            <w:tcBorders>
-              <w:top w:val="single" w:color="BFBFBF" w:sz="4"/>
-              <w:left w:val="single" w:color="BFBFBF" w:sz="4"/>
-              <w:bottom w:val="single" w:color="BFBFBF" w:sz="4"/>
-              <w:right w:val="single" w:color="BFBFBF" w:sz="4"/>
-            </w:tcBorders>
-            <w:tcMar>
-              <w:top w:type="dxa" w:w="60"/>
-              <w:left w:type="dxa" w:w="100"/>
-              <w:bottom w:type="dxa" w:w="60"/>
-              <w:right w:type="dxa" w:w="100"/>
-            </w:tcMar>
-          </w:tcPr>
-          <w:p>
-            <w:pPr>
-              <w:spacing w:after="20"/>
-            </w:pPr>
-            <w:r>
-              <w:rPr>
-                <w:sz w:val="19"/>
-                <w:szCs w:val="19"/>
-              </w:rPr>
-              <w:t xml:space="preserve">Ana tarama</w:t>
-            </w:r>
-          </w:p>
-        </w:tc>
-        <w:tc>
-          <w:tcPr>
-            <w:tcW w:type="dxa" w:w="3103"/>
-            <w:tcBorders>
-              <w:top w:val="single" w:color="BFBFBF" w:sz="4"/>
-              <w:left w:val="single" w:color="BFBFBF" w:sz="4"/>
-              <w:bottom w:val="single" w:color="BFBFBF" w:sz="4"/>
-              <w:right w:val="single" w:color="BFBFBF" w:sz="4"/>
-            </w:tcBorders>
-            <w:tcMar>
-              <w:top w:type="dxa" w:w="60"/>
-              <w:left w:type="dxa" w:w="100"/>
-              <w:bottom w:type="dxa" w:w="60"/>
-              <w:right w:type="dxa" w:w="100"/>
-            </w:tcMar>
-          </w:tcPr>
-          <w:p>
-            <w:pPr>
-              <w:spacing w:after="20"/>
-            </w:pPr>
-            <w:r>
-              <w:rPr>
-                <w:rFonts w:ascii="Courier New" w:cs="Courier New" w:eastAsia="Courier New" w:hAnsi="Courier New"/>
-                <w:sz w:val="19"/>
-                <w:szCs w:val="19"/>
-              </w:rPr>
-              <w:t xml:space="preserve">gemini:gemma-4-31b-it</w:t>
-            </w:r>
-          </w:p>
-        </w:tc>
-        <w:tc>
-          <w:tcPr>
-            <w:tcW w:type="dxa" w:w="4902"/>
-            <w:tcBorders>
-              <w:top w:val="single" w:color="BFBFBF" w:sz="4"/>
-              <w:left w:val="single" w:color="BFBFBF" w:sz="4"/>
-              <w:bottom w:val="single" w:color="BFBFBF" w:sz="4"/>
-              <w:right w:val="single" w:color="BFBFBF" w:sz="4"/>
-            </w:tcBorders>
-            <w:tcMar>
-              <w:top w:type="dxa" w:w="60"/>
-              <w:left w:type="dxa" w:w="100"/>
-              <w:bottom w:type="dxa" w:w="60"/>
-              <w:right w:type="dxa" w:w="100"/>
-            </w:tcMar>
-          </w:tcPr>
-          <w:p>
-            <w:pPr>
-              <w:spacing w:after="20"/>
-            </w:pPr>
-            <w:r>
-              <w:rPr>
-                <w:sz w:val="19"/>
-                <w:szCs w:val="19"/>
-              </w:rPr>
-              <w:t xml:space="preserve">Görsel denetimde fiilen kullanılan model; ücretsiz katmanda çalışır.</w:t>
-            </w:r>
-          </w:p>
-        </w:tc>
-      </w:tr>
-      <w:tr>
-        <w:trPr>
-          <w:cantSplit/>
-        </w:trPr>
-        <w:tc>
-          <w:tcPr>
-            <w:tcW w:type="dxa" w:w="1633"/>
-            <w:tcBorders>
-              <w:top w:val="single" w:color="BFBFBF" w:sz="4"/>
-              <w:left w:val="single" w:color="BFBFBF" w:sz="4"/>
-              <w:bottom w:val="single" w:color="BFBFBF" w:sz="4"/>
-              <w:right w:val="single" w:color="BFBFBF" w:sz="4"/>
-            </w:tcBorders>
-            <w:tcMar>
-              <w:top w:type="dxa" w:w="60"/>
-              <w:left w:type="dxa" w:w="100"/>
-              <w:bottom w:type="dxa" w:w="60"/>
-              <w:right w:type="dxa" w:w="100"/>
-            </w:tcMar>
-          </w:tcPr>
-          <w:p>
-            <w:pPr>
-              <w:spacing w:after="20"/>
-            </w:pPr>
-            <w:r>
-              <w:rPr>
-                <w:sz w:val="19"/>
-                <w:szCs w:val="19"/>
-              </w:rPr>
-              <w:t xml:space="preserve">Hakem</w:t>
-            </w:r>
-          </w:p>
-        </w:tc>
-        <w:tc>
-          <w:tcPr>
-            <w:tcW w:type="dxa" w:w="3103"/>
-            <w:tcBorders>
-              <w:top w:val="single" w:color="BFBFBF" w:sz="4"/>
-              <w:left w:val="single" w:color="BFBFBF" w:sz="4"/>
-              <w:bottom w:val="single" w:color="BFBFBF" w:sz="4"/>
-              <w:right w:val="single" w:color="BFBFBF" w:sz="4"/>
-            </w:tcBorders>
-            <w:tcMar>
-              <w:top w:type="dxa" w:w="60"/>
-              <w:left w:type="dxa" w:w="100"/>
-              <w:bottom w:type="dxa" w:w="60"/>
-              <w:right w:type="dxa" w:w="100"/>
-            </w:tcMar>
-          </w:tcPr>
-          <w:p>
-            <w:pPr>
-              <w:spacing w:after="20"/>
-            </w:pPr>
-            <w:r>
-              <w:rPr>
-                <w:rFonts w:ascii="Courier New" w:cs="Courier New" w:eastAsia="Courier New" w:hAnsi="Courier New"/>
-                <w:sz w:val="19"/>
-                <w:szCs w:val="19"/>
-              </w:rPr>
-              <w:t xml:space="preserve">gemini:gemini-3.5-flash-lite</w:t>
-            </w:r>
-          </w:p>
-        </w:tc>
-        <w:tc>
-          <w:tcPr>
-            <w:tcW w:type="dxa" w:w="4902"/>
-            <w:tcBorders>
-              <w:top w:val="single" w:color="BFBFBF" w:sz="4"/>
-              <w:left w:val="single" w:color="BFBFBF" w:sz="4"/>
-              <w:bottom w:val="single" w:color="BFBFBF" w:sz="4"/>
-              <w:right w:val="single" w:color="BFBFBF" w:sz="4"/>
-            </w:tcBorders>
-            <w:tcMar>
-              <w:top w:type="dxa" w:w="60"/>
-              <w:left w:type="dxa" w:w="100"/>
-              <w:bottom w:type="dxa" w:w="60"/>
-              <w:right w:type="dxa" w:w="100"/>
-            </w:tcMar>
-          </w:tcPr>
-          <w:p>
-            <w:pPr>
-              <w:spacing w:after="20"/>
-            </w:pPr>
-            <w:r>
-              <w:rPr>
-                <w:sz w:val="19"/>
-                <w:szCs w:val="19"/>
-              </w:rPr>
-              <w:t xml:space="preserve">Tür bazlı örneklemle (</w:t>
-            </w:r>
-            <w:r>
-              <w:rPr>
-                <w:rFonts w:ascii="Courier New" w:cs="Courier New" w:eastAsia="Courier New" w:hAnsi="Courier New"/>
-                <w:sz w:val="19"/>
-                <w:szCs w:val="19"/>
-              </w:rPr>
-              <w:t xml:space="preserve">tur</w:t>
-            </w:r>
-            <w:r>
-              <w:rPr>
-                <w:sz w:val="19"/>
-                <w:szCs w:val="19"/>
-              </w:rPr>
-              <w:t xml:space="preserve">) modelin isabetini ölçer.</w:t>
-            </w:r>
-          </w:p>
-        </w:tc>
-      </w:tr>
-      <w:tr>
-        <w:trPr>
-          <w:cantSplit/>
-        </w:trPr>
-        <w:tc>
-          <w:tcPr>
-            <w:tcW w:type="dxa" w:w="1633"/>
-            <w:tcBorders>
-              <w:top w:val="single" w:color="BFBFBF" w:sz="4"/>
-              <w:left w:val="single" w:color="BFBFBF" w:sz="4"/>
-              <w:bottom w:val="single" w:color="BFBFBF" w:sz="4"/>
-              <w:right w:val="single" w:color="BFBFBF" w:sz="4"/>
-            </w:tcBorders>
-            <w:tcMar>
-              <w:top w:type="dxa" w:w="60"/>
-              <w:left w:type="dxa" w:w="100"/>
-              <w:bottom w:type="dxa" w:w="60"/>
-              <w:right w:type="dxa" w:w="100"/>
-            </w:tcMar>
-          </w:tcPr>
-          <w:p>
-            <w:pPr>
-              <w:spacing w:after="20"/>
-            </w:pPr>
-            <w:r>
-              <w:rPr>
-                <w:sz w:val="19"/>
-                <w:szCs w:val="19"/>
-              </w:rPr>
-              <w:t xml:space="preserve">Yerel model</w:t>
-            </w:r>
-          </w:p>
-        </w:tc>
-        <w:tc>
-          <w:tcPr>
-            <w:tcW w:type="dxa" w:w="3103"/>
-            <w:tcBorders>
-              <w:top w:val="single" w:color="BFBFBF" w:sz="4"/>
-              <w:left w:val="single" w:color="BFBFBF" w:sz="4"/>
-              <w:bottom w:val="single" w:color="BFBFBF" w:sz="4"/>
-              <w:right w:val="single" w:color="BFBFBF" w:sz="4"/>
-            </w:tcBorders>
-            <w:tcMar>
-              <w:top w:type="dxa" w:w="60"/>
-              <w:left w:type="dxa" w:w="100"/>
-              <w:bottom w:type="dxa" w:w="60"/>
-              <w:right w:type="dxa" w:w="100"/>
-            </w:tcMar>
-          </w:tcPr>
-          <w:p>
-            <w:pPr>
-              <w:spacing w:after="20"/>
-            </w:pPr>
-            <w:r>
-              <w:rPr>
-                <w:rFonts w:ascii="Courier New" w:cs="Courier New" w:eastAsia="Courier New" w:hAnsi="Courier New"/>
-                <w:sz w:val="19"/>
-                <w:szCs w:val="19"/>
-              </w:rPr>
-              <w:t xml:space="preserve">qwen2.5vl:3b</w:t>
-            </w:r>
-          </w:p>
-        </w:tc>
-        <w:tc>
-          <w:tcPr>
-            <w:tcW w:type="dxa" w:w="4902"/>
-            <w:tcBorders>
-              <w:top w:val="single" w:color="BFBFBF" w:sz="4"/>
-              <w:left w:val="single" w:color="BFBFBF" w:sz="4"/>
-              <w:bottom w:val="single" w:color="BFBFBF" w:sz="4"/>
-              <w:right w:val="single" w:color="BFBFBF" w:sz="4"/>
-            </w:tcBorders>
-            <w:tcMar>
-              <w:top w:type="dxa" w:w="60"/>
-              <w:left w:type="dxa" w:w="100"/>
-              <w:bottom w:type="dxa" w:w="60"/>
-              <w:right w:type="dxa" w:w="100"/>
-            </w:tcMar>
-          </w:tcPr>
-          <w:p>
-            <w:pPr>
-              <w:spacing w:after="20"/>
-            </w:pPr>
-            <w:r>
-              <w:rPr>
-                <w:sz w:val="19"/>
-                <w:szCs w:val="19"/>
-              </w:rPr>
-              <w:t xml:space="preserve">Ollama incelemesi. Küçük modeller hataları kaçırabilir; GPU varsa </w:t>
-            </w:r>
-            <w:r>
-              <w:rPr>
-                <w:rFonts w:ascii="Courier New" w:cs="Courier New" w:eastAsia="Courier New" w:hAnsi="Courier New"/>
-                <w:sz w:val="19"/>
-                <w:szCs w:val="19"/>
-              </w:rPr>
-              <w:t xml:space="preserve">qwen2.5vl:7b</w:t>
-            </w:r>
-            <w:r>
-              <w:rPr>
-                <w:sz w:val="19"/>
-                <w:szCs w:val="19"/>
-              </w:rPr>
-              <w:t xml:space="preserve"> önerilir.</w:t>
-            </w:r>
-          </w:p>
-        </w:tc>
-      </w:tr>
-    </w:tbl>
-    <w:p>
-      <w:pPr>
-        <w:spacing w:after="100"/>
-      </w:pPr>
-    </w:p>
-    <w:p>
-      <w:pPr>
-        <w:pStyle w:val="Heading2"/>
-      </w:pPr>
-      <w:bookmarkStart w:name="b60" w:id="60"/>
-      <w:r>
-        <w:t xml:space="preserve">8.3 Anahtarlar ve güvenlik</w:t>
-      </w:r>
-      <w:bookmarkEnd w:id="60"/>
-    </w:p>
-    <w:p>
-      <w:pPr>
-        <w:pStyle w:val="ListParagraph"/>
-        <w:numPr>
-          <w:ilvl w:val="0"/>
-          <w:numId w:val="2"/>
-        </w:numPr>
-        <w:spacing w:after="60"/>
-      </w:pPr>
-      <w:r>
-        <w:t xml:space="preserve">Anahtarlar varsayılan olarak </w:t>
-      </w:r>
-      <w:r>
-        <w:rPr>
-          <w:b/>
-          <w:bCs/>
-        </w:rPr>
-        <w:t xml:space="preserve">diske yazılmaz</w:t>
-      </w:r>
-      <w:r>
-        <w:t xml:space="preserve">; yalnızca o oturumda kullanılır. Kalıcı olsun isterseniz </w:t>
-      </w:r>
-      <w:r>
-        <w:rPr>
-          <w:b/>
-          <w:bCs/>
-        </w:rPr>
-        <w:t xml:space="preserve">Anahtarları diske kaydet</w:t>
-      </w:r>
-      <w:r>
-        <w:t xml:space="preserve">'i işaretleyin; anahtarlar </w:t>
-      </w:r>
-      <w:r>
-        <w:rPr>
-          <w:rFonts w:ascii="Courier New" w:cs="Courier New" w:eastAsia="Courier New" w:hAnsi="Courier New"/>
-          <w:sz w:val="19"/>
-          <w:szCs w:val="19"/>
-        </w:rPr>
-        <w:t xml:space="preserve">ayarlar.json</w:t>
-      </w:r>
-      <w:r>
-        <w:t xml:space="preserve">'a yazılır ve bu dosya git'e girmez.</w:t>
-      </w:r>
-    </w:p>
-    <w:p>
-      <w:pPr>
-        <w:pStyle w:val="ListParagraph"/>
-        <w:numPr>
-          <w:ilvl w:val="0"/>
-          <w:numId w:val="2"/>
-        </w:numPr>
-        <w:spacing w:after="60"/>
-      </w:pPr>
-      <w:r>
-        <w:t xml:space="preserve">Anahtarlar araçlara ortam değişkeni olarak geçirilir ve çalışma kaydına hiçbir zaman açık yazılmaz.</w:t>
-      </w:r>
-    </w:p>
-    <w:p>
-      <w:pPr>
-        <w:pStyle w:val="ListParagraph"/>
-        <w:numPr>
-          <w:ilvl w:val="0"/>
-          <w:numId w:val="2"/>
-        </w:numPr>
-        <w:spacing w:after="60"/>
-      </w:pPr>
-      <w:r>
-        <w:t xml:space="preserve">Kurum içi bir sitenin ekran görüntüleri bulut modellere gönderilir. Bu kabul edilemiyorsa yerel Ollama ya da kurum içi OpenAI uyumlu bir sunucu kullanın.</w:t>
-      </w:r>
-    </w:p>
-    <w:p>
-      <w:pPr>
-        <w:pStyle w:val="Heading2"/>
-      </w:pPr>
-      <w:bookmarkStart w:name="b61" w:id="61"/>
-      <w:r>
-        <w:t xml:space="preserve">8.4 Kota, hız ve maliyet</w:t>
-      </w:r>
-      <w:bookmarkEnd w:id="61"/>
-    </w:p>
-    <w:p>
-      <w:pPr>
-        <w:pStyle w:val="ListParagraph"/>
-        <w:numPr>
-          <w:ilvl w:val="0"/>
-          <w:numId w:val="2"/>
-        </w:numPr>
-        <w:spacing w:after="60"/>
-      </w:pPr>
-      <w:r>
-        <w:rPr>
-          <w:b/>
-          <w:bCs/>
-        </w:rPr>
-        <w:t xml:space="preserve">Dakikada istek sınırı</w:t>
-      </w:r>
-      <w:r>
-        <w:t xml:space="preserve"> (varsayılan 8): ücretsiz Gemini katmanının dakikalık sınırına takılmamak için. Ücretli hesapta 0 (sınırsız) yapılabilir.</w:t>
-      </w:r>
-    </w:p>
-    <w:p>
-      <w:pPr>
-        <w:pStyle w:val="ListParagraph"/>
-        <w:numPr>
-          <w:ilvl w:val="0"/>
-          <w:numId w:val="2"/>
-        </w:numPr>
-        <w:spacing w:after="60"/>
-      </w:pPr>
-      <w:r>
-        <w:t xml:space="preserve">Günlük kota dolarsa analiz o model için durur; ertesi gün aynı adım kaldığı yerden devam eder.</w:t>
-      </w:r>
-    </w:p>
-    <w:p>
-      <w:pPr>
-        <w:pStyle w:val="ListParagraph"/>
-        <w:numPr>
-          <w:ilvl w:val="0"/>
-          <w:numId w:val="2"/>
-        </w:numPr>
-        <w:spacing w:after="60"/>
-      </w:pPr>
-      <w:r>
-        <w:rPr>
-          <w:b/>
-          <w:bCs/>
-        </w:rPr>
-        <w:t xml:space="preserve">3a. Maliyet/süre tahmini</w:t>
-      </w:r>
-      <w:r>
-        <w:t xml:space="preserve"> API çağırmadan istek sayısını ve Claude için tahmini maliyeti gösterir. Önce </w:t>
-      </w:r>
-      <w:r>
-        <w:rPr>
-          <w:b/>
-          <w:bCs/>
-        </w:rPr>
-        <w:t xml:space="preserve">Sayfa sınırı (deneme)</w:t>
-      </w:r>
-      <w:r>
-        <w:t xml:space="preserve"> ile küçük bir tur yapmanız önerilir.</w:t>
-      </w:r>
-    </w:p>
-    <w:p>
-      <w:pPr>
-        <w:pStyle w:val="ListParagraph"/>
-        <w:numPr>
-          <w:ilvl w:val="0"/>
-          <w:numId w:val="2"/>
-        </w:numPr>
-        <w:spacing w:after="60"/>
-      </w:pPr>
-      <w:r>
-        <w:t xml:space="preserve">Claude kullanıyorsanız </w:t>
-      </w:r>
-      <w:r>
-        <w:rPr>
-          <w:b/>
-          <w:bCs/>
-        </w:rPr>
-        <w:t xml:space="preserve">Claude toplu istek (Batch)</w:t>
-      </w:r>
-      <w:r>
-        <w:t xml:space="preserve"> maliyeti yarıya indirir; sonuç genelde bir saat içinde gelir.</w:t>
-      </w:r>
-    </w:p>
-    <w:p>
-      <w:pPr>
-        <w:pStyle w:val="Heading2"/>
-      </w:pPr>
-      <w:bookmarkStart w:name="b62" w:id="62"/>
-      <w:r>
-        <w:t xml:space="preserve">8.5 Modele giden talimat</w:t>
-      </w:r>
-      <w:bookmarkEnd w:id="62"/>
-    </w:p>
-    <w:p>
-      <w:pPr>
-        <w:spacing w:after="120"/>
-      </w:pPr>
-      <w:r>
-        <w:t xml:space="preserve">Her ekran görüntüsü cihaza göre dilimlenir (masaüstü 1024×1024, mobil 375×1334 piksel, görüntü başına en fazla 3 dilim) ve her dilim modele ayrı sorulur. Modele, sitenin tanımını ve dilini içeren İngilizce bir talimat, dilimin cihaz ve konum bilgisi, görüntü ve cevabın uyması gereken JSON şeması gider. Model yalnızca gerçek bir ziyaretçinin fark edeceği görsel hataları, her biri için görünen metni kanıt olarak kopyalayarak raporlar; emin olmadığı şeyi yazmaz. Hata türleri: yatay taşma, üst üste binme, kesik metin, kırık görsel, hizasızlık, düşük kontrast, bozuk karakter, açıklanamayan boşluk, bozuk gezinme, eksik veri, diğer.</w:t>
-      </w:r>
-    </w:p>
-    <w:p>
-      <w:pPr>
-        <w:spacing w:after="120"/>
-      </w:pPr>
-      <w:r>
-        <w:t xml:space="preserve">Talimattaki site tanımı ve dil </w:t>
-      </w:r>
-      <w:r>
-        <w:rPr>
-          <w:b/>
-          <w:bCs/>
-        </w:rPr>
-        <w:t xml:space="preserve">Ayarlar &gt; Site profili &gt; Yapay zekâ talimatı</w:t>
-      </w:r>
-      <w:r>
-        <w:t xml:space="preserve">'ndan değiştirilir. Talimatın tam metni </w:t>
-      </w:r>
-      <w:r>
-        <w:rPr>
-          <w:rFonts w:ascii="Courier New" w:cs="Courier New" w:eastAsia="Courier New" w:hAnsi="Courier New"/>
-          <w:sz w:val="19"/>
-          <w:szCs w:val="19"/>
-        </w:rPr>
-        <w:t xml:space="preserve">tools/visual_audit/analiz.py</w:t>
-      </w:r>
-      <w:r>
-        <w:t xml:space="preserve"> dosyasındadır.</w:t>
-      </w:r>
-    </w:p>
-    <w:p>
-      <w:pPr>
-        <w:pStyle w:val="Heading1"/>
-        <w:pageBreakBefore/>
-      </w:pPr>
-      <w:bookmarkStart w:name="b63" w:id="63"/>
-      <w:r>
-        <w:t xml:space="preserve">9. Ayarlar başvurusu</w:t>
-      </w:r>
-      <w:bookmarkEnd w:id="63"/>
-    </w:p>
-    <w:p>
-      <w:pPr>
-        <w:keepNext/>
-        <w:spacing w:after="40" w:before="80"/>
-        <w:jc w:val="center"/>
-      </w:pPr>
-      <w:r>
-        <w:drawing>
-          <wp:inline distT="0" distB="0" distL="0" distR="0">
-            <wp:extent cx="5905500" cy="4029075"/>
-            <wp:effectExtent t="0" r="0" b="0" l="0"/>
-            <wp:docPr id="1" name="12_ayarlar_site.png" descr="Ayarlar: site profili" title="Ayarlar: site profili"/>
             <wp:cNvGraphicFramePr>
               <a:graphicFrameLocks xmlns:a="http://schemas.openxmlformats.org/drawingml/2006/main" noChangeAspect="1"/>
             </wp:cNvGraphicFramePr>
@@ -19926,6 +18584,1524 @@
           <w:szCs w:val="18"/>
         </w:rPr>
         <w:t xml:space="preserve">Şekil 16. </w:t>
+      </w:r>
+      <w:r>
+        <w:rPr>
+          <w:i/>
+          <w:iCs/>
+          <w:color w:val="595959"/>
+          <w:sz w:val="18"/>
+          <w:szCs w:val="18"/>
+        </w:rPr>
+        <w:t xml:space="preserve">Raporlar ve özet sayfası</w:t>
+      </w:r>
+    </w:p>
+    <w:p>
+      <w:pPr>
+        <w:pStyle w:val="Heading2"/>
+      </w:pPr>
+      <w:bookmarkStart w:name="b56" w:id="56"/>
+      <w:r>
+        <w:t xml:space="preserve">7.10 Teslim paketi</w:t>
+      </w:r>
+      <w:bookmarkEnd w:id="56"/>
+    </w:p>
+    <w:p>
+      <w:pPr>
+        <w:spacing w:after="120"/>
+      </w:pPr>
+      <w:r>
+        <w:rPr>
+          <w:rFonts w:ascii="Courier New" w:cs="Courier New" w:eastAsia="Courier New" w:hAnsi="Courier New"/>
+          <w:sz w:val="19"/>
+          <w:szCs w:val="19"/>
+        </w:rPr>
+        <w:t xml:space="preserve">TESLIM/</w:t>
+      </w:r>
+      <w:r>
+        <w:t xml:space="preserve"> klasöründe </w:t>
+      </w:r>
+      <w:r>
+        <w:rPr>
+          <w:rFonts w:ascii="Courier New" w:cs="Courier New" w:eastAsia="Courier New" w:hAnsi="Courier New"/>
+          <w:sz w:val="19"/>
+          <w:szCs w:val="19"/>
+        </w:rPr>
+        <w:t xml:space="preserve">raporlar/</w:t>
+      </w:r>
+      <w:r>
+        <w:t xml:space="preserve"> (HTML raporlar, CSS önerisi, son görsel denetim raporu, önce/sonra görüntüleri) ve </w:t>
+      </w:r>
+      <w:r>
+        <w:rPr>
+          <w:rFonts w:ascii="Courier New" w:cs="Courier New" w:eastAsia="Courier New" w:hAnsi="Courier New"/>
+          <w:sz w:val="19"/>
+          <w:szCs w:val="19"/>
+        </w:rPr>
+        <w:t xml:space="preserve">veri/</w:t>
+      </w:r>
+      <w:r>
+        <w:t xml:space="preserve"> (bütün CSV/XLSX/JSON çıktılar) bulunur; </w:t>
+      </w:r>
+      <w:r>
+        <w:rPr>
+          <w:rFonts w:ascii="Courier New" w:cs="Courier New" w:eastAsia="Courier New" w:hAnsi="Courier New"/>
+          <w:sz w:val="19"/>
+          <w:szCs w:val="19"/>
+        </w:rPr>
+        <w:t xml:space="preserve">index.html</w:t>
+      </w:r>
+      <w:r>
+        <w:t xml:space="preserve"> bunların açıklamalı listesidir. Ekran görüntüleri büyük olduğu için pakete kopyalanmaz; gerekirse </w:t>
+      </w:r>
+      <w:r>
+        <w:rPr>
+          <w:rFonts w:ascii="Courier New" w:cs="Courier New" w:eastAsia="Courier New" w:hAnsi="Courier New"/>
+          <w:sz w:val="19"/>
+          <w:szCs w:val="19"/>
+        </w:rPr>
+        <w:t xml:space="preserve">test_output/screenshots/</w:t>
+      </w:r>
+      <w:r>
+        <w:t xml:space="preserve"> ayrıca ZIP'lenir.</w:t>
+      </w:r>
+    </w:p>
+    <w:p>
+      <w:pPr>
+        <w:pStyle w:val="Heading1"/>
+        <w:pageBreakBefore/>
+      </w:pPr>
+      <w:bookmarkStart w:name="b57" w:id="57"/>
+      <w:r>
+        <w:t xml:space="preserve">8. Yapay zekâ ayarları</w:t>
+      </w:r>
+      <w:bookmarkEnd w:id="57"/>
+    </w:p>
+    <w:p>
+      <w:pPr>
+        <w:pStyle w:val="Heading2"/>
+      </w:pPr>
+      <w:bookmarkStart w:name="b58" w:id="58"/>
+      <w:r>
+        <w:t xml:space="preserve">8.1 Sağlayıcılar ve model yazımı</w:t>
+      </w:r>
+      <w:bookmarkEnd w:id="58"/>
+    </w:p>
+    <w:p>
+      <w:pPr>
+        <w:keepNext/>
+        <w:spacing w:after="40" w:before="80"/>
+        <w:jc w:val="center"/>
+      </w:pPr>
+      <w:r>
+        <w:drawing>
+          <wp:inline distT="0" distB="0" distL="0" distR="0">
+            <wp:extent cx="5905500" cy="4029075"/>
+            <wp:effectExtent t="0" r="0" b="0" l="0"/>
+            <wp:docPr id="1" name="13_ayarlar_genel.png" descr="Ayarlar: yapay zekâ sağlayıcıları ve modeller" title="Ayarlar: yapay zekâ sağlayıcıları ve modeller"/>
+            <wp:cNvGraphicFramePr>
+              <a:graphicFrameLocks xmlns:a="http://schemas.openxmlformats.org/drawingml/2006/main" noChangeAspect="1"/>
+            </wp:cNvGraphicFramePr>
+            <a:graphic xmlns:a="http://schemas.openxmlformats.org/drawingml/2006/main">
+              <a:graphicData uri="http://schemas.openxmlformats.org/drawingml/2006/picture">
+                <pic:pic xmlns:pic="http://schemas.openxmlformats.org/drawingml/2006/picture">
+                  <pic:nvPicPr>
+                    <pic:cNvPr id="0" name="" descr=""/>
+                    <pic:cNvPicPr>
+                      <a:picLocks noChangeAspect="1" noChangeArrowheads="1"/>
+                    </pic:cNvPicPr>
+                  </pic:nvPicPr>
+                  <pic:blipFill>
+                    <a:blip r:embed="rId25" cstate="none"/>
+                    <a:srcRect/>
+                    <a:stretch>
+                      <a:fillRect/>
+                    </a:stretch>
+                  </pic:blipFill>
+                  <pic:spPr bwMode="auto">
+                    <a:xfrm>
+                      <a:off x="0" y="0"/>
+                      <a:ext cx="5905500" cy="4029075"/>
+                    </a:xfrm>
+                    <a:prstGeom prst="rect">
+                      <a:avLst/>
+                    </a:prstGeom>
+                  </pic:spPr>
+                </pic:pic>
+              </a:graphicData>
+            </a:graphic>
+          </wp:inline>
+        </w:drawing>
+      </w:r>
+    </w:p>
+    <w:p>
+      <w:pPr>
+        <w:spacing w:after="200"/>
+        <w:jc w:val="center"/>
+      </w:pPr>
+      <w:r>
+        <w:rPr>
+          <w:b/>
+          <w:bCs/>
+          <w:color w:val="595959"/>
+          <w:sz w:val="18"/>
+          <w:szCs w:val="18"/>
+        </w:rPr>
+        <w:t xml:space="preserve">Şekil 17. </w:t>
+      </w:r>
+      <w:r>
+        <w:rPr>
+          <w:i/>
+          <w:iCs/>
+          <w:color w:val="595959"/>
+          <w:sz w:val="18"/>
+          <w:szCs w:val="18"/>
+        </w:rPr>
+        <w:t xml:space="preserve">Ayarlar: yapay zekâ sağlayıcıları ve modeller</w:t>
+      </w:r>
+    </w:p>
+    <w:p>
+      <w:pPr>
+        <w:spacing w:after="120"/>
+      </w:pPr>
+      <w:r>
+        <w:t xml:space="preserve">Ayarlar &gt; </w:t>
+      </w:r>
+      <w:r>
+        <w:rPr>
+          <w:b/>
+          <w:bCs/>
+        </w:rPr>
+        <w:t xml:space="preserve">Yapay zekâ, Bologna, genel</w:t>
+      </w:r>
+      <w:r>
+        <w:t xml:space="preserve"> sekmesinde her sağlayıcının anahtarı, adresi ve varsayılan modeli girilir. </w:t>
+      </w:r>
+      <w:r>
+        <w:rPr>
+          <w:b/>
+          <w:bCs/>
+        </w:rPr>
+        <w:t xml:space="preserve">Tarayan modeller</w:t>
+      </w:r>
+      <w:r>
+        <w:t xml:space="preserve"> (virgülle birden fazla) ve </w:t>
+      </w:r>
+      <w:r>
+        <w:rPr>
+          <w:b/>
+          <w:bCs/>
+        </w:rPr>
+        <w:t xml:space="preserve">Hakem modeli</w:t>
+      </w:r>
+      <w:r>
+        <w:t xml:space="preserve"> alanları şu yazımları kabul eder:</w:t>
+      </w:r>
+    </w:p>
+    <w:tbl>
+      <w:tblPr>
+        <w:tblW w:type="dxa" w:w="9638"/>
+        <w:tblBorders>
+          <w:top w:val="single" w:color="auto" w:sz="4"/>
+          <w:left w:val="single" w:color="auto" w:sz="4"/>
+          <w:bottom w:val="single" w:color="auto" w:sz="4"/>
+          <w:right w:val="single" w:color="auto" w:sz="4"/>
+          <w:insideH w:val="single" w:color="auto" w:sz="4"/>
+          <w:insideV w:val="single" w:color="auto" w:sz="4"/>
+        </w:tblBorders>
+        <w:tblLayout w:type="fixed"/>
+      </w:tblPr>
+      <w:tblGrid>
+        <w:gridCol w:w="2570"/>
+        <w:gridCol w:w="3855"/>
+        <w:gridCol w:w="3213"/>
+      </w:tblGrid>
+      <w:tr>
+        <w:trPr>
+          <w:cantSplit/>
+          <w:tblHeader/>
+        </w:trPr>
+        <w:tc>
+          <w:tcPr>
+            <w:tcW w:type="dxa" w:w="2570"/>
+            <w:tcBorders>
+              <w:top w:val="single" w:color="BFBFBF" w:sz="4"/>
+              <w:left w:val="single" w:color="BFBFBF" w:sz="4"/>
+              <w:bottom w:val="single" w:color="BFBFBF" w:sz="4"/>
+              <w:right w:val="single" w:color="BFBFBF" w:sz="4"/>
+            </w:tcBorders>
+            <w:shd w:fill="1F4E79" w:color="auto" w:val="clear"/>
+            <w:tcMar>
+              <w:top w:type="dxa" w:w="60"/>
+              <w:left w:type="dxa" w:w="100"/>
+              <w:bottom w:type="dxa" w:w="60"/>
+              <w:right w:type="dxa" w:w="100"/>
+            </w:tcMar>
+          </w:tcPr>
+          <w:p>
+            <w:pPr>
+              <w:spacing w:after="20"/>
+            </w:pPr>
+            <w:r>
+              <w:rPr>
+                <w:b/>
+                <w:bCs/>
+                <w:color w:val="FFFFFF"/>
+                <w:sz w:val="19"/>
+                <w:szCs w:val="19"/>
+              </w:rPr>
+              <w:t xml:space="preserve">Yazım</w:t>
+            </w:r>
+          </w:p>
+        </w:tc>
+        <w:tc>
+          <w:tcPr>
+            <w:tcW w:type="dxa" w:w="3855"/>
+            <w:tcBorders>
+              <w:top w:val="single" w:color="BFBFBF" w:sz="4"/>
+              <w:left w:val="single" w:color="BFBFBF" w:sz="4"/>
+              <w:bottom w:val="single" w:color="BFBFBF" w:sz="4"/>
+              <w:right w:val="single" w:color="BFBFBF" w:sz="4"/>
+            </w:tcBorders>
+            <w:shd w:fill="1F4E79" w:color="auto" w:val="clear"/>
+            <w:tcMar>
+              <w:top w:type="dxa" w:w="60"/>
+              <w:left w:type="dxa" w:w="100"/>
+              <w:bottom w:type="dxa" w:w="60"/>
+              <w:right w:type="dxa" w:w="100"/>
+            </w:tcMar>
+          </w:tcPr>
+          <w:p>
+            <w:pPr>
+              <w:spacing w:after="20"/>
+            </w:pPr>
+            <w:r>
+              <w:rPr>
+                <w:b/>
+                <w:bCs/>
+                <w:color w:val="FFFFFF"/>
+                <w:sz w:val="19"/>
+                <w:szCs w:val="19"/>
+              </w:rPr>
+              <w:t xml:space="preserve">Sağlayıcı</w:t>
+            </w:r>
+          </w:p>
+        </w:tc>
+        <w:tc>
+          <w:tcPr>
+            <w:tcW w:type="dxa" w:w="3213"/>
+            <w:tcBorders>
+              <w:top w:val="single" w:color="BFBFBF" w:sz="4"/>
+              <w:left w:val="single" w:color="BFBFBF" w:sz="4"/>
+              <w:bottom w:val="single" w:color="BFBFBF" w:sz="4"/>
+              <w:right w:val="single" w:color="BFBFBF" w:sz="4"/>
+            </w:tcBorders>
+            <w:shd w:fill="1F4E79" w:color="auto" w:val="clear"/>
+            <w:tcMar>
+              <w:top w:type="dxa" w:w="60"/>
+              <w:left w:type="dxa" w:w="100"/>
+              <w:bottom w:type="dxa" w:w="60"/>
+              <w:right w:type="dxa" w:w="100"/>
+            </w:tcMar>
+          </w:tcPr>
+          <w:p>
+            <w:pPr>
+              <w:spacing w:after="20"/>
+            </w:pPr>
+            <w:r>
+              <w:rPr>
+                <w:b/>
+                <w:bCs/>
+                <w:color w:val="FFFFFF"/>
+                <w:sz w:val="19"/>
+                <w:szCs w:val="19"/>
+              </w:rPr>
+              <w:t xml:space="preserve">Gerekenler</w:t>
+            </w:r>
+          </w:p>
+        </w:tc>
+      </w:tr>
+      <w:tr>
+        <w:trPr>
+          <w:cantSplit/>
+        </w:trPr>
+        <w:tc>
+          <w:tcPr>
+            <w:tcW w:type="dxa" w:w="2570"/>
+            <w:tcBorders>
+              <w:top w:val="single" w:color="BFBFBF" w:sz="4"/>
+              <w:left w:val="single" w:color="BFBFBF" w:sz="4"/>
+              <w:bottom w:val="single" w:color="BFBFBF" w:sz="4"/>
+              <w:right w:val="single" w:color="BFBFBF" w:sz="4"/>
+            </w:tcBorders>
+            <w:tcMar>
+              <w:top w:type="dxa" w:w="60"/>
+              <w:left w:type="dxa" w:w="100"/>
+              <w:bottom w:type="dxa" w:w="60"/>
+              <w:right w:type="dxa" w:w="100"/>
+            </w:tcMar>
+          </w:tcPr>
+          <w:p>
+            <w:pPr>
+              <w:spacing w:after="20"/>
+            </w:pPr>
+            <w:r>
+              <w:rPr>
+                <w:rFonts w:ascii="Courier New" w:cs="Courier New" w:eastAsia="Courier New" w:hAnsi="Courier New"/>
+                <w:sz w:val="19"/>
+                <w:szCs w:val="19"/>
+              </w:rPr>
+              <w:t xml:space="preserve">claude</w:t>
+            </w:r>
+            <w:r>
+              <w:rPr>
+                <w:sz w:val="19"/>
+                <w:szCs w:val="19"/>
+              </w:rPr>
+              <w:t xml:space="preserve"> veya </w:t>
+            </w:r>
+            <w:r>
+              <w:rPr>
+                <w:rFonts w:ascii="Courier New" w:cs="Courier New" w:eastAsia="Courier New" w:hAnsi="Courier New"/>
+                <w:sz w:val="19"/>
+                <w:szCs w:val="19"/>
+              </w:rPr>
+              <w:t xml:space="preserve">claude:&lt;model&gt;</w:t>
+            </w:r>
+          </w:p>
+        </w:tc>
+        <w:tc>
+          <w:tcPr>
+            <w:tcW w:type="dxa" w:w="3855"/>
+            <w:tcBorders>
+              <w:top w:val="single" w:color="BFBFBF" w:sz="4"/>
+              <w:left w:val="single" w:color="BFBFBF" w:sz="4"/>
+              <w:bottom w:val="single" w:color="BFBFBF" w:sz="4"/>
+              <w:right w:val="single" w:color="BFBFBF" w:sz="4"/>
+            </w:tcBorders>
+            <w:tcMar>
+              <w:top w:type="dxa" w:w="60"/>
+              <w:left w:type="dxa" w:w="100"/>
+              <w:bottom w:type="dxa" w:w="60"/>
+              <w:right w:type="dxa" w:w="100"/>
+            </w:tcMar>
+          </w:tcPr>
+          <w:p>
+            <w:pPr>
+              <w:spacing w:after="20"/>
+            </w:pPr>
+            <w:r>
+              <w:rPr>
+                <w:sz w:val="19"/>
+                <w:szCs w:val="19"/>
+              </w:rPr>
+              <w:t xml:space="preserve">Anthropic</w:t>
+            </w:r>
+          </w:p>
+        </w:tc>
+        <w:tc>
+          <w:tcPr>
+            <w:tcW w:type="dxa" w:w="3213"/>
+            <w:tcBorders>
+              <w:top w:val="single" w:color="BFBFBF" w:sz="4"/>
+              <w:left w:val="single" w:color="BFBFBF" w:sz="4"/>
+              <w:bottom w:val="single" w:color="BFBFBF" w:sz="4"/>
+              <w:right w:val="single" w:color="BFBFBF" w:sz="4"/>
+            </w:tcBorders>
+            <w:tcMar>
+              <w:top w:type="dxa" w:w="60"/>
+              <w:left w:type="dxa" w:w="100"/>
+              <w:bottom w:type="dxa" w:w="60"/>
+              <w:right w:type="dxa" w:w="100"/>
+            </w:tcMar>
+          </w:tcPr>
+          <w:p>
+            <w:pPr>
+              <w:spacing w:after="20"/>
+            </w:pPr>
+            <w:r>
+              <w:rPr>
+                <w:sz w:val="19"/>
+                <w:szCs w:val="19"/>
+              </w:rPr>
+              <w:t xml:space="preserve">Anthropic API anahtarı</w:t>
+            </w:r>
+          </w:p>
+        </w:tc>
+      </w:tr>
+      <w:tr>
+        <w:trPr>
+          <w:cantSplit/>
+        </w:trPr>
+        <w:tc>
+          <w:tcPr>
+            <w:tcW w:type="dxa" w:w="2570"/>
+            <w:tcBorders>
+              <w:top w:val="single" w:color="BFBFBF" w:sz="4"/>
+              <w:left w:val="single" w:color="BFBFBF" w:sz="4"/>
+              <w:bottom w:val="single" w:color="BFBFBF" w:sz="4"/>
+              <w:right w:val="single" w:color="BFBFBF" w:sz="4"/>
+            </w:tcBorders>
+            <w:tcMar>
+              <w:top w:type="dxa" w:w="60"/>
+              <w:left w:type="dxa" w:w="100"/>
+              <w:bottom w:type="dxa" w:w="60"/>
+              <w:right w:type="dxa" w:w="100"/>
+            </w:tcMar>
+          </w:tcPr>
+          <w:p>
+            <w:pPr>
+              <w:spacing w:after="20"/>
+            </w:pPr>
+            <w:r>
+              <w:rPr>
+                <w:rFonts w:ascii="Courier New" w:cs="Courier New" w:eastAsia="Courier New" w:hAnsi="Courier New"/>
+                <w:sz w:val="19"/>
+                <w:szCs w:val="19"/>
+              </w:rPr>
+              <w:t xml:space="preserve">gemini</w:t>
+            </w:r>
+            <w:r>
+              <w:rPr>
+                <w:sz w:val="19"/>
+                <w:szCs w:val="19"/>
+              </w:rPr>
+              <w:t xml:space="preserve"> veya </w:t>
+            </w:r>
+            <w:r>
+              <w:rPr>
+                <w:rFonts w:ascii="Courier New" w:cs="Courier New" w:eastAsia="Courier New" w:hAnsi="Courier New"/>
+                <w:sz w:val="19"/>
+                <w:szCs w:val="19"/>
+              </w:rPr>
+              <w:t xml:space="preserve">gemini:&lt;model&gt;</w:t>
+            </w:r>
+          </w:p>
+        </w:tc>
+        <w:tc>
+          <w:tcPr>
+            <w:tcW w:type="dxa" w:w="3855"/>
+            <w:tcBorders>
+              <w:top w:val="single" w:color="BFBFBF" w:sz="4"/>
+              <w:left w:val="single" w:color="BFBFBF" w:sz="4"/>
+              <w:bottom w:val="single" w:color="BFBFBF" w:sz="4"/>
+              <w:right w:val="single" w:color="BFBFBF" w:sz="4"/>
+            </w:tcBorders>
+            <w:tcMar>
+              <w:top w:type="dxa" w:w="60"/>
+              <w:left w:type="dxa" w:w="100"/>
+              <w:bottom w:type="dxa" w:w="60"/>
+              <w:right w:type="dxa" w:w="100"/>
+            </w:tcMar>
+          </w:tcPr>
+          <w:p>
+            <w:pPr>
+              <w:spacing w:after="20"/>
+            </w:pPr>
+            <w:r>
+              <w:rPr>
+                <w:sz w:val="19"/>
+                <w:szCs w:val="19"/>
+              </w:rPr>
+              <w:t xml:space="preserve">Google Gemini / Gemma</w:t>
+            </w:r>
+          </w:p>
+        </w:tc>
+        <w:tc>
+          <w:tcPr>
+            <w:tcW w:type="dxa" w:w="3213"/>
+            <w:tcBorders>
+              <w:top w:val="single" w:color="BFBFBF" w:sz="4"/>
+              <w:left w:val="single" w:color="BFBFBF" w:sz="4"/>
+              <w:bottom w:val="single" w:color="BFBFBF" w:sz="4"/>
+              <w:right w:val="single" w:color="BFBFBF" w:sz="4"/>
+            </w:tcBorders>
+            <w:tcMar>
+              <w:top w:type="dxa" w:w="60"/>
+              <w:left w:type="dxa" w:w="100"/>
+              <w:bottom w:type="dxa" w:w="60"/>
+              <w:right w:type="dxa" w:w="100"/>
+            </w:tcMar>
+          </w:tcPr>
+          <w:p>
+            <w:pPr>
+              <w:spacing w:after="20"/>
+            </w:pPr>
+            <w:r>
+              <w:rPr>
+                <w:sz w:val="19"/>
+                <w:szCs w:val="19"/>
+              </w:rPr>
+              <w:t xml:space="preserve">Gemini API anahtarı (ücretsiz katman yeterli)</w:t>
+            </w:r>
+          </w:p>
+        </w:tc>
+      </w:tr>
+      <w:tr>
+        <w:trPr>
+          <w:cantSplit/>
+        </w:trPr>
+        <w:tc>
+          <w:tcPr>
+            <w:tcW w:type="dxa" w:w="2570"/>
+            <w:tcBorders>
+              <w:top w:val="single" w:color="BFBFBF" w:sz="4"/>
+              <w:left w:val="single" w:color="BFBFBF" w:sz="4"/>
+              <w:bottom w:val="single" w:color="BFBFBF" w:sz="4"/>
+              <w:right w:val="single" w:color="BFBFBF" w:sz="4"/>
+            </w:tcBorders>
+            <w:tcMar>
+              <w:top w:type="dxa" w:w="60"/>
+              <w:left w:type="dxa" w:w="100"/>
+              <w:bottom w:type="dxa" w:w="60"/>
+              <w:right w:type="dxa" w:w="100"/>
+            </w:tcMar>
+          </w:tcPr>
+          <w:p>
+            <w:pPr>
+              <w:spacing w:after="20"/>
+            </w:pPr>
+            <w:r>
+              <w:rPr>
+                <w:rFonts w:ascii="Courier New" w:cs="Courier New" w:eastAsia="Courier New" w:hAnsi="Courier New"/>
+                <w:sz w:val="19"/>
+                <w:szCs w:val="19"/>
+              </w:rPr>
+              <w:t xml:space="preserve">openai:&lt;model&gt;</w:t>
+            </w:r>
+          </w:p>
+        </w:tc>
+        <w:tc>
+          <w:tcPr>
+            <w:tcW w:type="dxa" w:w="3855"/>
+            <w:tcBorders>
+              <w:top w:val="single" w:color="BFBFBF" w:sz="4"/>
+              <w:left w:val="single" w:color="BFBFBF" w:sz="4"/>
+              <w:bottom w:val="single" w:color="BFBFBF" w:sz="4"/>
+              <w:right w:val="single" w:color="BFBFBF" w:sz="4"/>
+            </w:tcBorders>
+            <w:tcMar>
+              <w:top w:type="dxa" w:w="60"/>
+              <w:left w:type="dxa" w:w="100"/>
+              <w:bottom w:type="dxa" w:w="60"/>
+              <w:right w:type="dxa" w:w="100"/>
+            </w:tcMar>
+          </w:tcPr>
+          <w:p>
+            <w:pPr>
+              <w:spacing w:after="20"/>
+            </w:pPr>
+            <w:r>
+              <w:rPr>
+                <w:sz w:val="19"/>
+                <w:szCs w:val="19"/>
+              </w:rPr>
+              <w:t xml:space="preserve">OpenAI uyumlu her servis: OpenAI, OpenRouter, Groq, Mistral, Together, LM Studio, vLLM, Ollama'nın OpenAI ucu</w:t>
+            </w:r>
+          </w:p>
+        </w:tc>
+        <w:tc>
+          <w:tcPr>
+            <w:tcW w:type="dxa" w:w="3213"/>
+            <w:tcBorders>
+              <w:top w:val="single" w:color="BFBFBF" w:sz="4"/>
+              <w:left w:val="single" w:color="BFBFBF" w:sz="4"/>
+              <w:bottom w:val="single" w:color="BFBFBF" w:sz="4"/>
+              <w:right w:val="single" w:color="BFBFBF" w:sz="4"/>
+            </w:tcBorders>
+            <w:tcMar>
+              <w:top w:type="dxa" w:w="60"/>
+              <w:left w:type="dxa" w:w="100"/>
+              <w:bottom w:type="dxa" w:w="60"/>
+              <w:right w:type="dxa" w:w="100"/>
+            </w:tcMar>
+          </w:tcPr>
+          <w:p>
+            <w:pPr>
+              <w:spacing w:after="20"/>
+            </w:pPr>
+            <w:r>
+              <w:rPr>
+                <w:sz w:val="19"/>
+                <w:szCs w:val="19"/>
+              </w:rPr>
+              <w:t xml:space="preserve">Adres (listeden seçilir) ve gerekirse anahtar</w:t>
+            </w:r>
+          </w:p>
+        </w:tc>
+      </w:tr>
+      <w:tr>
+        <w:trPr>
+          <w:cantSplit/>
+        </w:trPr>
+        <w:tc>
+          <w:tcPr>
+            <w:tcW w:type="dxa" w:w="2570"/>
+            <w:tcBorders>
+              <w:top w:val="single" w:color="BFBFBF" w:sz="4"/>
+              <w:left w:val="single" w:color="BFBFBF" w:sz="4"/>
+              <w:bottom w:val="single" w:color="BFBFBF" w:sz="4"/>
+              <w:right w:val="single" w:color="BFBFBF" w:sz="4"/>
+            </w:tcBorders>
+            <w:tcMar>
+              <w:top w:type="dxa" w:w="60"/>
+              <w:left w:type="dxa" w:w="100"/>
+              <w:bottom w:type="dxa" w:w="60"/>
+              <w:right w:type="dxa" w:w="100"/>
+            </w:tcMar>
+          </w:tcPr>
+          <w:p>
+            <w:pPr>
+              <w:spacing w:after="20"/>
+            </w:pPr>
+            <w:r>
+              <w:rPr>
+                <w:rFonts w:ascii="Courier New" w:cs="Courier New" w:eastAsia="Courier New" w:hAnsi="Courier New"/>
+                <w:sz w:val="19"/>
+                <w:szCs w:val="19"/>
+              </w:rPr>
+              <w:t xml:space="preserve">ollama:&lt;model&gt;</w:t>
+            </w:r>
+          </w:p>
+        </w:tc>
+        <w:tc>
+          <w:tcPr>
+            <w:tcW w:type="dxa" w:w="3855"/>
+            <w:tcBorders>
+              <w:top w:val="single" w:color="BFBFBF" w:sz="4"/>
+              <w:left w:val="single" w:color="BFBFBF" w:sz="4"/>
+              <w:bottom w:val="single" w:color="BFBFBF" w:sz="4"/>
+              <w:right w:val="single" w:color="BFBFBF" w:sz="4"/>
+            </w:tcBorders>
+            <w:tcMar>
+              <w:top w:type="dxa" w:w="60"/>
+              <w:left w:type="dxa" w:w="100"/>
+              <w:bottom w:type="dxa" w:w="60"/>
+              <w:right w:type="dxa" w:w="100"/>
+            </w:tcMar>
+          </w:tcPr>
+          <w:p>
+            <w:pPr>
+              <w:spacing w:after="20"/>
+            </w:pPr>
+            <w:r>
+              <w:rPr>
+                <w:sz w:val="19"/>
+                <w:szCs w:val="19"/>
+              </w:rPr>
+              <w:t xml:space="preserve">Yerel Ollama</w:t>
+            </w:r>
+          </w:p>
+        </w:tc>
+        <w:tc>
+          <w:tcPr>
+            <w:tcW w:type="dxa" w:w="3213"/>
+            <w:tcBorders>
+              <w:top w:val="single" w:color="BFBFBF" w:sz="4"/>
+              <w:left w:val="single" w:color="BFBFBF" w:sz="4"/>
+              <w:bottom w:val="single" w:color="BFBFBF" w:sz="4"/>
+              <w:right w:val="single" w:color="BFBFBF" w:sz="4"/>
+            </w:tcBorders>
+            <w:tcMar>
+              <w:top w:type="dxa" w:w="60"/>
+              <w:left w:type="dxa" w:w="100"/>
+              <w:bottom w:type="dxa" w:w="60"/>
+              <w:right w:type="dxa" w:w="100"/>
+            </w:tcMar>
+          </w:tcPr>
+          <w:p>
+            <w:pPr>
+              <w:spacing w:after="20"/>
+            </w:pPr>
+            <w:r>
+              <w:rPr>
+                <w:sz w:val="19"/>
+                <w:szCs w:val="19"/>
+              </w:rPr>
+              <w:t xml:space="preserve">Ollama kurulu ve model indirilmiş olmalı (</w:t>
+            </w:r>
+            <w:r>
+              <w:rPr>
+                <w:rFonts w:ascii="Courier New" w:cs="Courier New" w:eastAsia="Courier New" w:hAnsi="Courier New"/>
+                <w:sz w:val="19"/>
+                <w:szCs w:val="19"/>
+              </w:rPr>
+              <w:t xml:space="preserve">ollama pull &lt;model&gt;</w:t>
+            </w:r>
+            <w:r>
+              <w:rPr>
+                <w:sz w:val="19"/>
+                <w:szCs w:val="19"/>
+              </w:rPr>
+              <w:t xml:space="preserve">)</w:t>
+            </w:r>
+          </w:p>
+        </w:tc>
+      </w:tr>
+    </w:tbl>
+    <w:p>
+      <w:pPr>
+        <w:spacing w:after="100"/>
+      </w:pPr>
+    </w:p>
+    <w:p>
+      <w:pPr>
+        <w:spacing w:after="120"/>
+      </w:pPr>
+      <w:r>
+        <w:rPr>
+          <w:b/>
+          <w:bCs/>
+        </w:rPr>
+        <w:t xml:space="preserve">Hazırlık &gt; Yapay zekâ sağlayıcılarını dene</w:t>
+      </w:r>
+      <w:r>
+        <w:t xml:space="preserve"> her sağlayıcıya bağlanır, kullanılabilir modelleri listeler ve ayarlardaki model adının listede olup olmadığını söyler. Yeni bir servis için kod değişikliği gerekmez.</w:t>
+      </w:r>
+    </w:p>
+    <w:p>
+      <w:pPr>
+        <w:pStyle w:val="Heading2"/>
+      </w:pPr>
+      <w:bookmarkStart w:name="b59" w:id="59"/>
+      <w:r>
+        <w:t xml:space="preserve">8.2 Varsayılan modeller</w:t>
+      </w:r>
+      <w:bookmarkEnd w:id="59"/>
+    </w:p>
+    <w:tbl>
+      <w:tblPr>
+        <w:tblW w:type="dxa" w:w="9638"/>
+        <w:tblBorders>
+          <w:top w:val="single" w:color="auto" w:sz="4"/>
+          <w:left w:val="single" w:color="auto" w:sz="4"/>
+          <w:bottom w:val="single" w:color="auto" w:sz="4"/>
+          <w:right w:val="single" w:color="auto" w:sz="4"/>
+          <w:insideH w:val="single" w:color="auto" w:sz="4"/>
+          <w:insideV w:val="single" w:color="auto" w:sz="4"/>
+        </w:tblBorders>
+        <w:tblLayout w:type="fixed"/>
+      </w:tblPr>
+      <w:tblGrid>
+        <w:gridCol w:w="1633"/>
+        <w:gridCol w:w="3103"/>
+        <w:gridCol w:w="4902"/>
+      </w:tblGrid>
+      <w:tr>
+        <w:trPr>
+          <w:cantSplit/>
+          <w:tblHeader/>
+        </w:trPr>
+        <w:tc>
+          <w:tcPr>
+            <w:tcW w:type="dxa" w:w="1633"/>
+            <w:tcBorders>
+              <w:top w:val="single" w:color="BFBFBF" w:sz="4"/>
+              <w:left w:val="single" w:color="BFBFBF" w:sz="4"/>
+              <w:bottom w:val="single" w:color="BFBFBF" w:sz="4"/>
+              <w:right w:val="single" w:color="BFBFBF" w:sz="4"/>
+            </w:tcBorders>
+            <w:shd w:fill="1F4E79" w:color="auto" w:val="clear"/>
+            <w:tcMar>
+              <w:top w:type="dxa" w:w="60"/>
+              <w:left w:type="dxa" w:w="100"/>
+              <w:bottom w:type="dxa" w:w="60"/>
+              <w:right w:type="dxa" w:w="100"/>
+            </w:tcMar>
+          </w:tcPr>
+          <w:p>
+            <w:pPr>
+              <w:spacing w:after="20"/>
+            </w:pPr>
+            <w:r>
+              <w:rPr>
+                <w:b/>
+                <w:bCs/>
+                <w:color w:val="FFFFFF"/>
+                <w:sz w:val="19"/>
+                <w:szCs w:val="19"/>
+              </w:rPr>
+              <w:t xml:space="preserve">Görev</w:t>
+            </w:r>
+          </w:p>
+        </w:tc>
+        <w:tc>
+          <w:tcPr>
+            <w:tcW w:type="dxa" w:w="3103"/>
+            <w:tcBorders>
+              <w:top w:val="single" w:color="BFBFBF" w:sz="4"/>
+              <w:left w:val="single" w:color="BFBFBF" w:sz="4"/>
+              <w:bottom w:val="single" w:color="BFBFBF" w:sz="4"/>
+              <w:right w:val="single" w:color="BFBFBF" w:sz="4"/>
+            </w:tcBorders>
+            <w:shd w:fill="1F4E79" w:color="auto" w:val="clear"/>
+            <w:tcMar>
+              <w:top w:type="dxa" w:w="60"/>
+              <w:left w:type="dxa" w:w="100"/>
+              <w:bottom w:type="dxa" w:w="60"/>
+              <w:right w:type="dxa" w:w="100"/>
+            </w:tcMar>
+          </w:tcPr>
+          <w:p>
+            <w:pPr>
+              <w:spacing w:after="20"/>
+            </w:pPr>
+            <w:r>
+              <w:rPr>
+                <w:b/>
+                <w:bCs/>
+                <w:color w:val="FFFFFF"/>
+                <w:sz w:val="19"/>
+                <w:szCs w:val="19"/>
+              </w:rPr>
+              <w:t xml:space="preserve">Model</w:t>
+            </w:r>
+          </w:p>
+        </w:tc>
+        <w:tc>
+          <w:tcPr>
+            <w:tcW w:type="dxa" w:w="4902"/>
+            <w:tcBorders>
+              <w:top w:val="single" w:color="BFBFBF" w:sz="4"/>
+              <w:left w:val="single" w:color="BFBFBF" w:sz="4"/>
+              <w:bottom w:val="single" w:color="BFBFBF" w:sz="4"/>
+              <w:right w:val="single" w:color="BFBFBF" w:sz="4"/>
+            </w:tcBorders>
+            <w:shd w:fill="1F4E79" w:color="auto" w:val="clear"/>
+            <w:tcMar>
+              <w:top w:type="dxa" w:w="60"/>
+              <w:left w:type="dxa" w:w="100"/>
+              <w:bottom w:type="dxa" w:w="60"/>
+              <w:right w:type="dxa" w:w="100"/>
+            </w:tcMar>
+          </w:tcPr>
+          <w:p>
+            <w:pPr>
+              <w:spacing w:after="20"/>
+            </w:pPr>
+            <w:r>
+              <w:rPr>
+                <w:b/>
+                <w:bCs/>
+                <w:color w:val="FFFFFF"/>
+                <w:sz w:val="19"/>
+                <w:szCs w:val="19"/>
+              </w:rPr>
+              <w:t xml:space="preserve">Not</w:t>
+            </w:r>
+          </w:p>
+        </w:tc>
+      </w:tr>
+      <w:tr>
+        <w:trPr>
+          <w:cantSplit/>
+        </w:trPr>
+        <w:tc>
+          <w:tcPr>
+            <w:tcW w:type="dxa" w:w="1633"/>
+            <w:tcBorders>
+              <w:top w:val="single" w:color="BFBFBF" w:sz="4"/>
+              <w:left w:val="single" w:color="BFBFBF" w:sz="4"/>
+              <w:bottom w:val="single" w:color="BFBFBF" w:sz="4"/>
+              <w:right w:val="single" w:color="BFBFBF" w:sz="4"/>
+            </w:tcBorders>
+            <w:tcMar>
+              <w:top w:type="dxa" w:w="60"/>
+              <w:left w:type="dxa" w:w="100"/>
+              <w:bottom w:type="dxa" w:w="60"/>
+              <w:right w:type="dxa" w:w="100"/>
+            </w:tcMar>
+          </w:tcPr>
+          <w:p>
+            <w:pPr>
+              <w:spacing w:after="20"/>
+            </w:pPr>
+            <w:r>
+              <w:rPr>
+                <w:sz w:val="19"/>
+                <w:szCs w:val="19"/>
+              </w:rPr>
+              <w:t xml:space="preserve">Ana tarama</w:t>
+            </w:r>
+          </w:p>
+        </w:tc>
+        <w:tc>
+          <w:tcPr>
+            <w:tcW w:type="dxa" w:w="3103"/>
+            <w:tcBorders>
+              <w:top w:val="single" w:color="BFBFBF" w:sz="4"/>
+              <w:left w:val="single" w:color="BFBFBF" w:sz="4"/>
+              <w:bottom w:val="single" w:color="BFBFBF" w:sz="4"/>
+              <w:right w:val="single" w:color="BFBFBF" w:sz="4"/>
+            </w:tcBorders>
+            <w:tcMar>
+              <w:top w:type="dxa" w:w="60"/>
+              <w:left w:type="dxa" w:w="100"/>
+              <w:bottom w:type="dxa" w:w="60"/>
+              <w:right w:type="dxa" w:w="100"/>
+            </w:tcMar>
+          </w:tcPr>
+          <w:p>
+            <w:pPr>
+              <w:spacing w:after="20"/>
+            </w:pPr>
+            <w:r>
+              <w:rPr>
+                <w:rFonts w:ascii="Courier New" w:cs="Courier New" w:eastAsia="Courier New" w:hAnsi="Courier New"/>
+                <w:sz w:val="19"/>
+                <w:szCs w:val="19"/>
+              </w:rPr>
+              <w:t xml:space="preserve">gemini:gemma-4-31b-it</w:t>
+            </w:r>
+          </w:p>
+        </w:tc>
+        <w:tc>
+          <w:tcPr>
+            <w:tcW w:type="dxa" w:w="4902"/>
+            <w:tcBorders>
+              <w:top w:val="single" w:color="BFBFBF" w:sz="4"/>
+              <w:left w:val="single" w:color="BFBFBF" w:sz="4"/>
+              <w:bottom w:val="single" w:color="BFBFBF" w:sz="4"/>
+              <w:right w:val="single" w:color="BFBFBF" w:sz="4"/>
+            </w:tcBorders>
+            <w:tcMar>
+              <w:top w:type="dxa" w:w="60"/>
+              <w:left w:type="dxa" w:w="100"/>
+              <w:bottom w:type="dxa" w:w="60"/>
+              <w:right w:type="dxa" w:w="100"/>
+            </w:tcMar>
+          </w:tcPr>
+          <w:p>
+            <w:pPr>
+              <w:spacing w:after="20"/>
+            </w:pPr>
+            <w:r>
+              <w:rPr>
+                <w:sz w:val="19"/>
+                <w:szCs w:val="19"/>
+              </w:rPr>
+              <w:t xml:space="preserve">Görsel denetimde fiilen kullanılan model; ücretsiz katmanda çalışır.</w:t>
+            </w:r>
+          </w:p>
+        </w:tc>
+      </w:tr>
+      <w:tr>
+        <w:trPr>
+          <w:cantSplit/>
+        </w:trPr>
+        <w:tc>
+          <w:tcPr>
+            <w:tcW w:type="dxa" w:w="1633"/>
+            <w:tcBorders>
+              <w:top w:val="single" w:color="BFBFBF" w:sz="4"/>
+              <w:left w:val="single" w:color="BFBFBF" w:sz="4"/>
+              <w:bottom w:val="single" w:color="BFBFBF" w:sz="4"/>
+              <w:right w:val="single" w:color="BFBFBF" w:sz="4"/>
+            </w:tcBorders>
+            <w:tcMar>
+              <w:top w:type="dxa" w:w="60"/>
+              <w:left w:type="dxa" w:w="100"/>
+              <w:bottom w:type="dxa" w:w="60"/>
+              <w:right w:type="dxa" w:w="100"/>
+            </w:tcMar>
+          </w:tcPr>
+          <w:p>
+            <w:pPr>
+              <w:spacing w:after="20"/>
+            </w:pPr>
+            <w:r>
+              <w:rPr>
+                <w:sz w:val="19"/>
+                <w:szCs w:val="19"/>
+              </w:rPr>
+              <w:t xml:space="preserve">Hakem</w:t>
+            </w:r>
+          </w:p>
+        </w:tc>
+        <w:tc>
+          <w:tcPr>
+            <w:tcW w:type="dxa" w:w="3103"/>
+            <w:tcBorders>
+              <w:top w:val="single" w:color="BFBFBF" w:sz="4"/>
+              <w:left w:val="single" w:color="BFBFBF" w:sz="4"/>
+              <w:bottom w:val="single" w:color="BFBFBF" w:sz="4"/>
+              <w:right w:val="single" w:color="BFBFBF" w:sz="4"/>
+            </w:tcBorders>
+            <w:tcMar>
+              <w:top w:type="dxa" w:w="60"/>
+              <w:left w:type="dxa" w:w="100"/>
+              <w:bottom w:type="dxa" w:w="60"/>
+              <w:right w:type="dxa" w:w="100"/>
+            </w:tcMar>
+          </w:tcPr>
+          <w:p>
+            <w:pPr>
+              <w:spacing w:after="20"/>
+            </w:pPr>
+            <w:r>
+              <w:rPr>
+                <w:rFonts w:ascii="Courier New" w:cs="Courier New" w:eastAsia="Courier New" w:hAnsi="Courier New"/>
+                <w:sz w:val="19"/>
+                <w:szCs w:val="19"/>
+              </w:rPr>
+              <w:t xml:space="preserve">gemini:gemini-3.5-flash-lite</w:t>
+            </w:r>
+          </w:p>
+        </w:tc>
+        <w:tc>
+          <w:tcPr>
+            <w:tcW w:type="dxa" w:w="4902"/>
+            <w:tcBorders>
+              <w:top w:val="single" w:color="BFBFBF" w:sz="4"/>
+              <w:left w:val="single" w:color="BFBFBF" w:sz="4"/>
+              <w:bottom w:val="single" w:color="BFBFBF" w:sz="4"/>
+              <w:right w:val="single" w:color="BFBFBF" w:sz="4"/>
+            </w:tcBorders>
+            <w:tcMar>
+              <w:top w:type="dxa" w:w="60"/>
+              <w:left w:type="dxa" w:w="100"/>
+              <w:bottom w:type="dxa" w:w="60"/>
+              <w:right w:type="dxa" w:w="100"/>
+            </w:tcMar>
+          </w:tcPr>
+          <w:p>
+            <w:pPr>
+              <w:spacing w:after="20"/>
+            </w:pPr>
+            <w:r>
+              <w:rPr>
+                <w:sz w:val="19"/>
+                <w:szCs w:val="19"/>
+              </w:rPr>
+              <w:t xml:space="preserve">Tür bazlı örneklemle (</w:t>
+            </w:r>
+            <w:r>
+              <w:rPr>
+                <w:rFonts w:ascii="Courier New" w:cs="Courier New" w:eastAsia="Courier New" w:hAnsi="Courier New"/>
+                <w:sz w:val="19"/>
+                <w:szCs w:val="19"/>
+              </w:rPr>
+              <w:t xml:space="preserve">tur</w:t>
+            </w:r>
+            <w:r>
+              <w:rPr>
+                <w:sz w:val="19"/>
+                <w:szCs w:val="19"/>
+              </w:rPr>
+              <w:t xml:space="preserve">) modelin isabetini ölçer.</w:t>
+            </w:r>
+          </w:p>
+        </w:tc>
+      </w:tr>
+      <w:tr>
+        <w:trPr>
+          <w:cantSplit/>
+        </w:trPr>
+        <w:tc>
+          <w:tcPr>
+            <w:tcW w:type="dxa" w:w="1633"/>
+            <w:tcBorders>
+              <w:top w:val="single" w:color="BFBFBF" w:sz="4"/>
+              <w:left w:val="single" w:color="BFBFBF" w:sz="4"/>
+              <w:bottom w:val="single" w:color="BFBFBF" w:sz="4"/>
+              <w:right w:val="single" w:color="BFBFBF" w:sz="4"/>
+            </w:tcBorders>
+            <w:tcMar>
+              <w:top w:type="dxa" w:w="60"/>
+              <w:left w:type="dxa" w:w="100"/>
+              <w:bottom w:type="dxa" w:w="60"/>
+              <w:right w:type="dxa" w:w="100"/>
+            </w:tcMar>
+          </w:tcPr>
+          <w:p>
+            <w:pPr>
+              <w:spacing w:after="20"/>
+            </w:pPr>
+            <w:r>
+              <w:rPr>
+                <w:sz w:val="19"/>
+                <w:szCs w:val="19"/>
+              </w:rPr>
+              <w:t xml:space="preserve">Yerel model</w:t>
+            </w:r>
+          </w:p>
+        </w:tc>
+        <w:tc>
+          <w:tcPr>
+            <w:tcW w:type="dxa" w:w="3103"/>
+            <w:tcBorders>
+              <w:top w:val="single" w:color="BFBFBF" w:sz="4"/>
+              <w:left w:val="single" w:color="BFBFBF" w:sz="4"/>
+              <w:bottom w:val="single" w:color="BFBFBF" w:sz="4"/>
+              <w:right w:val="single" w:color="BFBFBF" w:sz="4"/>
+            </w:tcBorders>
+            <w:tcMar>
+              <w:top w:type="dxa" w:w="60"/>
+              <w:left w:type="dxa" w:w="100"/>
+              <w:bottom w:type="dxa" w:w="60"/>
+              <w:right w:type="dxa" w:w="100"/>
+            </w:tcMar>
+          </w:tcPr>
+          <w:p>
+            <w:pPr>
+              <w:spacing w:after="20"/>
+            </w:pPr>
+            <w:r>
+              <w:rPr>
+                <w:rFonts w:ascii="Courier New" w:cs="Courier New" w:eastAsia="Courier New" w:hAnsi="Courier New"/>
+                <w:sz w:val="19"/>
+                <w:szCs w:val="19"/>
+              </w:rPr>
+              <w:t xml:space="preserve">qwen2.5vl:3b</w:t>
+            </w:r>
+          </w:p>
+        </w:tc>
+        <w:tc>
+          <w:tcPr>
+            <w:tcW w:type="dxa" w:w="4902"/>
+            <w:tcBorders>
+              <w:top w:val="single" w:color="BFBFBF" w:sz="4"/>
+              <w:left w:val="single" w:color="BFBFBF" w:sz="4"/>
+              <w:bottom w:val="single" w:color="BFBFBF" w:sz="4"/>
+              <w:right w:val="single" w:color="BFBFBF" w:sz="4"/>
+            </w:tcBorders>
+            <w:tcMar>
+              <w:top w:type="dxa" w:w="60"/>
+              <w:left w:type="dxa" w:w="100"/>
+              <w:bottom w:type="dxa" w:w="60"/>
+              <w:right w:type="dxa" w:w="100"/>
+            </w:tcMar>
+          </w:tcPr>
+          <w:p>
+            <w:pPr>
+              <w:spacing w:after="20"/>
+            </w:pPr>
+            <w:r>
+              <w:rPr>
+                <w:sz w:val="19"/>
+                <w:szCs w:val="19"/>
+              </w:rPr>
+              <w:t xml:space="preserve">Ollama incelemesi. Küçük modeller hataları kaçırabilir; GPU varsa </w:t>
+            </w:r>
+            <w:r>
+              <w:rPr>
+                <w:rFonts w:ascii="Courier New" w:cs="Courier New" w:eastAsia="Courier New" w:hAnsi="Courier New"/>
+                <w:sz w:val="19"/>
+                <w:szCs w:val="19"/>
+              </w:rPr>
+              <w:t xml:space="preserve">qwen2.5vl:7b</w:t>
+            </w:r>
+            <w:r>
+              <w:rPr>
+                <w:sz w:val="19"/>
+                <w:szCs w:val="19"/>
+              </w:rPr>
+              <w:t xml:space="preserve"> önerilir.</w:t>
+            </w:r>
+          </w:p>
+        </w:tc>
+      </w:tr>
+    </w:tbl>
+    <w:p>
+      <w:pPr>
+        <w:spacing w:after="100"/>
+      </w:pPr>
+    </w:p>
+    <w:p>
+      <w:pPr>
+        <w:pStyle w:val="Heading2"/>
+      </w:pPr>
+      <w:bookmarkStart w:name="b60" w:id="60"/>
+      <w:r>
+        <w:t xml:space="preserve">8.3 Anahtarlar ve güvenlik</w:t>
+      </w:r>
+      <w:bookmarkEnd w:id="60"/>
+    </w:p>
+    <w:p>
+      <w:pPr>
+        <w:pStyle w:val="ListParagraph"/>
+        <w:numPr>
+          <w:ilvl w:val="0"/>
+          <w:numId w:val="2"/>
+        </w:numPr>
+        <w:spacing w:after="60"/>
+      </w:pPr>
+      <w:r>
+        <w:t xml:space="preserve">Anahtarlar varsayılan olarak </w:t>
+      </w:r>
+      <w:r>
+        <w:rPr>
+          <w:b/>
+          <w:bCs/>
+        </w:rPr>
+        <w:t xml:space="preserve">diske yazılmaz</w:t>
+      </w:r>
+      <w:r>
+        <w:t xml:space="preserve">; yalnızca o oturumda kullanılır. Kalıcı olsun isterseniz </w:t>
+      </w:r>
+      <w:r>
+        <w:rPr>
+          <w:b/>
+          <w:bCs/>
+        </w:rPr>
+        <w:t xml:space="preserve">Anahtarları diske kaydet</w:t>
+      </w:r>
+      <w:r>
+        <w:t xml:space="preserve">'i işaretleyin; anahtarlar </w:t>
+      </w:r>
+      <w:r>
+        <w:rPr>
+          <w:rFonts w:ascii="Courier New" w:cs="Courier New" w:eastAsia="Courier New" w:hAnsi="Courier New"/>
+          <w:sz w:val="19"/>
+          <w:szCs w:val="19"/>
+        </w:rPr>
+        <w:t xml:space="preserve">ayarlar.json</w:t>
+      </w:r>
+      <w:r>
+        <w:t xml:space="preserve">'a yazılır ve bu dosya git'e girmez.</w:t>
+      </w:r>
+    </w:p>
+    <w:p>
+      <w:pPr>
+        <w:pStyle w:val="ListParagraph"/>
+        <w:numPr>
+          <w:ilvl w:val="0"/>
+          <w:numId w:val="2"/>
+        </w:numPr>
+        <w:spacing w:after="60"/>
+      </w:pPr>
+      <w:r>
+        <w:t xml:space="preserve">Anahtarlar araçlara ortam değişkeni olarak geçirilir ve çalışma kaydına hiçbir zaman açık yazılmaz.</w:t>
+      </w:r>
+    </w:p>
+    <w:p>
+      <w:pPr>
+        <w:pStyle w:val="ListParagraph"/>
+        <w:numPr>
+          <w:ilvl w:val="0"/>
+          <w:numId w:val="2"/>
+        </w:numPr>
+        <w:spacing w:after="60"/>
+      </w:pPr>
+      <w:r>
+        <w:t xml:space="preserve">Kurum içi bir sitenin ekran görüntüleri bulut modellere gönderilir. Bu kabul edilemiyorsa yerel Ollama ya da kurum içi OpenAI uyumlu bir sunucu kullanın.</w:t>
+      </w:r>
+    </w:p>
+    <w:p>
+      <w:pPr>
+        <w:pStyle w:val="Heading2"/>
+      </w:pPr>
+      <w:bookmarkStart w:name="b61" w:id="61"/>
+      <w:r>
+        <w:t xml:space="preserve">8.4 Kota, hız ve maliyet</w:t>
+      </w:r>
+      <w:bookmarkEnd w:id="61"/>
+    </w:p>
+    <w:p>
+      <w:pPr>
+        <w:pStyle w:val="ListParagraph"/>
+        <w:numPr>
+          <w:ilvl w:val="0"/>
+          <w:numId w:val="2"/>
+        </w:numPr>
+        <w:spacing w:after="60"/>
+      </w:pPr>
+      <w:r>
+        <w:rPr>
+          <w:b/>
+          <w:bCs/>
+        </w:rPr>
+        <w:t xml:space="preserve">Dakikada istek sınırı</w:t>
+      </w:r>
+      <w:r>
+        <w:t xml:space="preserve"> (varsayılan 8): ücretsiz Gemini katmanının dakikalık sınırına takılmamak için. Ücretli hesapta 0 (sınırsız) yapılabilir.</w:t>
+      </w:r>
+    </w:p>
+    <w:p>
+      <w:pPr>
+        <w:pStyle w:val="ListParagraph"/>
+        <w:numPr>
+          <w:ilvl w:val="0"/>
+          <w:numId w:val="2"/>
+        </w:numPr>
+        <w:spacing w:after="60"/>
+      </w:pPr>
+      <w:r>
+        <w:t xml:space="preserve">Günlük kota dolarsa analiz o model için durur; ertesi gün aynı adım kaldığı yerden devam eder.</w:t>
+      </w:r>
+    </w:p>
+    <w:p>
+      <w:pPr>
+        <w:pStyle w:val="ListParagraph"/>
+        <w:numPr>
+          <w:ilvl w:val="0"/>
+          <w:numId w:val="2"/>
+        </w:numPr>
+        <w:spacing w:after="60"/>
+      </w:pPr>
+      <w:r>
+        <w:rPr>
+          <w:b/>
+          <w:bCs/>
+        </w:rPr>
+        <w:t xml:space="preserve">3a. Maliyet/süre tahmini</w:t>
+      </w:r>
+      <w:r>
+        <w:t xml:space="preserve"> API çağırmadan istek sayısını ve Claude için tahmini maliyeti gösterir. Önce </w:t>
+      </w:r>
+      <w:r>
+        <w:rPr>
+          <w:b/>
+          <w:bCs/>
+        </w:rPr>
+        <w:t xml:space="preserve">Sayfa sınırı (deneme)</w:t>
+      </w:r>
+      <w:r>
+        <w:t xml:space="preserve"> ile küçük bir tur yapmanız önerilir.</w:t>
+      </w:r>
+    </w:p>
+    <w:p>
+      <w:pPr>
+        <w:pStyle w:val="ListParagraph"/>
+        <w:numPr>
+          <w:ilvl w:val="0"/>
+          <w:numId w:val="2"/>
+        </w:numPr>
+        <w:spacing w:after="60"/>
+      </w:pPr>
+      <w:r>
+        <w:t xml:space="preserve">Claude kullanıyorsanız </w:t>
+      </w:r>
+      <w:r>
+        <w:rPr>
+          <w:b/>
+          <w:bCs/>
+        </w:rPr>
+        <w:t xml:space="preserve">Claude toplu istek (Batch)</w:t>
+      </w:r>
+      <w:r>
+        <w:t xml:space="preserve"> maliyeti yarıya indirir; sonuç genelde bir saat içinde gelir.</w:t>
+      </w:r>
+    </w:p>
+    <w:p>
+      <w:pPr>
+        <w:pStyle w:val="Heading2"/>
+      </w:pPr>
+      <w:bookmarkStart w:name="b62" w:id="62"/>
+      <w:r>
+        <w:t xml:space="preserve">8.5 Modele giden talimat</w:t>
+      </w:r>
+      <w:bookmarkEnd w:id="62"/>
+    </w:p>
+    <w:p>
+      <w:pPr>
+        <w:spacing w:after="120"/>
+      </w:pPr>
+      <w:r>
+        <w:t xml:space="preserve">Her ekran görüntüsü cihaza göre dilimlenir (masaüstü 1024×1024, mobil 375×1334 piksel, görüntü başına en fazla 3 dilim) ve her dilim modele ayrı sorulur. Modele, sitenin tanımını ve dilini içeren İngilizce bir talimat, dilimin cihaz ve konum bilgisi, görüntü ve cevabın uyması gereken JSON şeması gider. Model yalnızca gerçek bir ziyaretçinin fark edeceği görsel hataları, her biri için görünen metni kanıt olarak kopyalayarak raporlar; emin olmadığı şeyi yazmaz. Hata türleri: yatay taşma, üst üste binme, kesik metin, kırık görsel, hizasızlık, düşük kontrast, bozuk karakter, açıklanamayan boşluk, bozuk gezinme, eksik veri, diğer.</w:t>
+      </w:r>
+    </w:p>
+    <w:p>
+      <w:pPr>
+        <w:spacing w:after="120"/>
+      </w:pPr>
+      <w:r>
+        <w:t xml:space="preserve">Talimattaki site tanımı ve dil </w:t>
+      </w:r>
+      <w:r>
+        <w:rPr>
+          <w:b/>
+          <w:bCs/>
+        </w:rPr>
+        <w:t xml:space="preserve">Ayarlar &gt; Site profili &gt; Yapay zekâ talimatı</w:t>
+      </w:r>
+      <w:r>
+        <w:t xml:space="preserve">'ndan değiştirilir. Talimatın tam metni </w:t>
+      </w:r>
+      <w:r>
+        <w:rPr>
+          <w:rFonts w:ascii="Courier New" w:cs="Courier New" w:eastAsia="Courier New" w:hAnsi="Courier New"/>
+          <w:sz w:val="19"/>
+          <w:szCs w:val="19"/>
+        </w:rPr>
+        <w:t xml:space="preserve">tools/visual_audit/analiz.py</w:t>
+      </w:r>
+      <w:r>
+        <w:t xml:space="preserve"> dosyasındadır.</w:t>
+      </w:r>
+    </w:p>
+    <w:p>
+      <w:pPr>
+        <w:pStyle w:val="Heading1"/>
+        <w:pageBreakBefore/>
+      </w:pPr>
+      <w:bookmarkStart w:name="b63" w:id="63"/>
+      <w:r>
+        <w:t xml:space="preserve">9. Ayarlar başvurusu</w:t>
+      </w:r>
+      <w:bookmarkEnd w:id="63"/>
+    </w:p>
+    <w:p>
+      <w:pPr>
+        <w:keepNext/>
+        <w:spacing w:after="40" w:before="80"/>
+        <w:jc w:val="center"/>
+      </w:pPr>
+      <w:r>
+        <w:drawing>
+          <wp:inline distT="0" distB="0" distL="0" distR="0">
+            <wp:extent cx="5905500" cy="4029075"/>
+            <wp:effectExtent t="0" r="0" b="0" l="0"/>
+            <wp:docPr id="1" name="12_ayarlar_site.png" descr="Ayarlar: site profili" title="Ayarlar: site profili"/>
+            <wp:cNvGraphicFramePr>
+              <a:graphicFrameLocks xmlns:a="http://schemas.openxmlformats.org/drawingml/2006/main" noChangeAspect="1"/>
+            </wp:cNvGraphicFramePr>
+            <a:graphic xmlns:a="http://schemas.openxmlformats.org/drawingml/2006/main">
+              <a:graphicData uri="http://schemas.openxmlformats.org/drawingml/2006/picture">
+                <pic:pic xmlns:pic="http://schemas.openxmlformats.org/drawingml/2006/picture">
+                  <pic:nvPicPr>
+                    <pic:cNvPr id="0" name="" descr=""/>
+                    <pic:cNvPicPr>
+                      <a:picLocks noChangeAspect="1" noChangeArrowheads="1"/>
+                    </pic:cNvPicPr>
+                  </pic:nvPicPr>
+                  <pic:blipFill>
+                    <a:blip r:embed="rId26" cstate="none"/>
+                    <a:srcRect/>
+                    <a:stretch>
+                      <a:fillRect/>
+                    </a:stretch>
+                  </pic:blipFill>
+                  <pic:spPr bwMode="auto">
+                    <a:xfrm>
+                      <a:off x="0" y="0"/>
+                      <a:ext cx="5905500" cy="4029075"/>
+                    </a:xfrm>
+                    <a:prstGeom prst="rect">
+                      <a:avLst/>
+                    </a:prstGeom>
+                  </pic:spPr>
+                </pic:pic>
+              </a:graphicData>
+            </a:graphic>
+          </wp:inline>
+        </w:drawing>
+      </w:r>
+    </w:p>
+    <w:p>
+      <w:pPr>
+        <w:spacing w:after="200"/>
+        <w:jc w:val="center"/>
+      </w:pPr>
+      <w:r>
+        <w:rPr>
+          <w:b/>
+          <w:bCs/>
+          <w:color w:val="595959"/>
+          <w:sz w:val="18"/>
+          <w:szCs w:val="18"/>
+        </w:rPr>
+        <w:t xml:space="preserve">Şekil 18. </w:t>
       </w:r>
       <w:r>
         <w:rPr>

</xml_diff>

<commit_message>
Kılavuz: adım raporları bölümü ve güncel ekran görüntüleri
7.10 Adım raporları bölümü ve örnek şekil; ayrıntı kartındaki "Son adım raporunu aç",
Son çalışma sekmesindeki "Adım raporu" satırı ve Raporlar'daki yeni düğme görüntülerde.

Co-Authored-By: Claude Opus 5.5 <noreply@anthropic.com>
Claude-Session: https://claude.ai/code/session_01Y7HA7zWrzagZQyqvydG6xL
</commit_message>
<xml_diff>
--- a/docs/KULLANIM_KILAVUZU.docx
+++ b/docs/KULLANIM_KILAVUZU.docx
@@ -1535,7 +1535,7 @@
             <w:sz w:val="20"/>
             <w:szCs w:val="20"/>
           </w:rPr>
-          <w:t xml:space="preserve">7.10 Teslim paketi</w:t>
+          <w:t xml:space="preserve">7.10 Adım raporları: her adımın her çalışması</w:t>
         </w:r>
         <w:r>
           <w:rPr>
@@ -1554,10 +1554,40 @@
         <w:tabs>
           <w:tab w:val="right" w:pos="9638" w:leader="dot"/>
         </w:tabs>
+        <w:spacing w:after="40" w:before="0"/>
+        <w:ind w:left="400"/>
+      </w:pPr>
+      <w:hyperlink w:history="1" w:anchor="b57">
+        <w:r>
+          <w:rPr>
+            <w:b w:val="false"/>
+            <w:bCs w:val="false"/>
+            <w:sz w:val="20"/>
+            <w:szCs w:val="20"/>
+          </w:rPr>
+          <w:t xml:space="preserve">7.10 Teslim paketi</w:t>
+        </w:r>
+        <w:r>
+          <w:rPr>
+            <w:b w:val="false"/>
+            <w:bCs w:val="false"/>
+            <w:sz w:val="20"/>
+            <w:szCs w:val="20"/>
+          </w:rPr>
+          <w:tab/>
+          <w:t xml:space="preserve">31</w:t>
+        </w:r>
+      </w:hyperlink>
+    </w:p>
+    <w:p>
+      <w:pPr>
+        <w:tabs>
+          <w:tab w:val="right" w:pos="9638" w:leader="dot"/>
+        </w:tabs>
         <w:spacing w:after="40" w:before="120"/>
         <w:ind w:left="0"/>
       </w:pPr>
-      <w:hyperlink w:history="1" w:anchor="b57">
+      <w:hyperlink w:history="1" w:anchor="b58">
         <w:r>
           <w:rPr>
             <w:b/>
@@ -1575,7 +1605,7 @@
             <w:szCs w:val="20"/>
           </w:rPr>
           <w:tab/>
-          <w:t xml:space="preserve">31</w:t>
+          <w:t xml:space="preserve">32</w:t>
         </w:r>
       </w:hyperlink>
     </w:p>
@@ -1587,7 +1617,7 @@
         <w:spacing w:after="40" w:before="0"/>
         <w:ind w:left="400"/>
       </w:pPr>
-      <w:hyperlink w:history="1" w:anchor="b58">
+      <w:hyperlink w:history="1" w:anchor="b59">
         <w:r>
           <w:rPr>
             <w:b w:val="false"/>
@@ -1605,7 +1635,7 @@
             <w:szCs w:val="20"/>
           </w:rPr>
           <w:tab/>
-          <w:t xml:space="preserve">31</w:t>
+          <w:t xml:space="preserve">32</w:t>
         </w:r>
       </w:hyperlink>
     </w:p>
@@ -1617,7 +1647,7 @@
         <w:spacing w:after="40" w:before="0"/>
         <w:ind w:left="400"/>
       </w:pPr>
-      <w:hyperlink w:history="1" w:anchor="b59">
+      <w:hyperlink w:history="1" w:anchor="b60">
         <w:r>
           <w:rPr>
             <w:b w:val="false"/>
@@ -1635,7 +1665,7 @@
             <w:szCs w:val="20"/>
           </w:rPr>
           <w:tab/>
-          <w:t xml:space="preserve">32</w:t>
+          <w:t xml:space="preserve">33</w:t>
         </w:r>
       </w:hyperlink>
     </w:p>
@@ -1647,7 +1677,7 @@
         <w:spacing w:after="40" w:before="0"/>
         <w:ind w:left="400"/>
       </w:pPr>
-      <w:hyperlink w:history="1" w:anchor="b60">
+      <w:hyperlink w:history="1" w:anchor="b61">
         <w:r>
           <w:rPr>
             <w:b w:val="false"/>
@@ -1665,7 +1695,7 @@
             <w:szCs w:val="20"/>
           </w:rPr>
           <w:tab/>
-          <w:t xml:space="preserve">32</w:t>
+          <w:t xml:space="preserve">33</w:t>
         </w:r>
       </w:hyperlink>
     </w:p>
@@ -1677,7 +1707,7 @@
         <w:spacing w:after="40" w:before="0"/>
         <w:ind w:left="400"/>
       </w:pPr>
-      <w:hyperlink w:history="1" w:anchor="b61">
+      <w:hyperlink w:history="1" w:anchor="b62">
         <w:r>
           <w:rPr>
             <w:b w:val="false"/>
@@ -1695,7 +1725,7 @@
             <w:szCs w:val="20"/>
           </w:rPr>
           <w:tab/>
-          <w:t xml:space="preserve">32</w:t>
+          <w:t xml:space="preserve">33</w:t>
         </w:r>
       </w:hyperlink>
     </w:p>
@@ -1707,7 +1737,7 @@
         <w:spacing w:after="40" w:before="0"/>
         <w:ind w:left="400"/>
       </w:pPr>
-      <w:hyperlink w:history="1" w:anchor="b62">
+      <w:hyperlink w:history="1" w:anchor="b63">
         <w:r>
           <w:rPr>
             <w:b w:val="false"/>
@@ -1725,7 +1755,7 @@
             <w:szCs w:val="20"/>
           </w:rPr>
           <w:tab/>
-          <w:t xml:space="preserve">32</w:t>
+          <w:t xml:space="preserve">33</w:t>
         </w:r>
       </w:hyperlink>
     </w:p>
@@ -1737,7 +1767,7 @@
         <w:spacing w:after="40" w:before="120"/>
         <w:ind w:left="0"/>
       </w:pPr>
-      <w:hyperlink w:history="1" w:anchor="b63">
+      <w:hyperlink w:history="1" w:anchor="b64">
         <w:r>
           <w:rPr>
             <w:b/>
@@ -1755,7 +1785,7 @@
             <w:szCs w:val="20"/>
           </w:rPr>
           <w:tab/>
-          <w:t xml:space="preserve">33</w:t>
+          <w:t xml:space="preserve">34</w:t>
         </w:r>
       </w:hyperlink>
     </w:p>
@@ -1767,7 +1797,7 @@
         <w:spacing w:after="40" w:before="0"/>
         <w:ind w:left="400"/>
       </w:pPr>
-      <w:hyperlink w:history="1" w:anchor="b64">
+      <w:hyperlink w:history="1" w:anchor="b65">
         <w:r>
           <w:rPr>
             <w:b w:val="false"/>
@@ -1785,7 +1815,7 @@
             <w:szCs w:val="20"/>
           </w:rPr>
           <w:tab/>
-          <w:t xml:space="preserve">33</w:t>
+          <w:t xml:space="preserve">34</w:t>
         </w:r>
       </w:hyperlink>
     </w:p>
@@ -1797,7 +1827,7 @@
         <w:spacing w:after="40" w:before="0"/>
         <w:ind w:left="400"/>
       </w:pPr>
-      <w:hyperlink w:history="1" w:anchor="b71">
+      <w:hyperlink w:history="1" w:anchor="b72">
         <w:r>
           <w:rPr>
             <w:b w:val="false"/>
@@ -1815,7 +1845,7 @@
             <w:szCs w:val="20"/>
           </w:rPr>
           <w:tab/>
-          <w:t xml:space="preserve">35</w:t>
+          <w:t xml:space="preserve">36</w:t>
         </w:r>
       </w:hyperlink>
     </w:p>
@@ -1827,7 +1857,7 @@
         <w:spacing w:after="40" w:before="120"/>
         <w:ind w:left="0"/>
       </w:pPr>
-      <w:hyperlink w:history="1" w:anchor="b76">
+      <w:hyperlink w:history="1" w:anchor="b77">
         <w:r>
           <w:rPr>
             <w:b/>
@@ -1845,7 +1875,7 @@
             <w:szCs w:val="20"/>
           </w:rPr>
           <w:tab/>
-          <w:t xml:space="preserve">38</w:t>
+          <w:t xml:space="preserve">39</w:t>
         </w:r>
       </w:hyperlink>
     </w:p>
@@ -1857,7 +1887,7 @@
         <w:spacing w:after="40" w:before="120"/>
         <w:ind w:left="0"/>
       </w:pPr>
-      <w:hyperlink w:history="1" w:anchor="b77">
+      <w:hyperlink w:history="1" w:anchor="b78">
         <w:r>
           <w:rPr>
             <w:b/>
@@ -1875,7 +1905,7 @@
             <w:szCs w:val="20"/>
           </w:rPr>
           <w:tab/>
-          <w:t xml:space="preserve">39</w:t>
+          <w:t xml:space="preserve">40</w:t>
         </w:r>
       </w:hyperlink>
     </w:p>
@@ -1887,7 +1917,7 @@
         <w:spacing w:after="40" w:before="120"/>
         <w:ind w:left="0"/>
       </w:pPr>
-      <w:hyperlink w:history="1" w:anchor="b78">
+      <w:hyperlink w:history="1" w:anchor="b79">
         <w:r>
           <w:rPr>
             <w:b/>
@@ -1905,7 +1935,7 @@
             <w:szCs w:val="20"/>
           </w:rPr>
           <w:tab/>
-          <w:t xml:space="preserve">40</w:t>
+          <w:t xml:space="preserve">41</w:t>
         </w:r>
       </w:hyperlink>
     </w:p>
@@ -1917,7 +1947,7 @@
         <w:spacing w:after="40" w:before="120"/>
         <w:ind w:left="0"/>
       </w:pPr>
-      <w:hyperlink w:history="1" w:anchor="b79">
+      <w:hyperlink w:history="1" w:anchor="b80">
         <w:r>
           <w:rPr>
             <w:b/>
@@ -1935,7 +1965,7 @@
             <w:szCs w:val="20"/>
           </w:rPr>
           <w:tab/>
-          <w:t xml:space="preserve">42</w:t>
+          <w:t xml:space="preserve">43</w:t>
         </w:r>
       </w:hyperlink>
     </w:p>
@@ -1947,7 +1977,7 @@
         <w:spacing w:after="40" w:before="120"/>
         <w:ind w:left="0"/>
       </w:pPr>
-      <w:hyperlink w:history="1" w:anchor="b80">
+      <w:hyperlink w:history="1" w:anchor="b81">
         <w:r>
           <w:rPr>
             <w:b/>
@@ -1965,7 +1995,7 @@
             <w:szCs w:val="20"/>
           </w:rPr>
           <w:tab/>
-          <w:t xml:space="preserve">43</w:t>
+          <w:t xml:space="preserve">44</w:t>
         </w:r>
       </w:hyperlink>
     </w:p>
@@ -1977,7 +2007,7 @@
         <w:spacing w:after="40" w:before="120"/>
         <w:ind w:left="0"/>
       </w:pPr>
-      <w:hyperlink w:history="1" w:anchor="b81">
+      <w:hyperlink w:history="1" w:anchor="b82">
         <w:r>
           <w:rPr>
             <w:b/>
@@ -1995,7 +2025,7 @@
             <w:szCs w:val="20"/>
           </w:rPr>
           <w:tab/>
-          <w:t xml:space="preserve">44</w:t>
+          <w:t xml:space="preserve">45</w:t>
         </w:r>
       </w:hyperlink>
     </w:p>
@@ -5539,7 +5569,17 @@
         <w:t xml:space="preserve">Klasörü aç</w:t>
       </w:r>
       <w:r>
-        <w:t xml:space="preserve"> ve </w:t>
+        <w:t xml:space="preserve">, </w:t>
+      </w:r>
+      <w:r>
+        <w:rPr>
+          <w:b/>
+          <w:bCs/>
+        </w:rPr>
+        <w:t xml:space="preserve">Son adım raporunu aç</w:t>
+      </w:r>
+      <w:r>
+        <w:t xml:space="preserve"> (bu adımın son çalışmasının raporu; bkz. 7.10) ve </w:t>
       </w:r>
       <w:r>
         <w:rPr>
@@ -6134,6 +6174,24 @@
     </w:p>
     <w:p>
       <w:pPr>
+        <w:spacing w:after="120"/>
+      </w:pPr>
+      <w:r>
+        <w:t xml:space="preserve">Her adımın altındaki ilk satır </w:t>
+      </w:r>
+      <w:r>
+        <w:rPr>
+          <w:b/>
+          <w:bCs/>
+        </w:rPr>
+        <w:t xml:space="preserve">Adım raporu</w:t>
+      </w:r>
+      <w:r>
+        <w:t xml:space="preserve">dur: o adımın bu çalışmadaki sonucunu tek sayfada gösterir (bkz. 7.10).</w:t>
+      </w:r>
+    </w:p>
+    <w:p>
+      <w:pPr>
         <w:pStyle w:val="Heading2"/>
       </w:pPr>
       <w:bookmarkStart w:name="b22" w:id="22"/>
@@ -18602,7 +18660,7 @@
       </w:pPr>
       <w:bookmarkStart w:name="b56" w:id="56"/>
       <w:r>
-        <w:t xml:space="preserve">7.10 Teslim paketi</w:t>
+        <w:t xml:space="preserve">7.10 Adım raporları: her adımın her çalışması</w:t>
       </w:r>
       <w:bookmarkEnd w:id="56"/>
     </w:p>
@@ -18611,81 +18669,67 @@
         <w:spacing w:after="120"/>
       </w:pPr>
       <w:r>
+        <w:t xml:space="preserve">Program, hangi adım olursa olsun, adım bittiği anda o adım için bir </w:t>
+      </w:r>
+      <w:r>
         <w:rPr>
-          <w:rFonts w:ascii="Courier New" w:cs="Courier New" w:eastAsia="Courier New" w:hAnsi="Courier New"/>
-          <w:sz w:val="19"/>
-          <w:szCs w:val="19"/>
+          <w:b/>
+          <w:bCs/>
         </w:rPr>
-        <w:t xml:space="preserve">TESLIM/</w:t>
-      </w:r>
-      <w:r>
-        <w:t xml:space="preserve"> klasöründe </w:t>
+        <w:t xml:space="preserve">adım raporu</w:t>
+      </w:r>
+      <w:r>
+        <w:t xml:space="preserve"> yazar; kendi raporu olmayan ara adımlar (doğrulama, kümeleme, piksel tarama, yapay zekâ analizi ve hakem, isabet, metin denetimi, canlı doğrulama, CSS denemesi, Bologna, kurulum ve ortam kontrolü) dahil hiçbir adımın sonucu yalnızca bir CSV'de ya da kayıtta kalmaz. Raporda:</w:t>
+      </w:r>
+    </w:p>
+    <w:p>
+      <w:pPr>
+        <w:pStyle w:val="ListParagraph"/>
+        <w:numPr>
+          <w:ilvl w:val="0"/>
+          <w:numId w:val="2"/>
+        </w:numPr>
+        <w:spacing w:after="60"/>
+      </w:pPr>
+      <w:r>
+        <w:t xml:space="preserve">sonuç (başarılı / başarısız / durduruldu), süre, hata ve uyarı sayıları;</w:t>
+      </w:r>
+    </w:p>
+    <w:p>
+      <w:pPr>
+        <w:pStyle w:val="ListParagraph"/>
+        <w:numPr>
+          <w:ilvl w:val="0"/>
+          <w:numId w:val="2"/>
+        </w:numPr>
+        <w:spacing w:after="60"/>
+      </w:pPr>
+      <w:r>
+        <w:t xml:space="preserve">adımın ürettiği </w:t>
       </w:r>
       <w:r>
         <w:rPr>
-          <w:rFonts w:ascii="Courier New" w:cs="Courier New" w:eastAsia="Courier New" w:hAnsi="Courier New"/>
-          <w:sz w:val="19"/>
-          <w:szCs w:val="19"/>
+          <w:b/>
+          <w:bCs/>
         </w:rPr>
-        <w:t xml:space="preserve">raporlar/</w:t>
-      </w:r>
-      <w:r>
-        <w:t xml:space="preserve"> (HTML raporlar, CSS önerisi, son görsel denetim raporu, önce/sonra görüntüleri) ve </w:t>
-      </w:r>
-      <w:r>
-        <w:rPr>
-          <w:rFonts w:ascii="Courier New" w:cs="Courier New" w:eastAsia="Courier New" w:hAnsi="Courier New"/>
-          <w:sz w:val="19"/>
-          <w:szCs w:val="19"/>
-        </w:rPr>
-        <w:t xml:space="preserve">veri/</w:t>
-      </w:r>
-      <w:r>
-        <w:t xml:space="preserve"> (bütün CSV/XLSX/JSON çıktılar) bulunur; </w:t>
-      </w:r>
-      <w:r>
-        <w:rPr>
-          <w:rFonts w:ascii="Courier New" w:cs="Courier New" w:eastAsia="Courier New" w:hAnsi="Courier New"/>
-          <w:sz w:val="19"/>
-          <w:szCs w:val="19"/>
-        </w:rPr>
-        <w:t xml:space="preserve">index.html</w:t>
-      </w:r>
-      <w:r>
-        <w:t xml:space="preserve"> bunların açıklamalı listesidir. Ekran görüntüleri büyük olduğu için pakete kopyalanmaz; gerekirse </w:t>
-      </w:r>
-      <w:r>
-        <w:rPr>
-          <w:rFonts w:ascii="Courier New" w:cs="Courier New" w:eastAsia="Courier New" w:hAnsi="Courier New"/>
-          <w:sz w:val="19"/>
-          <w:szCs w:val="19"/>
-        </w:rPr>
-        <w:t xml:space="preserve">test_output/screenshots/</w:t>
-      </w:r>
-      <w:r>
-        <w:t xml:space="preserve"> ayrıca ZIP'lenir.</w:t>
-      </w:r>
-    </w:p>
-    <w:p>
-      <w:pPr>
-        <w:pStyle w:val="Heading1"/>
-        <w:pageBreakBefore/>
-      </w:pPr>
-      <w:bookmarkStart w:name="b57" w:id="57"/>
-      <w:r>
-        <w:t xml:space="preserve">8. Yapay zekâ ayarları</w:t>
-      </w:r>
-      <w:bookmarkEnd w:id="57"/>
-    </w:p>
-    <w:p>
-      <w:pPr>
-        <w:pStyle w:val="Heading2"/>
-      </w:pPr>
-      <w:bookmarkStart w:name="b58" w:id="58"/>
-      <w:r>
-        <w:t xml:space="preserve">8.1 Sağlayıcılar ve model yazımı</w:t>
-      </w:r>
-      <w:bookmarkEnd w:id="58"/>
+        <w:t xml:space="preserve">her dosya</w:t>
+      </w:r>
+      <w:r>
+        <w:t xml:space="preserve">: kendi HTML raporu varsa bağlantısı, CSV'ler aranabilir tablo olarak (ilk 500 satır), TXT'ler metin olarak, JSON'lar özet olarak (alanlar ve öğe sayıları);</w:t>
+      </w:r>
+    </w:p>
+    <w:p>
+      <w:pPr>
+        <w:pStyle w:val="ListParagraph"/>
+        <w:numPr>
+          <w:ilvl w:val="0"/>
+          <w:numId w:val="2"/>
+        </w:numPr>
+        <w:spacing w:after="60"/>
+      </w:pPr>
+      <w:r>
+        <w:t xml:space="preserve">hatalar ve uyarılar listesi, çalıştırılan komutlar ve çalışma kaydının son 400 satırı (tamamına bağlantı).</w:t>
+      </w:r>
     </w:p>
     <w:p>
       <w:pPr>
@@ -18696,9 +18740,9 @@
       <w:r>
         <w:drawing>
           <wp:inline distT="0" distB="0" distL="0" distR="0">
-            <wp:extent cx="5905500" cy="4029075"/>
+            <wp:extent cx="5905500" cy="3667125"/>
             <wp:effectExtent t="0" r="0" b="0" l="0"/>
-            <wp:docPr id="1" name="13_ayarlar_genel.png" descr="Ayarlar: yapay zekâ sağlayıcıları ve modeller" title="Ayarlar: yapay zekâ sağlayıcıları ve modeller"/>
+            <wp:docPr id="1" name="21_adim_raporu.png" descr="Adım raporu örneği: Kırık sayfa doğrulama — sonuç, CSV çıktısı tablo olarak, hatalar ve komutlar" title="Adım raporu örneği: Kırık sayfa doğrulama — sonuç, CSV çıktısı tablo olarak, hatalar ve komutlar"/>
             <wp:cNvGraphicFramePr>
               <a:graphicFrameLocks xmlns:a="http://schemas.openxmlformats.org/drawingml/2006/main" noChangeAspect="1"/>
             </wp:cNvGraphicFramePr>
@@ -18721,7 +18765,7 @@
                   <pic:spPr bwMode="auto">
                     <a:xfrm>
                       <a:off x="0" y="0"/>
-                      <a:ext cx="5905500" cy="4029075"/>
+                      <a:ext cx="5905500" cy="3667125"/>
                     </a:xfrm>
                     <a:prstGeom prst="rect">
                       <a:avLst/>
@@ -18757,7 +18801,7 @@
           <w:sz w:val="18"/>
           <w:szCs w:val="18"/>
         </w:rPr>
-        <w:t xml:space="preserve">Ayarlar: yapay zekâ sağlayıcıları ve modeller</w:t>
+        <w:t xml:space="preserve">Adım raporu örneği: Kırık sayfa doğrulama — sonuç, CSV çıktısı tablo olarak, hatalar ve komutlar</w:t>
       </w:r>
     </w:p>
     <w:p>
@@ -18765,1089 +18809,7 @@
         <w:spacing w:after="120"/>
       </w:pPr>
       <w:r>
-        <w:t xml:space="preserve">Ayarlar &gt; </w:t>
-      </w:r>
-      <w:r>
-        <w:rPr>
-          <w:b/>
-          <w:bCs/>
-        </w:rPr>
-        <w:t xml:space="preserve">Yapay zekâ, Bologna, genel</w:t>
-      </w:r>
-      <w:r>
-        <w:t xml:space="preserve"> sekmesinde her sağlayıcının anahtarı, adresi ve varsayılan modeli girilir. </w:t>
-      </w:r>
-      <w:r>
-        <w:rPr>
-          <w:b/>
-          <w:bCs/>
-        </w:rPr>
-        <w:t xml:space="preserve">Tarayan modeller</w:t>
-      </w:r>
-      <w:r>
-        <w:t xml:space="preserve"> (virgülle birden fazla) ve </w:t>
-      </w:r>
-      <w:r>
-        <w:rPr>
-          <w:b/>
-          <w:bCs/>
-        </w:rPr>
-        <w:t xml:space="preserve">Hakem modeli</w:t>
-      </w:r>
-      <w:r>
-        <w:t xml:space="preserve"> alanları şu yazımları kabul eder:</w:t>
-      </w:r>
-    </w:p>
-    <w:tbl>
-      <w:tblPr>
-        <w:tblW w:type="dxa" w:w="9638"/>
-        <w:tblBorders>
-          <w:top w:val="single" w:color="auto" w:sz="4"/>
-          <w:left w:val="single" w:color="auto" w:sz="4"/>
-          <w:bottom w:val="single" w:color="auto" w:sz="4"/>
-          <w:right w:val="single" w:color="auto" w:sz="4"/>
-          <w:insideH w:val="single" w:color="auto" w:sz="4"/>
-          <w:insideV w:val="single" w:color="auto" w:sz="4"/>
-        </w:tblBorders>
-        <w:tblLayout w:type="fixed"/>
-      </w:tblPr>
-      <w:tblGrid>
-        <w:gridCol w:w="2570"/>
-        <w:gridCol w:w="3855"/>
-        <w:gridCol w:w="3213"/>
-      </w:tblGrid>
-      <w:tr>
-        <w:trPr>
-          <w:cantSplit/>
-          <w:tblHeader/>
-        </w:trPr>
-        <w:tc>
-          <w:tcPr>
-            <w:tcW w:type="dxa" w:w="2570"/>
-            <w:tcBorders>
-              <w:top w:val="single" w:color="BFBFBF" w:sz="4"/>
-              <w:left w:val="single" w:color="BFBFBF" w:sz="4"/>
-              <w:bottom w:val="single" w:color="BFBFBF" w:sz="4"/>
-              <w:right w:val="single" w:color="BFBFBF" w:sz="4"/>
-            </w:tcBorders>
-            <w:shd w:fill="1F4E79" w:color="auto" w:val="clear"/>
-            <w:tcMar>
-              <w:top w:type="dxa" w:w="60"/>
-              <w:left w:type="dxa" w:w="100"/>
-              <w:bottom w:type="dxa" w:w="60"/>
-              <w:right w:type="dxa" w:w="100"/>
-            </w:tcMar>
-          </w:tcPr>
-          <w:p>
-            <w:pPr>
-              <w:spacing w:after="20"/>
-            </w:pPr>
-            <w:r>
-              <w:rPr>
-                <w:b/>
-                <w:bCs/>
-                <w:color w:val="FFFFFF"/>
-                <w:sz w:val="19"/>
-                <w:szCs w:val="19"/>
-              </w:rPr>
-              <w:t xml:space="preserve">Yazım</w:t>
-            </w:r>
-          </w:p>
-        </w:tc>
-        <w:tc>
-          <w:tcPr>
-            <w:tcW w:type="dxa" w:w="3855"/>
-            <w:tcBorders>
-              <w:top w:val="single" w:color="BFBFBF" w:sz="4"/>
-              <w:left w:val="single" w:color="BFBFBF" w:sz="4"/>
-              <w:bottom w:val="single" w:color="BFBFBF" w:sz="4"/>
-              <w:right w:val="single" w:color="BFBFBF" w:sz="4"/>
-            </w:tcBorders>
-            <w:shd w:fill="1F4E79" w:color="auto" w:val="clear"/>
-            <w:tcMar>
-              <w:top w:type="dxa" w:w="60"/>
-              <w:left w:type="dxa" w:w="100"/>
-              <w:bottom w:type="dxa" w:w="60"/>
-              <w:right w:type="dxa" w:w="100"/>
-            </w:tcMar>
-          </w:tcPr>
-          <w:p>
-            <w:pPr>
-              <w:spacing w:after="20"/>
-            </w:pPr>
-            <w:r>
-              <w:rPr>
-                <w:b/>
-                <w:bCs/>
-                <w:color w:val="FFFFFF"/>
-                <w:sz w:val="19"/>
-                <w:szCs w:val="19"/>
-              </w:rPr>
-              <w:t xml:space="preserve">Sağlayıcı</w:t>
-            </w:r>
-          </w:p>
-        </w:tc>
-        <w:tc>
-          <w:tcPr>
-            <w:tcW w:type="dxa" w:w="3213"/>
-            <w:tcBorders>
-              <w:top w:val="single" w:color="BFBFBF" w:sz="4"/>
-              <w:left w:val="single" w:color="BFBFBF" w:sz="4"/>
-              <w:bottom w:val="single" w:color="BFBFBF" w:sz="4"/>
-              <w:right w:val="single" w:color="BFBFBF" w:sz="4"/>
-            </w:tcBorders>
-            <w:shd w:fill="1F4E79" w:color="auto" w:val="clear"/>
-            <w:tcMar>
-              <w:top w:type="dxa" w:w="60"/>
-              <w:left w:type="dxa" w:w="100"/>
-              <w:bottom w:type="dxa" w:w="60"/>
-              <w:right w:type="dxa" w:w="100"/>
-            </w:tcMar>
-          </w:tcPr>
-          <w:p>
-            <w:pPr>
-              <w:spacing w:after="20"/>
-            </w:pPr>
-            <w:r>
-              <w:rPr>
-                <w:b/>
-                <w:bCs/>
-                <w:color w:val="FFFFFF"/>
-                <w:sz w:val="19"/>
-                <w:szCs w:val="19"/>
-              </w:rPr>
-              <w:t xml:space="preserve">Gerekenler</w:t>
-            </w:r>
-          </w:p>
-        </w:tc>
-      </w:tr>
-      <w:tr>
-        <w:trPr>
-          <w:cantSplit/>
-        </w:trPr>
-        <w:tc>
-          <w:tcPr>
-            <w:tcW w:type="dxa" w:w="2570"/>
-            <w:tcBorders>
-              <w:top w:val="single" w:color="BFBFBF" w:sz="4"/>
-              <w:left w:val="single" w:color="BFBFBF" w:sz="4"/>
-              <w:bottom w:val="single" w:color="BFBFBF" w:sz="4"/>
-              <w:right w:val="single" w:color="BFBFBF" w:sz="4"/>
-            </w:tcBorders>
-            <w:tcMar>
-              <w:top w:type="dxa" w:w="60"/>
-              <w:left w:type="dxa" w:w="100"/>
-              <w:bottom w:type="dxa" w:w="60"/>
-              <w:right w:type="dxa" w:w="100"/>
-            </w:tcMar>
-          </w:tcPr>
-          <w:p>
-            <w:pPr>
-              <w:spacing w:after="20"/>
-            </w:pPr>
-            <w:r>
-              <w:rPr>
-                <w:rFonts w:ascii="Courier New" w:cs="Courier New" w:eastAsia="Courier New" w:hAnsi="Courier New"/>
-                <w:sz w:val="19"/>
-                <w:szCs w:val="19"/>
-              </w:rPr>
-              <w:t xml:space="preserve">claude</w:t>
-            </w:r>
-            <w:r>
-              <w:rPr>
-                <w:sz w:val="19"/>
-                <w:szCs w:val="19"/>
-              </w:rPr>
-              <w:t xml:space="preserve"> veya </w:t>
-            </w:r>
-            <w:r>
-              <w:rPr>
-                <w:rFonts w:ascii="Courier New" w:cs="Courier New" w:eastAsia="Courier New" w:hAnsi="Courier New"/>
-                <w:sz w:val="19"/>
-                <w:szCs w:val="19"/>
-              </w:rPr>
-              <w:t xml:space="preserve">claude:&lt;model&gt;</w:t>
-            </w:r>
-          </w:p>
-        </w:tc>
-        <w:tc>
-          <w:tcPr>
-            <w:tcW w:type="dxa" w:w="3855"/>
-            <w:tcBorders>
-              <w:top w:val="single" w:color="BFBFBF" w:sz="4"/>
-              <w:left w:val="single" w:color="BFBFBF" w:sz="4"/>
-              <w:bottom w:val="single" w:color="BFBFBF" w:sz="4"/>
-              <w:right w:val="single" w:color="BFBFBF" w:sz="4"/>
-            </w:tcBorders>
-            <w:tcMar>
-              <w:top w:type="dxa" w:w="60"/>
-              <w:left w:type="dxa" w:w="100"/>
-              <w:bottom w:type="dxa" w:w="60"/>
-              <w:right w:type="dxa" w:w="100"/>
-            </w:tcMar>
-          </w:tcPr>
-          <w:p>
-            <w:pPr>
-              <w:spacing w:after="20"/>
-            </w:pPr>
-            <w:r>
-              <w:rPr>
-                <w:sz w:val="19"/>
-                <w:szCs w:val="19"/>
-              </w:rPr>
-              <w:t xml:space="preserve">Anthropic</w:t>
-            </w:r>
-          </w:p>
-        </w:tc>
-        <w:tc>
-          <w:tcPr>
-            <w:tcW w:type="dxa" w:w="3213"/>
-            <w:tcBorders>
-              <w:top w:val="single" w:color="BFBFBF" w:sz="4"/>
-              <w:left w:val="single" w:color="BFBFBF" w:sz="4"/>
-              <w:bottom w:val="single" w:color="BFBFBF" w:sz="4"/>
-              <w:right w:val="single" w:color="BFBFBF" w:sz="4"/>
-            </w:tcBorders>
-            <w:tcMar>
-              <w:top w:type="dxa" w:w="60"/>
-              <w:left w:type="dxa" w:w="100"/>
-              <w:bottom w:type="dxa" w:w="60"/>
-              <w:right w:type="dxa" w:w="100"/>
-            </w:tcMar>
-          </w:tcPr>
-          <w:p>
-            <w:pPr>
-              <w:spacing w:after="20"/>
-            </w:pPr>
-            <w:r>
-              <w:rPr>
-                <w:sz w:val="19"/>
-                <w:szCs w:val="19"/>
-              </w:rPr>
-              <w:t xml:space="preserve">Anthropic API anahtarı</w:t>
-            </w:r>
-          </w:p>
-        </w:tc>
-      </w:tr>
-      <w:tr>
-        <w:trPr>
-          <w:cantSplit/>
-        </w:trPr>
-        <w:tc>
-          <w:tcPr>
-            <w:tcW w:type="dxa" w:w="2570"/>
-            <w:tcBorders>
-              <w:top w:val="single" w:color="BFBFBF" w:sz="4"/>
-              <w:left w:val="single" w:color="BFBFBF" w:sz="4"/>
-              <w:bottom w:val="single" w:color="BFBFBF" w:sz="4"/>
-              <w:right w:val="single" w:color="BFBFBF" w:sz="4"/>
-            </w:tcBorders>
-            <w:tcMar>
-              <w:top w:type="dxa" w:w="60"/>
-              <w:left w:type="dxa" w:w="100"/>
-              <w:bottom w:type="dxa" w:w="60"/>
-              <w:right w:type="dxa" w:w="100"/>
-            </w:tcMar>
-          </w:tcPr>
-          <w:p>
-            <w:pPr>
-              <w:spacing w:after="20"/>
-            </w:pPr>
-            <w:r>
-              <w:rPr>
-                <w:rFonts w:ascii="Courier New" w:cs="Courier New" w:eastAsia="Courier New" w:hAnsi="Courier New"/>
-                <w:sz w:val="19"/>
-                <w:szCs w:val="19"/>
-              </w:rPr>
-              <w:t xml:space="preserve">gemini</w:t>
-            </w:r>
-            <w:r>
-              <w:rPr>
-                <w:sz w:val="19"/>
-                <w:szCs w:val="19"/>
-              </w:rPr>
-              <w:t xml:space="preserve"> veya </w:t>
-            </w:r>
-            <w:r>
-              <w:rPr>
-                <w:rFonts w:ascii="Courier New" w:cs="Courier New" w:eastAsia="Courier New" w:hAnsi="Courier New"/>
-                <w:sz w:val="19"/>
-                <w:szCs w:val="19"/>
-              </w:rPr>
-              <w:t xml:space="preserve">gemini:&lt;model&gt;</w:t>
-            </w:r>
-          </w:p>
-        </w:tc>
-        <w:tc>
-          <w:tcPr>
-            <w:tcW w:type="dxa" w:w="3855"/>
-            <w:tcBorders>
-              <w:top w:val="single" w:color="BFBFBF" w:sz="4"/>
-              <w:left w:val="single" w:color="BFBFBF" w:sz="4"/>
-              <w:bottom w:val="single" w:color="BFBFBF" w:sz="4"/>
-              <w:right w:val="single" w:color="BFBFBF" w:sz="4"/>
-            </w:tcBorders>
-            <w:tcMar>
-              <w:top w:type="dxa" w:w="60"/>
-              <w:left w:type="dxa" w:w="100"/>
-              <w:bottom w:type="dxa" w:w="60"/>
-              <w:right w:type="dxa" w:w="100"/>
-            </w:tcMar>
-          </w:tcPr>
-          <w:p>
-            <w:pPr>
-              <w:spacing w:after="20"/>
-            </w:pPr>
-            <w:r>
-              <w:rPr>
-                <w:sz w:val="19"/>
-                <w:szCs w:val="19"/>
-              </w:rPr>
-              <w:t xml:space="preserve">Google Gemini / Gemma</w:t>
-            </w:r>
-          </w:p>
-        </w:tc>
-        <w:tc>
-          <w:tcPr>
-            <w:tcW w:type="dxa" w:w="3213"/>
-            <w:tcBorders>
-              <w:top w:val="single" w:color="BFBFBF" w:sz="4"/>
-              <w:left w:val="single" w:color="BFBFBF" w:sz="4"/>
-              <w:bottom w:val="single" w:color="BFBFBF" w:sz="4"/>
-              <w:right w:val="single" w:color="BFBFBF" w:sz="4"/>
-            </w:tcBorders>
-            <w:tcMar>
-              <w:top w:type="dxa" w:w="60"/>
-              <w:left w:type="dxa" w:w="100"/>
-              <w:bottom w:type="dxa" w:w="60"/>
-              <w:right w:type="dxa" w:w="100"/>
-            </w:tcMar>
-          </w:tcPr>
-          <w:p>
-            <w:pPr>
-              <w:spacing w:after="20"/>
-            </w:pPr>
-            <w:r>
-              <w:rPr>
-                <w:sz w:val="19"/>
-                <w:szCs w:val="19"/>
-              </w:rPr>
-              <w:t xml:space="preserve">Gemini API anahtarı (ücretsiz katman yeterli)</w:t>
-            </w:r>
-          </w:p>
-        </w:tc>
-      </w:tr>
-      <w:tr>
-        <w:trPr>
-          <w:cantSplit/>
-        </w:trPr>
-        <w:tc>
-          <w:tcPr>
-            <w:tcW w:type="dxa" w:w="2570"/>
-            <w:tcBorders>
-              <w:top w:val="single" w:color="BFBFBF" w:sz="4"/>
-              <w:left w:val="single" w:color="BFBFBF" w:sz="4"/>
-              <w:bottom w:val="single" w:color="BFBFBF" w:sz="4"/>
-              <w:right w:val="single" w:color="BFBFBF" w:sz="4"/>
-            </w:tcBorders>
-            <w:tcMar>
-              <w:top w:type="dxa" w:w="60"/>
-              <w:left w:type="dxa" w:w="100"/>
-              <w:bottom w:type="dxa" w:w="60"/>
-              <w:right w:type="dxa" w:w="100"/>
-            </w:tcMar>
-          </w:tcPr>
-          <w:p>
-            <w:pPr>
-              <w:spacing w:after="20"/>
-            </w:pPr>
-            <w:r>
-              <w:rPr>
-                <w:rFonts w:ascii="Courier New" w:cs="Courier New" w:eastAsia="Courier New" w:hAnsi="Courier New"/>
-                <w:sz w:val="19"/>
-                <w:szCs w:val="19"/>
-              </w:rPr>
-              <w:t xml:space="preserve">openai:&lt;model&gt;</w:t>
-            </w:r>
-          </w:p>
-        </w:tc>
-        <w:tc>
-          <w:tcPr>
-            <w:tcW w:type="dxa" w:w="3855"/>
-            <w:tcBorders>
-              <w:top w:val="single" w:color="BFBFBF" w:sz="4"/>
-              <w:left w:val="single" w:color="BFBFBF" w:sz="4"/>
-              <w:bottom w:val="single" w:color="BFBFBF" w:sz="4"/>
-              <w:right w:val="single" w:color="BFBFBF" w:sz="4"/>
-            </w:tcBorders>
-            <w:tcMar>
-              <w:top w:type="dxa" w:w="60"/>
-              <w:left w:type="dxa" w:w="100"/>
-              <w:bottom w:type="dxa" w:w="60"/>
-              <w:right w:type="dxa" w:w="100"/>
-            </w:tcMar>
-          </w:tcPr>
-          <w:p>
-            <w:pPr>
-              <w:spacing w:after="20"/>
-            </w:pPr>
-            <w:r>
-              <w:rPr>
-                <w:sz w:val="19"/>
-                <w:szCs w:val="19"/>
-              </w:rPr>
-              <w:t xml:space="preserve">OpenAI uyumlu her servis: OpenAI, OpenRouter, Groq, Mistral, Together, LM Studio, vLLM, Ollama'nın OpenAI ucu</w:t>
-            </w:r>
-          </w:p>
-        </w:tc>
-        <w:tc>
-          <w:tcPr>
-            <w:tcW w:type="dxa" w:w="3213"/>
-            <w:tcBorders>
-              <w:top w:val="single" w:color="BFBFBF" w:sz="4"/>
-              <w:left w:val="single" w:color="BFBFBF" w:sz="4"/>
-              <w:bottom w:val="single" w:color="BFBFBF" w:sz="4"/>
-              <w:right w:val="single" w:color="BFBFBF" w:sz="4"/>
-            </w:tcBorders>
-            <w:tcMar>
-              <w:top w:type="dxa" w:w="60"/>
-              <w:left w:type="dxa" w:w="100"/>
-              <w:bottom w:type="dxa" w:w="60"/>
-              <w:right w:type="dxa" w:w="100"/>
-            </w:tcMar>
-          </w:tcPr>
-          <w:p>
-            <w:pPr>
-              <w:spacing w:after="20"/>
-            </w:pPr>
-            <w:r>
-              <w:rPr>
-                <w:sz w:val="19"/>
-                <w:szCs w:val="19"/>
-              </w:rPr>
-              <w:t xml:space="preserve">Adres (listeden seçilir) ve gerekirse anahtar</w:t>
-            </w:r>
-          </w:p>
-        </w:tc>
-      </w:tr>
-      <w:tr>
-        <w:trPr>
-          <w:cantSplit/>
-        </w:trPr>
-        <w:tc>
-          <w:tcPr>
-            <w:tcW w:type="dxa" w:w="2570"/>
-            <w:tcBorders>
-              <w:top w:val="single" w:color="BFBFBF" w:sz="4"/>
-              <w:left w:val="single" w:color="BFBFBF" w:sz="4"/>
-              <w:bottom w:val="single" w:color="BFBFBF" w:sz="4"/>
-              <w:right w:val="single" w:color="BFBFBF" w:sz="4"/>
-            </w:tcBorders>
-            <w:tcMar>
-              <w:top w:type="dxa" w:w="60"/>
-              <w:left w:type="dxa" w:w="100"/>
-              <w:bottom w:type="dxa" w:w="60"/>
-              <w:right w:type="dxa" w:w="100"/>
-            </w:tcMar>
-          </w:tcPr>
-          <w:p>
-            <w:pPr>
-              <w:spacing w:after="20"/>
-            </w:pPr>
-            <w:r>
-              <w:rPr>
-                <w:rFonts w:ascii="Courier New" w:cs="Courier New" w:eastAsia="Courier New" w:hAnsi="Courier New"/>
-                <w:sz w:val="19"/>
-                <w:szCs w:val="19"/>
-              </w:rPr>
-              <w:t xml:space="preserve">ollama:&lt;model&gt;</w:t>
-            </w:r>
-          </w:p>
-        </w:tc>
-        <w:tc>
-          <w:tcPr>
-            <w:tcW w:type="dxa" w:w="3855"/>
-            <w:tcBorders>
-              <w:top w:val="single" w:color="BFBFBF" w:sz="4"/>
-              <w:left w:val="single" w:color="BFBFBF" w:sz="4"/>
-              <w:bottom w:val="single" w:color="BFBFBF" w:sz="4"/>
-              <w:right w:val="single" w:color="BFBFBF" w:sz="4"/>
-            </w:tcBorders>
-            <w:tcMar>
-              <w:top w:type="dxa" w:w="60"/>
-              <w:left w:type="dxa" w:w="100"/>
-              <w:bottom w:type="dxa" w:w="60"/>
-              <w:right w:type="dxa" w:w="100"/>
-            </w:tcMar>
-          </w:tcPr>
-          <w:p>
-            <w:pPr>
-              <w:spacing w:after="20"/>
-            </w:pPr>
-            <w:r>
-              <w:rPr>
-                <w:sz w:val="19"/>
-                <w:szCs w:val="19"/>
-              </w:rPr>
-              <w:t xml:space="preserve">Yerel Ollama</w:t>
-            </w:r>
-          </w:p>
-        </w:tc>
-        <w:tc>
-          <w:tcPr>
-            <w:tcW w:type="dxa" w:w="3213"/>
-            <w:tcBorders>
-              <w:top w:val="single" w:color="BFBFBF" w:sz="4"/>
-              <w:left w:val="single" w:color="BFBFBF" w:sz="4"/>
-              <w:bottom w:val="single" w:color="BFBFBF" w:sz="4"/>
-              <w:right w:val="single" w:color="BFBFBF" w:sz="4"/>
-            </w:tcBorders>
-            <w:tcMar>
-              <w:top w:type="dxa" w:w="60"/>
-              <w:left w:type="dxa" w:w="100"/>
-              <w:bottom w:type="dxa" w:w="60"/>
-              <w:right w:type="dxa" w:w="100"/>
-            </w:tcMar>
-          </w:tcPr>
-          <w:p>
-            <w:pPr>
-              <w:spacing w:after="20"/>
-            </w:pPr>
-            <w:r>
-              <w:rPr>
-                <w:sz w:val="19"/>
-                <w:szCs w:val="19"/>
-              </w:rPr>
-              <w:t xml:space="preserve">Ollama kurulu ve model indirilmiş olmalı (</w:t>
-            </w:r>
-            <w:r>
-              <w:rPr>
-                <w:rFonts w:ascii="Courier New" w:cs="Courier New" w:eastAsia="Courier New" w:hAnsi="Courier New"/>
-                <w:sz w:val="19"/>
-                <w:szCs w:val="19"/>
-              </w:rPr>
-              <w:t xml:space="preserve">ollama pull &lt;model&gt;</w:t>
-            </w:r>
-            <w:r>
-              <w:rPr>
-                <w:sz w:val="19"/>
-                <w:szCs w:val="19"/>
-              </w:rPr>
-              <w:t xml:space="preserve">)</w:t>
-            </w:r>
-          </w:p>
-        </w:tc>
-      </w:tr>
-    </w:tbl>
-    <w:p>
-      <w:pPr>
-        <w:spacing w:after="100"/>
-      </w:pPr>
-    </w:p>
-    <w:p>
-      <w:pPr>
-        <w:spacing w:after="120"/>
-      </w:pPr>
-      <w:r>
-        <w:rPr>
-          <w:b/>
-          <w:bCs/>
-        </w:rPr>
-        <w:t xml:space="preserve">Hazırlık &gt; Yapay zekâ sağlayıcılarını dene</w:t>
-      </w:r>
-      <w:r>
-        <w:t xml:space="preserve"> her sağlayıcıya bağlanır, kullanılabilir modelleri listeler ve ayarlardaki model adının listede olup olmadığını söyler. Yeni bir servis için kod değişikliği gerekmez.</w:t>
-      </w:r>
-    </w:p>
-    <w:p>
-      <w:pPr>
-        <w:pStyle w:val="Heading2"/>
-      </w:pPr>
-      <w:bookmarkStart w:name="b59" w:id="59"/>
-      <w:r>
-        <w:t xml:space="preserve">8.2 Varsayılan modeller</w:t>
-      </w:r>
-      <w:bookmarkEnd w:id="59"/>
-    </w:p>
-    <w:tbl>
-      <w:tblPr>
-        <w:tblW w:type="dxa" w:w="9638"/>
-        <w:tblBorders>
-          <w:top w:val="single" w:color="auto" w:sz="4"/>
-          <w:left w:val="single" w:color="auto" w:sz="4"/>
-          <w:bottom w:val="single" w:color="auto" w:sz="4"/>
-          <w:right w:val="single" w:color="auto" w:sz="4"/>
-          <w:insideH w:val="single" w:color="auto" w:sz="4"/>
-          <w:insideV w:val="single" w:color="auto" w:sz="4"/>
-        </w:tblBorders>
-        <w:tblLayout w:type="fixed"/>
-      </w:tblPr>
-      <w:tblGrid>
-        <w:gridCol w:w="1633"/>
-        <w:gridCol w:w="3103"/>
-        <w:gridCol w:w="4902"/>
-      </w:tblGrid>
-      <w:tr>
-        <w:trPr>
-          <w:cantSplit/>
-          <w:tblHeader/>
-        </w:trPr>
-        <w:tc>
-          <w:tcPr>
-            <w:tcW w:type="dxa" w:w="1633"/>
-            <w:tcBorders>
-              <w:top w:val="single" w:color="BFBFBF" w:sz="4"/>
-              <w:left w:val="single" w:color="BFBFBF" w:sz="4"/>
-              <w:bottom w:val="single" w:color="BFBFBF" w:sz="4"/>
-              <w:right w:val="single" w:color="BFBFBF" w:sz="4"/>
-            </w:tcBorders>
-            <w:shd w:fill="1F4E79" w:color="auto" w:val="clear"/>
-            <w:tcMar>
-              <w:top w:type="dxa" w:w="60"/>
-              <w:left w:type="dxa" w:w="100"/>
-              <w:bottom w:type="dxa" w:w="60"/>
-              <w:right w:type="dxa" w:w="100"/>
-            </w:tcMar>
-          </w:tcPr>
-          <w:p>
-            <w:pPr>
-              <w:spacing w:after="20"/>
-            </w:pPr>
-            <w:r>
-              <w:rPr>
-                <w:b/>
-                <w:bCs/>
-                <w:color w:val="FFFFFF"/>
-                <w:sz w:val="19"/>
-                <w:szCs w:val="19"/>
-              </w:rPr>
-              <w:t xml:space="preserve">Görev</w:t>
-            </w:r>
-          </w:p>
-        </w:tc>
-        <w:tc>
-          <w:tcPr>
-            <w:tcW w:type="dxa" w:w="3103"/>
-            <w:tcBorders>
-              <w:top w:val="single" w:color="BFBFBF" w:sz="4"/>
-              <w:left w:val="single" w:color="BFBFBF" w:sz="4"/>
-              <w:bottom w:val="single" w:color="BFBFBF" w:sz="4"/>
-              <w:right w:val="single" w:color="BFBFBF" w:sz="4"/>
-            </w:tcBorders>
-            <w:shd w:fill="1F4E79" w:color="auto" w:val="clear"/>
-            <w:tcMar>
-              <w:top w:type="dxa" w:w="60"/>
-              <w:left w:type="dxa" w:w="100"/>
-              <w:bottom w:type="dxa" w:w="60"/>
-              <w:right w:type="dxa" w:w="100"/>
-            </w:tcMar>
-          </w:tcPr>
-          <w:p>
-            <w:pPr>
-              <w:spacing w:after="20"/>
-            </w:pPr>
-            <w:r>
-              <w:rPr>
-                <w:b/>
-                <w:bCs/>
-                <w:color w:val="FFFFFF"/>
-                <w:sz w:val="19"/>
-                <w:szCs w:val="19"/>
-              </w:rPr>
-              <w:t xml:space="preserve">Model</w:t>
-            </w:r>
-          </w:p>
-        </w:tc>
-        <w:tc>
-          <w:tcPr>
-            <w:tcW w:type="dxa" w:w="4902"/>
-            <w:tcBorders>
-              <w:top w:val="single" w:color="BFBFBF" w:sz="4"/>
-              <w:left w:val="single" w:color="BFBFBF" w:sz="4"/>
-              <w:bottom w:val="single" w:color="BFBFBF" w:sz="4"/>
-              <w:right w:val="single" w:color="BFBFBF" w:sz="4"/>
-            </w:tcBorders>
-            <w:shd w:fill="1F4E79" w:color="auto" w:val="clear"/>
-            <w:tcMar>
-              <w:top w:type="dxa" w:w="60"/>
-              <w:left w:type="dxa" w:w="100"/>
-              <w:bottom w:type="dxa" w:w="60"/>
-              <w:right w:type="dxa" w:w="100"/>
-            </w:tcMar>
-          </w:tcPr>
-          <w:p>
-            <w:pPr>
-              <w:spacing w:after="20"/>
-            </w:pPr>
-            <w:r>
-              <w:rPr>
-                <w:b/>
-                <w:bCs/>
-                <w:color w:val="FFFFFF"/>
-                <w:sz w:val="19"/>
-                <w:szCs w:val="19"/>
-              </w:rPr>
-              <w:t xml:space="preserve">Not</w:t>
-            </w:r>
-          </w:p>
-        </w:tc>
-      </w:tr>
-      <w:tr>
-        <w:trPr>
-          <w:cantSplit/>
-        </w:trPr>
-        <w:tc>
-          <w:tcPr>
-            <w:tcW w:type="dxa" w:w="1633"/>
-            <w:tcBorders>
-              <w:top w:val="single" w:color="BFBFBF" w:sz="4"/>
-              <w:left w:val="single" w:color="BFBFBF" w:sz="4"/>
-              <w:bottom w:val="single" w:color="BFBFBF" w:sz="4"/>
-              <w:right w:val="single" w:color="BFBFBF" w:sz="4"/>
-            </w:tcBorders>
-            <w:tcMar>
-              <w:top w:type="dxa" w:w="60"/>
-              <w:left w:type="dxa" w:w="100"/>
-              <w:bottom w:type="dxa" w:w="60"/>
-              <w:right w:type="dxa" w:w="100"/>
-            </w:tcMar>
-          </w:tcPr>
-          <w:p>
-            <w:pPr>
-              <w:spacing w:after="20"/>
-            </w:pPr>
-            <w:r>
-              <w:rPr>
-                <w:sz w:val="19"/>
-                <w:szCs w:val="19"/>
-              </w:rPr>
-              <w:t xml:space="preserve">Ana tarama</w:t>
-            </w:r>
-          </w:p>
-        </w:tc>
-        <w:tc>
-          <w:tcPr>
-            <w:tcW w:type="dxa" w:w="3103"/>
-            <w:tcBorders>
-              <w:top w:val="single" w:color="BFBFBF" w:sz="4"/>
-              <w:left w:val="single" w:color="BFBFBF" w:sz="4"/>
-              <w:bottom w:val="single" w:color="BFBFBF" w:sz="4"/>
-              <w:right w:val="single" w:color="BFBFBF" w:sz="4"/>
-            </w:tcBorders>
-            <w:tcMar>
-              <w:top w:type="dxa" w:w="60"/>
-              <w:left w:type="dxa" w:w="100"/>
-              <w:bottom w:type="dxa" w:w="60"/>
-              <w:right w:type="dxa" w:w="100"/>
-            </w:tcMar>
-          </w:tcPr>
-          <w:p>
-            <w:pPr>
-              <w:spacing w:after="20"/>
-            </w:pPr>
-            <w:r>
-              <w:rPr>
-                <w:rFonts w:ascii="Courier New" w:cs="Courier New" w:eastAsia="Courier New" w:hAnsi="Courier New"/>
-                <w:sz w:val="19"/>
-                <w:szCs w:val="19"/>
-              </w:rPr>
-              <w:t xml:space="preserve">gemini:gemma-4-31b-it</w:t>
-            </w:r>
-          </w:p>
-        </w:tc>
-        <w:tc>
-          <w:tcPr>
-            <w:tcW w:type="dxa" w:w="4902"/>
-            <w:tcBorders>
-              <w:top w:val="single" w:color="BFBFBF" w:sz="4"/>
-              <w:left w:val="single" w:color="BFBFBF" w:sz="4"/>
-              <w:bottom w:val="single" w:color="BFBFBF" w:sz="4"/>
-              <w:right w:val="single" w:color="BFBFBF" w:sz="4"/>
-            </w:tcBorders>
-            <w:tcMar>
-              <w:top w:type="dxa" w:w="60"/>
-              <w:left w:type="dxa" w:w="100"/>
-              <w:bottom w:type="dxa" w:w="60"/>
-              <w:right w:type="dxa" w:w="100"/>
-            </w:tcMar>
-          </w:tcPr>
-          <w:p>
-            <w:pPr>
-              <w:spacing w:after="20"/>
-            </w:pPr>
-            <w:r>
-              <w:rPr>
-                <w:sz w:val="19"/>
-                <w:szCs w:val="19"/>
-              </w:rPr>
-              <w:t xml:space="preserve">Görsel denetimde fiilen kullanılan model; ücretsiz katmanda çalışır.</w:t>
-            </w:r>
-          </w:p>
-        </w:tc>
-      </w:tr>
-      <w:tr>
-        <w:trPr>
-          <w:cantSplit/>
-        </w:trPr>
-        <w:tc>
-          <w:tcPr>
-            <w:tcW w:type="dxa" w:w="1633"/>
-            <w:tcBorders>
-              <w:top w:val="single" w:color="BFBFBF" w:sz="4"/>
-              <w:left w:val="single" w:color="BFBFBF" w:sz="4"/>
-              <w:bottom w:val="single" w:color="BFBFBF" w:sz="4"/>
-              <w:right w:val="single" w:color="BFBFBF" w:sz="4"/>
-            </w:tcBorders>
-            <w:tcMar>
-              <w:top w:type="dxa" w:w="60"/>
-              <w:left w:type="dxa" w:w="100"/>
-              <w:bottom w:type="dxa" w:w="60"/>
-              <w:right w:type="dxa" w:w="100"/>
-            </w:tcMar>
-          </w:tcPr>
-          <w:p>
-            <w:pPr>
-              <w:spacing w:after="20"/>
-            </w:pPr>
-            <w:r>
-              <w:rPr>
-                <w:sz w:val="19"/>
-                <w:szCs w:val="19"/>
-              </w:rPr>
-              <w:t xml:space="preserve">Hakem</w:t>
-            </w:r>
-          </w:p>
-        </w:tc>
-        <w:tc>
-          <w:tcPr>
-            <w:tcW w:type="dxa" w:w="3103"/>
-            <w:tcBorders>
-              <w:top w:val="single" w:color="BFBFBF" w:sz="4"/>
-              <w:left w:val="single" w:color="BFBFBF" w:sz="4"/>
-              <w:bottom w:val="single" w:color="BFBFBF" w:sz="4"/>
-              <w:right w:val="single" w:color="BFBFBF" w:sz="4"/>
-            </w:tcBorders>
-            <w:tcMar>
-              <w:top w:type="dxa" w:w="60"/>
-              <w:left w:type="dxa" w:w="100"/>
-              <w:bottom w:type="dxa" w:w="60"/>
-              <w:right w:type="dxa" w:w="100"/>
-            </w:tcMar>
-          </w:tcPr>
-          <w:p>
-            <w:pPr>
-              <w:spacing w:after="20"/>
-            </w:pPr>
-            <w:r>
-              <w:rPr>
-                <w:rFonts w:ascii="Courier New" w:cs="Courier New" w:eastAsia="Courier New" w:hAnsi="Courier New"/>
-                <w:sz w:val="19"/>
-                <w:szCs w:val="19"/>
-              </w:rPr>
-              <w:t xml:space="preserve">gemini:gemini-3.5-flash-lite</w:t>
-            </w:r>
-          </w:p>
-        </w:tc>
-        <w:tc>
-          <w:tcPr>
-            <w:tcW w:type="dxa" w:w="4902"/>
-            <w:tcBorders>
-              <w:top w:val="single" w:color="BFBFBF" w:sz="4"/>
-              <w:left w:val="single" w:color="BFBFBF" w:sz="4"/>
-              <w:bottom w:val="single" w:color="BFBFBF" w:sz="4"/>
-              <w:right w:val="single" w:color="BFBFBF" w:sz="4"/>
-            </w:tcBorders>
-            <w:tcMar>
-              <w:top w:type="dxa" w:w="60"/>
-              <w:left w:type="dxa" w:w="100"/>
-              <w:bottom w:type="dxa" w:w="60"/>
-              <w:right w:type="dxa" w:w="100"/>
-            </w:tcMar>
-          </w:tcPr>
-          <w:p>
-            <w:pPr>
-              <w:spacing w:after="20"/>
-            </w:pPr>
-            <w:r>
-              <w:rPr>
-                <w:sz w:val="19"/>
-                <w:szCs w:val="19"/>
-              </w:rPr>
-              <w:t xml:space="preserve">Tür bazlı örneklemle (</w:t>
-            </w:r>
-            <w:r>
-              <w:rPr>
-                <w:rFonts w:ascii="Courier New" w:cs="Courier New" w:eastAsia="Courier New" w:hAnsi="Courier New"/>
-                <w:sz w:val="19"/>
-                <w:szCs w:val="19"/>
-              </w:rPr>
-              <w:t xml:space="preserve">tur</w:t>
-            </w:r>
-            <w:r>
-              <w:rPr>
-                <w:sz w:val="19"/>
-                <w:szCs w:val="19"/>
-              </w:rPr>
-              <w:t xml:space="preserve">) modelin isabetini ölçer.</w:t>
-            </w:r>
-          </w:p>
-        </w:tc>
-      </w:tr>
-      <w:tr>
-        <w:trPr>
-          <w:cantSplit/>
-        </w:trPr>
-        <w:tc>
-          <w:tcPr>
-            <w:tcW w:type="dxa" w:w="1633"/>
-            <w:tcBorders>
-              <w:top w:val="single" w:color="BFBFBF" w:sz="4"/>
-              <w:left w:val="single" w:color="BFBFBF" w:sz="4"/>
-              <w:bottom w:val="single" w:color="BFBFBF" w:sz="4"/>
-              <w:right w:val="single" w:color="BFBFBF" w:sz="4"/>
-            </w:tcBorders>
-            <w:tcMar>
-              <w:top w:type="dxa" w:w="60"/>
-              <w:left w:type="dxa" w:w="100"/>
-              <w:bottom w:type="dxa" w:w="60"/>
-              <w:right w:type="dxa" w:w="100"/>
-            </w:tcMar>
-          </w:tcPr>
-          <w:p>
-            <w:pPr>
-              <w:spacing w:after="20"/>
-            </w:pPr>
-            <w:r>
-              <w:rPr>
-                <w:sz w:val="19"/>
-                <w:szCs w:val="19"/>
-              </w:rPr>
-              <w:t xml:space="preserve">Yerel model</w:t>
-            </w:r>
-          </w:p>
-        </w:tc>
-        <w:tc>
-          <w:tcPr>
-            <w:tcW w:type="dxa" w:w="3103"/>
-            <w:tcBorders>
-              <w:top w:val="single" w:color="BFBFBF" w:sz="4"/>
-              <w:left w:val="single" w:color="BFBFBF" w:sz="4"/>
-              <w:bottom w:val="single" w:color="BFBFBF" w:sz="4"/>
-              <w:right w:val="single" w:color="BFBFBF" w:sz="4"/>
-            </w:tcBorders>
-            <w:tcMar>
-              <w:top w:type="dxa" w:w="60"/>
-              <w:left w:type="dxa" w:w="100"/>
-              <w:bottom w:type="dxa" w:w="60"/>
-              <w:right w:type="dxa" w:w="100"/>
-            </w:tcMar>
-          </w:tcPr>
-          <w:p>
-            <w:pPr>
-              <w:spacing w:after="20"/>
-            </w:pPr>
-            <w:r>
-              <w:rPr>
-                <w:rFonts w:ascii="Courier New" w:cs="Courier New" w:eastAsia="Courier New" w:hAnsi="Courier New"/>
-                <w:sz w:val="19"/>
-                <w:szCs w:val="19"/>
-              </w:rPr>
-              <w:t xml:space="preserve">qwen2.5vl:3b</w:t>
-            </w:r>
-          </w:p>
-        </w:tc>
-        <w:tc>
-          <w:tcPr>
-            <w:tcW w:type="dxa" w:w="4902"/>
-            <w:tcBorders>
-              <w:top w:val="single" w:color="BFBFBF" w:sz="4"/>
-              <w:left w:val="single" w:color="BFBFBF" w:sz="4"/>
-              <w:bottom w:val="single" w:color="BFBFBF" w:sz="4"/>
-              <w:right w:val="single" w:color="BFBFBF" w:sz="4"/>
-            </w:tcBorders>
-            <w:tcMar>
-              <w:top w:type="dxa" w:w="60"/>
-              <w:left w:type="dxa" w:w="100"/>
-              <w:bottom w:type="dxa" w:w="60"/>
-              <w:right w:type="dxa" w:w="100"/>
-            </w:tcMar>
-          </w:tcPr>
-          <w:p>
-            <w:pPr>
-              <w:spacing w:after="20"/>
-            </w:pPr>
-            <w:r>
-              <w:rPr>
-                <w:sz w:val="19"/>
-                <w:szCs w:val="19"/>
-              </w:rPr>
-              <w:t xml:space="preserve">Ollama incelemesi. Küçük modeller hataları kaçırabilir; GPU varsa </w:t>
-            </w:r>
-            <w:r>
-              <w:rPr>
-                <w:rFonts w:ascii="Courier New" w:cs="Courier New" w:eastAsia="Courier New" w:hAnsi="Courier New"/>
-                <w:sz w:val="19"/>
-                <w:szCs w:val="19"/>
-              </w:rPr>
-              <w:t xml:space="preserve">qwen2.5vl:7b</w:t>
-            </w:r>
-            <w:r>
-              <w:rPr>
-                <w:sz w:val="19"/>
-                <w:szCs w:val="19"/>
-              </w:rPr>
-              <w:t xml:space="preserve"> önerilir.</w:t>
-            </w:r>
-          </w:p>
-        </w:tc>
-      </w:tr>
-    </w:tbl>
-    <w:p>
-      <w:pPr>
-        <w:spacing w:after="100"/>
-      </w:pPr>
-    </w:p>
-    <w:p>
-      <w:pPr>
-        <w:pStyle w:val="Heading2"/>
-      </w:pPr>
-      <w:bookmarkStart w:name="b60" w:id="60"/>
-      <w:r>
-        <w:t xml:space="preserve">8.3 Anahtarlar ve güvenlik</w:t>
-      </w:r>
-      <w:bookmarkEnd w:id="60"/>
-    </w:p>
-    <w:p>
-      <w:pPr>
-        <w:pStyle w:val="ListParagraph"/>
-        <w:numPr>
-          <w:ilvl w:val="0"/>
-          <w:numId w:val="2"/>
-        </w:numPr>
-        <w:spacing w:after="60"/>
-      </w:pPr>
-      <w:r>
-        <w:t xml:space="preserve">Anahtarlar varsayılan olarak </w:t>
-      </w:r>
-      <w:r>
-        <w:rPr>
-          <w:b/>
-          <w:bCs/>
-        </w:rPr>
-        <w:t xml:space="preserve">diske yazılmaz</w:t>
-      </w:r>
-      <w:r>
-        <w:t xml:space="preserve">; yalnızca o oturumda kullanılır. Kalıcı olsun isterseniz </w:t>
-      </w:r>
-      <w:r>
-        <w:rPr>
-          <w:b/>
-          <w:bCs/>
-        </w:rPr>
-        <w:t xml:space="preserve">Anahtarları diske kaydet</w:t>
-      </w:r>
-      <w:r>
-        <w:t xml:space="preserve">'i işaretleyin; anahtarlar </w:t>
+        <w:t xml:space="preserve">Raporlar </w:t>
       </w:r>
       <w:r>
         <w:rPr>
@@ -19855,179 +18817,100 @@
           <w:sz w:val="19"/>
           <w:szCs w:val="19"/>
         </w:rPr>
-        <w:t xml:space="preserve">ayarlar.json</w:t>
-      </w:r>
-      <w:r>
-        <w:t xml:space="preserve">'a yazılır ve bu dosya git'e girmez.</w:t>
-      </w:r>
-    </w:p>
-    <w:p>
-      <w:pPr>
-        <w:pStyle w:val="ListParagraph"/>
-        <w:numPr>
-          <w:ilvl w:val="0"/>
-          <w:numId w:val="2"/>
-        </w:numPr>
-        <w:spacing w:after="60"/>
-      </w:pPr>
-      <w:r>
-        <w:t xml:space="preserve">Anahtarlar araçlara ortam değişkeni olarak geçirilir ve çalışma kaydına hiçbir zaman açık yazılmaz.</w:t>
-      </w:r>
-    </w:p>
-    <w:p>
-      <w:pPr>
-        <w:pStyle w:val="ListParagraph"/>
-        <w:numPr>
-          <w:ilvl w:val="0"/>
-          <w:numId w:val="2"/>
-        </w:numPr>
-        <w:spacing w:after="60"/>
-      </w:pPr>
-      <w:r>
-        <w:t xml:space="preserve">Kurum içi bir sitenin ekran görüntüleri bulut modellere gönderilir. Bu kabul edilemiyorsa yerel Ollama ya da kurum içi OpenAI uyumlu bir sunucu kullanın.</w:t>
-      </w:r>
-    </w:p>
-    <w:p>
-      <w:pPr>
-        <w:pStyle w:val="Heading2"/>
-      </w:pPr>
-      <w:bookmarkStart w:name="b61" w:id="61"/>
-      <w:r>
-        <w:t xml:space="preserve">8.4 Kota, hız ve maliyet</w:t>
-      </w:r>
-      <w:bookmarkEnd w:id="61"/>
-    </w:p>
-    <w:p>
-      <w:pPr>
-        <w:pStyle w:val="ListParagraph"/>
-        <w:numPr>
-          <w:ilvl w:val="0"/>
-          <w:numId w:val="2"/>
-        </w:numPr>
-        <w:spacing w:after="60"/>
-      </w:pPr>
+        <w:t xml:space="preserve">&lt;çıktı klasörü&gt;/adim_raporlari/</w:t>
+      </w:r>
+      <w:r>
+        <w:t xml:space="preserve"> altında tarihli adlarla birikir; </w:t>
+      </w:r>
       <w:r>
         <w:rPr>
           <w:b/>
           <w:bCs/>
         </w:rPr>
-        <w:t xml:space="preserve">Dakikada istek sınırı</w:t>
-      </w:r>
-      <w:r>
-        <w:t xml:space="preserve"> (varsayılan 8): ücretsiz Gemini katmanının dakikalık sınırına takılmamak için. Ücretli hesapta 0 (sınırsız) yapılabilir.</w:t>
-      </w:r>
-    </w:p>
-    <w:p>
-      <w:pPr>
-        <w:pStyle w:val="ListParagraph"/>
-        <w:numPr>
-          <w:ilvl w:val="0"/>
-          <w:numId w:val="2"/>
-        </w:numPr>
-        <w:spacing w:after="60"/>
-      </w:pPr>
-      <w:r>
-        <w:t xml:space="preserve">Günlük kota dolarsa analiz o model için durur; ertesi gün aynı adım kaldığı yerden devam eder.</w:t>
-      </w:r>
-    </w:p>
-    <w:p>
-      <w:pPr>
-        <w:pStyle w:val="ListParagraph"/>
-        <w:numPr>
-          <w:ilvl w:val="0"/>
-          <w:numId w:val="2"/>
-        </w:numPr>
-        <w:spacing w:after="60"/>
-      </w:pPr>
+        <w:t xml:space="preserve">Raporlar ve özet → Adım raporları (her çalışma)</w:t>
+      </w:r>
+      <w:r>
+        <w:t xml:space="preserve"> hepsini en yeniden eskiye listeleyen dizini açar. Bir adımın en son raporu, adım sayfasındaki ayrıntı kartında </w:t>
+      </w:r>
       <w:r>
         <w:rPr>
           <w:b/>
           <w:bCs/>
         </w:rPr>
-        <w:t xml:space="preserve">3a. Maliyet/süre tahmini</w:t>
-      </w:r>
-      <w:r>
-        <w:t xml:space="preserve"> API çağırmadan istek sayısını ve Claude için tahmini maliyeti gösterir. Önce </w:t>
-      </w:r>
-      <w:r>
-        <w:rPr>
-          <w:b/>
-          <w:bCs/>
-        </w:rPr>
-        <w:t xml:space="preserve">Sayfa sınırı (deneme)</w:t>
-      </w:r>
-      <w:r>
-        <w:t xml:space="preserve"> ile küçük bir tur yapmanız önerilir.</w:t>
-      </w:r>
-    </w:p>
-    <w:p>
-      <w:pPr>
-        <w:pStyle w:val="ListParagraph"/>
-        <w:numPr>
-          <w:ilvl w:val="0"/>
-          <w:numId w:val="2"/>
-        </w:numPr>
-        <w:spacing w:after="60"/>
-      </w:pPr>
-      <w:r>
-        <w:t xml:space="preserve">Claude kullanıyorsanız </w:t>
-      </w:r>
-      <w:r>
-        <w:rPr>
-          <w:b/>
-          <w:bCs/>
-        </w:rPr>
-        <w:t xml:space="preserve">Claude toplu istek (Batch)</w:t>
-      </w:r>
-      <w:r>
-        <w:t xml:space="preserve"> maliyeti yarıya indirir; sonuç genelde bir saat içinde gelir.</w:t>
+        <w:t xml:space="preserve">Son adım raporunu aç</w:t>
+      </w:r>
+      <w:r>
+        <w:t xml:space="preserve"> ile de açılır. Kırık link raporu ayrıca doğrulama adımlarının teyitlerini (doğrudan erişim, buton tıklama) her kırık bağlantının yanında gösterir.</w:t>
       </w:r>
     </w:p>
     <w:p>
       <w:pPr>
         <w:pStyle w:val="Heading2"/>
       </w:pPr>
-      <w:bookmarkStart w:name="b62" w:id="62"/>
-      <w:r>
-        <w:t xml:space="preserve">8.5 Modele giden talimat</w:t>
-      </w:r>
-      <w:bookmarkEnd w:id="62"/>
+      <w:bookmarkStart w:name="b57" w:id="57"/>
+      <w:r>
+        <w:t xml:space="preserve">7.10 Teslim paketi</w:t>
+      </w:r>
+      <w:bookmarkEnd w:id="57"/>
     </w:p>
     <w:p>
       <w:pPr>
         <w:spacing w:after="120"/>
       </w:pPr>
-      <w:r>
-        <w:t xml:space="preserve">Her ekran görüntüsü cihaza göre dilimlenir (masaüstü 1024×1024, mobil 375×1334 piksel, görüntü başına en fazla 3 dilim) ve her dilim modele ayrı sorulur. Modele, sitenin tanımını ve dilini içeren İngilizce bir talimat, dilimin cihaz ve konum bilgisi, görüntü ve cevabın uyması gereken JSON şeması gider. Model yalnızca gerçek bir ziyaretçinin fark edeceği görsel hataları, her biri için görünen metni kanıt olarak kopyalayarak raporlar; emin olmadığı şeyi yazmaz. Hata türleri: yatay taşma, üst üste binme, kesik metin, kırık görsel, hizasızlık, düşük kontrast, bozuk karakter, açıklanamayan boşluk, bozuk gezinme, eksik veri, diğer.</w:t>
-      </w:r>
-    </w:p>
-    <w:p>
-      <w:pPr>
-        <w:spacing w:after="120"/>
-      </w:pPr>
-      <w:r>
-        <w:t xml:space="preserve">Talimattaki site tanımı ve dil </w:t>
-      </w:r>
-      <w:r>
-        <w:rPr>
-          <w:b/>
-          <w:bCs/>
-        </w:rPr>
-        <w:t xml:space="preserve">Ayarlar &gt; Site profili &gt; Yapay zekâ talimatı</w:t>
-      </w:r>
-      <w:r>
-        <w:t xml:space="preserve">'ndan değiştirilir. Talimatın tam metni </w:t>
-      </w:r>
       <w:r>
         <w:rPr>
           <w:rFonts w:ascii="Courier New" w:cs="Courier New" w:eastAsia="Courier New" w:hAnsi="Courier New"/>
           <w:sz w:val="19"/>
           <w:szCs w:val="19"/>
         </w:rPr>
-        <w:t xml:space="preserve">tools/visual_audit/analiz.py</w:t>
-      </w:r>
-      <w:r>
-        <w:t xml:space="preserve"> dosyasındadır.</w:t>
+        <w:t xml:space="preserve">TESLIM/</w:t>
+      </w:r>
+      <w:r>
+        <w:t xml:space="preserve"> klasöründe </w:t>
+      </w:r>
+      <w:r>
+        <w:rPr>
+          <w:rFonts w:ascii="Courier New" w:cs="Courier New" w:eastAsia="Courier New" w:hAnsi="Courier New"/>
+          <w:sz w:val="19"/>
+          <w:szCs w:val="19"/>
+        </w:rPr>
+        <w:t xml:space="preserve">raporlar/</w:t>
+      </w:r>
+      <w:r>
+        <w:t xml:space="preserve"> (HTML raporlar, CSS önerisi, son görsel denetim raporu, önce/sonra görüntüleri) ve </w:t>
+      </w:r>
+      <w:r>
+        <w:rPr>
+          <w:rFonts w:ascii="Courier New" w:cs="Courier New" w:eastAsia="Courier New" w:hAnsi="Courier New"/>
+          <w:sz w:val="19"/>
+          <w:szCs w:val="19"/>
+        </w:rPr>
+        <w:t xml:space="preserve">veri/</w:t>
+      </w:r>
+      <w:r>
+        <w:t xml:space="preserve"> (bütün CSV/XLSX/JSON çıktılar) bulunur; </w:t>
+      </w:r>
+      <w:r>
+        <w:rPr>
+          <w:rFonts w:ascii="Courier New" w:cs="Courier New" w:eastAsia="Courier New" w:hAnsi="Courier New"/>
+          <w:sz w:val="19"/>
+          <w:szCs w:val="19"/>
+        </w:rPr>
+        <w:t xml:space="preserve">index.html</w:t>
+      </w:r>
+      <w:r>
+        <w:t xml:space="preserve"> bunların açıklamalı listesidir. Ekran görüntüleri büyük olduğu için pakete kopyalanmaz; gerekirse </w:t>
+      </w:r>
+      <w:r>
+        <w:rPr>
+          <w:rFonts w:ascii="Courier New" w:cs="Courier New" w:eastAsia="Courier New" w:hAnsi="Courier New"/>
+          <w:sz w:val="19"/>
+          <w:szCs w:val="19"/>
+        </w:rPr>
+        <w:t xml:space="preserve">test_output/screenshots/</w:t>
+      </w:r>
+      <w:r>
+        <w:t xml:space="preserve"> ayrıca ZIP'lenir.</w:t>
       </w:r>
     </w:p>
     <w:p>
@@ -20035,11 +18918,21 @@
         <w:pStyle w:val="Heading1"/>
         <w:pageBreakBefore/>
       </w:pPr>
-      <w:bookmarkStart w:name="b63" w:id="63"/>
-      <w:r>
-        <w:t xml:space="preserve">9. Ayarlar başvurusu</w:t>
-      </w:r>
-      <w:bookmarkEnd w:id="63"/>
+      <w:bookmarkStart w:name="b58" w:id="58"/>
+      <w:r>
+        <w:t xml:space="preserve">8. Yapay zekâ ayarları</w:t>
+      </w:r>
+      <w:bookmarkEnd w:id="58"/>
+    </w:p>
+    <w:p>
+      <w:pPr>
+        <w:pStyle w:val="Heading2"/>
+      </w:pPr>
+      <w:bookmarkStart w:name="b59" w:id="59"/>
+      <w:r>
+        <w:t xml:space="preserve">8.1 Sağlayıcılar ve model yazımı</w:t>
+      </w:r>
+      <w:bookmarkEnd w:id="59"/>
     </w:p>
     <w:p>
       <w:pPr>
@@ -20052,7 +18945,7 @@
           <wp:inline distT="0" distB="0" distL="0" distR="0">
             <wp:extent cx="5905500" cy="4029075"/>
             <wp:effectExtent t="0" r="0" b="0" l="0"/>
-            <wp:docPr id="1" name="12_ayarlar_site.png" descr="Ayarlar: site profili" title="Ayarlar: site profili"/>
+            <wp:docPr id="1" name="13_ayarlar_genel.png" descr="Ayarlar: yapay zekâ sağlayıcıları ve modeller" title="Ayarlar: yapay zekâ sağlayıcıları ve modeller"/>
             <wp:cNvGraphicFramePr>
               <a:graphicFrameLocks xmlns:a="http://schemas.openxmlformats.org/drawingml/2006/main" noChangeAspect="1"/>
             </wp:cNvGraphicFramePr>
@@ -20111,6 +19004,1360 @@
           <w:sz w:val="18"/>
           <w:szCs w:val="18"/>
         </w:rPr>
+        <w:t xml:space="preserve">Ayarlar: yapay zekâ sağlayıcıları ve modeller</w:t>
+      </w:r>
+    </w:p>
+    <w:p>
+      <w:pPr>
+        <w:spacing w:after="120"/>
+      </w:pPr>
+      <w:r>
+        <w:t xml:space="preserve">Ayarlar &gt; </w:t>
+      </w:r>
+      <w:r>
+        <w:rPr>
+          <w:b/>
+          <w:bCs/>
+        </w:rPr>
+        <w:t xml:space="preserve">Yapay zekâ, Bologna, genel</w:t>
+      </w:r>
+      <w:r>
+        <w:t xml:space="preserve"> sekmesinde her sağlayıcının anahtarı, adresi ve varsayılan modeli girilir. </w:t>
+      </w:r>
+      <w:r>
+        <w:rPr>
+          <w:b/>
+          <w:bCs/>
+        </w:rPr>
+        <w:t xml:space="preserve">Tarayan modeller</w:t>
+      </w:r>
+      <w:r>
+        <w:t xml:space="preserve"> (virgülle birden fazla) ve </w:t>
+      </w:r>
+      <w:r>
+        <w:rPr>
+          <w:b/>
+          <w:bCs/>
+        </w:rPr>
+        <w:t xml:space="preserve">Hakem modeli</w:t>
+      </w:r>
+      <w:r>
+        <w:t xml:space="preserve"> alanları şu yazımları kabul eder:</w:t>
+      </w:r>
+    </w:p>
+    <w:tbl>
+      <w:tblPr>
+        <w:tblW w:type="dxa" w:w="9638"/>
+        <w:tblBorders>
+          <w:top w:val="single" w:color="auto" w:sz="4"/>
+          <w:left w:val="single" w:color="auto" w:sz="4"/>
+          <w:bottom w:val="single" w:color="auto" w:sz="4"/>
+          <w:right w:val="single" w:color="auto" w:sz="4"/>
+          <w:insideH w:val="single" w:color="auto" w:sz="4"/>
+          <w:insideV w:val="single" w:color="auto" w:sz="4"/>
+        </w:tblBorders>
+        <w:tblLayout w:type="fixed"/>
+      </w:tblPr>
+      <w:tblGrid>
+        <w:gridCol w:w="2570"/>
+        <w:gridCol w:w="3855"/>
+        <w:gridCol w:w="3213"/>
+      </w:tblGrid>
+      <w:tr>
+        <w:trPr>
+          <w:cantSplit/>
+          <w:tblHeader/>
+        </w:trPr>
+        <w:tc>
+          <w:tcPr>
+            <w:tcW w:type="dxa" w:w="2570"/>
+            <w:tcBorders>
+              <w:top w:val="single" w:color="BFBFBF" w:sz="4"/>
+              <w:left w:val="single" w:color="BFBFBF" w:sz="4"/>
+              <w:bottom w:val="single" w:color="BFBFBF" w:sz="4"/>
+              <w:right w:val="single" w:color="BFBFBF" w:sz="4"/>
+            </w:tcBorders>
+            <w:shd w:fill="1F4E79" w:color="auto" w:val="clear"/>
+            <w:tcMar>
+              <w:top w:type="dxa" w:w="60"/>
+              <w:left w:type="dxa" w:w="100"/>
+              <w:bottom w:type="dxa" w:w="60"/>
+              <w:right w:type="dxa" w:w="100"/>
+            </w:tcMar>
+          </w:tcPr>
+          <w:p>
+            <w:pPr>
+              <w:spacing w:after="20"/>
+            </w:pPr>
+            <w:r>
+              <w:rPr>
+                <w:b/>
+                <w:bCs/>
+                <w:color w:val="FFFFFF"/>
+                <w:sz w:val="19"/>
+                <w:szCs w:val="19"/>
+              </w:rPr>
+              <w:t xml:space="preserve">Yazım</w:t>
+            </w:r>
+          </w:p>
+        </w:tc>
+        <w:tc>
+          <w:tcPr>
+            <w:tcW w:type="dxa" w:w="3855"/>
+            <w:tcBorders>
+              <w:top w:val="single" w:color="BFBFBF" w:sz="4"/>
+              <w:left w:val="single" w:color="BFBFBF" w:sz="4"/>
+              <w:bottom w:val="single" w:color="BFBFBF" w:sz="4"/>
+              <w:right w:val="single" w:color="BFBFBF" w:sz="4"/>
+            </w:tcBorders>
+            <w:shd w:fill="1F4E79" w:color="auto" w:val="clear"/>
+            <w:tcMar>
+              <w:top w:type="dxa" w:w="60"/>
+              <w:left w:type="dxa" w:w="100"/>
+              <w:bottom w:type="dxa" w:w="60"/>
+              <w:right w:type="dxa" w:w="100"/>
+            </w:tcMar>
+          </w:tcPr>
+          <w:p>
+            <w:pPr>
+              <w:spacing w:after="20"/>
+            </w:pPr>
+            <w:r>
+              <w:rPr>
+                <w:b/>
+                <w:bCs/>
+                <w:color w:val="FFFFFF"/>
+                <w:sz w:val="19"/>
+                <w:szCs w:val="19"/>
+              </w:rPr>
+              <w:t xml:space="preserve">Sağlayıcı</w:t>
+            </w:r>
+          </w:p>
+        </w:tc>
+        <w:tc>
+          <w:tcPr>
+            <w:tcW w:type="dxa" w:w="3213"/>
+            <w:tcBorders>
+              <w:top w:val="single" w:color="BFBFBF" w:sz="4"/>
+              <w:left w:val="single" w:color="BFBFBF" w:sz="4"/>
+              <w:bottom w:val="single" w:color="BFBFBF" w:sz="4"/>
+              <w:right w:val="single" w:color="BFBFBF" w:sz="4"/>
+            </w:tcBorders>
+            <w:shd w:fill="1F4E79" w:color="auto" w:val="clear"/>
+            <w:tcMar>
+              <w:top w:type="dxa" w:w="60"/>
+              <w:left w:type="dxa" w:w="100"/>
+              <w:bottom w:type="dxa" w:w="60"/>
+              <w:right w:type="dxa" w:w="100"/>
+            </w:tcMar>
+          </w:tcPr>
+          <w:p>
+            <w:pPr>
+              <w:spacing w:after="20"/>
+            </w:pPr>
+            <w:r>
+              <w:rPr>
+                <w:b/>
+                <w:bCs/>
+                <w:color w:val="FFFFFF"/>
+                <w:sz w:val="19"/>
+                <w:szCs w:val="19"/>
+              </w:rPr>
+              <w:t xml:space="preserve">Gerekenler</w:t>
+            </w:r>
+          </w:p>
+        </w:tc>
+      </w:tr>
+      <w:tr>
+        <w:trPr>
+          <w:cantSplit/>
+        </w:trPr>
+        <w:tc>
+          <w:tcPr>
+            <w:tcW w:type="dxa" w:w="2570"/>
+            <w:tcBorders>
+              <w:top w:val="single" w:color="BFBFBF" w:sz="4"/>
+              <w:left w:val="single" w:color="BFBFBF" w:sz="4"/>
+              <w:bottom w:val="single" w:color="BFBFBF" w:sz="4"/>
+              <w:right w:val="single" w:color="BFBFBF" w:sz="4"/>
+            </w:tcBorders>
+            <w:tcMar>
+              <w:top w:type="dxa" w:w="60"/>
+              <w:left w:type="dxa" w:w="100"/>
+              <w:bottom w:type="dxa" w:w="60"/>
+              <w:right w:type="dxa" w:w="100"/>
+            </w:tcMar>
+          </w:tcPr>
+          <w:p>
+            <w:pPr>
+              <w:spacing w:after="20"/>
+            </w:pPr>
+            <w:r>
+              <w:rPr>
+                <w:rFonts w:ascii="Courier New" w:cs="Courier New" w:eastAsia="Courier New" w:hAnsi="Courier New"/>
+                <w:sz w:val="19"/>
+                <w:szCs w:val="19"/>
+              </w:rPr>
+              <w:t xml:space="preserve">claude</w:t>
+            </w:r>
+            <w:r>
+              <w:rPr>
+                <w:sz w:val="19"/>
+                <w:szCs w:val="19"/>
+              </w:rPr>
+              <w:t xml:space="preserve"> veya </w:t>
+            </w:r>
+            <w:r>
+              <w:rPr>
+                <w:rFonts w:ascii="Courier New" w:cs="Courier New" w:eastAsia="Courier New" w:hAnsi="Courier New"/>
+                <w:sz w:val="19"/>
+                <w:szCs w:val="19"/>
+              </w:rPr>
+              <w:t xml:space="preserve">claude:&lt;model&gt;</w:t>
+            </w:r>
+          </w:p>
+        </w:tc>
+        <w:tc>
+          <w:tcPr>
+            <w:tcW w:type="dxa" w:w="3855"/>
+            <w:tcBorders>
+              <w:top w:val="single" w:color="BFBFBF" w:sz="4"/>
+              <w:left w:val="single" w:color="BFBFBF" w:sz="4"/>
+              <w:bottom w:val="single" w:color="BFBFBF" w:sz="4"/>
+              <w:right w:val="single" w:color="BFBFBF" w:sz="4"/>
+            </w:tcBorders>
+            <w:tcMar>
+              <w:top w:type="dxa" w:w="60"/>
+              <w:left w:type="dxa" w:w="100"/>
+              <w:bottom w:type="dxa" w:w="60"/>
+              <w:right w:type="dxa" w:w="100"/>
+            </w:tcMar>
+          </w:tcPr>
+          <w:p>
+            <w:pPr>
+              <w:spacing w:after="20"/>
+            </w:pPr>
+            <w:r>
+              <w:rPr>
+                <w:sz w:val="19"/>
+                <w:szCs w:val="19"/>
+              </w:rPr>
+              <w:t xml:space="preserve">Anthropic</w:t>
+            </w:r>
+          </w:p>
+        </w:tc>
+        <w:tc>
+          <w:tcPr>
+            <w:tcW w:type="dxa" w:w="3213"/>
+            <w:tcBorders>
+              <w:top w:val="single" w:color="BFBFBF" w:sz="4"/>
+              <w:left w:val="single" w:color="BFBFBF" w:sz="4"/>
+              <w:bottom w:val="single" w:color="BFBFBF" w:sz="4"/>
+              <w:right w:val="single" w:color="BFBFBF" w:sz="4"/>
+            </w:tcBorders>
+            <w:tcMar>
+              <w:top w:type="dxa" w:w="60"/>
+              <w:left w:type="dxa" w:w="100"/>
+              <w:bottom w:type="dxa" w:w="60"/>
+              <w:right w:type="dxa" w:w="100"/>
+            </w:tcMar>
+          </w:tcPr>
+          <w:p>
+            <w:pPr>
+              <w:spacing w:after="20"/>
+            </w:pPr>
+            <w:r>
+              <w:rPr>
+                <w:sz w:val="19"/>
+                <w:szCs w:val="19"/>
+              </w:rPr>
+              <w:t xml:space="preserve">Anthropic API anahtarı</w:t>
+            </w:r>
+          </w:p>
+        </w:tc>
+      </w:tr>
+      <w:tr>
+        <w:trPr>
+          <w:cantSplit/>
+        </w:trPr>
+        <w:tc>
+          <w:tcPr>
+            <w:tcW w:type="dxa" w:w="2570"/>
+            <w:tcBorders>
+              <w:top w:val="single" w:color="BFBFBF" w:sz="4"/>
+              <w:left w:val="single" w:color="BFBFBF" w:sz="4"/>
+              <w:bottom w:val="single" w:color="BFBFBF" w:sz="4"/>
+              <w:right w:val="single" w:color="BFBFBF" w:sz="4"/>
+            </w:tcBorders>
+            <w:tcMar>
+              <w:top w:type="dxa" w:w="60"/>
+              <w:left w:type="dxa" w:w="100"/>
+              <w:bottom w:type="dxa" w:w="60"/>
+              <w:right w:type="dxa" w:w="100"/>
+            </w:tcMar>
+          </w:tcPr>
+          <w:p>
+            <w:pPr>
+              <w:spacing w:after="20"/>
+            </w:pPr>
+            <w:r>
+              <w:rPr>
+                <w:rFonts w:ascii="Courier New" w:cs="Courier New" w:eastAsia="Courier New" w:hAnsi="Courier New"/>
+                <w:sz w:val="19"/>
+                <w:szCs w:val="19"/>
+              </w:rPr>
+              <w:t xml:space="preserve">gemini</w:t>
+            </w:r>
+            <w:r>
+              <w:rPr>
+                <w:sz w:val="19"/>
+                <w:szCs w:val="19"/>
+              </w:rPr>
+              <w:t xml:space="preserve"> veya </w:t>
+            </w:r>
+            <w:r>
+              <w:rPr>
+                <w:rFonts w:ascii="Courier New" w:cs="Courier New" w:eastAsia="Courier New" w:hAnsi="Courier New"/>
+                <w:sz w:val="19"/>
+                <w:szCs w:val="19"/>
+              </w:rPr>
+              <w:t xml:space="preserve">gemini:&lt;model&gt;</w:t>
+            </w:r>
+          </w:p>
+        </w:tc>
+        <w:tc>
+          <w:tcPr>
+            <w:tcW w:type="dxa" w:w="3855"/>
+            <w:tcBorders>
+              <w:top w:val="single" w:color="BFBFBF" w:sz="4"/>
+              <w:left w:val="single" w:color="BFBFBF" w:sz="4"/>
+              <w:bottom w:val="single" w:color="BFBFBF" w:sz="4"/>
+              <w:right w:val="single" w:color="BFBFBF" w:sz="4"/>
+            </w:tcBorders>
+            <w:tcMar>
+              <w:top w:type="dxa" w:w="60"/>
+              <w:left w:type="dxa" w:w="100"/>
+              <w:bottom w:type="dxa" w:w="60"/>
+              <w:right w:type="dxa" w:w="100"/>
+            </w:tcMar>
+          </w:tcPr>
+          <w:p>
+            <w:pPr>
+              <w:spacing w:after="20"/>
+            </w:pPr>
+            <w:r>
+              <w:rPr>
+                <w:sz w:val="19"/>
+                <w:szCs w:val="19"/>
+              </w:rPr>
+              <w:t xml:space="preserve">Google Gemini / Gemma</w:t>
+            </w:r>
+          </w:p>
+        </w:tc>
+        <w:tc>
+          <w:tcPr>
+            <w:tcW w:type="dxa" w:w="3213"/>
+            <w:tcBorders>
+              <w:top w:val="single" w:color="BFBFBF" w:sz="4"/>
+              <w:left w:val="single" w:color="BFBFBF" w:sz="4"/>
+              <w:bottom w:val="single" w:color="BFBFBF" w:sz="4"/>
+              <w:right w:val="single" w:color="BFBFBF" w:sz="4"/>
+            </w:tcBorders>
+            <w:tcMar>
+              <w:top w:type="dxa" w:w="60"/>
+              <w:left w:type="dxa" w:w="100"/>
+              <w:bottom w:type="dxa" w:w="60"/>
+              <w:right w:type="dxa" w:w="100"/>
+            </w:tcMar>
+          </w:tcPr>
+          <w:p>
+            <w:pPr>
+              <w:spacing w:after="20"/>
+            </w:pPr>
+            <w:r>
+              <w:rPr>
+                <w:sz w:val="19"/>
+                <w:szCs w:val="19"/>
+              </w:rPr>
+              <w:t xml:space="preserve">Gemini API anahtarı (ücretsiz katman yeterli)</w:t>
+            </w:r>
+          </w:p>
+        </w:tc>
+      </w:tr>
+      <w:tr>
+        <w:trPr>
+          <w:cantSplit/>
+        </w:trPr>
+        <w:tc>
+          <w:tcPr>
+            <w:tcW w:type="dxa" w:w="2570"/>
+            <w:tcBorders>
+              <w:top w:val="single" w:color="BFBFBF" w:sz="4"/>
+              <w:left w:val="single" w:color="BFBFBF" w:sz="4"/>
+              <w:bottom w:val="single" w:color="BFBFBF" w:sz="4"/>
+              <w:right w:val="single" w:color="BFBFBF" w:sz="4"/>
+            </w:tcBorders>
+            <w:tcMar>
+              <w:top w:type="dxa" w:w="60"/>
+              <w:left w:type="dxa" w:w="100"/>
+              <w:bottom w:type="dxa" w:w="60"/>
+              <w:right w:type="dxa" w:w="100"/>
+            </w:tcMar>
+          </w:tcPr>
+          <w:p>
+            <w:pPr>
+              <w:spacing w:after="20"/>
+            </w:pPr>
+            <w:r>
+              <w:rPr>
+                <w:rFonts w:ascii="Courier New" w:cs="Courier New" w:eastAsia="Courier New" w:hAnsi="Courier New"/>
+                <w:sz w:val="19"/>
+                <w:szCs w:val="19"/>
+              </w:rPr>
+              <w:t xml:space="preserve">openai:&lt;model&gt;</w:t>
+            </w:r>
+          </w:p>
+        </w:tc>
+        <w:tc>
+          <w:tcPr>
+            <w:tcW w:type="dxa" w:w="3855"/>
+            <w:tcBorders>
+              <w:top w:val="single" w:color="BFBFBF" w:sz="4"/>
+              <w:left w:val="single" w:color="BFBFBF" w:sz="4"/>
+              <w:bottom w:val="single" w:color="BFBFBF" w:sz="4"/>
+              <w:right w:val="single" w:color="BFBFBF" w:sz="4"/>
+            </w:tcBorders>
+            <w:tcMar>
+              <w:top w:type="dxa" w:w="60"/>
+              <w:left w:type="dxa" w:w="100"/>
+              <w:bottom w:type="dxa" w:w="60"/>
+              <w:right w:type="dxa" w:w="100"/>
+            </w:tcMar>
+          </w:tcPr>
+          <w:p>
+            <w:pPr>
+              <w:spacing w:after="20"/>
+            </w:pPr>
+            <w:r>
+              <w:rPr>
+                <w:sz w:val="19"/>
+                <w:szCs w:val="19"/>
+              </w:rPr>
+              <w:t xml:space="preserve">OpenAI uyumlu her servis: OpenAI, OpenRouter, Groq, Mistral, Together, LM Studio, vLLM, Ollama'nın OpenAI ucu</w:t>
+            </w:r>
+          </w:p>
+        </w:tc>
+        <w:tc>
+          <w:tcPr>
+            <w:tcW w:type="dxa" w:w="3213"/>
+            <w:tcBorders>
+              <w:top w:val="single" w:color="BFBFBF" w:sz="4"/>
+              <w:left w:val="single" w:color="BFBFBF" w:sz="4"/>
+              <w:bottom w:val="single" w:color="BFBFBF" w:sz="4"/>
+              <w:right w:val="single" w:color="BFBFBF" w:sz="4"/>
+            </w:tcBorders>
+            <w:tcMar>
+              <w:top w:type="dxa" w:w="60"/>
+              <w:left w:type="dxa" w:w="100"/>
+              <w:bottom w:type="dxa" w:w="60"/>
+              <w:right w:type="dxa" w:w="100"/>
+            </w:tcMar>
+          </w:tcPr>
+          <w:p>
+            <w:pPr>
+              <w:spacing w:after="20"/>
+            </w:pPr>
+            <w:r>
+              <w:rPr>
+                <w:sz w:val="19"/>
+                <w:szCs w:val="19"/>
+              </w:rPr>
+              <w:t xml:space="preserve">Adres (listeden seçilir) ve gerekirse anahtar</w:t>
+            </w:r>
+          </w:p>
+        </w:tc>
+      </w:tr>
+      <w:tr>
+        <w:trPr>
+          <w:cantSplit/>
+        </w:trPr>
+        <w:tc>
+          <w:tcPr>
+            <w:tcW w:type="dxa" w:w="2570"/>
+            <w:tcBorders>
+              <w:top w:val="single" w:color="BFBFBF" w:sz="4"/>
+              <w:left w:val="single" w:color="BFBFBF" w:sz="4"/>
+              <w:bottom w:val="single" w:color="BFBFBF" w:sz="4"/>
+              <w:right w:val="single" w:color="BFBFBF" w:sz="4"/>
+            </w:tcBorders>
+            <w:tcMar>
+              <w:top w:type="dxa" w:w="60"/>
+              <w:left w:type="dxa" w:w="100"/>
+              <w:bottom w:type="dxa" w:w="60"/>
+              <w:right w:type="dxa" w:w="100"/>
+            </w:tcMar>
+          </w:tcPr>
+          <w:p>
+            <w:pPr>
+              <w:spacing w:after="20"/>
+            </w:pPr>
+            <w:r>
+              <w:rPr>
+                <w:rFonts w:ascii="Courier New" w:cs="Courier New" w:eastAsia="Courier New" w:hAnsi="Courier New"/>
+                <w:sz w:val="19"/>
+                <w:szCs w:val="19"/>
+              </w:rPr>
+              <w:t xml:space="preserve">ollama:&lt;model&gt;</w:t>
+            </w:r>
+          </w:p>
+        </w:tc>
+        <w:tc>
+          <w:tcPr>
+            <w:tcW w:type="dxa" w:w="3855"/>
+            <w:tcBorders>
+              <w:top w:val="single" w:color="BFBFBF" w:sz="4"/>
+              <w:left w:val="single" w:color="BFBFBF" w:sz="4"/>
+              <w:bottom w:val="single" w:color="BFBFBF" w:sz="4"/>
+              <w:right w:val="single" w:color="BFBFBF" w:sz="4"/>
+            </w:tcBorders>
+            <w:tcMar>
+              <w:top w:type="dxa" w:w="60"/>
+              <w:left w:type="dxa" w:w="100"/>
+              <w:bottom w:type="dxa" w:w="60"/>
+              <w:right w:type="dxa" w:w="100"/>
+            </w:tcMar>
+          </w:tcPr>
+          <w:p>
+            <w:pPr>
+              <w:spacing w:after="20"/>
+            </w:pPr>
+            <w:r>
+              <w:rPr>
+                <w:sz w:val="19"/>
+                <w:szCs w:val="19"/>
+              </w:rPr>
+              <w:t xml:space="preserve">Yerel Ollama</w:t>
+            </w:r>
+          </w:p>
+        </w:tc>
+        <w:tc>
+          <w:tcPr>
+            <w:tcW w:type="dxa" w:w="3213"/>
+            <w:tcBorders>
+              <w:top w:val="single" w:color="BFBFBF" w:sz="4"/>
+              <w:left w:val="single" w:color="BFBFBF" w:sz="4"/>
+              <w:bottom w:val="single" w:color="BFBFBF" w:sz="4"/>
+              <w:right w:val="single" w:color="BFBFBF" w:sz="4"/>
+            </w:tcBorders>
+            <w:tcMar>
+              <w:top w:type="dxa" w:w="60"/>
+              <w:left w:type="dxa" w:w="100"/>
+              <w:bottom w:type="dxa" w:w="60"/>
+              <w:right w:type="dxa" w:w="100"/>
+            </w:tcMar>
+          </w:tcPr>
+          <w:p>
+            <w:pPr>
+              <w:spacing w:after="20"/>
+            </w:pPr>
+            <w:r>
+              <w:rPr>
+                <w:sz w:val="19"/>
+                <w:szCs w:val="19"/>
+              </w:rPr>
+              <w:t xml:space="preserve">Ollama kurulu ve model indirilmiş olmalı (</w:t>
+            </w:r>
+            <w:r>
+              <w:rPr>
+                <w:rFonts w:ascii="Courier New" w:cs="Courier New" w:eastAsia="Courier New" w:hAnsi="Courier New"/>
+                <w:sz w:val="19"/>
+                <w:szCs w:val="19"/>
+              </w:rPr>
+              <w:t xml:space="preserve">ollama pull &lt;model&gt;</w:t>
+            </w:r>
+            <w:r>
+              <w:rPr>
+                <w:sz w:val="19"/>
+                <w:szCs w:val="19"/>
+              </w:rPr>
+              <w:t xml:space="preserve">)</w:t>
+            </w:r>
+          </w:p>
+        </w:tc>
+      </w:tr>
+    </w:tbl>
+    <w:p>
+      <w:pPr>
+        <w:spacing w:after="100"/>
+      </w:pPr>
+    </w:p>
+    <w:p>
+      <w:pPr>
+        <w:spacing w:after="120"/>
+      </w:pPr>
+      <w:r>
+        <w:rPr>
+          <w:b/>
+          <w:bCs/>
+        </w:rPr>
+        <w:t xml:space="preserve">Hazırlık &gt; Yapay zekâ sağlayıcılarını dene</w:t>
+      </w:r>
+      <w:r>
+        <w:t xml:space="preserve"> her sağlayıcıya bağlanır, kullanılabilir modelleri listeler ve ayarlardaki model adının listede olup olmadığını söyler. Yeni bir servis için kod değişikliği gerekmez.</w:t>
+      </w:r>
+    </w:p>
+    <w:p>
+      <w:pPr>
+        <w:pStyle w:val="Heading2"/>
+      </w:pPr>
+      <w:bookmarkStart w:name="b60" w:id="60"/>
+      <w:r>
+        <w:t xml:space="preserve">8.2 Varsayılan modeller</w:t>
+      </w:r>
+      <w:bookmarkEnd w:id="60"/>
+    </w:p>
+    <w:tbl>
+      <w:tblPr>
+        <w:tblW w:type="dxa" w:w="9638"/>
+        <w:tblBorders>
+          <w:top w:val="single" w:color="auto" w:sz="4"/>
+          <w:left w:val="single" w:color="auto" w:sz="4"/>
+          <w:bottom w:val="single" w:color="auto" w:sz="4"/>
+          <w:right w:val="single" w:color="auto" w:sz="4"/>
+          <w:insideH w:val="single" w:color="auto" w:sz="4"/>
+          <w:insideV w:val="single" w:color="auto" w:sz="4"/>
+        </w:tblBorders>
+        <w:tblLayout w:type="fixed"/>
+      </w:tblPr>
+      <w:tblGrid>
+        <w:gridCol w:w="1633"/>
+        <w:gridCol w:w="3103"/>
+        <w:gridCol w:w="4902"/>
+      </w:tblGrid>
+      <w:tr>
+        <w:trPr>
+          <w:cantSplit/>
+          <w:tblHeader/>
+        </w:trPr>
+        <w:tc>
+          <w:tcPr>
+            <w:tcW w:type="dxa" w:w="1633"/>
+            <w:tcBorders>
+              <w:top w:val="single" w:color="BFBFBF" w:sz="4"/>
+              <w:left w:val="single" w:color="BFBFBF" w:sz="4"/>
+              <w:bottom w:val="single" w:color="BFBFBF" w:sz="4"/>
+              <w:right w:val="single" w:color="BFBFBF" w:sz="4"/>
+            </w:tcBorders>
+            <w:shd w:fill="1F4E79" w:color="auto" w:val="clear"/>
+            <w:tcMar>
+              <w:top w:type="dxa" w:w="60"/>
+              <w:left w:type="dxa" w:w="100"/>
+              <w:bottom w:type="dxa" w:w="60"/>
+              <w:right w:type="dxa" w:w="100"/>
+            </w:tcMar>
+          </w:tcPr>
+          <w:p>
+            <w:pPr>
+              <w:spacing w:after="20"/>
+            </w:pPr>
+            <w:r>
+              <w:rPr>
+                <w:b/>
+                <w:bCs/>
+                <w:color w:val="FFFFFF"/>
+                <w:sz w:val="19"/>
+                <w:szCs w:val="19"/>
+              </w:rPr>
+              <w:t xml:space="preserve">Görev</w:t>
+            </w:r>
+          </w:p>
+        </w:tc>
+        <w:tc>
+          <w:tcPr>
+            <w:tcW w:type="dxa" w:w="3103"/>
+            <w:tcBorders>
+              <w:top w:val="single" w:color="BFBFBF" w:sz="4"/>
+              <w:left w:val="single" w:color="BFBFBF" w:sz="4"/>
+              <w:bottom w:val="single" w:color="BFBFBF" w:sz="4"/>
+              <w:right w:val="single" w:color="BFBFBF" w:sz="4"/>
+            </w:tcBorders>
+            <w:shd w:fill="1F4E79" w:color="auto" w:val="clear"/>
+            <w:tcMar>
+              <w:top w:type="dxa" w:w="60"/>
+              <w:left w:type="dxa" w:w="100"/>
+              <w:bottom w:type="dxa" w:w="60"/>
+              <w:right w:type="dxa" w:w="100"/>
+            </w:tcMar>
+          </w:tcPr>
+          <w:p>
+            <w:pPr>
+              <w:spacing w:after="20"/>
+            </w:pPr>
+            <w:r>
+              <w:rPr>
+                <w:b/>
+                <w:bCs/>
+                <w:color w:val="FFFFFF"/>
+                <w:sz w:val="19"/>
+                <w:szCs w:val="19"/>
+              </w:rPr>
+              <w:t xml:space="preserve">Model</w:t>
+            </w:r>
+          </w:p>
+        </w:tc>
+        <w:tc>
+          <w:tcPr>
+            <w:tcW w:type="dxa" w:w="4902"/>
+            <w:tcBorders>
+              <w:top w:val="single" w:color="BFBFBF" w:sz="4"/>
+              <w:left w:val="single" w:color="BFBFBF" w:sz="4"/>
+              <w:bottom w:val="single" w:color="BFBFBF" w:sz="4"/>
+              <w:right w:val="single" w:color="BFBFBF" w:sz="4"/>
+            </w:tcBorders>
+            <w:shd w:fill="1F4E79" w:color="auto" w:val="clear"/>
+            <w:tcMar>
+              <w:top w:type="dxa" w:w="60"/>
+              <w:left w:type="dxa" w:w="100"/>
+              <w:bottom w:type="dxa" w:w="60"/>
+              <w:right w:type="dxa" w:w="100"/>
+            </w:tcMar>
+          </w:tcPr>
+          <w:p>
+            <w:pPr>
+              <w:spacing w:after="20"/>
+            </w:pPr>
+            <w:r>
+              <w:rPr>
+                <w:b/>
+                <w:bCs/>
+                <w:color w:val="FFFFFF"/>
+                <w:sz w:val="19"/>
+                <w:szCs w:val="19"/>
+              </w:rPr>
+              <w:t xml:space="preserve">Not</w:t>
+            </w:r>
+          </w:p>
+        </w:tc>
+      </w:tr>
+      <w:tr>
+        <w:trPr>
+          <w:cantSplit/>
+        </w:trPr>
+        <w:tc>
+          <w:tcPr>
+            <w:tcW w:type="dxa" w:w="1633"/>
+            <w:tcBorders>
+              <w:top w:val="single" w:color="BFBFBF" w:sz="4"/>
+              <w:left w:val="single" w:color="BFBFBF" w:sz="4"/>
+              <w:bottom w:val="single" w:color="BFBFBF" w:sz="4"/>
+              <w:right w:val="single" w:color="BFBFBF" w:sz="4"/>
+            </w:tcBorders>
+            <w:tcMar>
+              <w:top w:type="dxa" w:w="60"/>
+              <w:left w:type="dxa" w:w="100"/>
+              <w:bottom w:type="dxa" w:w="60"/>
+              <w:right w:type="dxa" w:w="100"/>
+            </w:tcMar>
+          </w:tcPr>
+          <w:p>
+            <w:pPr>
+              <w:spacing w:after="20"/>
+            </w:pPr>
+            <w:r>
+              <w:rPr>
+                <w:sz w:val="19"/>
+                <w:szCs w:val="19"/>
+              </w:rPr>
+              <w:t xml:space="preserve">Ana tarama</w:t>
+            </w:r>
+          </w:p>
+        </w:tc>
+        <w:tc>
+          <w:tcPr>
+            <w:tcW w:type="dxa" w:w="3103"/>
+            <w:tcBorders>
+              <w:top w:val="single" w:color="BFBFBF" w:sz="4"/>
+              <w:left w:val="single" w:color="BFBFBF" w:sz="4"/>
+              <w:bottom w:val="single" w:color="BFBFBF" w:sz="4"/>
+              <w:right w:val="single" w:color="BFBFBF" w:sz="4"/>
+            </w:tcBorders>
+            <w:tcMar>
+              <w:top w:type="dxa" w:w="60"/>
+              <w:left w:type="dxa" w:w="100"/>
+              <w:bottom w:type="dxa" w:w="60"/>
+              <w:right w:type="dxa" w:w="100"/>
+            </w:tcMar>
+          </w:tcPr>
+          <w:p>
+            <w:pPr>
+              <w:spacing w:after="20"/>
+            </w:pPr>
+            <w:r>
+              <w:rPr>
+                <w:rFonts w:ascii="Courier New" w:cs="Courier New" w:eastAsia="Courier New" w:hAnsi="Courier New"/>
+                <w:sz w:val="19"/>
+                <w:szCs w:val="19"/>
+              </w:rPr>
+              <w:t xml:space="preserve">gemini:gemma-4-31b-it</w:t>
+            </w:r>
+          </w:p>
+        </w:tc>
+        <w:tc>
+          <w:tcPr>
+            <w:tcW w:type="dxa" w:w="4902"/>
+            <w:tcBorders>
+              <w:top w:val="single" w:color="BFBFBF" w:sz="4"/>
+              <w:left w:val="single" w:color="BFBFBF" w:sz="4"/>
+              <w:bottom w:val="single" w:color="BFBFBF" w:sz="4"/>
+              <w:right w:val="single" w:color="BFBFBF" w:sz="4"/>
+            </w:tcBorders>
+            <w:tcMar>
+              <w:top w:type="dxa" w:w="60"/>
+              <w:left w:type="dxa" w:w="100"/>
+              <w:bottom w:type="dxa" w:w="60"/>
+              <w:right w:type="dxa" w:w="100"/>
+            </w:tcMar>
+          </w:tcPr>
+          <w:p>
+            <w:pPr>
+              <w:spacing w:after="20"/>
+            </w:pPr>
+            <w:r>
+              <w:rPr>
+                <w:sz w:val="19"/>
+                <w:szCs w:val="19"/>
+              </w:rPr>
+              <w:t xml:space="preserve">Görsel denetimde fiilen kullanılan model; ücretsiz katmanda çalışır.</w:t>
+            </w:r>
+          </w:p>
+        </w:tc>
+      </w:tr>
+      <w:tr>
+        <w:trPr>
+          <w:cantSplit/>
+        </w:trPr>
+        <w:tc>
+          <w:tcPr>
+            <w:tcW w:type="dxa" w:w="1633"/>
+            <w:tcBorders>
+              <w:top w:val="single" w:color="BFBFBF" w:sz="4"/>
+              <w:left w:val="single" w:color="BFBFBF" w:sz="4"/>
+              <w:bottom w:val="single" w:color="BFBFBF" w:sz="4"/>
+              <w:right w:val="single" w:color="BFBFBF" w:sz="4"/>
+            </w:tcBorders>
+            <w:tcMar>
+              <w:top w:type="dxa" w:w="60"/>
+              <w:left w:type="dxa" w:w="100"/>
+              <w:bottom w:type="dxa" w:w="60"/>
+              <w:right w:type="dxa" w:w="100"/>
+            </w:tcMar>
+          </w:tcPr>
+          <w:p>
+            <w:pPr>
+              <w:spacing w:after="20"/>
+            </w:pPr>
+            <w:r>
+              <w:rPr>
+                <w:sz w:val="19"/>
+                <w:szCs w:val="19"/>
+              </w:rPr>
+              <w:t xml:space="preserve">Hakem</w:t>
+            </w:r>
+          </w:p>
+        </w:tc>
+        <w:tc>
+          <w:tcPr>
+            <w:tcW w:type="dxa" w:w="3103"/>
+            <w:tcBorders>
+              <w:top w:val="single" w:color="BFBFBF" w:sz="4"/>
+              <w:left w:val="single" w:color="BFBFBF" w:sz="4"/>
+              <w:bottom w:val="single" w:color="BFBFBF" w:sz="4"/>
+              <w:right w:val="single" w:color="BFBFBF" w:sz="4"/>
+            </w:tcBorders>
+            <w:tcMar>
+              <w:top w:type="dxa" w:w="60"/>
+              <w:left w:type="dxa" w:w="100"/>
+              <w:bottom w:type="dxa" w:w="60"/>
+              <w:right w:type="dxa" w:w="100"/>
+            </w:tcMar>
+          </w:tcPr>
+          <w:p>
+            <w:pPr>
+              <w:spacing w:after="20"/>
+            </w:pPr>
+            <w:r>
+              <w:rPr>
+                <w:rFonts w:ascii="Courier New" w:cs="Courier New" w:eastAsia="Courier New" w:hAnsi="Courier New"/>
+                <w:sz w:val="19"/>
+                <w:szCs w:val="19"/>
+              </w:rPr>
+              <w:t xml:space="preserve">gemini:gemini-3.5-flash-lite</w:t>
+            </w:r>
+          </w:p>
+        </w:tc>
+        <w:tc>
+          <w:tcPr>
+            <w:tcW w:type="dxa" w:w="4902"/>
+            <w:tcBorders>
+              <w:top w:val="single" w:color="BFBFBF" w:sz="4"/>
+              <w:left w:val="single" w:color="BFBFBF" w:sz="4"/>
+              <w:bottom w:val="single" w:color="BFBFBF" w:sz="4"/>
+              <w:right w:val="single" w:color="BFBFBF" w:sz="4"/>
+            </w:tcBorders>
+            <w:tcMar>
+              <w:top w:type="dxa" w:w="60"/>
+              <w:left w:type="dxa" w:w="100"/>
+              <w:bottom w:type="dxa" w:w="60"/>
+              <w:right w:type="dxa" w:w="100"/>
+            </w:tcMar>
+          </w:tcPr>
+          <w:p>
+            <w:pPr>
+              <w:spacing w:after="20"/>
+            </w:pPr>
+            <w:r>
+              <w:rPr>
+                <w:sz w:val="19"/>
+                <w:szCs w:val="19"/>
+              </w:rPr>
+              <w:t xml:space="preserve">Tür bazlı örneklemle (</w:t>
+            </w:r>
+            <w:r>
+              <w:rPr>
+                <w:rFonts w:ascii="Courier New" w:cs="Courier New" w:eastAsia="Courier New" w:hAnsi="Courier New"/>
+                <w:sz w:val="19"/>
+                <w:szCs w:val="19"/>
+              </w:rPr>
+              <w:t xml:space="preserve">tur</w:t>
+            </w:r>
+            <w:r>
+              <w:rPr>
+                <w:sz w:val="19"/>
+                <w:szCs w:val="19"/>
+              </w:rPr>
+              <w:t xml:space="preserve">) modelin isabetini ölçer.</w:t>
+            </w:r>
+          </w:p>
+        </w:tc>
+      </w:tr>
+      <w:tr>
+        <w:trPr>
+          <w:cantSplit/>
+        </w:trPr>
+        <w:tc>
+          <w:tcPr>
+            <w:tcW w:type="dxa" w:w="1633"/>
+            <w:tcBorders>
+              <w:top w:val="single" w:color="BFBFBF" w:sz="4"/>
+              <w:left w:val="single" w:color="BFBFBF" w:sz="4"/>
+              <w:bottom w:val="single" w:color="BFBFBF" w:sz="4"/>
+              <w:right w:val="single" w:color="BFBFBF" w:sz="4"/>
+            </w:tcBorders>
+            <w:tcMar>
+              <w:top w:type="dxa" w:w="60"/>
+              <w:left w:type="dxa" w:w="100"/>
+              <w:bottom w:type="dxa" w:w="60"/>
+              <w:right w:type="dxa" w:w="100"/>
+            </w:tcMar>
+          </w:tcPr>
+          <w:p>
+            <w:pPr>
+              <w:spacing w:after="20"/>
+            </w:pPr>
+            <w:r>
+              <w:rPr>
+                <w:sz w:val="19"/>
+                <w:szCs w:val="19"/>
+              </w:rPr>
+              <w:t xml:space="preserve">Yerel model</w:t>
+            </w:r>
+          </w:p>
+        </w:tc>
+        <w:tc>
+          <w:tcPr>
+            <w:tcW w:type="dxa" w:w="3103"/>
+            <w:tcBorders>
+              <w:top w:val="single" w:color="BFBFBF" w:sz="4"/>
+              <w:left w:val="single" w:color="BFBFBF" w:sz="4"/>
+              <w:bottom w:val="single" w:color="BFBFBF" w:sz="4"/>
+              <w:right w:val="single" w:color="BFBFBF" w:sz="4"/>
+            </w:tcBorders>
+            <w:tcMar>
+              <w:top w:type="dxa" w:w="60"/>
+              <w:left w:type="dxa" w:w="100"/>
+              <w:bottom w:type="dxa" w:w="60"/>
+              <w:right w:type="dxa" w:w="100"/>
+            </w:tcMar>
+          </w:tcPr>
+          <w:p>
+            <w:pPr>
+              <w:spacing w:after="20"/>
+            </w:pPr>
+            <w:r>
+              <w:rPr>
+                <w:rFonts w:ascii="Courier New" w:cs="Courier New" w:eastAsia="Courier New" w:hAnsi="Courier New"/>
+                <w:sz w:val="19"/>
+                <w:szCs w:val="19"/>
+              </w:rPr>
+              <w:t xml:space="preserve">qwen2.5vl:3b</w:t>
+            </w:r>
+          </w:p>
+        </w:tc>
+        <w:tc>
+          <w:tcPr>
+            <w:tcW w:type="dxa" w:w="4902"/>
+            <w:tcBorders>
+              <w:top w:val="single" w:color="BFBFBF" w:sz="4"/>
+              <w:left w:val="single" w:color="BFBFBF" w:sz="4"/>
+              <w:bottom w:val="single" w:color="BFBFBF" w:sz="4"/>
+              <w:right w:val="single" w:color="BFBFBF" w:sz="4"/>
+            </w:tcBorders>
+            <w:tcMar>
+              <w:top w:type="dxa" w:w="60"/>
+              <w:left w:type="dxa" w:w="100"/>
+              <w:bottom w:type="dxa" w:w="60"/>
+              <w:right w:type="dxa" w:w="100"/>
+            </w:tcMar>
+          </w:tcPr>
+          <w:p>
+            <w:pPr>
+              <w:spacing w:after="20"/>
+            </w:pPr>
+            <w:r>
+              <w:rPr>
+                <w:sz w:val="19"/>
+                <w:szCs w:val="19"/>
+              </w:rPr>
+              <w:t xml:space="preserve">Ollama incelemesi. Küçük modeller hataları kaçırabilir; GPU varsa </w:t>
+            </w:r>
+            <w:r>
+              <w:rPr>
+                <w:rFonts w:ascii="Courier New" w:cs="Courier New" w:eastAsia="Courier New" w:hAnsi="Courier New"/>
+                <w:sz w:val="19"/>
+                <w:szCs w:val="19"/>
+              </w:rPr>
+              <w:t xml:space="preserve">qwen2.5vl:7b</w:t>
+            </w:r>
+            <w:r>
+              <w:rPr>
+                <w:sz w:val="19"/>
+                <w:szCs w:val="19"/>
+              </w:rPr>
+              <w:t xml:space="preserve"> önerilir.</w:t>
+            </w:r>
+          </w:p>
+        </w:tc>
+      </w:tr>
+    </w:tbl>
+    <w:p>
+      <w:pPr>
+        <w:spacing w:after="100"/>
+      </w:pPr>
+    </w:p>
+    <w:p>
+      <w:pPr>
+        <w:pStyle w:val="Heading2"/>
+      </w:pPr>
+      <w:bookmarkStart w:name="b61" w:id="61"/>
+      <w:r>
+        <w:t xml:space="preserve">8.3 Anahtarlar ve güvenlik</w:t>
+      </w:r>
+      <w:bookmarkEnd w:id="61"/>
+    </w:p>
+    <w:p>
+      <w:pPr>
+        <w:pStyle w:val="ListParagraph"/>
+        <w:numPr>
+          <w:ilvl w:val="0"/>
+          <w:numId w:val="2"/>
+        </w:numPr>
+        <w:spacing w:after="60"/>
+      </w:pPr>
+      <w:r>
+        <w:t xml:space="preserve">Anahtarlar varsayılan olarak </w:t>
+      </w:r>
+      <w:r>
+        <w:rPr>
+          <w:b/>
+          <w:bCs/>
+        </w:rPr>
+        <w:t xml:space="preserve">diske yazılmaz</w:t>
+      </w:r>
+      <w:r>
+        <w:t xml:space="preserve">; yalnızca o oturumda kullanılır. Kalıcı olsun isterseniz </w:t>
+      </w:r>
+      <w:r>
+        <w:rPr>
+          <w:b/>
+          <w:bCs/>
+        </w:rPr>
+        <w:t xml:space="preserve">Anahtarları diske kaydet</w:t>
+      </w:r>
+      <w:r>
+        <w:t xml:space="preserve">'i işaretleyin; anahtarlar </w:t>
+      </w:r>
+      <w:r>
+        <w:rPr>
+          <w:rFonts w:ascii="Courier New" w:cs="Courier New" w:eastAsia="Courier New" w:hAnsi="Courier New"/>
+          <w:sz w:val="19"/>
+          <w:szCs w:val="19"/>
+        </w:rPr>
+        <w:t xml:space="preserve">ayarlar.json</w:t>
+      </w:r>
+      <w:r>
+        <w:t xml:space="preserve">'a yazılır ve bu dosya git'e girmez.</w:t>
+      </w:r>
+    </w:p>
+    <w:p>
+      <w:pPr>
+        <w:pStyle w:val="ListParagraph"/>
+        <w:numPr>
+          <w:ilvl w:val="0"/>
+          <w:numId w:val="2"/>
+        </w:numPr>
+        <w:spacing w:after="60"/>
+      </w:pPr>
+      <w:r>
+        <w:t xml:space="preserve">Anahtarlar araçlara ortam değişkeni olarak geçirilir ve çalışma kaydına hiçbir zaman açık yazılmaz.</w:t>
+      </w:r>
+    </w:p>
+    <w:p>
+      <w:pPr>
+        <w:pStyle w:val="ListParagraph"/>
+        <w:numPr>
+          <w:ilvl w:val="0"/>
+          <w:numId w:val="2"/>
+        </w:numPr>
+        <w:spacing w:after="60"/>
+      </w:pPr>
+      <w:r>
+        <w:t xml:space="preserve">Kurum içi bir sitenin ekran görüntüleri bulut modellere gönderilir. Bu kabul edilemiyorsa yerel Ollama ya da kurum içi OpenAI uyumlu bir sunucu kullanın.</w:t>
+      </w:r>
+    </w:p>
+    <w:p>
+      <w:pPr>
+        <w:pStyle w:val="Heading2"/>
+      </w:pPr>
+      <w:bookmarkStart w:name="b62" w:id="62"/>
+      <w:r>
+        <w:t xml:space="preserve">8.4 Kota, hız ve maliyet</w:t>
+      </w:r>
+      <w:bookmarkEnd w:id="62"/>
+    </w:p>
+    <w:p>
+      <w:pPr>
+        <w:pStyle w:val="ListParagraph"/>
+        <w:numPr>
+          <w:ilvl w:val="0"/>
+          <w:numId w:val="2"/>
+        </w:numPr>
+        <w:spacing w:after="60"/>
+      </w:pPr>
+      <w:r>
+        <w:rPr>
+          <w:b/>
+          <w:bCs/>
+        </w:rPr>
+        <w:t xml:space="preserve">Dakikada istek sınırı</w:t>
+      </w:r>
+      <w:r>
+        <w:t xml:space="preserve"> (varsayılan 8): ücretsiz Gemini katmanının dakikalık sınırına takılmamak için. Ücretli hesapta 0 (sınırsız) yapılabilir.</w:t>
+      </w:r>
+    </w:p>
+    <w:p>
+      <w:pPr>
+        <w:pStyle w:val="ListParagraph"/>
+        <w:numPr>
+          <w:ilvl w:val="0"/>
+          <w:numId w:val="2"/>
+        </w:numPr>
+        <w:spacing w:after="60"/>
+      </w:pPr>
+      <w:r>
+        <w:t xml:space="preserve">Günlük kota dolarsa analiz o model için durur; ertesi gün aynı adım kaldığı yerden devam eder.</w:t>
+      </w:r>
+    </w:p>
+    <w:p>
+      <w:pPr>
+        <w:pStyle w:val="ListParagraph"/>
+        <w:numPr>
+          <w:ilvl w:val="0"/>
+          <w:numId w:val="2"/>
+        </w:numPr>
+        <w:spacing w:after="60"/>
+      </w:pPr>
+      <w:r>
+        <w:rPr>
+          <w:b/>
+          <w:bCs/>
+        </w:rPr>
+        <w:t xml:space="preserve">3a. Maliyet/süre tahmini</w:t>
+      </w:r>
+      <w:r>
+        <w:t xml:space="preserve"> API çağırmadan istek sayısını ve Claude için tahmini maliyeti gösterir. Önce </w:t>
+      </w:r>
+      <w:r>
+        <w:rPr>
+          <w:b/>
+          <w:bCs/>
+        </w:rPr>
+        <w:t xml:space="preserve">Sayfa sınırı (deneme)</w:t>
+      </w:r>
+      <w:r>
+        <w:t xml:space="preserve"> ile küçük bir tur yapmanız önerilir.</w:t>
+      </w:r>
+    </w:p>
+    <w:p>
+      <w:pPr>
+        <w:pStyle w:val="ListParagraph"/>
+        <w:numPr>
+          <w:ilvl w:val="0"/>
+          <w:numId w:val="2"/>
+        </w:numPr>
+        <w:spacing w:after="60"/>
+      </w:pPr>
+      <w:r>
+        <w:t xml:space="preserve">Claude kullanıyorsanız </w:t>
+      </w:r>
+      <w:r>
+        <w:rPr>
+          <w:b/>
+          <w:bCs/>
+        </w:rPr>
+        <w:t xml:space="preserve">Claude toplu istek (Batch)</w:t>
+      </w:r>
+      <w:r>
+        <w:t xml:space="preserve"> maliyeti yarıya indirir; sonuç genelde bir saat içinde gelir.</w:t>
+      </w:r>
+    </w:p>
+    <w:p>
+      <w:pPr>
+        <w:pStyle w:val="Heading2"/>
+      </w:pPr>
+      <w:bookmarkStart w:name="b63" w:id="63"/>
+      <w:r>
+        <w:t xml:space="preserve">8.5 Modele giden talimat</w:t>
+      </w:r>
+      <w:bookmarkEnd w:id="63"/>
+    </w:p>
+    <w:p>
+      <w:pPr>
+        <w:spacing w:after="120"/>
+      </w:pPr>
+      <w:r>
+        <w:t xml:space="preserve">Her ekran görüntüsü cihaza göre dilimlenir (masaüstü 1024×1024, mobil 375×1334 piksel, görüntü başına en fazla 3 dilim) ve her dilim modele ayrı sorulur. Modele, sitenin tanımını ve dilini içeren İngilizce bir talimat, dilimin cihaz ve konum bilgisi, görüntü ve cevabın uyması gereken JSON şeması gider. Model yalnızca gerçek bir ziyaretçinin fark edeceği görsel hataları, her biri için görünen metni kanıt olarak kopyalayarak raporlar; emin olmadığı şeyi yazmaz. Hata türleri: yatay taşma, üst üste binme, kesik metin, kırık görsel, hizasızlık, düşük kontrast, bozuk karakter, açıklanamayan boşluk, bozuk gezinme, eksik veri, diğer.</w:t>
+      </w:r>
+    </w:p>
+    <w:p>
+      <w:pPr>
+        <w:spacing w:after="120"/>
+      </w:pPr>
+      <w:r>
+        <w:t xml:space="preserve">Talimattaki site tanımı ve dil </w:t>
+      </w:r>
+      <w:r>
+        <w:rPr>
+          <w:b/>
+          <w:bCs/>
+        </w:rPr>
+        <w:t xml:space="preserve">Ayarlar &gt; Site profili &gt; Yapay zekâ talimatı</w:t>
+      </w:r>
+      <w:r>
+        <w:t xml:space="preserve">'ndan değiştirilir. Talimatın tam metni </w:t>
+      </w:r>
+      <w:r>
+        <w:rPr>
+          <w:rFonts w:ascii="Courier New" w:cs="Courier New" w:eastAsia="Courier New" w:hAnsi="Courier New"/>
+          <w:sz w:val="19"/>
+          <w:szCs w:val="19"/>
+        </w:rPr>
+        <w:t xml:space="preserve">tools/visual_audit/analiz.py</w:t>
+      </w:r>
+      <w:r>
+        <w:t xml:space="preserve"> dosyasındadır.</w:t>
+      </w:r>
+    </w:p>
+    <w:p>
+      <w:pPr>
+        <w:pStyle w:val="Heading1"/>
+        <w:pageBreakBefore/>
+      </w:pPr>
+      <w:bookmarkStart w:name="b64" w:id="64"/>
+      <w:r>
+        <w:t xml:space="preserve">9. Ayarlar başvurusu</w:t>
+      </w:r>
+      <w:bookmarkEnd w:id="64"/>
+    </w:p>
+    <w:p>
+      <w:pPr>
+        <w:keepNext/>
+        <w:spacing w:after="40" w:before="80"/>
+        <w:jc w:val="center"/>
+      </w:pPr>
+      <w:r>
+        <w:drawing>
+          <wp:inline distT="0" distB="0" distL="0" distR="0">
+            <wp:extent cx="5905500" cy="4029075"/>
+            <wp:effectExtent t="0" r="0" b="0" l="0"/>
+            <wp:docPr id="1" name="12_ayarlar_site.png" descr="Ayarlar: site profili" title="Ayarlar: site profili"/>
+            <wp:cNvGraphicFramePr>
+              <a:graphicFrameLocks xmlns:a="http://schemas.openxmlformats.org/drawingml/2006/main" noChangeAspect="1"/>
+            </wp:cNvGraphicFramePr>
+            <a:graphic xmlns:a="http://schemas.openxmlformats.org/drawingml/2006/main">
+              <a:graphicData uri="http://schemas.openxmlformats.org/drawingml/2006/picture">
+                <pic:pic xmlns:pic="http://schemas.openxmlformats.org/drawingml/2006/picture">
+                  <pic:nvPicPr>
+                    <pic:cNvPr id="0" name="" descr=""/>
+                    <pic:cNvPicPr>
+                      <a:picLocks noChangeAspect="1" noChangeArrowheads="1"/>
+                    </pic:cNvPicPr>
+                  </pic:nvPicPr>
+                  <pic:blipFill>
+                    <a:blip r:embed="rId27" cstate="none"/>
+                    <a:srcRect/>
+                    <a:stretch>
+                      <a:fillRect/>
+                    </a:stretch>
+                  </pic:blipFill>
+                  <pic:spPr bwMode="auto">
+                    <a:xfrm>
+                      <a:off x="0" y="0"/>
+                      <a:ext cx="5905500" cy="4029075"/>
+                    </a:xfrm>
+                    <a:prstGeom prst="rect">
+                      <a:avLst/>
+                    </a:prstGeom>
+                  </pic:spPr>
+                </pic:pic>
+              </a:graphicData>
+            </a:graphic>
+          </wp:inline>
+        </w:drawing>
+      </w:r>
+    </w:p>
+    <w:p>
+      <w:pPr>
+        <w:spacing w:after="200"/>
+        <w:jc w:val="center"/>
+      </w:pPr>
+      <w:r>
+        <w:rPr>
+          <w:b/>
+          <w:bCs/>
+          <w:color w:val="595959"/>
+          <w:sz w:val="18"/>
+          <w:szCs w:val="18"/>
+        </w:rPr>
+        <w:t xml:space="preserve">Şekil 19. </w:t>
+      </w:r>
+      <w:r>
+        <w:rPr>
+          <w:i/>
+          <w:iCs/>
+          <w:color w:val="595959"/>
+          <w:sz w:val="18"/>
+          <w:szCs w:val="18"/>
+        </w:rPr>
         <w:t xml:space="preserve">Ayarlar: site profili</w:t>
       </w:r>
     </w:p>
@@ -20143,21 +20390,21 @@
       <w:pPr>
         <w:pStyle w:val="Heading2"/>
       </w:pPr>
-      <w:bookmarkStart w:name="b64" w:id="64"/>
+      <w:bookmarkStart w:name="b65" w:id="65"/>
       <w:r>
         <w:t xml:space="preserve">9.1 Site profili</w:t>
       </w:r>
-      <w:bookmarkEnd w:id="64"/>
+      <w:bookmarkEnd w:id="65"/>
     </w:p>
     <w:p>
       <w:pPr>
         <w:pStyle w:val="Heading3"/>
       </w:pPr>
-      <w:bookmarkStart w:name="b65" w:id="65"/>
+      <w:bookmarkStart w:name="b66" w:id="66"/>
       <w:r>
         <w:t xml:space="preserve">Site</w:t>
       </w:r>
-      <w:bookmarkEnd w:id="65"/>
+      <w:bookmarkEnd w:id="66"/>
     </w:p>
     <w:tbl>
       <w:tblPr>
@@ -20856,11 +21103,11 @@
       <w:pPr>
         <w:pStyle w:val="Heading3"/>
       </w:pPr>
-      <w:bookmarkStart w:name="b66" w:id="66"/>
+      <w:bookmarkStart w:name="b67" w:id="67"/>
       <w:r>
         <w:t xml:space="preserve">Keşif kuralları</w:t>
       </w:r>
-      <w:bookmarkEnd w:id="66"/>
+      <w:bookmarkEnd w:id="67"/>
     </w:p>
     <w:tbl>
       <w:tblPr>
@@ -22217,11 +22464,11 @@
       <w:pPr>
         <w:pStyle w:val="Heading3"/>
       </w:pPr>
-      <w:bookmarkStart w:name="b67" w:id="67"/>
+      <w:bookmarkStart w:name="b68" w:id="68"/>
       <w:r>
         <w:t xml:space="preserve">Test</w:t>
       </w:r>
-      <w:bookmarkEnd w:id="67"/>
+      <w:bookmarkEnd w:id="68"/>
     </w:p>
     <w:tbl>
       <w:tblPr>
@@ -23296,11 +23543,11 @@
       <w:pPr>
         <w:pStyle w:val="Heading3"/>
       </w:pPr>
-      <w:bookmarkStart w:name="b68" w:id="68"/>
+      <w:bookmarkStart w:name="b69" w:id="69"/>
       <w:r>
         <w:t xml:space="preserve">Görsel doğrulama ve düzeltme</w:t>
       </w:r>
-      <w:bookmarkEnd w:id="68"/>
+      <w:bookmarkEnd w:id="69"/>
     </w:p>
     <w:tbl>
       <w:tblPr>
@@ -24093,11 +24340,11 @@
       <w:pPr>
         <w:pStyle w:val="Heading3"/>
       </w:pPr>
-      <w:bookmarkStart w:name="b69" w:id="69"/>
+      <w:bookmarkStart w:name="b70" w:id="70"/>
       <w:r>
         <w:t xml:space="preserve">Yapay zekâ talimatı</w:t>
       </w:r>
-      <w:bookmarkEnd w:id="69"/>
+      <w:bookmarkEnd w:id="70"/>
     </w:p>
     <w:tbl>
       <w:tblPr>
@@ -24420,11 +24667,11 @@
       <w:pPr>
         <w:pStyle w:val="Heading3"/>
       </w:pPr>
-      <w:bookmarkStart w:name="b70" w:id="70"/>
+      <w:bookmarkStart w:name="b71" w:id="71"/>
       <w:r>
         <w:t xml:space="preserve">Bologna (OİBS)</w:t>
       </w:r>
-      <w:bookmarkEnd w:id="70"/>
+      <w:bookmarkEnd w:id="71"/>
     </w:p>
     <w:tbl>
       <w:tblPr>
@@ -24841,21 +25088,21 @@
       <w:pPr>
         <w:pStyle w:val="Heading2"/>
       </w:pPr>
-      <w:bookmarkStart w:name="b71" w:id="71"/>
+      <w:bookmarkStart w:name="b72" w:id="72"/>
       <w:r>
         <w:t xml:space="preserve">9.2 Yapay zekâ, Bologna, genel</w:t>
       </w:r>
-      <w:bookmarkEnd w:id="71"/>
+      <w:bookmarkEnd w:id="72"/>
     </w:p>
     <w:p>
       <w:pPr>
         <w:pStyle w:val="Heading3"/>
       </w:pPr>
-      <w:bookmarkStart w:name="b72" w:id="72"/>
+      <w:bookmarkStart w:name="b73" w:id="73"/>
       <w:r>
         <w:t xml:space="preserve">Sağlayıcılar ve modeller</w:t>
       </w:r>
-      <w:bookmarkEnd w:id="72"/>
+      <w:bookmarkEnd w:id="73"/>
     </w:p>
     <w:tbl>
       <w:tblPr>
@@ -26024,11 +26271,11 @@
       <w:pPr>
         <w:pStyle w:val="Heading3"/>
       </w:pPr>
-      <w:bookmarkStart w:name="b73" w:id="73"/>
+      <w:bookmarkStart w:name="b74" w:id="74"/>
       <w:r>
         <w:t xml:space="preserve">Yapay zekâ analiz hattı</w:t>
       </w:r>
-      <w:bookmarkEnd w:id="73"/>
+      <w:bookmarkEnd w:id="74"/>
     </w:p>
     <w:tbl>
       <w:tblPr>
@@ -27103,11 +27350,11 @@
       <w:pPr>
         <w:pStyle w:val="Heading3"/>
       </w:pPr>
-      <w:bookmarkStart w:name="b74" w:id="74"/>
+      <w:bookmarkStart w:name="b75" w:id="75"/>
       <w:r>
         <w:t xml:space="preserve">Bologna veritabanı</w:t>
       </w:r>
-      <w:bookmarkEnd w:id="74"/>
+      <w:bookmarkEnd w:id="75"/>
     </w:p>
     <w:tbl>
       <w:tblPr>
@@ -27806,11 +28053,11 @@
       <w:pPr>
         <w:pStyle w:val="Heading3"/>
       </w:pPr>
-      <w:bookmarkStart w:name="b75" w:id="75"/>
+      <w:bookmarkStart w:name="b76" w:id="76"/>
       <w:r>
         <w:t xml:space="preserve">Genel</w:t>
       </w:r>
-      <w:bookmarkEnd w:id="75"/>
+      <w:bookmarkEnd w:id="76"/>
     </w:p>
     <w:tbl>
       <w:tblPr>
@@ -28228,11 +28475,11 @@
         <w:pStyle w:val="Heading1"/>
         <w:pageBreakBefore/>
       </w:pPr>
-      <w:bookmarkStart w:name="b76" w:id="76"/>
+      <w:bookmarkStart w:name="b77" w:id="77"/>
       <w:r>
         <w:t xml:space="preserve">10. Komut satırı</w:t>
       </w:r>
-      <w:bookmarkEnd w:id="76"/>
+      <w:bookmarkEnd w:id="77"/>
     </w:p>
     <w:p>
       <w:pPr>
@@ -28504,11 +28751,11 @@
         <w:pStyle w:val="Heading1"/>
         <w:pageBreakBefore/>
       </w:pPr>
-      <w:bookmarkStart w:name="b77" w:id="77"/>
+      <w:bookmarkStart w:name="b78" w:id="78"/>
       <w:r>
         <w:t xml:space="preserve">11. Klasörler ve dosyalar</w:t>
       </w:r>
-      <w:bookmarkEnd w:id="77"/>
+      <w:bookmarkEnd w:id="78"/>
     </w:p>
     <w:tbl>
       <w:tblPr>
@@ -28869,11 +29116,11 @@
         <w:pStyle w:val="Heading1"/>
         <w:pageBreakBefore/>
       </w:pPr>
-      <w:bookmarkStart w:name="b78" w:id="78"/>
+      <w:bookmarkStart w:name="b79" w:id="79"/>
       <w:r>
         <w:t xml:space="preserve">12. Sorun giderme</w:t>
       </w:r>
-      <w:bookmarkEnd w:id="78"/>
+      <w:bookmarkEnd w:id="79"/>
     </w:p>
     <w:tbl>
       <w:tblPr>
@@ -30686,11 +30933,11 @@
         <w:pStyle w:val="Heading1"/>
         <w:pageBreakBefore/>
       </w:pPr>
-      <w:bookmarkStart w:name="b79" w:id="79"/>
+      <w:bookmarkStart w:name="b80" w:id="80"/>
       <w:r>
         <w:t xml:space="preserve">13. Sık sorulan sorular</w:t>
       </w:r>
-      <w:bookmarkEnd w:id="79"/>
+      <w:bookmarkEnd w:id="80"/>
     </w:p>
     <w:p>
       <w:pPr>
@@ -30895,11 +31142,11 @@
         <w:pStyle w:val="Heading1"/>
         <w:pageBreakBefore/>
       </w:pPr>
-      <w:bookmarkStart w:name="b80" w:id="80"/>
+      <w:bookmarkStart w:name="b81" w:id="81"/>
       <w:r>
         <w:t xml:space="preserve">Ek A. Bologna</w:t>
       </w:r>
-      <w:bookmarkEnd w:id="80"/>
+      <w:bookmarkEnd w:id="81"/>
     </w:p>
     <w:p>
       <w:pPr>
@@ -31073,11 +31320,11 @@
         <w:pStyle w:val="Heading1"/>
         <w:pageBreakBefore/>
       </w:pPr>
-      <w:bookmarkStart w:name="b81" w:id="81"/>
+      <w:bookmarkStart w:name="b82" w:id="82"/>
       <w:r>
         <w:t xml:space="preserve">Ek B. Geliştirme notları</w:t>
       </w:r>
-      <w:bookmarkEnd w:id="81"/>
+      <w:bookmarkEnd w:id="82"/>
     </w:p>
     <w:p>
       <w:pPr>

</xml_diff>

<commit_message>
Yapay zekâ analizi: yapılamayan istekler için açık uyarı ve tekrar deneme rehberi
- analiz.py: çalışma sonunda yapılamayan istekleri türüne göre sayar (Gemma kalıcı 500,
  kota/hız sınırı, geçersiz cevap, bağlantı) ve "⚠ N istekten M tanesi yapılamadı" ile
  ne yapılacağını yazar: aynı adımı tekrar çalıştırın (yalnız yapılamayanlar denenir),
  sonra hakem ve sonraki adımları. Uyarı programın Hatalar sekmesine de düşer.
- Hakem: hata türü örneklemesi (hakem örnek > 0, grup "tur") açıkken ana modelin hiç
  bakamadığı dilimler hakemden de düşüyordu; artık ikinci bir --sadece-bakilamayan
  turunda hakeme gider. Test eklendi.
- Adım açıklamaları ve kılavuz (5.3, 8.4, sorun giderme, SSS): hata alan isteklerin
  tekrar çalıştırmada yeniden denendiği, Gemma 500'ün nasıl ele alındığı ve 3b'den sonra
  3c-6'nın yeniden çalıştırılması gerektiği.

Co-Authored-By: Claude Opus 5.5 <noreply@anthropic.com>
Claude-Session: https://claude.ai/code/session_01Y7HA7zWrzagZQyqvydG6xL
</commit_message>
<xml_diff>
--- a/docs/KULLANIM_KILAVUZU.docx
+++ b/docs/KULLANIM_KILAVUZU.docx
@@ -1215,7 +1215,7 @@
             <w:szCs w:val="20"/>
           </w:rPr>
           <w:tab/>
-          <w:t xml:space="preserve">23</w:t>
+          <w:t xml:space="preserve">24</w:t>
         </w:r>
       </w:hyperlink>
     </w:p>
@@ -8586,6 +8586,36 @@
     </w:p>
     <w:p>
       <w:pPr>
+        <w:pStyle w:val="ListParagraph"/>
+        <w:numPr>
+          <w:ilvl w:val="0"/>
+          <w:numId w:val="2"/>
+        </w:numPr>
+        <w:spacing w:after="60"/>
+      </w:pPr>
+      <w:r>
+        <w:rPr>
+          <w:b/>
+          <w:bCs/>
+        </w:rPr>
+        <w:t xml:space="preserve">Hata alan istekler de yeniden denenir.</w:t>
+      </w:r>
+      <w:r>
+        <w:t xml:space="preserve"> Yapay zekâ analizi yalnız başarılı cevapları "yapıldı" sayar; sunucu hatası (ör. Gemma 500), kota ya da bağlantı hatası alan istekler aynı adım tekrar çalıştırıldığında yeniden gönderilir. Analiz bitince kayıtta (ve </w:t>
+      </w:r>
+      <w:r>
+        <w:rPr>
+          <w:b/>
+          <w:bCs/>
+        </w:rPr>
+        <w:t xml:space="preserve">Hatalar ve uyarılar</w:t>
+      </w:r>
+      <w:r>
+        <w:t xml:space="preserve"> sekmesinde) "⚠ N istekten M tanesi yapılamadı" uyarısı ve ne yapılacağı yazar.</w:t>
+      </w:r>
+    </w:p>
+    <w:p>
+      <w:pPr>
         <w:pStyle w:val="Heading2"/>
       </w:pPr>
       <w:bookmarkStart w:name="b32" w:id="32"/>
@@ -12402,7 +12432,7 @@
                 <w:sz w:val="19"/>
                 <w:szCs w:val="19"/>
               </w:rPr>
-              <w:t xml:space="preserve">Görüntüleri dilimleyip seçili modellere aynı talimat ve JSON şemasıyla sorar. Yarıda kalırsa tekrar çalıştırın, kaldığı yerden devam eder.</w:t>
+              <w:t xml:space="preserve">Görüntüleri dilimleyip seçili modellere aynı talimat ve JSON şemasıyla sorar. Yarıda kalırsa ya da sonunda 'N istek yapılamadı' uyarısı çıkarsa (Gemma 500, kota) tekrar çalıştırın: yalnız yapılamayanlar denenir. Sonra 3c ve sonrasını da çalıştırın.</w:t>
             </w:r>
           </w:p>
         </w:tc>
@@ -12518,7 +12548,7 @@
                 <w:sz w:val="19"/>
                 <w:szCs w:val="19"/>
               </w:rPr>
-              <w:t xml:space="preserve">Modellerin anlaşamadığı veya yüksek önem verdiği dilimleri hakem modele sorar.</w:t>
+              <w:t xml:space="preserve">Modellerin anlaşamadığı veya yüksek önem verdiği dilimleri ve ana modelin hiç bakamadığı dilimleri (ör. Gemma kalıcı 500) hakem modele sorar. 3b yeniden çalıştırıldıysa bu adımı ve sonrasını da yeniden çalıştırın.</w:t>
             </w:r>
           </w:p>
         </w:tc>
@@ -20191,6 +20221,56 @@
           <w:b/>
           <w:bCs/>
         </w:rPr>
+        <w:t xml:space="preserve">Gemma "gemma_500_kalici" hatası:</w:t>
+      </w:r>
+      <w:r>
+        <w:t xml:space="preserve"> Gemma bazı görüntülerde sunucu hatası (500) verir. Araç görüntüyü önce PNG, sonra JPEG olarak dener; ikisi de düşerse dilimi "bakılamadı" işaretleyip geçer ve </w:t>
+      </w:r>
+      <w:r>
+        <w:rPr>
+          <w:b/>
+          <w:bCs/>
+        </w:rPr>
+        <w:t xml:space="preserve">3c. Hakem modeli</w:t>
+      </w:r>
+      <w:r>
+        <w:t xml:space="preserve"> bu dilimlere bakar. Daha çok dilimin ana modelden geçmesi için analiz bitince </w:t>
+      </w:r>
+      <w:r>
+        <w:rPr>
+          <w:b/>
+          <w:bCs/>
+        </w:rPr>
+        <w:t xml:space="preserve">3b</w:t>
+      </w:r>
+      <w:r>
+        <w:t xml:space="preserve">'yi bir kez daha çalıştırın (yalnız yapılamayanlar denenir); ardından </w:t>
+      </w:r>
+      <w:r>
+        <w:rPr>
+          <w:b/>
+          <w:bCs/>
+        </w:rPr>
+        <w:t xml:space="preserve">3c, 4, 5 ve 6</w:t>
+      </w:r>
+      <w:r>
+        <w:t xml:space="preserve">'yı yeniden çalıştırın.</w:t>
+      </w:r>
+    </w:p>
+    <w:p>
+      <w:pPr>
+        <w:pStyle w:val="ListParagraph"/>
+        <w:numPr>
+          <w:ilvl w:val="0"/>
+          <w:numId w:val="2"/>
+        </w:numPr>
+        <w:spacing w:after="60"/>
+      </w:pPr>
+      <w:r>
+        <w:rPr>
+          <w:b/>
+          <w:bCs/>
+        </w:rPr>
         <w:t xml:space="preserve">3a. Maliyet/süre tahmini</w:t>
       </w:r>
       <w:r>
@@ -30421,6 +30501,130 @@
                 <w:sz w:val="19"/>
                 <w:szCs w:val="19"/>
               </w:rPr>
+              <w:t xml:space="preserve">Yapay zekâ: çok sayıda "gemma_500_kalici" ya da sonda "N istek yapılamadı"</w:t>
+            </w:r>
+          </w:p>
+        </w:tc>
+        <w:tc>
+          <w:tcPr>
+            <w:tcW w:type="dxa" w:w="2536"/>
+            <w:tcBorders>
+              <w:top w:val="single" w:color="BFBFBF" w:sz="4"/>
+              <w:left w:val="single" w:color="BFBFBF" w:sz="4"/>
+              <w:bottom w:val="single" w:color="BFBFBF" w:sz="4"/>
+              <w:right w:val="single" w:color="BFBFBF" w:sz="4"/>
+            </w:tcBorders>
+            <w:tcMar>
+              <w:top w:type="dxa" w:w="60"/>
+              <w:left w:type="dxa" w:w="100"/>
+              <w:bottom w:type="dxa" w:w="60"/>
+              <w:right w:type="dxa" w:w="100"/>
+            </w:tcMar>
+          </w:tcPr>
+          <w:p>
+            <w:pPr>
+              <w:spacing w:after="20"/>
+            </w:pPr>
+            <w:r>
+              <w:rPr>
+                <w:sz w:val="19"/>
+                <w:szCs w:val="19"/>
+              </w:rPr>
+              <w:t xml:space="preserve">Gemma sunucu hatası, kota ya da bağlantı sorunu.</w:t>
+            </w:r>
+          </w:p>
+        </w:tc>
+        <w:tc>
+          <w:tcPr>
+            <w:tcW w:type="dxa" w:w="4397"/>
+            <w:tcBorders>
+              <w:top w:val="single" w:color="BFBFBF" w:sz="4"/>
+              <w:left w:val="single" w:color="BFBFBF" w:sz="4"/>
+              <w:bottom w:val="single" w:color="BFBFBF" w:sz="4"/>
+              <w:right w:val="single" w:color="BFBFBF" w:sz="4"/>
+            </w:tcBorders>
+            <w:tcMar>
+              <w:top w:type="dxa" w:w="60"/>
+              <w:left w:type="dxa" w:w="100"/>
+              <w:bottom w:type="dxa" w:w="60"/>
+              <w:right w:type="dxa" w:w="100"/>
+            </w:tcMar>
+          </w:tcPr>
+          <w:p>
+            <w:pPr>
+              <w:spacing w:after="20"/>
+            </w:pPr>
+            <w:r>
+              <w:rPr>
+                <w:sz w:val="19"/>
+                <w:szCs w:val="19"/>
+              </w:rPr>
+              <w:t xml:space="preserve">Adım bitince </w:t>
+            </w:r>
+            <w:r>
+              <w:rPr>
+                <w:b/>
+                <w:bCs/>
+                <w:sz w:val="19"/>
+                <w:szCs w:val="19"/>
+              </w:rPr>
+              <w:t xml:space="preserve">3b</w:t>
+            </w:r>
+            <w:r>
+              <w:rPr>
+                <w:sz w:val="19"/>
+                <w:szCs w:val="19"/>
+              </w:rPr>
+              <w:t xml:space="preserve">'yi tekrar çalıştırın: yalnız yapılamayanlar denenir. Sonra </w:t>
+            </w:r>
+            <w:r>
+              <w:rPr>
+                <w:b/>
+                <w:bCs/>
+                <w:sz w:val="19"/>
+                <w:szCs w:val="19"/>
+              </w:rPr>
+              <w:t xml:space="preserve">3c, 4, 5, 6</w:t>
+            </w:r>
+            <w:r>
+              <w:rPr>
+                <w:sz w:val="19"/>
+                <w:szCs w:val="19"/>
+              </w:rPr>
+              <w:t xml:space="preserve">'yı yeniden çalıştırın. Yine düşen Gemma dilimlerine hakem bakar.</w:t>
+            </w:r>
+          </w:p>
+        </w:tc>
+      </w:tr>
+      <w:tr>
+        <w:trPr>
+          <w:cantSplit/>
+        </w:trPr>
+        <w:tc>
+          <w:tcPr>
+            <w:tcW w:type="dxa" w:w="2705"/>
+            <w:tcBorders>
+              <w:top w:val="single" w:color="BFBFBF" w:sz="4"/>
+              <w:left w:val="single" w:color="BFBFBF" w:sz="4"/>
+              <w:bottom w:val="single" w:color="BFBFBF" w:sz="4"/>
+              <w:right w:val="single" w:color="BFBFBF" w:sz="4"/>
+            </w:tcBorders>
+            <w:tcMar>
+              <w:top w:type="dxa" w:w="60"/>
+              <w:left w:type="dxa" w:w="100"/>
+              <w:bottom w:type="dxa" w:w="60"/>
+              <w:right w:type="dxa" w:w="100"/>
+            </w:tcMar>
+          </w:tcPr>
+          <w:p>
+            <w:pPr>
+              <w:spacing w:after="20"/>
+            </w:pPr>
+            <w:r>
+              <w:rPr>
+                <w:sz w:val="19"/>
+                <w:szCs w:val="19"/>
+              </w:rPr>
               <w:t xml:space="preserve">Yapay zekâ adımı "ornekler.csv yok" diyor</w:t>
             </w:r>
           </w:p>
@@ -31000,6 +31204,27 @@
       </w:pPr>
       <w:r>
         <w:t xml:space="preserve">Hayır. Aynı adımı yeniden çalıştırın; test, keşif, yapay zekâ analizi ve Bologna kaldığı yerden devam eder.</w:t>
+      </w:r>
+    </w:p>
+    <w:p>
+      <w:pPr>
+        <w:keepNext/>
+        <w:spacing w:after="40"/>
+      </w:pPr>
+      <w:r>
+        <w:rPr>
+          <w:b/>
+          <w:bCs/>
+        </w:rPr>
+        <w:t xml:space="preserve">Yapay zekâ analizinde hata alan istekler ne olur? Adımı tekrar çalıştırırsam hepsini baştan mı yapar?</w:t>
+      </w:r>
+    </w:p>
+    <w:p>
+      <w:pPr>
+        <w:spacing w:after="120"/>
+      </w:pPr>
+      <w:r>
+        <w:t xml:space="preserve">Hayır, yalnız yapılamayanları (sunucu hatası, kota, bağlantı) yeniden dener; başarılı olanlar atlanır. Analizi yeniden çalıştırdıysanız hakem (3c) ve sonraki adımları da yeniden çalıştırın ki son rapor güncellensin.</w:t>
       </w:r>
     </w:p>
     <w:p>

</xml_diff>

<commit_message>
AI analizi: Gemini isteklerine 5 dk zaman aşımı, ilerleme satırında başarılı/yapılamayan sayısı
Cevapsız kalan bağlantı artık asılı kalmıyor; zaman aşımı hata sayılıp yeniden
deneniyor. İlerleme satırı: [i/N] ✓ başarılı ✗ yapılamadı ~dk kaldı.
Kılavuza 'çalıştığını nasıl anlarım' notu ve sorun giderme satırı eklendi.

Co-Authored-By: Claude Opus 5.5 <noreply@anthropic.com>
Claude-Session: https://claude.ai/code/session_01Y7HA7zWrzagZQyqvydG6xL
</commit_message>
<xml_diff>
--- a/docs/KULLANIM_KILAVUZU.docx
+++ b/docs/KULLANIM_KILAVUZU.docx
@@ -8616,6 +8616,48 @@
     </w:p>
     <w:p>
       <w:pPr>
+        <w:pStyle w:val="ListParagraph"/>
+        <w:numPr>
+          <w:ilvl w:val="0"/>
+          <w:numId w:val="2"/>
+        </w:numPr>
+        <w:spacing w:after="60"/>
+      </w:pPr>
+      <w:r>
+        <w:rPr>
+          <w:b/>
+          <w:bCs/>
+        </w:rPr>
+        <w:t xml:space="preserve">Çalıştığını nasıl anlarım?</w:t>
+      </w:r>
+      <w:r>
+        <w:t xml:space="preserve"> Kayda yalnız hata alan istekler tek tek yazılır; başarılı cevaplar sessizce </w:t>
+      </w:r>
+      <w:r>
+        <w:rPr>
+          <w:rFonts w:ascii="Courier New" w:cs="Courier New" w:eastAsia="Courier New" w:hAnsi="Courier New"/>
+          <w:sz w:val="19"/>
+          <w:szCs w:val="19"/>
+        </w:rPr>
+        <w:t xml:space="preserve">sonuclar.jsonl</w:t>
+      </w:r>
+      <w:r>
+        <w:t xml:space="preserve"> dosyasına kaydedilir. Her 20 istekte bir </w:t>
+      </w:r>
+      <w:r>
+        <w:rPr>
+          <w:rFonts w:ascii="Courier New" w:cs="Courier New" w:eastAsia="Courier New" w:hAnsi="Courier New"/>
+          <w:sz w:val="19"/>
+          <w:szCs w:val="19"/>
+        </w:rPr>
+        <w:t xml:space="preserve">[340/3792] ✓ 270 başarılı  ✗ 70 yapılamadı  ~906 dk kaldı</w:t>
+      </w:r>
+      <w:r>
+        <w:t xml:space="preserve"> gibi bir ilerleme satırı çıkar. Gemma yavaş olduğu için iki satır arası 8–15 dakika sürebilir. Cevap vermeyen bir bağlantı 5 dakikada zaman aşımına uğrar ve yeniden denenir, yani istek asılı kalmaz. 30 dakikadan uzun süre yeni satır gelmezse (ör. bilgisayar uykuya geçtiyse) adımı durdurup yeniden başlatın; tamamlananlar atlanır.</w:t>
+      </w:r>
+    </w:p>
+    <w:p>
+      <w:pPr>
         <w:pStyle w:val="Heading2"/>
       </w:pPr>
       <w:bookmarkStart w:name="b32" w:id="32"/>
@@ -30468,6 +30510,106 @@
                 <w:szCs w:val="19"/>
               </w:rPr>
               <w:t xml:space="preserve">Ertesi gün aynı adımı çalıştırın; kaldığı yerden devam eder.</w:t>
+            </w:r>
+          </w:p>
+        </w:tc>
+      </w:tr>
+      <w:tr>
+        <w:trPr>
+          <w:cantSplit/>
+        </w:trPr>
+        <w:tc>
+          <w:tcPr>
+            <w:tcW w:type="dxa" w:w="2705"/>
+            <w:tcBorders>
+              <w:top w:val="single" w:color="BFBFBF" w:sz="4"/>
+              <w:left w:val="single" w:color="BFBFBF" w:sz="4"/>
+              <w:bottom w:val="single" w:color="BFBFBF" w:sz="4"/>
+              <w:right w:val="single" w:color="BFBFBF" w:sz="4"/>
+            </w:tcBorders>
+            <w:tcMar>
+              <w:top w:type="dxa" w:w="60"/>
+              <w:left w:type="dxa" w:w="100"/>
+              <w:bottom w:type="dxa" w:w="60"/>
+              <w:right w:type="dxa" w:w="100"/>
+            </w:tcMar>
+          </w:tcPr>
+          <w:p>
+            <w:pPr>
+              <w:spacing w:after="20"/>
+            </w:pPr>
+            <w:r>
+              <w:rPr>
+                <w:sz w:val="19"/>
+                <w:szCs w:val="19"/>
+              </w:rPr>
+              <w:t xml:space="preserve">Yapay zekâ analizi uzun süre ilerlemiyor gibi görünüyor</w:t>
+            </w:r>
+          </w:p>
+        </w:tc>
+        <w:tc>
+          <w:tcPr>
+            <w:tcW w:type="dxa" w:w="2536"/>
+            <w:tcBorders>
+              <w:top w:val="single" w:color="BFBFBF" w:sz="4"/>
+              <w:left w:val="single" w:color="BFBFBF" w:sz="4"/>
+              <w:bottom w:val="single" w:color="BFBFBF" w:sz="4"/>
+              <w:right w:val="single" w:color="BFBFBF" w:sz="4"/>
+            </w:tcBorders>
+            <w:tcMar>
+              <w:top w:type="dxa" w:w="60"/>
+              <w:left w:type="dxa" w:w="100"/>
+              <w:bottom w:type="dxa" w:w="60"/>
+              <w:right w:type="dxa" w:w="100"/>
+            </w:tcMar>
+          </w:tcPr>
+          <w:p>
+            <w:pPr>
+              <w:spacing w:after="20"/>
+            </w:pPr>
+            <w:r>
+              <w:rPr>
+                <w:sz w:val="19"/>
+                <w:szCs w:val="19"/>
+              </w:rPr>
+              <w:t xml:space="preserve">Ekrana yalnız hatalar yazılır; Gemma yavaştır.</w:t>
+            </w:r>
+          </w:p>
+        </w:tc>
+        <w:tc>
+          <w:tcPr>
+            <w:tcW w:type="dxa" w:w="4397"/>
+            <w:tcBorders>
+              <w:top w:val="single" w:color="BFBFBF" w:sz="4"/>
+              <w:left w:val="single" w:color="BFBFBF" w:sz="4"/>
+              <w:bottom w:val="single" w:color="BFBFBF" w:sz="4"/>
+              <w:right w:val="single" w:color="BFBFBF" w:sz="4"/>
+            </w:tcBorders>
+            <w:tcMar>
+              <w:top w:type="dxa" w:w="60"/>
+              <w:left w:type="dxa" w:w="100"/>
+              <w:bottom w:type="dxa" w:w="60"/>
+              <w:right w:type="dxa" w:w="100"/>
+            </w:tcMar>
+          </w:tcPr>
+          <w:p>
+            <w:pPr>
+              <w:spacing w:after="20"/>
+            </w:pPr>
+            <w:r>
+              <w:rPr>
+                <w:rFonts w:ascii="Courier New" w:cs="Courier New" w:eastAsia="Courier New" w:hAnsi="Courier New"/>
+                <w:sz w:val="19"/>
+                <w:szCs w:val="19"/>
+              </w:rPr>
+              <w:t xml:space="preserve">[i/N] ✓ … ✗ …</w:t>
+            </w:r>
+            <w:r>
+              <w:rPr>
+                <w:sz w:val="19"/>
+                <w:szCs w:val="19"/>
+              </w:rPr>
+              <w:t xml:space="preserve"> satırındaki sayaç ilerliyorsa çalışıyordur (satır arası 8–15 dk normal). 30 dakikadan uzun süre yeni satır yoksa adımı durdurup yeniden başlatın; tamamlananlar atlanır. Bilgisayarın uykuya geçmediğinden emin olun.</w:t>
             </w:r>
           </w:p>
         </w:tc>

</xml_diff>

<commit_message>
Yapay zekâ: ilk model ve hakem ayrı aşamalar, aralarında tamamlanma kontrolü
- 3b yapılamayanları aynı çalıştırmada 2 tur daha dener (--tekrar-tur)
- Kapsam (beklenen/tamam/yapılamadı/denenmedi) kapsam.json'a yazılır; hiç
  denenmemiş ya da kota yüzünden kalan dilim varsa 3b çıkış kodu 3 ile biter
- 3c ilk model tamamlanmadan başlamaz (--zorla ile geçilir); ilk modelin
  denemelere rağmen bakamadığı her dilim (yalnız Gemma 500 değil) hakeme gider
- Tamamlanmış görüntüler yeniden dilimlenmez
- Ana sayfa yol haritasında hazırlık / ilk model / hakem ve rapor ayrı satırlar
- Kılavuz güncellendi

Co-Authored-By: Claude Opus 5.5 <noreply@anthropic.com>
Claude-Session: https://claude.ai/code/session_01Y7HA7zWrzagZQyqvydG6xL
</commit_message>
<xml_diff>
--- a/docs/KULLANIM_KILAVUZU.docx
+++ b/docs/KULLANIM_KILAVUZU.docx
@@ -975,7 +975,7 @@
             <w:szCs w:val="20"/>
           </w:rPr>
           <w:tab/>
-          <w:t xml:space="preserve">19</w:t>
+          <w:t xml:space="preserve">20</w:t>
         </w:r>
       </w:hyperlink>
     </w:p>
@@ -1005,7 +1005,7 @@
             <w:szCs w:val="20"/>
           </w:rPr>
           <w:tab/>
-          <w:t xml:space="preserve">19</w:t>
+          <w:t xml:space="preserve">20</w:t>
         </w:r>
       </w:hyperlink>
     </w:p>
@@ -1035,7 +1035,7 @@
             <w:szCs w:val="20"/>
           </w:rPr>
           <w:tab/>
-          <w:t xml:space="preserve">19</w:t>
+          <w:t xml:space="preserve">20</w:t>
         </w:r>
       </w:hyperlink>
     </w:p>
@@ -1065,7 +1065,7 @@
             <w:szCs w:val="20"/>
           </w:rPr>
           <w:tab/>
-          <w:t xml:space="preserve">20</w:t>
+          <w:t xml:space="preserve">21</w:t>
         </w:r>
       </w:hyperlink>
     </w:p>
@@ -1095,7 +1095,7 @@
             <w:szCs w:val="20"/>
           </w:rPr>
           <w:tab/>
-          <w:t xml:space="preserve">20</w:t>
+          <w:t xml:space="preserve">21</w:t>
         </w:r>
       </w:hyperlink>
     </w:p>
@@ -1125,7 +1125,7 @@
             <w:szCs w:val="20"/>
           </w:rPr>
           <w:tab/>
-          <w:t xml:space="preserve">20</w:t>
+          <w:t xml:space="preserve">21</w:t>
         </w:r>
       </w:hyperlink>
     </w:p>
@@ -1155,7 +1155,7 @@
             <w:szCs w:val="20"/>
           </w:rPr>
           <w:tab/>
-          <w:t xml:space="preserve">22</w:t>
+          <w:t xml:space="preserve">23</w:t>
         </w:r>
       </w:hyperlink>
     </w:p>
@@ -1185,7 +1185,7 @@
             <w:szCs w:val="20"/>
           </w:rPr>
           <w:tab/>
-          <w:t xml:space="preserve">23</w:t>
+          <w:t xml:space="preserve">24</w:t>
         </w:r>
       </w:hyperlink>
     </w:p>
@@ -1215,7 +1215,7 @@
             <w:szCs w:val="20"/>
           </w:rPr>
           <w:tab/>
-          <w:t xml:space="preserve">24</w:t>
+          <w:t xml:space="preserve">25</w:t>
         </w:r>
       </w:hyperlink>
     </w:p>
@@ -1245,7 +1245,7 @@
             <w:szCs w:val="20"/>
           </w:rPr>
           <w:tab/>
-          <w:t xml:space="preserve">25</w:t>
+          <w:t xml:space="preserve">26</w:t>
         </w:r>
       </w:hyperlink>
     </w:p>
@@ -1275,7 +1275,7 @@
             <w:szCs w:val="20"/>
           </w:rPr>
           <w:tab/>
-          <w:t xml:space="preserve">25</w:t>
+          <w:t xml:space="preserve">26</w:t>
         </w:r>
       </w:hyperlink>
     </w:p>
@@ -1305,7 +1305,7 @@
             <w:szCs w:val="20"/>
           </w:rPr>
           <w:tab/>
-          <w:t xml:space="preserve">25</w:t>
+          <w:t xml:space="preserve">26</w:t>
         </w:r>
       </w:hyperlink>
     </w:p>
@@ -1335,7 +1335,7 @@
             <w:szCs w:val="20"/>
           </w:rPr>
           <w:tab/>
-          <w:t xml:space="preserve">27</w:t>
+          <w:t xml:space="preserve">28</w:t>
         </w:r>
       </w:hyperlink>
     </w:p>
@@ -1365,7 +1365,7 @@
             <w:szCs w:val="20"/>
           </w:rPr>
           <w:tab/>
-          <w:t xml:space="preserve">28</w:t>
+          <w:t xml:space="preserve">29</w:t>
         </w:r>
       </w:hyperlink>
     </w:p>
@@ -1395,7 +1395,7 @@
             <w:szCs w:val="20"/>
           </w:rPr>
           <w:tab/>
-          <w:t xml:space="preserve">29</w:t>
+          <w:t xml:space="preserve">30</w:t>
         </w:r>
       </w:hyperlink>
     </w:p>
@@ -1425,7 +1425,7 @@
             <w:szCs w:val="20"/>
           </w:rPr>
           <w:tab/>
-          <w:t xml:space="preserve">29</w:t>
+          <w:t xml:space="preserve">30</w:t>
         </w:r>
       </w:hyperlink>
     </w:p>
@@ -1455,7 +1455,7 @@
             <w:szCs w:val="20"/>
           </w:rPr>
           <w:tab/>
-          <w:t xml:space="preserve">29</w:t>
+          <w:t xml:space="preserve">30</w:t>
         </w:r>
       </w:hyperlink>
     </w:p>
@@ -1485,7 +1485,7 @@
             <w:szCs w:val="20"/>
           </w:rPr>
           <w:tab/>
-          <w:t xml:space="preserve">29</w:t>
+          <w:t xml:space="preserve">30</w:t>
         </w:r>
       </w:hyperlink>
     </w:p>
@@ -1515,7 +1515,7 @@
             <w:szCs w:val="20"/>
           </w:rPr>
           <w:tab/>
-          <w:t xml:space="preserve">30</w:t>
+          <w:t xml:space="preserve">31</w:t>
         </w:r>
       </w:hyperlink>
     </w:p>
@@ -1545,7 +1545,7 @@
             <w:szCs w:val="20"/>
           </w:rPr>
           <w:tab/>
-          <w:t xml:space="preserve">30</w:t>
+          <w:t xml:space="preserve">31</w:t>
         </w:r>
       </w:hyperlink>
     </w:p>
@@ -1575,7 +1575,7 @@
             <w:szCs w:val="20"/>
           </w:rPr>
           <w:tab/>
-          <w:t xml:space="preserve">31</w:t>
+          <w:t xml:space="preserve">32</w:t>
         </w:r>
       </w:hyperlink>
     </w:p>
@@ -1605,7 +1605,7 @@
             <w:szCs w:val="20"/>
           </w:rPr>
           <w:tab/>
-          <w:t xml:space="preserve">32</w:t>
+          <w:t xml:space="preserve">33</w:t>
         </w:r>
       </w:hyperlink>
     </w:p>
@@ -1635,7 +1635,7 @@
             <w:szCs w:val="20"/>
           </w:rPr>
           <w:tab/>
-          <w:t xml:space="preserve">32</w:t>
+          <w:t xml:space="preserve">33</w:t>
         </w:r>
       </w:hyperlink>
     </w:p>
@@ -1665,7 +1665,7 @@
             <w:szCs w:val="20"/>
           </w:rPr>
           <w:tab/>
-          <w:t xml:space="preserve">33</w:t>
+          <w:t xml:space="preserve">34</w:t>
         </w:r>
       </w:hyperlink>
     </w:p>
@@ -1695,7 +1695,7 @@
             <w:szCs w:val="20"/>
           </w:rPr>
           <w:tab/>
-          <w:t xml:space="preserve">33</w:t>
+          <w:t xml:space="preserve">34</w:t>
         </w:r>
       </w:hyperlink>
     </w:p>
@@ -1725,7 +1725,7 @@
             <w:szCs w:val="20"/>
           </w:rPr>
           <w:tab/>
-          <w:t xml:space="preserve">33</w:t>
+          <w:t xml:space="preserve">34</w:t>
         </w:r>
       </w:hyperlink>
     </w:p>
@@ -1755,7 +1755,7 @@
             <w:szCs w:val="20"/>
           </w:rPr>
           <w:tab/>
-          <w:t xml:space="preserve">33</w:t>
+          <w:t xml:space="preserve">34</w:t>
         </w:r>
       </w:hyperlink>
     </w:p>
@@ -1785,7 +1785,7 @@
             <w:szCs w:val="20"/>
           </w:rPr>
           <w:tab/>
-          <w:t xml:space="preserve">34</w:t>
+          <w:t xml:space="preserve">35</w:t>
         </w:r>
       </w:hyperlink>
     </w:p>
@@ -1815,7 +1815,7 @@
             <w:szCs w:val="20"/>
           </w:rPr>
           <w:tab/>
-          <w:t xml:space="preserve">34</w:t>
+          <w:t xml:space="preserve">35</w:t>
         </w:r>
       </w:hyperlink>
     </w:p>
@@ -1845,7 +1845,7 @@
             <w:szCs w:val="20"/>
           </w:rPr>
           <w:tab/>
-          <w:t xml:space="preserve">36</w:t>
+          <w:t xml:space="preserve">37</w:t>
         </w:r>
       </w:hyperlink>
     </w:p>
@@ -1875,7 +1875,7 @@
             <w:szCs w:val="20"/>
           </w:rPr>
           <w:tab/>
-          <w:t xml:space="preserve">39</w:t>
+          <w:t xml:space="preserve">40</w:t>
         </w:r>
       </w:hyperlink>
     </w:p>
@@ -1905,7 +1905,7 @@
             <w:szCs w:val="20"/>
           </w:rPr>
           <w:tab/>
-          <w:t xml:space="preserve">40</w:t>
+          <w:t xml:space="preserve">41</w:t>
         </w:r>
       </w:hyperlink>
     </w:p>
@@ -1935,7 +1935,7 @@
             <w:szCs w:val="20"/>
           </w:rPr>
           <w:tab/>
-          <w:t xml:space="preserve">41</w:t>
+          <w:t xml:space="preserve">42</w:t>
         </w:r>
       </w:hyperlink>
     </w:p>
@@ -1965,7 +1965,7 @@
             <w:szCs w:val="20"/>
           </w:rPr>
           <w:tab/>
-          <w:t xml:space="preserve">43</w:t>
+          <w:t xml:space="preserve">44</w:t>
         </w:r>
       </w:hyperlink>
     </w:p>
@@ -1995,7 +1995,7 @@
             <w:szCs w:val="20"/>
           </w:rPr>
           <w:tab/>
-          <w:t xml:space="preserve">44</w:t>
+          <w:t xml:space="preserve">45</w:t>
         </w:r>
       </w:hyperlink>
     </w:p>
@@ -2025,7 +2025,7 @@
             <w:szCs w:val="20"/>
           </w:rPr>
           <w:tab/>
-          <w:t xml:space="preserve">45</w:t>
+          <w:t xml:space="preserve">46</w:t>
         </w:r>
       </w:hyperlink>
     </w:p>
@@ -7992,7 +7992,7 @@
                 <w:sz w:val="19"/>
                 <w:szCs w:val="19"/>
               </w:rPr>
-              <w:t xml:space="preserve">Yapay zekâ görsel denetimi</w:t>
+              <w:t xml:space="preserve">Yapay zekâ: hazırlık</w:t>
             </w:r>
           </w:p>
         </w:tc>
@@ -8021,7 +8021,7 @@
                 <w:sz w:val="19"/>
                 <w:szCs w:val="19"/>
               </w:rPr>
-              <w:t xml:space="preserve">Kodla ölçülemeyen görsel hatalar (üst üste binme, eksik veri, bozuk karakter …) için.</w:t>
+              <w:t xml:space="preserve">Görüntüler kodla taranır, her şablondan temsilciler seçilip yeniden çekilir.</w:t>
             </w:r>
           </w:p>
         </w:tc>
@@ -8084,7 +8084,7 @@
                 <w:sz w:val="19"/>
                 <w:szCs w:val="19"/>
               </w:rPr>
-              <w:t xml:space="preserve">Doğrula ve düzelt</w:t>
+              <w:t xml:space="preserve">Yapay zekâ: ilk model</w:t>
             </w:r>
           </w:p>
         </w:tc>
@@ -8113,7 +8113,7 @@
                 <w:sz w:val="19"/>
                 <w:szCs w:val="19"/>
               </w:rPr>
-              <w:t xml:space="preserve">Bulgular canlı sitede doğrulanır; taşma için CSS düzeltme önerisi üretilir.</w:t>
+              <w:t xml:space="preserve">Temsilcilerin her dilimi ilk modele (Gemma) sorulur. Satırda kapsam görünür (ör. 3990/4084 dilim, 94 yapılamadı). Hiç denenmemiş ya da kota yüzünden kalan dilim varsa aşama tamam sayılmaz.</w:t>
             </w:r>
           </w:p>
         </w:tc>
@@ -8148,6 +8148,190 @@
                 <w:szCs w:val="19"/>
               </w:rPr>
               <w:t xml:space="preserve">8</w:t>
+            </w:r>
+          </w:p>
+        </w:tc>
+        <w:tc>
+          <w:tcPr>
+            <w:tcW w:type="dxa" w:w="2613"/>
+            <w:tcBorders>
+              <w:top w:val="single" w:color="BFBFBF" w:sz="4"/>
+              <w:left w:val="single" w:color="BFBFBF" w:sz="4"/>
+              <w:bottom w:val="single" w:color="BFBFBF" w:sz="4"/>
+              <w:right w:val="single" w:color="BFBFBF" w:sz="4"/>
+            </w:tcBorders>
+            <w:tcMar>
+              <w:top w:type="dxa" w:w="60"/>
+              <w:left w:type="dxa" w:w="100"/>
+              <w:bottom w:type="dxa" w:w="60"/>
+              <w:right w:type="dxa" w:w="100"/>
+            </w:tcMar>
+          </w:tcPr>
+          <w:p>
+            <w:pPr>
+              <w:spacing w:after="20"/>
+            </w:pPr>
+            <w:r>
+              <w:rPr>
+                <w:sz w:val="19"/>
+                <w:szCs w:val="19"/>
+              </w:rPr>
+              <w:t xml:space="preserve">Yapay zekâ: hakem ve rapor</w:t>
+            </w:r>
+          </w:p>
+        </w:tc>
+        <w:tc>
+          <w:tcPr>
+            <w:tcW w:type="dxa" w:w="6535"/>
+            <w:tcBorders>
+              <w:top w:val="single" w:color="BFBFBF" w:sz="4"/>
+              <w:left w:val="single" w:color="BFBFBF" w:sz="4"/>
+              <w:bottom w:val="single" w:color="BFBFBF" w:sz="4"/>
+              <w:right w:val="single" w:color="BFBFBF" w:sz="4"/>
+            </w:tcBorders>
+            <w:tcMar>
+              <w:top w:type="dxa" w:w="60"/>
+              <w:left w:type="dxa" w:w="100"/>
+              <w:bottom w:type="dxa" w:w="60"/>
+              <w:right w:type="dxa" w:w="100"/>
+            </w:tcMar>
+          </w:tcPr>
+          <w:p>
+            <w:pPr>
+              <w:spacing w:after="20"/>
+            </w:pPr>
+            <w:r>
+              <w:rPr>
+                <w:sz w:val="19"/>
+                <w:szCs w:val="19"/>
+              </w:rPr>
+              <w:t xml:space="preserve">Şüpheli dilimler ve ilk modelin bakamadığı dilimler hakeme gider; isabet, metin kontrolü ve son rapor üretilir. İlk model tamamlanmadan başlamaz.</w:t>
+            </w:r>
+          </w:p>
+        </w:tc>
+      </w:tr>
+      <w:tr>
+        <w:trPr>
+          <w:cantSplit/>
+        </w:trPr>
+        <w:tc>
+          <w:tcPr>
+            <w:tcW w:type="dxa" w:w="490"/>
+            <w:tcBorders>
+              <w:top w:val="single" w:color="BFBFBF" w:sz="4"/>
+              <w:left w:val="single" w:color="BFBFBF" w:sz="4"/>
+              <w:bottom w:val="single" w:color="BFBFBF" w:sz="4"/>
+              <w:right w:val="single" w:color="BFBFBF" w:sz="4"/>
+            </w:tcBorders>
+            <w:tcMar>
+              <w:top w:type="dxa" w:w="60"/>
+              <w:left w:type="dxa" w:w="100"/>
+              <w:bottom w:type="dxa" w:w="60"/>
+              <w:right w:type="dxa" w:w="100"/>
+            </w:tcMar>
+          </w:tcPr>
+          <w:p>
+            <w:pPr>
+              <w:spacing w:after="20"/>
+            </w:pPr>
+            <w:r>
+              <w:rPr>
+                <w:sz w:val="19"/>
+                <w:szCs w:val="19"/>
+              </w:rPr>
+              <w:t xml:space="preserve">9</w:t>
+            </w:r>
+          </w:p>
+        </w:tc>
+        <w:tc>
+          <w:tcPr>
+            <w:tcW w:type="dxa" w:w="2613"/>
+            <w:tcBorders>
+              <w:top w:val="single" w:color="BFBFBF" w:sz="4"/>
+              <w:left w:val="single" w:color="BFBFBF" w:sz="4"/>
+              <w:bottom w:val="single" w:color="BFBFBF" w:sz="4"/>
+              <w:right w:val="single" w:color="BFBFBF" w:sz="4"/>
+            </w:tcBorders>
+            <w:tcMar>
+              <w:top w:type="dxa" w:w="60"/>
+              <w:left w:type="dxa" w:w="100"/>
+              <w:bottom w:type="dxa" w:w="60"/>
+              <w:right w:type="dxa" w:w="100"/>
+            </w:tcMar>
+          </w:tcPr>
+          <w:p>
+            <w:pPr>
+              <w:spacing w:after="20"/>
+            </w:pPr>
+            <w:r>
+              <w:rPr>
+                <w:sz w:val="19"/>
+                <w:szCs w:val="19"/>
+              </w:rPr>
+              <w:t xml:space="preserve">Doğrula ve düzelt</w:t>
+            </w:r>
+          </w:p>
+        </w:tc>
+        <w:tc>
+          <w:tcPr>
+            <w:tcW w:type="dxa" w:w="6535"/>
+            <w:tcBorders>
+              <w:top w:val="single" w:color="BFBFBF" w:sz="4"/>
+              <w:left w:val="single" w:color="BFBFBF" w:sz="4"/>
+              <w:bottom w:val="single" w:color="BFBFBF" w:sz="4"/>
+              <w:right w:val="single" w:color="BFBFBF" w:sz="4"/>
+            </w:tcBorders>
+            <w:tcMar>
+              <w:top w:type="dxa" w:w="60"/>
+              <w:left w:type="dxa" w:w="100"/>
+              <w:bottom w:type="dxa" w:w="60"/>
+              <w:right w:type="dxa" w:w="100"/>
+            </w:tcMar>
+          </w:tcPr>
+          <w:p>
+            <w:pPr>
+              <w:spacing w:after="20"/>
+            </w:pPr>
+            <w:r>
+              <w:rPr>
+                <w:sz w:val="19"/>
+                <w:szCs w:val="19"/>
+              </w:rPr>
+              <w:t xml:space="preserve">Bulgular canlı sitede doğrulanır; taşma için CSS düzeltme önerisi üretilir.</w:t>
+            </w:r>
+          </w:p>
+        </w:tc>
+      </w:tr>
+      <w:tr>
+        <w:trPr>
+          <w:cantSplit/>
+        </w:trPr>
+        <w:tc>
+          <w:tcPr>
+            <w:tcW w:type="dxa" w:w="490"/>
+            <w:tcBorders>
+              <w:top w:val="single" w:color="BFBFBF" w:sz="4"/>
+              <w:left w:val="single" w:color="BFBFBF" w:sz="4"/>
+              <w:bottom w:val="single" w:color="BFBFBF" w:sz="4"/>
+              <w:right w:val="single" w:color="BFBFBF" w:sz="4"/>
+            </w:tcBorders>
+            <w:tcMar>
+              <w:top w:type="dxa" w:w="60"/>
+              <w:left w:type="dxa" w:w="100"/>
+              <w:bottom w:type="dxa" w:w="60"/>
+              <w:right w:type="dxa" w:w="100"/>
+            </w:tcMar>
+          </w:tcPr>
+          <w:p>
+            <w:pPr>
+              <w:spacing w:after="20"/>
+            </w:pPr>
+            <w:r>
+              <w:rPr>
+                <w:sz w:val="19"/>
+                <w:szCs w:val="19"/>
+              </w:rPr>
+              <w:t xml:space="preserve">10</w:t>
             </w:r>
           </w:p>
         </w:tc>
@@ -8601,17 +8785,47 @@
         <w:t xml:space="preserve">Hata alan istekler de yeniden denenir.</w:t>
       </w:r>
       <w:r>
-        <w:t xml:space="preserve"> Yapay zekâ analizi yalnız başarılı cevapları "yapıldı" sayar; sunucu hatası (ör. Gemma 500), kota ya da bağlantı hatası alan istekler aynı adım tekrar çalıştırıldığında yeniden gönderilir. Analiz bitince kayıtta (ve </w:t>
+        <w:t xml:space="preserve"> Yapay zekâ analizi yalnız başarılı cevapları "yapıldı" sayar. Sunucu hatası (ör. Gemma 500), zaman aşımı ya da kota hatası alan istekler aynı çalıştırmada otomatik olarak </w:t>
       </w:r>
       <w:r>
         <w:rPr>
           <w:b/>
           <w:bCs/>
         </w:rPr>
-        <w:t xml:space="preserve">Hatalar ve uyarılar</w:t>
-      </w:r>
-      <w:r>
-        <w:t xml:space="preserve"> sekmesinde) "⚠ N istekten M tanesi yapılamadı" uyarısı ve ne yapılacağı yazar.</w:t>
+        <w:t xml:space="preserve">2 tur daha</w:t>
+      </w:r>
+      <w:r>
+        <w:t xml:space="preserve"> denenir (kayıtta "Yeniden deneme turu 1/2"); adım sonradan tekrar çalıştırılırsa yine yalnız yapılamayanlar gönderilir.</w:t>
+      </w:r>
+    </w:p>
+    <w:p>
+      <w:pPr>
+        <w:pStyle w:val="ListParagraph"/>
+        <w:numPr>
+          <w:ilvl w:val="0"/>
+          <w:numId w:val="2"/>
+        </w:numPr>
+        <w:spacing w:after="60"/>
+      </w:pPr>
+      <w:r>
+        <w:rPr>
+          <w:b/>
+          <w:bCs/>
+        </w:rPr>
+        <w:t xml:space="preserve">İlk model ve hakem ayrı aşamalardır.</w:t>
+      </w:r>
+      <w:r>
+        <w:t xml:space="preserve"> 3b bitince kayda kapsam yazılır: "İlk model (gemini:gemma-4-31b-it): 3990/4084 dilim tamam, 94 yapılamadı". Hiç denenmemiş (yarıda kalmış) ya da kota yüzünden yapılamamış dilim varsa 3b </w:t>
+      </w:r>
+      <w:r>
+        <w:rPr>
+          <w:b/>
+          <w:bCs/>
+        </w:rPr>
+        <w:t xml:space="preserve">başarısız</w:t>
+      </w:r>
+      <w:r>
+        <w:t xml:space="preserve"> biter ("İlk model tamamlanmadı") ve hat hakeme geçmez; 3b'yi tekrar çalıştırın. 3c de başlamadan aynı kontrolü yapar. 3 denemede de yapılamayan dilimler (Gemma 500, zaman aşımı) ise hakeme gider; denetimsiz kalmaz.</w:t>
       </w:r>
     </w:p>
     <w:p>
@@ -12474,7 +12688,7 @@
                 <w:sz w:val="19"/>
                 <w:szCs w:val="19"/>
               </w:rPr>
-              <w:t xml:space="preserve">Görüntüleri dilimleyip seçili modellere aynı talimat ve JSON şemasıyla sorar. Yarıda kalırsa ya da sonunda 'N istek yapılamadı' uyarısı çıkarsa (Gemma 500, kota) tekrar çalıştırın: yalnız yapılamayanlar denenir. Sonra 3c ve sonrasını da çalıştırın.</w:t>
+              <w:t xml:space="preserve">İlk model aşaması. Görüntüleri dilimleyip seçili modellere aynı talimat ve JSON şemasıyla sorar; yapılamayanları aynı çalıştırmada 2 tur daha dener. Sonda kapsamı yazar (ör. 4084 dilimden 3990 tamam). Hiç denenmemiş ya da kota yüzünden kalan dilim varsa adım başarısız biter ve hakeme geçilmez: tekrar çalıştırın, yalnız eksikler denenir.</w:t>
             </w:r>
           </w:p>
         </w:tc>
@@ -12590,7 +12804,7 @@
                 <w:sz w:val="19"/>
                 <w:szCs w:val="19"/>
               </w:rPr>
-              <w:t xml:space="preserve">Modellerin anlaşamadığı veya yüksek önem verdiği dilimleri ve ana modelin hiç bakamadığı dilimleri (ör. Gemma kalıcı 500) hakem modele sorar. 3b yeniden çalıştırıldıysa bu adımı ve sonrasını da yeniden çalıştırın.</w:t>
+              <w:t xml:space="preserve">Hakem aşaması. Önce ilk modelin her dilimi denediğini kontrol eder; eksik varsa başlamaz. Modellerin anlaşamadığı veya yüksek önem verdiği dilimleri ve ilk modelin denemelere rağmen bakamadığı dilimleri (Gemma 500, zaman aşımı) hakem modele sorar. 3b yeniden çalıştırıldıysa bu adımı ve sonrasını da yeniden çalıştırın.</w:t>
             </w:r>
           </w:p>
         </w:tc>
@@ -20266,7 +20480,7 @@
         <w:t xml:space="preserve">Gemma "gemma_500_kalici" hatası:</w:t>
       </w:r>
       <w:r>
-        <w:t xml:space="preserve"> Gemma bazı görüntülerde sunucu hatası (500) verir. Araç görüntüyü önce PNG, sonra JPEG olarak dener; ikisi de düşerse dilimi "bakılamadı" işaretleyip geçer ve </w:t>
+        <w:t xml:space="preserve"> Gemma bazı görüntülerde sunucu hatası (500) verir. Araç görüntüyü önce PNG, sonra JPEG olarak dener; ikisi de düşerse dilimi "bakılamadı" işaretler. Bu dilimler aynı çalıştırmada 2 tur daha denenir; yine düşenlere </w:t>
       </w:r>
       <w:r>
         <w:rPr>
@@ -20276,7 +20490,7 @@
         <w:t xml:space="preserve">3c. Hakem modeli</w:t>
       </w:r>
       <w:r>
-        <w:t xml:space="preserve"> bu dilimlere bakar. Daha çok dilimin ana modelden geçmesi için analiz bitince </w:t>
+        <w:t xml:space="preserve"> bakar. İsterseniz 3c'den önce </w:t>
       </w:r>
       <w:r>
         <w:rPr>
@@ -20286,17 +20500,7 @@
         <w:t xml:space="preserve">3b</w:t>
       </w:r>
       <w:r>
-        <w:t xml:space="preserve">'yi bir kez daha çalıştırın (yalnız yapılamayanlar denenir); ardından </w:t>
-      </w:r>
-      <w:r>
-        <w:rPr>
-          <w:b/>
-          <w:bCs/>
-        </w:rPr>
-        <w:t xml:space="preserve">3c, 4, 5 ve 6</w:t>
-      </w:r>
-      <w:r>
-        <w:t xml:space="preserve">'yı yeniden çalıştırın.</w:t>
+        <w:t xml:space="preserve">'yi bir kez daha çalıştırıp ilk modele bir şans daha verebilirsiniz.</w:t>
       </w:r>
     </w:p>
     <w:p>
@@ -30610,6 +30814,107 @@
                 <w:szCs w:val="19"/>
               </w:rPr>
               <w:t xml:space="preserve"> satırındaki sayaç ilerliyorsa çalışıyordur (satır arası 8–15 dk normal). 30 dakikadan uzun süre yeni satır yoksa adımı durdurup yeniden başlatın; tamamlananlar atlanır. Bilgisayarın uykuya geçmediğinden emin olun.</w:t>
+            </w:r>
+          </w:p>
+        </w:tc>
+      </w:tr>
+      <w:tr>
+        <w:trPr>
+          <w:cantSplit/>
+        </w:trPr>
+        <w:tc>
+          <w:tcPr>
+            <w:tcW w:type="dxa" w:w="2705"/>
+            <w:tcBorders>
+              <w:top w:val="single" w:color="BFBFBF" w:sz="4"/>
+              <w:left w:val="single" w:color="BFBFBF" w:sz="4"/>
+              <w:bottom w:val="single" w:color="BFBFBF" w:sz="4"/>
+              <w:right w:val="single" w:color="BFBFBF" w:sz="4"/>
+            </w:tcBorders>
+            <w:tcMar>
+              <w:top w:type="dxa" w:w="60"/>
+              <w:left w:type="dxa" w:w="100"/>
+              <w:bottom w:type="dxa" w:w="60"/>
+              <w:right w:type="dxa" w:w="100"/>
+            </w:tcMar>
+          </w:tcPr>
+          <w:p>
+            <w:pPr>
+              <w:spacing w:after="20"/>
+            </w:pPr>
+            <w:r>
+              <w:rPr>
+                <w:sz w:val="19"/>
+                <w:szCs w:val="19"/>
+              </w:rPr>
+              <w:t xml:space="preserve">Yapay zekâ: 3b "İlk model tamamlanmadı" ile başarısız bitti ya da 3c "İlk model tamamlanmadan hakem başlamaz" diyor</w:t>
+            </w:r>
+          </w:p>
+        </w:tc>
+        <w:tc>
+          <w:tcPr>
+            <w:tcW w:type="dxa" w:w="2536"/>
+            <w:tcBorders>
+              <w:top w:val="single" w:color="BFBFBF" w:sz="4"/>
+              <w:left w:val="single" w:color="BFBFBF" w:sz="4"/>
+              <w:bottom w:val="single" w:color="BFBFBF" w:sz="4"/>
+              <w:right w:val="single" w:color="BFBFBF" w:sz="4"/>
+            </w:tcBorders>
+            <w:tcMar>
+              <w:top w:type="dxa" w:w="60"/>
+              <w:left w:type="dxa" w:w="100"/>
+              <w:bottom w:type="dxa" w:w="60"/>
+              <w:right w:type="dxa" w:w="100"/>
+            </w:tcMar>
+          </w:tcPr>
+          <w:p>
+            <w:pPr>
+              <w:spacing w:after="20"/>
+            </w:pPr>
+            <w:r>
+              <w:rPr>
+                <w:sz w:val="19"/>
+                <w:szCs w:val="19"/>
+              </w:rPr>
+              <w:t xml:space="preserve">Analiz yarıda kalmış ya da kota dolmuş; bazı dilimler ilk modele hiç sorulmamış.</w:t>
+            </w:r>
+          </w:p>
+        </w:tc>
+        <w:tc>
+          <w:tcPr>
+            <w:tcW w:type="dxa" w:w="4397"/>
+            <w:tcBorders>
+              <w:top w:val="single" w:color="BFBFBF" w:sz="4"/>
+              <w:left w:val="single" w:color="BFBFBF" w:sz="4"/>
+              <w:bottom w:val="single" w:color="BFBFBF" w:sz="4"/>
+              <w:right w:val="single" w:color="BFBFBF" w:sz="4"/>
+            </w:tcBorders>
+            <w:tcMar>
+              <w:top w:type="dxa" w:w="60"/>
+              <w:left w:type="dxa" w:w="100"/>
+              <w:bottom w:type="dxa" w:w="60"/>
+              <w:right w:type="dxa" w:w="100"/>
+            </w:tcMar>
+          </w:tcPr>
+          <w:p>
+            <w:pPr>
+              <w:spacing w:after="20"/>
+            </w:pPr>
+            <w:r>
+              <w:rPr>
+                <w:b/>
+                <w:bCs/>
+                <w:sz w:val="19"/>
+                <w:szCs w:val="19"/>
+              </w:rPr>
+              <w:t xml:space="preserve">3b</w:t>
+            </w:r>
+            <w:r>
+              <w:rPr>
+                <w:sz w:val="19"/>
+                <w:szCs w:val="19"/>
+              </w:rPr>
+              <w:t xml:space="preserve">'yi tekrar çalıştırın (günlük kota bittiyse ertesi gün): yalnız eksikler denenir. Ana sayfadaki "Yapay zekâ: ilk model" satırı tamamlanınca 3c'yi çalıştırın.</w:t>
             </w:r>
           </w:p>
         </w:tc>

</xml_diff>

<commit_message>
8b (etiketleri işle) etiketleme yapılmadan çalışmaz
8a'dan sonra indirilmiş etiket dosyası yoksa ne yapılacağını yazıp durur; tarayıcının
'etiketler (1).csv' diye kaydettiği en yeni dosyayı kullanır. Kılavuz güncellendi.

Co-Authored-By: Claude Opus 5.5 <noreply@anthropic.com>
Claude-Session: https://claude.ai/code/session_01Y7HA7zWrzagZQyqvydG6xL
</commit_message>
<xml_diff>
--- a/docs/KULLANIM_KILAVUZU.docx
+++ b/docs/KULLANIM_KILAVUZU.docx
@@ -1485,7 +1485,7 @@
             <w:szCs w:val="20"/>
           </w:rPr>
           <w:tab/>
-          <w:t xml:space="preserve">30</w:t>
+          <w:t xml:space="preserve">31</w:t>
         </w:r>
       </w:hyperlink>
     </w:p>
@@ -13761,7 +13761,7 @@
                 <w:sz w:val="19"/>
                 <w:szCs w:val="19"/>
               </w:rPr>
-              <w:t xml:space="preserve">İndirilen etiketler.csv'den tür başına elle ölçülmüş isabeti ve otomatik doğrulamanın isabetini hesaplar. Dosya yolu Ayarlar'dan değiştirilebilir (varsayılan: İndirilenler).</w:t>
+              <w:t xml:space="preserve">8a'dan sonra, etiketleme sayfasında işaretleyip 'CSV indir' ile kaydettiğiniz etiketler.csv'den tür başına elle ölçülmüş isabeti ve otomatik doğrulamanın isabetini hesaplar. 8a ile art arda değil, etiketlemeden sonra tek başına çalıştırın; dosya yoksa ya da 8a'dan eskiyse bekler. Dosya yolu Ayarlar'dan değiştirilebilir (varsayılan: İndirilenler).</w:t>
             </w:r>
           </w:p>
         </w:tc>
@@ -18648,6 +18648,40 @@
       </w:r>
       <w:r>
         <w:t xml:space="preserve">) üretir.</w:t>
+      </w:r>
+    </w:p>
+    <w:p>
+      <w:pPr>
+        <w:pStyle w:val="ListParagraph"/>
+        <w:numPr>
+          <w:ilvl w:val="0"/>
+          <w:numId w:val="10"/>
+        </w:numPr>
+        <w:spacing w:after="60"/>
+      </w:pPr>
+      <w:r>
+        <w:t xml:space="preserve">8a ile 8b'yi art arda çalıştırmayın: 8b, etiketleme sayfası oluşturulduktan </w:t>
+      </w:r>
+      <w:r>
+        <w:rPr>
+          <w:b/>
+          <w:bCs/>
+        </w:rPr>
+        <w:t xml:space="preserve">sonra</w:t>
+      </w:r>
+      <w:r>
+        <w:t xml:space="preserve"> indirilmiş bir etiket dosyası bulamazsa "8b bekliyor" deyip durur. Tarayıcı dosyayı </w:t>
+      </w:r>
+      <w:r>
+        <w:rPr>
+          <w:rFonts w:ascii="Courier New" w:cs="Courier New" w:eastAsia="Courier New" w:hAnsi="Courier New"/>
+          <w:sz w:val="19"/>
+          <w:szCs w:val="19"/>
+        </w:rPr>
+        <w:t xml:space="preserve">etiketler (1).csv</w:t>
+      </w:r>
+      <w:r>
+        <w:t xml:space="preserve"> gibi bir adla kaydettiyse en yenisi kendiliğinden kullanılır.</w:t>
       </w:r>
     </w:p>
     <w:p>

</xml_diff>

<commit_message>
Ana sayfa: canlı doğrulama, elle etiketleme (8a, 8b) ve taşma düzeltme ayrı aşamalar
Seçilenleri çalıştır'da 8a ile birlikte seçilen 8b çıkarılır ve neden söylenir.
Kılavuz ve teknik doküman güncellendi.

Co-Authored-By: Claude Opus 5.5 <noreply@anthropic.com>
Claude-Session: https://claude.ai/code/session_01Y7HA7zWrzagZQyqvydG6xL
</commit_message>
<xml_diff>
--- a/docs/KULLANIM_KILAVUZU.docx
+++ b/docs/KULLANIM_KILAVUZU.docx
@@ -8268,7 +8268,7 @@
                 <w:sz w:val="19"/>
                 <w:szCs w:val="19"/>
               </w:rPr>
-              <w:t xml:space="preserve">Doğrula ve düzelt</w:t>
+              <w:t xml:space="preserve">Canlı doğrulama</w:t>
             </w:r>
           </w:p>
         </w:tc>
@@ -8297,7 +8297,7 @@
                 <w:sz w:val="19"/>
                 <w:szCs w:val="19"/>
               </w:rPr>
-              <w:t xml:space="preserve">Bulgular canlı sitede doğrulanır; taşma için CSS düzeltme önerisi üretilir.</w:t>
+              <w:t xml:space="preserve">Bulgular canlı sitede yeniden ölçülür: gerçek mi, yanlış alarm mı? (7. adım)</w:t>
             </w:r>
           </w:p>
         </w:tc>
@@ -8332,6 +8332,282 @@
                 <w:szCs w:val="19"/>
               </w:rPr>
               <w:t xml:space="preserve">10</w:t>
+            </w:r>
+          </w:p>
+        </w:tc>
+        <w:tc>
+          <w:tcPr>
+            <w:tcW w:type="dxa" w:w="2613"/>
+            <w:tcBorders>
+              <w:top w:val="single" w:color="BFBFBF" w:sz="4"/>
+              <w:left w:val="single" w:color="BFBFBF" w:sz="4"/>
+              <w:bottom w:val="single" w:color="BFBFBF" w:sz="4"/>
+              <w:right w:val="single" w:color="BFBFBF" w:sz="4"/>
+            </w:tcBorders>
+            <w:tcMar>
+              <w:top w:type="dxa" w:w="60"/>
+              <w:left w:type="dxa" w:w="100"/>
+              <w:bottom w:type="dxa" w:w="60"/>
+              <w:right w:type="dxa" w:w="100"/>
+            </w:tcMar>
+          </w:tcPr>
+          <w:p>
+            <w:pPr>
+              <w:spacing w:after="20"/>
+            </w:pPr>
+            <w:r>
+              <w:rPr>
+                <w:sz w:val="19"/>
+                <w:szCs w:val="19"/>
+              </w:rPr>
+              <w:t xml:space="preserve">Elle etiketleme: sayfa</w:t>
+            </w:r>
+          </w:p>
+        </w:tc>
+        <w:tc>
+          <w:tcPr>
+            <w:tcW w:type="dxa" w:w="6535"/>
+            <w:tcBorders>
+              <w:top w:val="single" w:color="BFBFBF" w:sz="4"/>
+              <w:left w:val="single" w:color="BFBFBF" w:sz="4"/>
+              <w:bottom w:val="single" w:color="BFBFBF" w:sz="4"/>
+              <w:right w:val="single" w:color="BFBFBF" w:sz="4"/>
+            </w:tcBorders>
+            <w:tcMar>
+              <w:top w:type="dxa" w:w="60"/>
+              <w:left w:type="dxa" w:w="100"/>
+              <w:bottom w:type="dxa" w:w="60"/>
+              <w:right w:type="dxa" w:w="100"/>
+            </w:tcMar>
+          </w:tcPr>
+          <w:p>
+            <w:pPr>
+              <w:spacing w:after="20"/>
+            </w:pPr>
+            <w:r>
+              <w:rPr>
+                <w:sz w:val="19"/>
+                <w:szCs w:val="19"/>
+              </w:rPr>
+              <w:t xml:space="preserve">Etiketleme sayfası oluşturulur; açıp bulguları 1/2/3 ile işaretleyin, 'CSV indir'e basın (8a).</w:t>
+            </w:r>
+          </w:p>
+        </w:tc>
+      </w:tr>
+      <w:tr>
+        <w:trPr>
+          <w:cantSplit/>
+        </w:trPr>
+        <w:tc>
+          <w:tcPr>
+            <w:tcW w:type="dxa" w:w="490"/>
+            <w:tcBorders>
+              <w:top w:val="single" w:color="BFBFBF" w:sz="4"/>
+              <w:left w:val="single" w:color="BFBFBF" w:sz="4"/>
+              <w:bottom w:val="single" w:color="BFBFBF" w:sz="4"/>
+              <w:right w:val="single" w:color="BFBFBF" w:sz="4"/>
+            </w:tcBorders>
+            <w:tcMar>
+              <w:top w:type="dxa" w:w="60"/>
+              <w:left w:type="dxa" w:w="100"/>
+              <w:bottom w:type="dxa" w:w="60"/>
+              <w:right w:type="dxa" w:w="100"/>
+            </w:tcMar>
+          </w:tcPr>
+          <w:p>
+            <w:pPr>
+              <w:spacing w:after="20"/>
+            </w:pPr>
+            <w:r>
+              <w:rPr>
+                <w:sz w:val="19"/>
+                <w:szCs w:val="19"/>
+              </w:rPr>
+              <w:t xml:space="preserve">11</w:t>
+            </w:r>
+          </w:p>
+        </w:tc>
+        <w:tc>
+          <w:tcPr>
+            <w:tcW w:type="dxa" w:w="2613"/>
+            <w:tcBorders>
+              <w:top w:val="single" w:color="BFBFBF" w:sz="4"/>
+              <w:left w:val="single" w:color="BFBFBF" w:sz="4"/>
+              <w:bottom w:val="single" w:color="BFBFBF" w:sz="4"/>
+              <w:right w:val="single" w:color="BFBFBF" w:sz="4"/>
+            </w:tcBorders>
+            <w:tcMar>
+              <w:top w:type="dxa" w:w="60"/>
+              <w:left w:type="dxa" w:w="100"/>
+              <w:bottom w:type="dxa" w:w="60"/>
+              <w:right w:type="dxa" w:w="100"/>
+            </w:tcMar>
+          </w:tcPr>
+          <w:p>
+            <w:pPr>
+              <w:spacing w:after="20"/>
+            </w:pPr>
+            <w:r>
+              <w:rPr>
+                <w:sz w:val="19"/>
+                <w:szCs w:val="19"/>
+              </w:rPr>
+              <w:t xml:space="preserve">Elle etiketleme: sonuç</w:t>
+            </w:r>
+          </w:p>
+        </w:tc>
+        <w:tc>
+          <w:tcPr>
+            <w:tcW w:type="dxa" w:w="6535"/>
+            <w:tcBorders>
+              <w:top w:val="single" w:color="BFBFBF" w:sz="4"/>
+              <w:left w:val="single" w:color="BFBFBF" w:sz="4"/>
+              <w:bottom w:val="single" w:color="BFBFBF" w:sz="4"/>
+              <w:right w:val="single" w:color="BFBFBF" w:sz="4"/>
+            </w:tcBorders>
+            <w:tcMar>
+              <w:top w:type="dxa" w:w="60"/>
+              <w:left w:type="dxa" w:w="100"/>
+              <w:bottom w:type="dxa" w:w="60"/>
+              <w:right w:type="dxa" w:w="100"/>
+            </w:tcMar>
+          </w:tcPr>
+          <w:p>
+            <w:pPr>
+              <w:spacing w:after="20"/>
+            </w:pPr>
+            <w:r>
+              <w:rPr>
+                <w:sz w:val="19"/>
+                <w:szCs w:val="19"/>
+              </w:rPr>
+              <w:t xml:space="preserve">İndirilen etiketlerden isabet hesaplanır (8b). Etiketlemeden sonra ayrı çalıştırın.</w:t>
+            </w:r>
+          </w:p>
+        </w:tc>
+      </w:tr>
+      <w:tr>
+        <w:trPr>
+          <w:cantSplit/>
+        </w:trPr>
+        <w:tc>
+          <w:tcPr>
+            <w:tcW w:type="dxa" w:w="490"/>
+            <w:tcBorders>
+              <w:top w:val="single" w:color="BFBFBF" w:sz="4"/>
+              <w:left w:val="single" w:color="BFBFBF" w:sz="4"/>
+              <w:bottom w:val="single" w:color="BFBFBF" w:sz="4"/>
+              <w:right w:val="single" w:color="BFBFBF" w:sz="4"/>
+            </w:tcBorders>
+            <w:tcMar>
+              <w:top w:type="dxa" w:w="60"/>
+              <w:left w:type="dxa" w:w="100"/>
+              <w:bottom w:type="dxa" w:w="60"/>
+              <w:right w:type="dxa" w:w="100"/>
+            </w:tcMar>
+          </w:tcPr>
+          <w:p>
+            <w:pPr>
+              <w:spacing w:after="20"/>
+            </w:pPr>
+            <w:r>
+              <w:rPr>
+                <w:sz w:val="19"/>
+                <w:szCs w:val="19"/>
+              </w:rPr>
+              <w:t xml:space="preserve">12</w:t>
+            </w:r>
+          </w:p>
+        </w:tc>
+        <w:tc>
+          <w:tcPr>
+            <w:tcW w:type="dxa" w:w="2613"/>
+            <w:tcBorders>
+              <w:top w:val="single" w:color="BFBFBF" w:sz="4"/>
+              <w:left w:val="single" w:color="BFBFBF" w:sz="4"/>
+              <w:bottom w:val="single" w:color="BFBFBF" w:sz="4"/>
+              <w:right w:val="single" w:color="BFBFBF" w:sz="4"/>
+            </w:tcBorders>
+            <w:tcMar>
+              <w:top w:type="dxa" w:w="60"/>
+              <w:left w:type="dxa" w:w="100"/>
+              <w:bottom w:type="dxa" w:w="60"/>
+              <w:right w:type="dxa" w:w="100"/>
+            </w:tcMar>
+          </w:tcPr>
+          <w:p>
+            <w:pPr>
+              <w:spacing w:after="20"/>
+            </w:pPr>
+            <w:r>
+              <w:rPr>
+                <w:sz w:val="19"/>
+                <w:szCs w:val="19"/>
+              </w:rPr>
+              <w:t xml:space="preserve">Taşma düzeltme</w:t>
+            </w:r>
+          </w:p>
+        </w:tc>
+        <w:tc>
+          <w:tcPr>
+            <w:tcW w:type="dxa" w:w="6535"/>
+            <w:tcBorders>
+              <w:top w:val="single" w:color="BFBFBF" w:sz="4"/>
+              <w:left w:val="single" w:color="BFBFBF" w:sz="4"/>
+              <w:bottom w:val="single" w:color="BFBFBF" w:sz="4"/>
+              <w:right w:val="single" w:color="BFBFBF" w:sz="4"/>
+            </w:tcBorders>
+            <w:tcMar>
+              <w:top w:type="dxa" w:w="60"/>
+              <w:left w:type="dxa" w:w="100"/>
+              <w:bottom w:type="dxa" w:w="60"/>
+              <w:right w:type="dxa" w:w="100"/>
+            </w:tcMar>
+          </w:tcPr>
+          <w:p>
+            <w:pPr>
+              <w:spacing w:after="20"/>
+            </w:pPr>
+            <w:r>
+              <w:rPr>
+                <w:sz w:val="19"/>
+                <w:szCs w:val="19"/>
+              </w:rPr>
+              <w:t xml:space="preserve">Taşma için CSS önerisi üretilir ve canlı sayfada denenir (10 ve 9. adımlar).</w:t>
+            </w:r>
+          </w:p>
+        </w:tc>
+      </w:tr>
+      <w:tr>
+        <w:trPr>
+          <w:cantSplit/>
+        </w:trPr>
+        <w:tc>
+          <w:tcPr>
+            <w:tcW w:type="dxa" w:w="490"/>
+            <w:tcBorders>
+              <w:top w:val="single" w:color="BFBFBF" w:sz="4"/>
+              <w:left w:val="single" w:color="BFBFBF" w:sz="4"/>
+              <w:bottom w:val="single" w:color="BFBFBF" w:sz="4"/>
+              <w:right w:val="single" w:color="BFBFBF" w:sz="4"/>
+            </w:tcBorders>
+            <w:tcMar>
+              <w:top w:type="dxa" w:w="60"/>
+              <w:left w:type="dxa" w:w="100"/>
+              <w:bottom w:type="dxa" w:w="60"/>
+              <w:right w:type="dxa" w:w="100"/>
+            </w:tcMar>
+          </w:tcPr>
+          <w:p>
+            <w:pPr>
+              <w:spacing w:after="20"/>
+            </w:pPr>
+            <w:r>
+              <w:rPr>
+                <w:sz w:val="19"/>
+                <w:szCs w:val="19"/>
+              </w:rPr>
+              <w:t xml:space="preserve">13</w:t>
             </w:r>
           </w:p>
         </w:tc>

</xml_diff>

<commit_message>
Sürüm 1.1: kılavuz, README ve sürüm notları güncel; ekran görüntüleri yenilendi
- Kılavuz: ZIP ile güncelleme (tek tek dosya indirme uyarısı), açılış hatası,
  Docker/WSL sorun giderme, Bologna süreleri, Raporlar düğmeleri ve etiketleme sayfası
- Ekran görüntüleri programın 1.1 sürümünden yeniden çekildi (ana sayfa yeni aşamalar)
- README: güncelleme yolu, yol haritası, ilk model/hakem, 8a/8b, klasör yapısı
- DEGISIKLIKLER.md (sürüm notları), docs/kaynak/README.md (iki belgenin üretimi)
- requirements.txt açıklaması düzeltildi

Co-Authored-By: Claude Opus 5.5 <noreply@anthropic.com>
Claude-Session: https://claude.ai/code/session_01Y7HA7zWrzagZQyqvydG6xL
</commit_message>
<xml_diff>
--- a/docs/KULLANIM_KILAVUZU.docx
+++ b/docs/KULLANIM_KILAVUZU.docx
@@ -67,7 +67,7 @@
           <w:sz w:val="22"/>
           <w:szCs w:val="22"/>
         </w:rPr>
-        <w:t xml:space="preserve">Sürüm 1.0  ·  Ekim 2026</w:t>
+        <w:t xml:space="preserve">Sürüm 1.1  ·  Ekim 2026</w:t>
       </w:r>
     </w:p>
     <w:p>
@@ -435,7 +435,7 @@
             <w:szCs w:val="20"/>
           </w:rPr>
           <w:tab/>
-          <w:t xml:space="preserve">8</w:t>
+          <w:t xml:space="preserve">9</w:t>
         </w:r>
       </w:hyperlink>
     </w:p>
@@ -465,7 +465,7 @@
             <w:szCs w:val="20"/>
           </w:rPr>
           <w:tab/>
-          <w:t xml:space="preserve">8</w:t>
+          <w:t xml:space="preserve">9</w:t>
         </w:r>
       </w:hyperlink>
     </w:p>
@@ -495,7 +495,7 @@
             <w:szCs w:val="20"/>
           </w:rPr>
           <w:tab/>
-          <w:t xml:space="preserve">8</w:t>
+          <w:t xml:space="preserve">9</w:t>
         </w:r>
       </w:hyperlink>
     </w:p>
@@ -525,7 +525,7 @@
             <w:szCs w:val="20"/>
           </w:rPr>
           <w:tab/>
-          <w:t xml:space="preserve">8</w:t>
+          <w:t xml:space="preserve">9</w:t>
         </w:r>
       </w:hyperlink>
     </w:p>
@@ -555,7 +555,7 @@
             <w:szCs w:val="20"/>
           </w:rPr>
           <w:tab/>
-          <w:t xml:space="preserve">9</w:t>
+          <w:t xml:space="preserve">10</w:t>
         </w:r>
       </w:hyperlink>
     </w:p>
@@ -585,7 +585,7 @@
             <w:szCs w:val="20"/>
           </w:rPr>
           <w:tab/>
-          <w:t xml:space="preserve">9</w:t>
+          <w:t xml:space="preserve">10</w:t>
         </w:r>
       </w:hyperlink>
     </w:p>
@@ -615,7 +615,7 @@
             <w:szCs w:val="20"/>
           </w:rPr>
           <w:tab/>
-          <w:t xml:space="preserve">10</w:t>
+          <w:t xml:space="preserve">11</w:t>
         </w:r>
       </w:hyperlink>
     </w:p>
@@ -645,7 +645,7 @@
             <w:szCs w:val="20"/>
           </w:rPr>
           <w:tab/>
-          <w:t xml:space="preserve">13</w:t>
+          <w:t xml:space="preserve">14</w:t>
         </w:r>
       </w:hyperlink>
     </w:p>
@@ -675,7 +675,7 @@
             <w:szCs w:val="20"/>
           </w:rPr>
           <w:tab/>
-          <w:t xml:space="preserve">15</w:t>
+          <w:t xml:space="preserve">16</w:t>
         </w:r>
       </w:hyperlink>
     </w:p>
@@ -705,7 +705,7 @@
             <w:szCs w:val="20"/>
           </w:rPr>
           <w:tab/>
-          <w:t xml:space="preserve">15</w:t>
+          <w:t xml:space="preserve">16</w:t>
         </w:r>
       </w:hyperlink>
     </w:p>
@@ -735,7 +735,7 @@
             <w:szCs w:val="20"/>
           </w:rPr>
           <w:tab/>
-          <w:t xml:space="preserve">15</w:t>
+          <w:t xml:space="preserve">16</w:t>
         </w:r>
       </w:hyperlink>
     </w:p>
@@ -765,7 +765,7 @@
             <w:szCs w:val="20"/>
           </w:rPr>
           <w:tab/>
-          <w:t xml:space="preserve">15</w:t>
+          <w:t xml:space="preserve">16</w:t>
         </w:r>
       </w:hyperlink>
     </w:p>
@@ -795,7 +795,7 @@
             <w:szCs w:val="20"/>
           </w:rPr>
           <w:tab/>
-          <w:t xml:space="preserve">16</w:t>
+          <w:t xml:space="preserve">17</w:t>
         </w:r>
       </w:hyperlink>
     </w:p>
@@ -825,7 +825,7 @@
             <w:szCs w:val="20"/>
           </w:rPr>
           <w:tab/>
-          <w:t xml:space="preserve">17</w:t>
+          <w:t xml:space="preserve">18</w:t>
         </w:r>
       </w:hyperlink>
     </w:p>
@@ -855,7 +855,7 @@
             <w:szCs w:val="20"/>
           </w:rPr>
           <w:tab/>
-          <w:t xml:space="preserve">17</w:t>
+          <w:t xml:space="preserve">18</w:t>
         </w:r>
       </w:hyperlink>
     </w:p>
@@ -885,7 +885,7 @@
             <w:szCs w:val="20"/>
           </w:rPr>
           <w:tab/>
-          <w:t xml:space="preserve">17</w:t>
+          <w:t xml:space="preserve">18</w:t>
         </w:r>
       </w:hyperlink>
     </w:p>
@@ -915,7 +915,7 @@
             <w:szCs w:val="20"/>
           </w:rPr>
           <w:tab/>
-          <w:t xml:space="preserve">18</w:t>
+          <w:t xml:space="preserve">19</w:t>
         </w:r>
       </w:hyperlink>
     </w:p>
@@ -945,7 +945,7 @@
             <w:szCs w:val="20"/>
           </w:rPr>
           <w:tab/>
-          <w:t xml:space="preserve">18</w:t>
+          <w:t xml:space="preserve">19</w:t>
         </w:r>
       </w:hyperlink>
     </w:p>
@@ -975,7 +975,7 @@
             <w:szCs w:val="20"/>
           </w:rPr>
           <w:tab/>
-          <w:t xml:space="preserve">20</w:t>
+          <w:t xml:space="preserve">21</w:t>
         </w:r>
       </w:hyperlink>
     </w:p>
@@ -1005,7 +1005,7 @@
             <w:szCs w:val="20"/>
           </w:rPr>
           <w:tab/>
-          <w:t xml:space="preserve">20</w:t>
+          <w:t xml:space="preserve">21</w:t>
         </w:r>
       </w:hyperlink>
     </w:p>
@@ -1035,7 +1035,7 @@
             <w:szCs w:val="20"/>
           </w:rPr>
           <w:tab/>
-          <w:t xml:space="preserve">20</w:t>
+          <w:t xml:space="preserve">21</w:t>
         </w:r>
       </w:hyperlink>
     </w:p>
@@ -1065,7 +1065,7 @@
             <w:szCs w:val="20"/>
           </w:rPr>
           <w:tab/>
-          <w:t xml:space="preserve">21</w:t>
+          <w:t xml:space="preserve">22</w:t>
         </w:r>
       </w:hyperlink>
     </w:p>
@@ -1095,7 +1095,7 @@
             <w:szCs w:val="20"/>
           </w:rPr>
           <w:tab/>
-          <w:t xml:space="preserve">21</w:t>
+          <w:t xml:space="preserve">22</w:t>
         </w:r>
       </w:hyperlink>
     </w:p>
@@ -1125,7 +1125,7 @@
             <w:szCs w:val="20"/>
           </w:rPr>
           <w:tab/>
-          <w:t xml:space="preserve">21</w:t>
+          <w:t xml:space="preserve">22</w:t>
         </w:r>
       </w:hyperlink>
     </w:p>
@@ -1155,7 +1155,7 @@
             <w:szCs w:val="20"/>
           </w:rPr>
           <w:tab/>
-          <w:t xml:space="preserve">23</w:t>
+          <w:t xml:space="preserve">24</w:t>
         </w:r>
       </w:hyperlink>
     </w:p>
@@ -1185,7 +1185,7 @@
             <w:szCs w:val="20"/>
           </w:rPr>
           <w:tab/>
-          <w:t xml:space="preserve">24</w:t>
+          <w:t xml:space="preserve">25</w:t>
         </w:r>
       </w:hyperlink>
     </w:p>
@@ -1215,7 +1215,7 @@
             <w:szCs w:val="20"/>
           </w:rPr>
           <w:tab/>
-          <w:t xml:space="preserve">25</w:t>
+          <w:t xml:space="preserve">26</w:t>
         </w:r>
       </w:hyperlink>
     </w:p>
@@ -1245,7 +1245,7 @@
             <w:szCs w:val="20"/>
           </w:rPr>
           <w:tab/>
-          <w:t xml:space="preserve">26</w:t>
+          <w:t xml:space="preserve">27</w:t>
         </w:r>
       </w:hyperlink>
     </w:p>
@@ -1275,7 +1275,7 @@
             <w:szCs w:val="20"/>
           </w:rPr>
           <w:tab/>
-          <w:t xml:space="preserve">26</w:t>
+          <w:t xml:space="preserve">27</w:t>
         </w:r>
       </w:hyperlink>
     </w:p>
@@ -1305,7 +1305,7 @@
             <w:szCs w:val="20"/>
           </w:rPr>
           <w:tab/>
-          <w:t xml:space="preserve">26</w:t>
+          <w:t xml:space="preserve">27</w:t>
         </w:r>
       </w:hyperlink>
     </w:p>
@@ -1335,7 +1335,7 @@
             <w:szCs w:val="20"/>
           </w:rPr>
           <w:tab/>
-          <w:t xml:space="preserve">28</w:t>
+          <w:t xml:space="preserve">29</w:t>
         </w:r>
       </w:hyperlink>
     </w:p>
@@ -1365,7 +1365,7 @@
             <w:szCs w:val="20"/>
           </w:rPr>
           <w:tab/>
-          <w:t xml:space="preserve">29</w:t>
+          <w:t xml:space="preserve">30</w:t>
         </w:r>
       </w:hyperlink>
     </w:p>
@@ -1395,7 +1395,7 @@
             <w:szCs w:val="20"/>
           </w:rPr>
           <w:tab/>
-          <w:t xml:space="preserve">30</w:t>
+          <w:t xml:space="preserve">31</w:t>
         </w:r>
       </w:hyperlink>
     </w:p>
@@ -1425,7 +1425,7 @@
             <w:szCs w:val="20"/>
           </w:rPr>
           <w:tab/>
-          <w:t xml:space="preserve">30</w:t>
+          <w:t xml:space="preserve">31</w:t>
         </w:r>
       </w:hyperlink>
     </w:p>
@@ -1455,7 +1455,7 @@
             <w:szCs w:val="20"/>
           </w:rPr>
           <w:tab/>
-          <w:t xml:space="preserve">30</w:t>
+          <w:t xml:space="preserve">31</w:t>
         </w:r>
       </w:hyperlink>
     </w:p>
@@ -1485,7 +1485,7 @@
             <w:szCs w:val="20"/>
           </w:rPr>
           <w:tab/>
-          <w:t xml:space="preserve">31</w:t>
+          <w:t xml:space="preserve">32</w:t>
         </w:r>
       </w:hyperlink>
     </w:p>
@@ -1515,7 +1515,7 @@
             <w:szCs w:val="20"/>
           </w:rPr>
           <w:tab/>
-          <w:t xml:space="preserve">31</w:t>
+          <w:t xml:space="preserve">32</w:t>
         </w:r>
       </w:hyperlink>
     </w:p>
@@ -1545,7 +1545,7 @@
             <w:szCs w:val="20"/>
           </w:rPr>
           <w:tab/>
-          <w:t xml:space="preserve">31</w:t>
+          <w:t xml:space="preserve">33</w:t>
         </w:r>
       </w:hyperlink>
     </w:p>
@@ -1575,7 +1575,7 @@
             <w:szCs w:val="20"/>
           </w:rPr>
           <w:tab/>
-          <w:t xml:space="preserve">32</w:t>
+          <w:t xml:space="preserve">34</w:t>
         </w:r>
       </w:hyperlink>
     </w:p>
@@ -1605,7 +1605,7 @@
             <w:szCs w:val="20"/>
           </w:rPr>
           <w:tab/>
-          <w:t xml:space="preserve">33</w:t>
+          <w:t xml:space="preserve">35</w:t>
         </w:r>
       </w:hyperlink>
     </w:p>
@@ -1635,7 +1635,7 @@
             <w:szCs w:val="20"/>
           </w:rPr>
           <w:tab/>
-          <w:t xml:space="preserve">33</w:t>
+          <w:t xml:space="preserve">35</w:t>
         </w:r>
       </w:hyperlink>
     </w:p>
@@ -1665,7 +1665,7 @@
             <w:szCs w:val="20"/>
           </w:rPr>
           <w:tab/>
-          <w:t xml:space="preserve">34</w:t>
+          <w:t xml:space="preserve">36</w:t>
         </w:r>
       </w:hyperlink>
     </w:p>
@@ -1695,7 +1695,7 @@
             <w:szCs w:val="20"/>
           </w:rPr>
           <w:tab/>
-          <w:t xml:space="preserve">34</w:t>
+          <w:t xml:space="preserve">36</w:t>
         </w:r>
       </w:hyperlink>
     </w:p>
@@ -1725,7 +1725,7 @@
             <w:szCs w:val="20"/>
           </w:rPr>
           <w:tab/>
-          <w:t xml:space="preserve">34</w:t>
+          <w:t xml:space="preserve">36</w:t>
         </w:r>
       </w:hyperlink>
     </w:p>
@@ -1755,7 +1755,7 @@
             <w:szCs w:val="20"/>
           </w:rPr>
           <w:tab/>
-          <w:t xml:space="preserve">34</w:t>
+          <w:t xml:space="preserve">36</w:t>
         </w:r>
       </w:hyperlink>
     </w:p>
@@ -1785,7 +1785,7 @@
             <w:szCs w:val="20"/>
           </w:rPr>
           <w:tab/>
-          <w:t xml:space="preserve">35</w:t>
+          <w:t xml:space="preserve">37</w:t>
         </w:r>
       </w:hyperlink>
     </w:p>
@@ -1815,7 +1815,7 @@
             <w:szCs w:val="20"/>
           </w:rPr>
           <w:tab/>
-          <w:t xml:space="preserve">35</w:t>
+          <w:t xml:space="preserve">37</w:t>
         </w:r>
       </w:hyperlink>
     </w:p>
@@ -1845,7 +1845,7 @@
             <w:szCs w:val="20"/>
           </w:rPr>
           <w:tab/>
-          <w:t xml:space="preserve">37</w:t>
+          <w:t xml:space="preserve">39</w:t>
         </w:r>
       </w:hyperlink>
     </w:p>
@@ -1875,7 +1875,7 @@
             <w:szCs w:val="20"/>
           </w:rPr>
           <w:tab/>
-          <w:t xml:space="preserve">40</w:t>
+          <w:t xml:space="preserve">42</w:t>
         </w:r>
       </w:hyperlink>
     </w:p>
@@ -1905,7 +1905,7 @@
             <w:szCs w:val="20"/>
           </w:rPr>
           <w:tab/>
-          <w:t xml:space="preserve">41</w:t>
+          <w:t xml:space="preserve">43</w:t>
         </w:r>
       </w:hyperlink>
     </w:p>
@@ -1935,7 +1935,7 @@
             <w:szCs w:val="20"/>
           </w:rPr>
           <w:tab/>
-          <w:t xml:space="preserve">42</w:t>
+          <w:t xml:space="preserve">44</w:t>
         </w:r>
       </w:hyperlink>
     </w:p>
@@ -1965,7 +1965,7 @@
             <w:szCs w:val="20"/>
           </w:rPr>
           <w:tab/>
-          <w:t xml:space="preserve">44</w:t>
+          <w:t xml:space="preserve">46</w:t>
         </w:r>
       </w:hyperlink>
     </w:p>
@@ -1995,7 +1995,7 @@
             <w:szCs w:val="20"/>
           </w:rPr>
           <w:tab/>
-          <w:t xml:space="preserve">45</w:t>
+          <w:t xml:space="preserve">47</w:t>
         </w:r>
       </w:hyperlink>
     </w:p>
@@ -2025,7 +2025,7 @@
             <w:szCs w:val="20"/>
           </w:rPr>
           <w:tab/>
-          <w:t xml:space="preserve">46</w:t>
+          <w:t xml:space="preserve">48</w:t>
         </w:r>
       </w:hyperlink>
     </w:p>
@@ -4523,7 +4523,17 @@
         <w:spacing w:after="60"/>
       </w:pPr>
       <w:r>
-        <w:t xml:space="preserve">Programı kapatın.</w:t>
+        <w:t xml:space="preserve">Programı kapatın. Çalışan bir adım varsa önce </w:t>
+      </w:r>
+      <w:r>
+        <w:rPr>
+          <w:b/>
+          <w:bCs/>
+        </w:rPr>
+        <w:t xml:space="preserve">Durdur</w:t>
+      </w:r>
+      <w:r>
+        <w:t xml:space="preserve"> ile durdurun.</w:t>
       </w:r>
     </w:p>
     <w:p>
@@ -4536,7 +4546,65 @@
         <w:spacing w:after="60"/>
       </w:pPr>
       <w:r>
-        <w:t xml:space="preserve">Klasörde </w:t>
+        <w:rPr>
+          <w:b/>
+          <w:bCs/>
+        </w:rPr>
+        <w:t xml:space="preserve">ZIP ile:</w:t>
+      </w:r>
+      <w:r>
+        <w:t xml:space="preserve"> GitHub'da depo sayfasında </w:t>
+      </w:r>
+      <w:r>
+        <w:rPr>
+          <w:b/>
+          <w:bCs/>
+        </w:rPr>
+        <w:t xml:space="preserve">Code &gt; Download ZIP</w:t>
+      </w:r>
+      <w:r>
+        <w:t xml:space="preserve"> ile projeyi indirin. ZIP'teki </w:t>
+      </w:r>
+      <w:r>
+        <w:rPr>
+          <w:rFonts w:ascii="Courier New" w:cs="Courier New" w:eastAsia="Courier New" w:hAnsi="Courier New"/>
+          <w:sz w:val="19"/>
+          <w:szCs w:val="19"/>
+        </w:rPr>
+        <w:t xml:space="preserve">web-denetim-merkezi-main</w:t>
+      </w:r>
+      <w:r>
+        <w:t xml:space="preserve"> klasörünün </w:t>
+      </w:r>
+      <w:r>
+        <w:rPr>
+          <w:b/>
+          <w:bCs/>
+        </w:rPr>
+        <w:t xml:space="preserve">içindekilerin hepsini</w:t>
+      </w:r>
+      <w:r>
+        <w:t xml:space="preserve"> program klasörünün üzerine kopyalayın ve "Hedefteki dosyaları değiştir" deyin.</w:t>
+      </w:r>
+    </w:p>
+    <w:p>
+      <w:pPr>
+        <w:pStyle w:val="ListParagraph"/>
+        <w:numPr>
+          <w:ilvl w:val="0"/>
+          <w:numId w:val="4"/>
+        </w:numPr>
+        <w:spacing w:after="60"/>
+      </w:pPr>
+      <w:r>
+        <w:rPr>
+          <w:b/>
+          <w:bCs/>
+        </w:rPr>
+        <w:t xml:space="preserve">git ile:</w:t>
+      </w:r>
+      <w:r>
+        <w:t xml:space="preserve"> program klasöründe </w:t>
       </w:r>
       <w:r>
         <w:rPr>
@@ -4547,8 +4615,57 @@
         <w:t xml:space="preserve">git pull</w:t>
       </w:r>
       <w:r>
-        <w:t xml:space="preserve"> çalıştırın (ZIP ile indirdiyseniz yeni ZIP'i aynı klasörün üzerine açın; </w:t>
-      </w:r>
+        <w:t xml:space="preserve"> çalıştırın.</w:t>
+      </w:r>
+    </w:p>
+    <w:p>
+      <w:pPr>
+        <w:pStyle w:val="ListParagraph"/>
+        <w:numPr>
+          <w:ilvl w:val="0"/>
+          <w:numId w:val="4"/>
+        </w:numPr>
+        <w:spacing w:after="60"/>
+      </w:pPr>
+      <w:r>
+        <w:rPr>
+          <w:b/>
+          <w:bCs/>
+        </w:rPr>
+        <w:t xml:space="preserve">KURULUM.bat</w:t>
+      </w:r>
+      <w:r>
+        <w:t xml:space="preserve">'ı (Linux/macOS: </w:t>
+      </w:r>
+      <w:r>
+        <w:rPr>
+          <w:rFonts w:ascii="Courier New" w:cs="Courier New" w:eastAsia="Courier New" w:hAnsi="Courier New"/>
+          <w:sz w:val="19"/>
+          <w:szCs w:val="19"/>
+        </w:rPr>
+        <w:t xml:space="preserve">./kurulum.sh</w:t>
+      </w:r>
+      <w:r>
+        <w:t xml:space="preserve">) bir kez çalıştırın; yeni paketler varsa kurulur.</w:t>
+      </w:r>
+    </w:p>
+    <w:p>
+      <w:pPr>
+        <w:pStyle w:val="ListParagraph"/>
+        <w:numPr>
+          <w:ilvl w:val="0"/>
+          <w:numId w:val="4"/>
+        </w:numPr>
+        <w:spacing w:after="60"/>
+      </w:pPr>
+      <w:r>
+        <w:t xml:space="preserve">Programı açın. Yarıda kalan bir adım varsa aynı adımı yeniden çalıştırın; kaldığı yerden devam eder.</w:t>
+      </w:r>
+    </w:p>
+    <w:p>
+      <w:pPr>
+        <w:spacing w:after="120"/>
+      </w:pPr>
       <w:r>
         <w:rPr>
           <w:rFonts w:ascii="Courier New" w:cs="Courier New" w:eastAsia="Courier New" w:hAnsi="Courier New"/>
@@ -4558,7 +4675,7 @@
         <w:t xml:space="preserve">ciktilar/</w:t>
       </w:r>
       <w:r>
-        <w:t xml:space="preserve">, </w:t>
+        <w:t xml:space="preserve"> (bütün sonuçlar), </w:t>
       </w:r>
       <w:r>
         <w:rPr>
@@ -4569,27 +4686,7 @@
         <w:t xml:space="preserve">ayarlar.json</w:t>
       </w:r>
       <w:r>
-        <w:t xml:space="preserve"> ve kendi profilleriniz korunur).</w:t>
-      </w:r>
-    </w:p>
-    <w:p>
-      <w:pPr>
-        <w:pStyle w:val="ListParagraph"/>
-        <w:numPr>
-          <w:ilvl w:val="0"/>
-          <w:numId w:val="4"/>
-        </w:numPr>
-        <w:spacing w:after="60"/>
-      </w:pPr>
-      <w:r>
-        <w:rPr>
-          <w:b/>
-          <w:bCs/>
-        </w:rPr>
-        <w:t xml:space="preserve">KURULUM.bat</w:t>
-      </w:r>
-      <w:r>
-        <w:t xml:space="preserve">'ı (Linux/macOS: </w:t>
+        <w:t xml:space="preserve"> (anahtarlar dahil), </w:t>
       </w:r>
       <w:r>
         <w:rPr>
@@ -4597,11 +4694,84 @@
           <w:sz w:val="19"/>
           <w:szCs w:val="19"/>
         </w:rPr>
-        <w:t xml:space="preserve">./kurulum.sh</w:t>
-      </w:r>
-      <w:r>
-        <w:t xml:space="preserve">) bir kez çalıştırın; yeni paketler varsa kurulur.</w:t>
-      </w:r>
+        <w:t xml:space="preserve">.venv/</w:t>
+      </w:r>
+      <w:r>
+        <w:t xml:space="preserve"> (kurulum) ve kendi oluşturduğunuz profiller ZIP'te yoktur; güncellemede üzerlerine yazılmaz.</w:t>
+      </w:r>
+    </w:p>
+    <w:tbl>
+      <w:tblPr>
+        <w:tblW w:type="dxa" w:w="9638"/>
+        <w:tblBorders>
+          <w:top w:val="single" w:color="auto" w:sz="4"/>
+          <w:left w:val="single" w:color="auto" w:sz="4"/>
+          <w:bottom w:val="single" w:color="auto" w:sz="4"/>
+          <w:right w:val="single" w:color="auto" w:sz="4"/>
+          <w:insideH w:val="single" w:color="auto" w:sz="4"/>
+          <w:insideV w:val="single" w:color="auto" w:sz="4"/>
+        </w:tblBorders>
+        <w:tblLayout w:type="fixed"/>
+      </w:tblPr>
+      <w:tblGrid>
+        <w:gridCol w:w="9638"/>
+      </w:tblGrid>
+      <w:tr>
+        <w:tc>
+          <w:tcPr>
+            <w:tcW w:type="dxa" w:w="9638"/>
+            <w:tcBorders>
+              <w:top w:val="none" w:color="FFFFFF" w:sz="0"/>
+              <w:left w:val="single" w:color="B26A00" w:sz="24"/>
+              <w:bottom w:val="none" w:color="FFFFFF" w:sz="0"/>
+              <w:right w:val="none" w:color="FFFFFF" w:sz="0"/>
+            </w:tcBorders>
+            <w:shd w:fill="FDF3E1" w:color="auto" w:val="clear"/>
+            <w:tcMar>
+              <w:top w:type="dxa" w:w="100"/>
+              <w:left w:type="dxa" w:w="160"/>
+              <w:bottom w:type="dxa" w:w="100"/>
+              <w:right w:type="dxa" w:w="160"/>
+            </w:tcMar>
+          </w:tcPr>
+          <w:p>
+            <w:pPr>
+              <w:spacing w:after="60"/>
+            </w:pPr>
+            <w:r>
+              <w:rPr>
+                <w:b/>
+                <w:bCs/>
+                <w:color w:val="B26A00"/>
+              </w:rPr>
+              <w:t xml:space="preserve">Dikkat</w:t>
+            </w:r>
+          </w:p>
+          <w:p>
+            <w:pPr>
+              <w:spacing w:after="60"/>
+            </w:pPr>
+            <w:r>
+              <w:t xml:space="preserve">Dosyaları GitHub'dan </w:t>
+            </w:r>
+            <w:r>
+              <w:rPr>
+                <w:b/>
+                <w:bCs/>
+              </w:rPr>
+              <w:t xml:space="preserve">tek tek</w:t>
+            </w:r>
+            <w:r>
+              <w:t xml:space="preserve"> indirerek güncellemeyin. Program dosyaları birbirine bağlıdır; yeni bir dosya, sizde olmayan başka bir yeni dosyaya ihtiyaç duyabilir ve program açılmaz. Ayrıca dosya sayfasında "Farklı kaydet" Python kodu yerine sayfanın HTML'ini kaydeder. Her zaman yukarıdaki ZIP ya da git yolunu kullanın.</w:t>
+            </w:r>
+          </w:p>
+        </w:tc>
+      </w:tr>
+    </w:tbl>
+    <w:p>
+      <w:pPr>
+        <w:spacing w:after="60"/>
+      </w:pPr>
     </w:p>
     <w:p>
       <w:pPr>
@@ -19179,6 +19349,104 @@
     </w:p>
     <w:p>
       <w:pPr>
+        <w:spacing w:after="120"/>
+      </w:pPr>
+      <w:r>
+        <w:t xml:space="preserve">Düğmeler (ana sayfadaki Raporlar kartında da aynıları vardır): Kanıtlı test raporu, Deneme testi raporu, Kırık link raporu, Kırık belge raporu, Görsel kusur raporu, Yapay zekâ son raporu, Doğrulama özeti, </w:t>
+      </w:r>
+      <w:r>
+        <w:rPr>
+          <w:b/>
+          <w:bCs/>
+        </w:rPr>
+        <w:t xml:space="preserve">Etiketleme sayfası (8a)</w:t>
+      </w:r>
+      <w:r>
+        <w:t xml:space="preserve">, Taşma düzeltme (önce/sonra), Teslim paketi, Adım raporları ve Çıktı klasörü. Henüz üretilmemiş raporun düğmesi soluk görünür.</w:t>
+      </w:r>
+    </w:p>
+    <w:tbl>
+      <w:tblPr>
+        <w:tblW w:type="dxa" w:w="9638"/>
+        <w:tblBorders>
+          <w:top w:val="single" w:color="auto" w:sz="4"/>
+          <w:left w:val="single" w:color="auto" w:sz="4"/>
+          <w:bottom w:val="single" w:color="auto" w:sz="4"/>
+          <w:right w:val="single" w:color="auto" w:sz="4"/>
+          <w:insideH w:val="single" w:color="auto" w:sz="4"/>
+          <w:insideV w:val="single" w:color="auto" w:sz="4"/>
+        </w:tblBorders>
+        <w:tblLayout w:type="fixed"/>
+      </w:tblPr>
+      <w:tblGrid>
+        <w:gridCol w:w="9638"/>
+      </w:tblGrid>
+      <w:tr>
+        <w:tc>
+          <w:tcPr>
+            <w:tcW w:type="dxa" w:w="9638"/>
+            <w:tcBorders>
+              <w:top w:val="none" w:color="FFFFFF" w:sz="0"/>
+              <w:left w:val="single" w:color="1F4E79" w:sz="24"/>
+              <w:bottom w:val="none" w:color="FFFFFF" w:sz="0"/>
+              <w:right w:val="none" w:color="FFFFFF" w:sz="0"/>
+            </w:tcBorders>
+            <w:shd w:fill="EAF1F8" w:color="auto" w:val="clear"/>
+            <w:tcMar>
+              <w:top w:type="dxa" w:w="100"/>
+              <w:left w:type="dxa" w:w="160"/>
+              <w:bottom w:type="dxa" w:w="100"/>
+              <w:right w:type="dxa" w:w="160"/>
+            </w:tcMar>
+          </w:tcPr>
+          <w:p>
+            <w:pPr>
+              <w:spacing w:after="60"/>
+            </w:pPr>
+            <w:r>
+              <w:rPr>
+                <w:b/>
+                <w:bCs/>
+                <w:color w:val="1F4E79"/>
+              </w:rPr>
+              <w:t xml:space="preserve">Not</w:t>
+            </w:r>
+          </w:p>
+          <w:p>
+            <w:pPr>
+              <w:spacing w:after="60"/>
+            </w:pPr>
+            <w:r>
+              <w:rPr>
+                <w:b/>
+                <w:bCs/>
+              </w:rPr>
+              <w:t xml:space="preserve">Etiketleme sayfası</w:t>
+            </w:r>
+            <w:r>
+              <w:t xml:space="preserve"> ile </w:t>
+            </w:r>
+            <w:r>
+              <w:rPr>
+                <w:b/>
+                <w:bCs/>
+              </w:rPr>
+              <w:t xml:space="preserve">Taşma düzeltme (önce/sonra)</w:t>
+            </w:r>
+            <w:r>
+              <w:t xml:space="preserve"> farklı şeylerdir: ilki bulguları 1/2/3 ile işaretlediğiniz sayfadır (8a), ikincisi otomatik CSS önerisinin önce/sonra görüntüleridir (10. adım) ve yalnız bakmak içindir.</w:t>
+            </w:r>
+          </w:p>
+        </w:tc>
+      </w:tr>
+    </w:tbl>
+    <w:p>
+      <w:pPr>
+        <w:spacing w:after="60"/>
+      </w:pPr>
+    </w:p>
+    <w:p>
+      <w:pPr>
         <w:keepNext/>
         <w:spacing w:after="40" w:before="80"/>
         <w:jc w:val="center"/>
@@ -29910,7 +30178,7 @@
                 <w:sz w:val="19"/>
                 <w:szCs w:val="19"/>
               </w:rPr>
-              <w:t xml:space="preserve">BASLAT.bat açılıp kapanıyor, "Python bulunamadı"</w:t>
+              <w:t xml:space="preserve">BASLAT.bat'a basınca pencere bir an açılıp kapanıyor; ya da "Web Denetim Merkezi açılamadı" penceresi çıkıyor</w:t>
             </w:r>
           </w:p>
         </w:tc>
@@ -29939,7 +30207,7 @@
                 <w:sz w:val="19"/>
                 <w:szCs w:val="19"/>
               </w:rPr>
-              <w:t xml:space="preserve">Python kurulu değil ya da PATH'te yok.</w:t>
+              <w:t xml:space="preserve">Bir program dosyası eksik, eski ya da bozuk (çoğunlukla dosyalar tek tek indirilerek güncellendiğinde).</w:t>
             </w:r>
           </w:p>
         </w:tc>
@@ -29968,7 +30236,53 @@
                 <w:sz w:val="19"/>
                 <w:szCs w:val="19"/>
               </w:rPr>
-              <w:t xml:space="preserve">Python'u python.org'dan "Add python.exe to PATH" işaretli kurun, BASLAT.bat'ı yeniden çalıştırın.</w:t>
+              <w:t xml:space="preserve">Projeyi </w:t>
+            </w:r>
+            <w:r>
+              <w:rPr>
+                <w:b/>
+                <w:bCs/>
+                <w:sz w:val="19"/>
+                <w:szCs w:val="19"/>
+              </w:rPr>
+              <w:t xml:space="preserve">ZIP ile</w:t>
+            </w:r>
+            <w:r>
+              <w:rPr>
+                <w:sz w:val="19"/>
+                <w:szCs w:val="19"/>
+              </w:rPr>
+              <w:t xml:space="preserve"> güncelleyin (2.5). Hatanın tamamı program klasöründeki </w:t>
+            </w:r>
+            <w:r>
+              <w:rPr>
+                <w:rFonts w:ascii="Courier New" w:cs="Courier New" w:eastAsia="Courier New" w:hAnsi="Courier New"/>
+                <w:sz w:val="19"/>
+                <w:szCs w:val="19"/>
+              </w:rPr>
+              <w:t xml:space="preserve">baslatma_hatasi.txt</w:t>
+            </w:r>
+            <w:r>
+              <w:rPr>
+                <w:sz w:val="19"/>
+                <w:szCs w:val="19"/>
+              </w:rPr>
+              <w:t xml:space="preserve"> dosyasındadır; komut isteminde </w:t>
+            </w:r>
+            <w:r>
+              <w:rPr>
+                <w:rFonts w:ascii="Courier New" w:cs="Courier New" w:eastAsia="Courier New" w:hAnsi="Courier New"/>
+                <w:sz w:val="19"/>
+                <w:szCs w:val="19"/>
+              </w:rPr>
+              <w:t xml:space="preserve">.venv\Scripts\python.exe web_denetim.py</w:t>
+            </w:r>
+            <w:r>
+              <w:rPr>
+                <w:sz w:val="19"/>
+                <w:szCs w:val="19"/>
+              </w:rPr>
+              <w:t xml:space="preserve"> ile de görülebilir.</w:t>
             </w:r>
           </w:p>
         </w:tc>
@@ -30002,7 +30316,7 @@
                 <w:sz w:val="19"/>
                 <w:szCs w:val="19"/>
               </w:rPr>
-              <w:t xml:space="preserve">Kurulum "Paketler kurulamadı" / "Chromium indirilemedi" diyor</w:t>
+              <w:t xml:space="preserve">BASLAT.bat açılıp kapanıyor, "Python bulunamadı"</w:t>
             </w:r>
           </w:p>
         </w:tc>
@@ -30031,7 +30345,7 @@
                 <w:sz w:val="19"/>
                 <w:szCs w:val="19"/>
               </w:rPr>
-              <w:t xml:space="preserve">İnternet ya da kurum proxy'si engelliyor.</w:t>
+              <w:t xml:space="preserve">Python kurulu değil ya da PATH'te yok.</w:t>
             </w:r>
           </w:p>
         </w:tc>
@@ -30060,22 +30374,7 @@
                 <w:sz w:val="19"/>
                 <w:szCs w:val="19"/>
               </w:rPr>
-              <w:t xml:space="preserve">Bağlantıyı ve proxy ayarlarını kontrol edip KURULUM.bat'ı tekrar çalıştırın. Kurum ağında </w:t>
-            </w:r>
-            <w:r>
-              <w:rPr>
-                <w:rFonts w:ascii="Courier New" w:cs="Courier New" w:eastAsia="Courier New" w:hAnsi="Courier New"/>
-                <w:sz w:val="19"/>
-                <w:szCs w:val="19"/>
-              </w:rPr>
-              <w:t xml:space="preserve">HTTPS_PROXY</w:t>
-            </w:r>
-            <w:r>
-              <w:rPr>
-                <w:sz w:val="19"/>
-                <w:szCs w:val="19"/>
-              </w:rPr>
-              <w:t xml:space="preserve"> ortam değişkeni gerekebilir.</w:t>
+              <w:t xml:space="preserve">Python'u python.org'dan "Add python.exe to PATH" işaretli kurun, BASLAT.bat'ı yeniden çalıştırın.</w:t>
             </w:r>
           </w:p>
         </w:tc>
@@ -30109,7 +30408,7 @@
                 <w:sz w:val="19"/>
                 <w:szCs w:val="19"/>
               </w:rPr>
-              <w:t xml:space="preserve">Arayüz açılmıyor, "tkinter" hatası</w:t>
+              <w:t xml:space="preserve">Kurulum "Paketler kurulamadı" / "Chromium indirilemedi" diyor</w:t>
             </w:r>
           </w:p>
         </w:tc>
@@ -30138,7 +30437,7 @@
                 <w:sz w:val="19"/>
                 <w:szCs w:val="19"/>
               </w:rPr>
-              <w:t xml:space="preserve">Python Tkinter'sız kurulmuş (Linux'ta sık).</w:t>
+              <w:t xml:space="preserve">İnternet ya da kurum proxy'si engelliyor.</w:t>
             </w:r>
           </w:p>
         </w:tc>
@@ -30167,7 +30466,7 @@
                 <w:sz w:val="19"/>
                 <w:szCs w:val="19"/>
               </w:rPr>
-              <w:t xml:space="preserve">Linux: </w:t>
+              <w:t xml:space="preserve">Bağlantıyı ve proxy ayarlarını kontrol edip KURULUM.bat'ı tekrar çalıştırın. Kurum ağında </w:t>
             </w:r>
             <w:r>
               <w:rPr>
@@ -30175,14 +30474,14 @@
                 <w:sz w:val="19"/>
                 <w:szCs w:val="19"/>
               </w:rPr>
-              <w:t xml:space="preserve">sudo apt install python3-tk</w:t>
-            </w:r>
-            <w:r>
-              <w:rPr>
-                <w:sz w:val="19"/>
-                <w:szCs w:val="19"/>
-              </w:rPr>
-              <w:t xml:space="preserve">; Windows: Python'u python.org kurulumuyla yeniden kurun. Komut satırı Tkinter'sız da çalışır.</w:t>
+              <w:t xml:space="preserve">HTTPS_PROXY</w:t>
+            </w:r>
+            <w:r>
+              <w:rPr>
+                <w:sz w:val="19"/>
+                <w:szCs w:val="19"/>
+              </w:rPr>
+              <w:t xml:space="preserve"> ortam değişkeni gerekebilir.</w:t>
             </w:r>
           </w:p>
         </w:tc>
@@ -30216,7 +30515,7 @@
                 <w:sz w:val="19"/>
                 <w:szCs w:val="19"/>
               </w:rPr>
-              <w:t xml:space="preserve">Ana sayfada "Kurulum eksik" uyarısı</w:t>
+              <w:t xml:space="preserve">Arayüz açılmıyor, "tkinter" hatası</w:t>
             </w:r>
           </w:p>
         </w:tc>
@@ -30245,7 +30544,7 @@
                 <w:sz w:val="19"/>
                 <w:szCs w:val="19"/>
               </w:rPr>
-              <w:t xml:space="preserve">Paket ya da Chromium eksik.</w:t>
+              <w:t xml:space="preserve">Python Tkinter'sız kurulmuş (Linux'ta sık).</w:t>
             </w:r>
           </w:p>
         </w:tc>
@@ -30274,39 +30573,22 @@
                 <w:sz w:val="19"/>
                 <w:szCs w:val="19"/>
               </w:rPr>
-              <w:t xml:space="preserve">Uyarıdaki </w:t>
-            </w:r>
-            <w:r>
-              <w:rPr>
-                <w:b/>
-                <w:bCs/>
-                <w:sz w:val="19"/>
-                <w:szCs w:val="19"/>
-              </w:rPr>
-              <w:t xml:space="preserve">Bağımlılıkları kur</w:t>
-            </w:r>
-            <w:r>
-              <w:rPr>
-                <w:sz w:val="19"/>
-                <w:szCs w:val="19"/>
-              </w:rPr>
-              <w:t xml:space="preserve"> düğmesi; ardından </w:t>
-            </w:r>
-            <w:r>
-              <w:rPr>
-                <w:b/>
-                <w:bCs/>
-                <w:sz w:val="19"/>
-                <w:szCs w:val="19"/>
-              </w:rPr>
-              <w:t xml:space="preserve">Ortam kontrolü</w:t>
-            </w:r>
-            <w:r>
-              <w:rPr>
-                <w:sz w:val="19"/>
-                <w:szCs w:val="19"/>
-              </w:rPr>
-              <w:t xml:space="preserve">.</w:t>
+              <w:t xml:space="preserve">Linux: </w:t>
+            </w:r>
+            <w:r>
+              <w:rPr>
+                <w:rFonts w:ascii="Courier New" w:cs="Courier New" w:eastAsia="Courier New" w:hAnsi="Courier New"/>
+                <w:sz w:val="19"/>
+                <w:szCs w:val="19"/>
+              </w:rPr>
+              <w:t xml:space="preserve">sudo apt install python3-tk</w:t>
+            </w:r>
+            <w:r>
+              <w:rPr>
+                <w:sz w:val="19"/>
+                <w:szCs w:val="19"/>
+              </w:rPr>
+              <w:t xml:space="preserve">; Windows: Python'u python.org kurulumuyla yeniden kurun. Komut satırı Tkinter'sız da çalışır.</w:t>
             </w:r>
           </w:p>
         </w:tc>
@@ -30340,7 +30622,7 @@
                 <w:sz w:val="19"/>
                 <w:szCs w:val="19"/>
               </w:rPr>
-              <w:t xml:space="preserve">Arayüz yavaş, sayfa geçişlerinde ya da tema değişiminde öğeler tek tek çiziliyor</w:t>
+              <w:t xml:space="preserve">Ana sayfada "Kurulum eksik" uyarısı</w:t>
             </w:r>
           </w:p>
         </w:tc>
@@ -30369,7 +30651,7 @@
                 <w:sz w:val="19"/>
                 <w:szCs w:val="19"/>
               </w:rPr>
-              <w:t xml:space="preserve">Modern görünüm (sv-ttk) seçilmiş. Bu tema her öğeyi saydam resimlerle çizer; Windows ölçümünde sayfa geçişi 5–7 kat, tema değişimi ~5 kat yavaş çıktı.</w:t>
+              <w:t xml:space="preserve">Paket ya da Chromium eksik.</w:t>
             </w:r>
           </w:p>
         </w:tc>
@@ -30393,6 +30675,13 @@
             <w:pPr>
               <w:spacing w:after="20"/>
             </w:pPr>
+            <w:r>
+              <w:rPr>
+                <w:sz w:val="19"/>
+                <w:szCs w:val="19"/>
+              </w:rPr>
+              <w:t xml:space="preserve">Uyarıdaki </w:t>
+            </w:r>
             <w:r>
               <w:rPr>
                 <w:b/>
@@ -30400,29 +30689,30 @@
                 <w:sz w:val="19"/>
                 <w:szCs w:val="19"/>
               </w:rPr>
-              <w:t xml:space="preserve">Ayarlar → Genel → Arayüz görünümü</w:t>
-            </w:r>
-            <w:r>
-              <w:rPr>
-                <w:sz w:val="19"/>
-                <w:szCs w:val="19"/>
-              </w:rPr>
-              <w:t xml:space="preserve">: </w:t>
-            </w:r>
-            <w:r>
-              <w:rPr>
-                <w:rFonts w:ascii="Courier New" w:cs="Courier New" w:eastAsia="Courier New" w:hAnsi="Courier New"/>
-                <w:sz w:val="19"/>
-                <w:szCs w:val="19"/>
-              </w:rPr>
-              <w:t xml:space="preserve">sade</w:t>
-            </w:r>
-            <w:r>
-              <w:rPr>
-                <w:sz w:val="19"/>
-                <w:szCs w:val="19"/>
-              </w:rPr>
-              <w:t xml:space="preserve"> (varsayılan) seçip kaydedin ve programı yeniden açın. Renkler ve düzen aynı kalır.</w:t>
+              <w:t xml:space="preserve">Bağımlılıkları kur</w:t>
+            </w:r>
+            <w:r>
+              <w:rPr>
+                <w:sz w:val="19"/>
+                <w:szCs w:val="19"/>
+              </w:rPr>
+              <w:t xml:space="preserve"> düğmesi; ardından </w:t>
+            </w:r>
+            <w:r>
+              <w:rPr>
+                <w:b/>
+                <w:bCs/>
+                <w:sz w:val="19"/>
+                <w:szCs w:val="19"/>
+              </w:rPr>
+              <w:t xml:space="preserve">Ortam kontrolü</w:t>
+            </w:r>
+            <w:r>
+              <w:rPr>
+                <w:sz w:val="19"/>
+                <w:szCs w:val="19"/>
+              </w:rPr>
+              <w:t xml:space="preserve">.</w:t>
             </w:r>
           </w:p>
         </w:tc>
@@ -30456,7 +30746,7 @@
                 <w:sz w:val="19"/>
                 <w:szCs w:val="19"/>
               </w:rPr>
-              <w:t xml:space="preserve">Testte çok sayıda ERROR / zaman aşımı</w:t>
+              <w:t xml:space="preserve">Arayüz yavaş, sayfa geçişlerinde ya da tema değişiminde öğeler tek tek çiziliyor</w:t>
             </w:r>
           </w:p>
         </w:tc>
@@ -30485,7 +30775,7 @@
                 <w:sz w:val="19"/>
                 <w:szCs w:val="19"/>
               </w:rPr>
-              <w:t xml:space="preserve">Sunucu yavaş ya da eşzamanlılık yüksek; VPN kopmuş.</w:t>
+              <w:t xml:space="preserve">Modern görünüm (sv-ttk) seçilmiş. Bu tema her öğeyi saydam resimlerle çizer; Windows ölçümünde sayfa geçişi 5–7 kat, tema değişimi ~5 kat yavaş çıktı.</w:t>
             </w:r>
           </w:p>
         </w:tc>
@@ -30509,13 +30799,6 @@
             <w:pPr>
               <w:spacing w:after="20"/>
             </w:pPr>
-            <w:r>
-              <w:rPr>
-                <w:sz w:val="19"/>
-                <w:szCs w:val="19"/>
-              </w:rPr>
-              <w:t xml:space="preserve">Eşzamanlılığı 2–3'e, zaman aşımını 45–60 sn'ye ayarlayın; </w:t>
-            </w:r>
             <w:r>
               <w:rPr>
                 <w:b/>
@@ -30523,14 +30806,29 @@
                 <w:sz w:val="19"/>
                 <w:szCs w:val="19"/>
               </w:rPr>
-              <w:t xml:space="preserve">Hatalı sayfaları yeniden test et</w:t>
-            </w:r>
-            <w:r>
-              <w:rPr>
-                <w:sz w:val="19"/>
-                <w:szCs w:val="19"/>
-              </w:rPr>
-              <w:t xml:space="preserve">. VPN'i kontrol edin.</w:t>
+              <w:t xml:space="preserve">Ayarlar → Genel → Arayüz görünümü</w:t>
+            </w:r>
+            <w:r>
+              <w:rPr>
+                <w:sz w:val="19"/>
+                <w:szCs w:val="19"/>
+              </w:rPr>
+              <w:t xml:space="preserve">: </w:t>
+            </w:r>
+            <w:r>
+              <w:rPr>
+                <w:rFonts w:ascii="Courier New" w:cs="Courier New" w:eastAsia="Courier New" w:hAnsi="Courier New"/>
+                <w:sz w:val="19"/>
+                <w:szCs w:val="19"/>
+              </w:rPr>
+              <w:t xml:space="preserve">sade</w:t>
+            </w:r>
+            <w:r>
+              <w:rPr>
+                <w:sz w:val="19"/>
+                <w:szCs w:val="19"/>
+              </w:rPr>
+              <w:t xml:space="preserve"> (varsayılan) seçip kaydedin ve programı yeniden açın. Renkler ve düzen aynı kalır.</w:t>
             </w:r>
           </w:p>
         </w:tc>
@@ -30564,7 +30862,7 @@
                 <w:sz w:val="19"/>
                 <w:szCs w:val="19"/>
               </w:rPr>
-              <w:t xml:space="preserve">Bütün sayfalar FAIL, durum boş</w:t>
+              <w:t xml:space="preserve">Testte çok sayıda ERROR / zaman aşımı</w:t>
             </w:r>
           </w:p>
         </w:tc>
@@ -30593,7 +30891,7 @@
                 <w:sz w:val="19"/>
                 <w:szCs w:val="19"/>
               </w:rPr>
-              <w:t xml:space="preserve">Siteye ulaşılamıyor (adres yanlış, VPN yok).</w:t>
+              <w:t xml:space="preserve">Sunucu yavaş ya da eşzamanlılık yüksek; VPN kopmuş.</w:t>
             </w:r>
           </w:p>
         </w:tc>
@@ -30622,7 +30920,23 @@
                 <w:sz w:val="19"/>
                 <w:szCs w:val="19"/>
               </w:rPr>
-              <w:t xml:space="preserve">Site adresini tarayıcıda açmayı deneyin; profilin başlangıç adresini kontrol edin.</w:t>
+              <w:t xml:space="preserve">Eşzamanlılığı 2–3'e, zaman aşımını 45–60 sn'ye ayarlayın; </w:t>
+            </w:r>
+            <w:r>
+              <w:rPr>
+                <w:b/>
+                <w:bCs/>
+                <w:sz w:val="19"/>
+                <w:szCs w:val="19"/>
+              </w:rPr>
+              <w:t xml:space="preserve">Hatalı sayfaları yeniden test et</w:t>
+            </w:r>
+            <w:r>
+              <w:rPr>
+                <w:sz w:val="19"/>
+                <w:szCs w:val="19"/>
+              </w:rPr>
+              <w:t xml:space="preserve">. VPN'i kontrol edin.</w:t>
             </w:r>
           </w:p>
         </w:tc>
@@ -30656,7 +30970,7 @@
                 <w:sz w:val="19"/>
                 <w:szCs w:val="19"/>
               </w:rPr>
-              <w:t xml:space="preserve">Keşif bitmiyor, sayfa sayısı çok büyük</w:t>
+              <w:t xml:space="preserve">Bütün sayfalar FAIL, durum boş</w:t>
             </w:r>
           </w:p>
         </w:tc>
@@ -30685,7 +30999,7 @@
                 <w:sz w:val="19"/>
                 <w:szCs w:val="19"/>
               </w:rPr>
-              <w:t xml:space="preserve">Filtre/takvim gibi sonsuz kombinasyonlu adresler.</w:t>
+              <w:t xml:space="preserve">Siteye ulaşılamıyor (adres yanlış, VPN yok).</w:t>
             </w:r>
           </w:p>
         </w:tc>
@@ -30714,22 +31028,7 @@
                 <w:sz w:val="19"/>
                 <w:szCs w:val="19"/>
               </w:rPr>
-              <w:t xml:space="preserve">Hariç desenler, silinecek parametreler ve sorgu sınırını ayarlayın; </w:t>
-            </w:r>
-            <w:r>
-              <w:rPr>
-                <w:rFonts w:ascii="Courier New" w:cs="Courier New" w:eastAsia="Courier New" w:hAnsi="Courier New"/>
-                <w:sz w:val="19"/>
-                <w:szCs w:val="19"/>
-              </w:rPr>
-              <w:t xml:space="preserve">kesif/</w:t>
-            </w:r>
-            <w:r>
-              <w:rPr>
-                <w:sz w:val="19"/>
-                <w:szCs w:val="19"/>
-              </w:rPr>
-              <w:t xml:space="preserve"> klasörünü silip yeniden başlatın.</w:t>
+              <w:t xml:space="preserve">Site adresini tarayıcıda açmayı deneyin; profilin başlangıç adresini kontrol edin.</w:t>
             </w:r>
           </w:p>
         </w:tc>
@@ -30763,7 +31062,7 @@
                 <w:sz w:val="19"/>
                 <w:szCs w:val="19"/>
               </w:rPr>
-              <w:t xml:space="preserve">Keşif çok az sayfa buldu</w:t>
+              <w:t xml:space="preserve">Keşif bitmiyor, sayfa sayısı çok büyük</w:t>
             </w:r>
           </w:p>
         </w:tc>
@@ -30792,7 +31091,7 @@
                 <w:sz w:val="19"/>
                 <w:szCs w:val="19"/>
               </w:rPr>
-              <w:t xml:space="preserve">Linkler JavaScript ile üretiliyor (SPA).</w:t>
+              <w:t xml:space="preserve">Filtre/takvim gibi sonsuz kombinasyonlu adresler.</w:t>
             </w:r>
           </w:p>
         </w:tc>
@@ -30818,19 +31117,25 @@
             </w:pPr>
             <w:r>
               <w:rPr>
-                <w:b/>
-                <w:bCs/>
-                <w:sz w:val="19"/>
-                <w:szCs w:val="19"/>
-              </w:rPr>
-              <w:t xml:space="preserve">Tarayıcıyla keşfet</w:t>
-            </w:r>
-            <w:r>
-              <w:rPr>
-                <w:sz w:val="19"/>
-                <w:szCs w:val="19"/>
-              </w:rPr>
-              <w:t xml:space="preserve">'i açın.</w:t>
+                <w:sz w:val="19"/>
+                <w:szCs w:val="19"/>
+              </w:rPr>
+              <w:t xml:space="preserve">Hariç desenler, silinecek parametreler ve sorgu sınırını ayarlayın; </w:t>
+            </w:r>
+            <w:r>
+              <w:rPr>
+                <w:rFonts w:ascii="Courier New" w:cs="Courier New" w:eastAsia="Courier New" w:hAnsi="Courier New"/>
+                <w:sz w:val="19"/>
+                <w:szCs w:val="19"/>
+              </w:rPr>
+              <w:t xml:space="preserve">kesif/</w:t>
+            </w:r>
+            <w:r>
+              <w:rPr>
+                <w:sz w:val="19"/>
+                <w:szCs w:val="19"/>
+              </w:rPr>
+              <w:t xml:space="preserve"> klasörünü silip yeniden başlatın.</w:t>
             </w:r>
           </w:p>
         </w:tc>
@@ -30864,7 +31169,7 @@
                 <w:sz w:val="19"/>
                 <w:szCs w:val="19"/>
               </w:rPr>
-              <w:t xml:space="preserve">Yapay zekâ: "model bu hesapta kullanılamıyor (404)"</w:t>
+              <w:t xml:space="preserve">Keşif çok az sayfa buldu</w:t>
             </w:r>
           </w:p>
         </w:tc>
@@ -30893,7 +31198,7 @@
                 <w:sz w:val="19"/>
                 <w:szCs w:val="19"/>
               </w:rPr>
-              <w:t xml:space="preserve">Model adı yanlış ya da hesapta yok.</w:t>
+              <w:t xml:space="preserve">Linkler JavaScript ile üretiliyor (SPA).</w:t>
             </w:r>
           </w:p>
         </w:tc>
@@ -30924,14 +31229,14 @@
                 <w:sz w:val="19"/>
                 <w:szCs w:val="19"/>
               </w:rPr>
-              <w:t xml:space="preserve">Yapay zekâ sağlayıcılarını dene</w:t>
-            </w:r>
-            <w:r>
-              <w:rPr>
-                <w:sz w:val="19"/>
-                <w:szCs w:val="19"/>
-              </w:rPr>
-              <w:t xml:space="preserve"> ile kullanılabilir modelleri görün, ayarı düzeltin.</w:t>
+              <w:t xml:space="preserve">Tarayıcıyla keşfet</w:t>
+            </w:r>
+            <w:r>
+              <w:rPr>
+                <w:sz w:val="19"/>
+                <w:szCs w:val="19"/>
+              </w:rPr>
+              <w:t xml:space="preserve">'i açın.</w:t>
             </w:r>
           </w:p>
         </w:tc>
@@ -30965,7 +31270,7 @@
                 <w:sz w:val="19"/>
                 <w:szCs w:val="19"/>
               </w:rPr>
-              <w:t xml:space="preserve">Yapay zekâ: "günlük kota doldu"</w:t>
+              <w:t xml:space="preserve">Yapay zekâ: "model bu hesapta kullanılamıyor (404)"</w:t>
             </w:r>
           </w:p>
         </w:tc>
@@ -30994,7 +31299,7 @@
                 <w:sz w:val="19"/>
                 <w:szCs w:val="19"/>
               </w:rPr>
-              <w:t xml:space="preserve">Ücretsiz katman kotası.</w:t>
+              <w:t xml:space="preserve">Model adı yanlış ya da hesapta yok.</w:t>
             </w:r>
           </w:p>
         </w:tc>
@@ -31020,10 +31325,19 @@
             </w:pPr>
             <w:r>
               <w:rPr>
-                <w:sz w:val="19"/>
-                <w:szCs w:val="19"/>
-              </w:rPr>
-              <w:t xml:space="preserve">Ertesi gün aynı adımı çalıştırın; kaldığı yerden devam eder.</w:t>
+                <w:b/>
+                <w:bCs/>
+                <w:sz w:val="19"/>
+                <w:szCs w:val="19"/>
+              </w:rPr>
+              <w:t xml:space="preserve">Yapay zekâ sağlayıcılarını dene</w:t>
+            </w:r>
+            <w:r>
+              <w:rPr>
+                <w:sz w:val="19"/>
+                <w:szCs w:val="19"/>
+              </w:rPr>
+              <w:t xml:space="preserve"> ile kullanılabilir modelleri görün, ayarı düzeltin.</w:t>
             </w:r>
           </w:p>
         </w:tc>
@@ -31057,7 +31371,7 @@
                 <w:sz w:val="19"/>
                 <w:szCs w:val="19"/>
               </w:rPr>
-              <w:t xml:space="preserve">Yapay zekâ analizi uzun süre ilerlemiyor gibi görünüyor</w:t>
+              <w:t xml:space="preserve">Yapay zekâ: "günlük kota doldu"</w:t>
             </w:r>
           </w:p>
         </w:tc>
@@ -31086,7 +31400,7 @@
                 <w:sz w:val="19"/>
                 <w:szCs w:val="19"/>
               </w:rPr>
-              <w:t xml:space="preserve">Ekrana yalnız hatalar yazılır; Gemma yavaştır.</w:t>
+              <w:t xml:space="preserve">Ücretsiz katman kotası.</w:t>
             </w:r>
           </w:p>
         </w:tc>
@@ -31112,18 +31426,10 @@
             </w:pPr>
             <w:r>
               <w:rPr>
-                <w:rFonts w:ascii="Courier New" w:cs="Courier New" w:eastAsia="Courier New" w:hAnsi="Courier New"/>
-                <w:sz w:val="19"/>
-                <w:szCs w:val="19"/>
-              </w:rPr>
-              <w:t xml:space="preserve">[i/N] ✓ … ✗ …</w:t>
-            </w:r>
-            <w:r>
-              <w:rPr>
-                <w:sz w:val="19"/>
-                <w:szCs w:val="19"/>
-              </w:rPr>
-              <w:t xml:space="preserve"> satırındaki sayaç ilerliyorsa çalışıyordur (satır arası 8–15 dk normal). 30 dakikadan uzun süre yeni satır yoksa adımı durdurup yeniden başlatın; tamamlananlar atlanır. Bilgisayarın uykuya geçmediğinden emin olun.</w:t>
+                <w:sz w:val="19"/>
+                <w:szCs w:val="19"/>
+              </w:rPr>
+              <w:t xml:space="preserve">Ertesi gün aynı adımı çalıştırın; kaldığı yerden devam eder.</w:t>
             </w:r>
           </w:p>
         </w:tc>
@@ -31157,7 +31463,7 @@
                 <w:sz w:val="19"/>
                 <w:szCs w:val="19"/>
               </w:rPr>
-              <w:t xml:space="preserve">Yapay zekâ: 3b "İlk model tamamlanmadı" ile başarısız bitti ya da 3c "İlk model tamamlanmadan hakem başlamaz" diyor</w:t>
+              <w:t xml:space="preserve">Yapay zekâ analizi uzun süre ilerlemiyor gibi görünüyor</w:t>
             </w:r>
           </w:p>
         </w:tc>
@@ -31186,7 +31492,7 @@
                 <w:sz w:val="19"/>
                 <w:szCs w:val="19"/>
               </w:rPr>
-              <w:t xml:space="preserve">Analiz yarıda kalmış ya da kota dolmuş; bazı dilimler ilk modele hiç sorulmamış.</w:t>
+              <w:t xml:space="preserve">Ekrana yalnız hatalar yazılır; Gemma yavaştır.</w:t>
             </w:r>
           </w:p>
         </w:tc>
@@ -31212,19 +31518,18 @@
             </w:pPr>
             <w:r>
               <w:rPr>
-                <w:b/>
-                <w:bCs/>
-                <w:sz w:val="19"/>
-                <w:szCs w:val="19"/>
-              </w:rPr>
-              <w:t xml:space="preserve">3b</w:t>
-            </w:r>
-            <w:r>
-              <w:rPr>
-                <w:sz w:val="19"/>
-                <w:szCs w:val="19"/>
-              </w:rPr>
-              <w:t xml:space="preserve">'yi tekrar çalıştırın (günlük kota bittiyse ertesi gün): yalnız eksikler denenir. Ana sayfadaki "Yapay zekâ: ilk model" satırı tamamlanınca 3c'yi çalıştırın.</w:t>
+                <w:rFonts w:ascii="Courier New" w:cs="Courier New" w:eastAsia="Courier New" w:hAnsi="Courier New"/>
+                <w:sz w:val="19"/>
+                <w:szCs w:val="19"/>
+              </w:rPr>
+              <w:t xml:space="preserve">[i/N] ✓ … ✗ …</w:t>
+            </w:r>
+            <w:r>
+              <w:rPr>
+                <w:sz w:val="19"/>
+                <w:szCs w:val="19"/>
+              </w:rPr>
+              <w:t xml:space="preserve"> satırındaki sayaç ilerliyorsa çalışıyordur (satır arası 8–15 dk normal). 30 dakikadan uzun süre yeni satır yoksa adımı durdurup yeniden başlatın; tamamlananlar atlanır. Bilgisayarın uykuya geçmediğinden emin olun.</w:t>
             </w:r>
           </w:p>
         </w:tc>
@@ -31258,7 +31563,7 @@
                 <w:sz w:val="19"/>
                 <w:szCs w:val="19"/>
               </w:rPr>
-              <w:t xml:space="preserve">Yapay zekâ: çok sayıda "gemma_500_kalici" ya da sonda "N istek yapılamadı"</w:t>
+              <w:t xml:space="preserve">Yapay zekâ: 3b "İlk model tamamlanmadı" ile başarısız bitti ya da 3c "İlk model tamamlanmadan hakem başlamaz" diyor</w:t>
             </w:r>
           </w:p>
         </w:tc>
@@ -31287,7 +31592,7 @@
                 <w:sz w:val="19"/>
                 <w:szCs w:val="19"/>
               </w:rPr>
-              <w:t xml:space="preserve">Gemma sunucu hatası, kota ya da bağlantı sorunu.</w:t>
+              <w:t xml:space="preserve">Analiz yarıda kalmış ya da kota dolmuş; bazı dilimler ilk modele hiç sorulmamış.</w:t>
             </w:r>
           </w:p>
         </w:tc>
@@ -31311,13 +31616,6 @@
             <w:pPr>
               <w:spacing w:after="20"/>
             </w:pPr>
-            <w:r>
-              <w:rPr>
-                <w:sz w:val="19"/>
-                <w:szCs w:val="19"/>
-              </w:rPr>
-              <w:t xml:space="preserve">Adım bitince </w:t>
-            </w:r>
             <w:r>
               <w:rPr>
                 <w:b/>
@@ -31332,23 +31630,7 @@
                 <w:sz w:val="19"/>
                 <w:szCs w:val="19"/>
               </w:rPr>
-              <w:t xml:space="preserve">'yi tekrar çalıştırın: yalnız yapılamayanlar denenir. Sonra </w:t>
-            </w:r>
-            <w:r>
-              <w:rPr>
-                <w:b/>
-                <w:bCs/>
-                <w:sz w:val="19"/>
-                <w:szCs w:val="19"/>
-              </w:rPr>
-              <w:t xml:space="preserve">3c, 4, 5, 6</w:t>
-            </w:r>
-            <w:r>
-              <w:rPr>
-                <w:sz w:val="19"/>
-                <w:szCs w:val="19"/>
-              </w:rPr>
-              <w:t xml:space="preserve">'yı yeniden çalıştırın. Yine düşen Gemma dilimlerine hakem bakar.</w:t>
+              <w:t xml:space="preserve">'yi tekrar çalıştırın (günlük kota bittiyse ertesi gün): yalnız eksikler denenir. Ana sayfadaki "Yapay zekâ: ilk model" satırı tamamlanınca 3c'yi çalıştırın.</w:t>
             </w:r>
           </w:p>
         </w:tc>
@@ -31382,7 +31664,7 @@
                 <w:sz w:val="19"/>
                 <w:szCs w:val="19"/>
               </w:rPr>
-              <w:t xml:space="preserve">Yapay zekâ adımı "ornekler.csv yok" diyor</w:t>
+              <w:t xml:space="preserve">Yapay zekâ: çok sayıda "gemma_500_kalici" ya da sonda "N istek yapılamadı"</w:t>
             </w:r>
           </w:p>
         </w:tc>
@@ -31411,7 +31693,7 @@
                 <w:sz w:val="19"/>
                 <w:szCs w:val="19"/>
               </w:rPr>
-              <w:t xml:space="preserve">Önceki adımlar çalışmamış.</w:t>
+              <w:t xml:space="preserve">Gemma sunucu hatası, kota ya da bağlantı sorunu.</w:t>
             </w:r>
           </w:p>
         </w:tc>
@@ -31440,7 +31722,39 @@
                 <w:sz w:val="19"/>
                 <w:szCs w:val="19"/>
               </w:rPr>
-              <w:t xml:space="preserve">Yapay zekâ hattını baştan (1. adımdan) çalıştırın.</w:t>
+              <w:t xml:space="preserve">Adım bitince </w:t>
+            </w:r>
+            <w:r>
+              <w:rPr>
+                <w:b/>
+                <w:bCs/>
+                <w:sz w:val="19"/>
+                <w:szCs w:val="19"/>
+              </w:rPr>
+              <w:t xml:space="preserve">3b</w:t>
+            </w:r>
+            <w:r>
+              <w:rPr>
+                <w:sz w:val="19"/>
+                <w:szCs w:val="19"/>
+              </w:rPr>
+              <w:t xml:space="preserve">'yi tekrar çalıştırın: yalnız yapılamayanlar denenir. Sonra </w:t>
+            </w:r>
+            <w:r>
+              <w:rPr>
+                <w:b/>
+                <w:bCs/>
+                <w:sz w:val="19"/>
+                <w:szCs w:val="19"/>
+              </w:rPr>
+              <w:t xml:space="preserve">3c, 4, 5, 6</w:t>
+            </w:r>
+            <w:r>
+              <w:rPr>
+                <w:sz w:val="19"/>
+                <w:szCs w:val="19"/>
+              </w:rPr>
+              <w:t xml:space="preserve">'yı yeniden çalıştırın. Yine düşen Gemma dilimlerine hakem bakar.</w:t>
             </w:r>
           </w:p>
         </w:tc>
@@ -31474,7 +31788,7 @@
                 <w:sz w:val="19"/>
                 <w:szCs w:val="19"/>
               </w:rPr>
-              <w:t xml:space="preserve">Canlı doğrulama "results.jsonl yok" diyor</w:t>
+              <w:t xml:space="preserve">Yapay zekâ adımı "ornekler.csv yok" diyor</w:t>
             </w:r>
           </w:p>
         </w:tc>
@@ -31503,7 +31817,7 @@
                 <w:sz w:val="19"/>
                 <w:szCs w:val="19"/>
               </w:rPr>
-              <w:t xml:space="preserve">Doğrulama çekimi yapılmamış ya da yarıda kalmış.</w:t>
+              <w:t xml:space="preserve">Önceki adımlar çalışmamış.</w:t>
             </w:r>
           </w:p>
         </w:tc>
@@ -31532,7 +31846,7 @@
                 <w:sz w:val="19"/>
                 <w:szCs w:val="19"/>
               </w:rPr>
-              <w:t xml:space="preserve">7. adımı yeniden çalıştırın.</w:t>
+              <w:t xml:space="preserve">Yapay zekâ hattını baştan (1. adımdan) çalıştırın.</w:t>
             </w:r>
           </w:p>
         </w:tc>
@@ -31566,7 +31880,7 @@
                 <w:sz w:val="19"/>
                 <w:szCs w:val="19"/>
               </w:rPr>
-              <w:t xml:space="preserve">"Etiketleri işle" CSV'yi okuyamıyor</w:t>
+              <w:t xml:space="preserve">Canlı doğrulama "results.jsonl yok" diyor</w:t>
             </w:r>
           </w:p>
         </w:tc>
@@ -31595,7 +31909,7 @@
                 <w:sz w:val="19"/>
                 <w:szCs w:val="19"/>
               </w:rPr>
-              <w:t xml:space="preserve">Dosya başka yerde ya da sayfadan indirilmemiş.</w:t>
+              <w:t xml:space="preserve">Doğrulama çekimi yapılmamış ya da yarıda kalmış.</w:t>
             </w:r>
           </w:p>
         </w:tc>
@@ -31624,23 +31938,7 @@
                 <w:sz w:val="19"/>
                 <w:szCs w:val="19"/>
               </w:rPr>
-              <w:t xml:space="preserve">Etiketleme sayfasındaki </w:t>
-            </w:r>
-            <w:r>
-              <w:rPr>
-                <w:b/>
-                <w:bCs/>
-                <w:sz w:val="19"/>
-                <w:szCs w:val="19"/>
-              </w:rPr>
-              <w:t xml:space="preserve">CSV indir</w:t>
-            </w:r>
-            <w:r>
-              <w:rPr>
-                <w:sz w:val="19"/>
-                <w:szCs w:val="19"/>
-              </w:rPr>
-              <w:t xml:space="preserve">'i kullanın; dosya İndirilenler'de değilse Ayarlar'da yolunu verin.</w:t>
+              <w:t xml:space="preserve">7. adımı yeniden çalıştırın.</w:t>
             </w:r>
           </w:p>
         </w:tc>
@@ -31674,7 +31972,7 @@
                 <w:sz w:val="19"/>
                 <w:szCs w:val="19"/>
               </w:rPr>
-              <w:t xml:space="preserve">Bologna: "docker" bulunamadı</w:t>
+              <w:t xml:space="preserve">"Etiketleri işle" CSV'yi okuyamıyor</w:t>
             </w:r>
           </w:p>
         </w:tc>
@@ -31703,6 +32001,114 @@
                 <w:sz w:val="19"/>
                 <w:szCs w:val="19"/>
               </w:rPr>
+              <w:t xml:space="preserve">Dosya başka yerde ya da sayfadan indirilmemiş.</w:t>
+            </w:r>
+          </w:p>
+        </w:tc>
+        <w:tc>
+          <w:tcPr>
+            <w:tcW w:type="dxa" w:w="4397"/>
+            <w:tcBorders>
+              <w:top w:val="single" w:color="BFBFBF" w:sz="4"/>
+              <w:left w:val="single" w:color="BFBFBF" w:sz="4"/>
+              <w:bottom w:val="single" w:color="BFBFBF" w:sz="4"/>
+              <w:right w:val="single" w:color="BFBFBF" w:sz="4"/>
+            </w:tcBorders>
+            <w:tcMar>
+              <w:top w:type="dxa" w:w="60"/>
+              <w:left w:type="dxa" w:w="100"/>
+              <w:bottom w:type="dxa" w:w="60"/>
+              <w:right w:type="dxa" w:w="100"/>
+            </w:tcMar>
+          </w:tcPr>
+          <w:p>
+            <w:pPr>
+              <w:spacing w:after="20"/>
+            </w:pPr>
+            <w:r>
+              <w:rPr>
+                <w:sz w:val="19"/>
+                <w:szCs w:val="19"/>
+              </w:rPr>
+              <w:t xml:space="preserve">Etiketleme sayfasındaki </w:t>
+            </w:r>
+            <w:r>
+              <w:rPr>
+                <w:b/>
+                <w:bCs/>
+                <w:sz w:val="19"/>
+                <w:szCs w:val="19"/>
+              </w:rPr>
+              <w:t xml:space="preserve">CSV indir</w:t>
+            </w:r>
+            <w:r>
+              <w:rPr>
+                <w:sz w:val="19"/>
+                <w:szCs w:val="19"/>
+              </w:rPr>
+              <w:t xml:space="preserve">'i kullanın; dosya İndirilenler'de değilse Ayarlar'da yolunu verin.</w:t>
+            </w:r>
+          </w:p>
+        </w:tc>
+      </w:tr>
+      <w:tr>
+        <w:trPr>
+          <w:cantSplit/>
+        </w:trPr>
+        <w:tc>
+          <w:tcPr>
+            <w:tcW w:type="dxa" w:w="2705"/>
+            <w:tcBorders>
+              <w:top w:val="single" w:color="BFBFBF" w:sz="4"/>
+              <w:left w:val="single" w:color="BFBFBF" w:sz="4"/>
+              <w:bottom w:val="single" w:color="BFBFBF" w:sz="4"/>
+              <w:right w:val="single" w:color="BFBFBF" w:sz="4"/>
+            </w:tcBorders>
+            <w:tcMar>
+              <w:top w:type="dxa" w:w="60"/>
+              <w:left w:type="dxa" w:w="100"/>
+              <w:bottom w:type="dxa" w:w="60"/>
+              <w:right w:type="dxa" w:w="100"/>
+            </w:tcMar>
+          </w:tcPr>
+          <w:p>
+            <w:pPr>
+              <w:spacing w:after="20"/>
+            </w:pPr>
+            <w:r>
+              <w:rPr>
+                <w:sz w:val="19"/>
+                <w:szCs w:val="19"/>
+              </w:rPr>
+              <w:t xml:space="preserve">Bologna: "Program bulunamadı: docker"</w:t>
+            </w:r>
+          </w:p>
+        </w:tc>
+        <w:tc>
+          <w:tcPr>
+            <w:tcW w:type="dxa" w:w="2536"/>
+            <w:tcBorders>
+              <w:top w:val="single" w:color="BFBFBF" w:sz="4"/>
+              <w:left w:val="single" w:color="BFBFBF" w:sz="4"/>
+              <w:bottom w:val="single" w:color="BFBFBF" w:sz="4"/>
+              <w:right w:val="single" w:color="BFBFBF" w:sz="4"/>
+            </w:tcBorders>
+            <w:tcMar>
+              <w:top w:type="dxa" w:w="60"/>
+              <w:left w:type="dxa" w:w="100"/>
+              <w:bottom w:type="dxa" w:w="60"/>
+              <w:right w:type="dxa" w:w="100"/>
+            </w:tcMar>
+          </w:tcPr>
+          <w:p>
+            <w:pPr>
+              <w:spacing w:after="20"/>
+            </w:pPr>
+            <w:r>
+              <w:rPr>
+                <w:sz w:val="19"/>
+                <w:szCs w:val="19"/>
+              </w:rPr>
               <w:t xml:space="preserve">Docker Desktop kurulu değil ya da çalışmıyor.</w:t>
             </w:r>
           </w:p>
@@ -31733,6 +32139,220 @@
                 <w:szCs w:val="19"/>
               </w:rPr>
               <w:t xml:space="preserve">Docker Desktop'ı kurup başlatın; ya da Ayarlar'da Bologna modunu "yerel" yapıp Go + PostgreSQL kurun.</w:t>
+            </w:r>
+          </w:p>
+        </w:tc>
+      </w:tr>
+      <w:tr>
+        <w:trPr>
+          <w:cantSplit/>
+        </w:trPr>
+        <w:tc>
+          <w:tcPr>
+            <w:tcW w:type="dxa" w:w="2705"/>
+            <w:tcBorders>
+              <w:top w:val="single" w:color="BFBFBF" w:sz="4"/>
+              <w:left w:val="single" w:color="BFBFBF" w:sz="4"/>
+              <w:bottom w:val="single" w:color="BFBFBF" w:sz="4"/>
+              <w:right w:val="single" w:color="BFBFBF" w:sz="4"/>
+            </w:tcBorders>
+            <w:tcMar>
+              <w:top w:type="dxa" w:w="60"/>
+              <w:left w:type="dxa" w:w="100"/>
+              <w:bottom w:type="dxa" w:w="60"/>
+              <w:right w:type="dxa" w:w="100"/>
+            </w:tcMar>
+          </w:tcPr>
+          <w:p>
+            <w:pPr>
+              <w:spacing w:after="20"/>
+            </w:pPr>
+            <w:r>
+              <w:rPr>
+                <w:sz w:val="19"/>
+                <w:szCs w:val="19"/>
+              </w:rPr>
+              <w:t xml:space="preserve">Docker Desktop: "WSL is not installed" / "WSL needs updating"</w:t>
+            </w:r>
+          </w:p>
+        </w:tc>
+        <w:tc>
+          <w:tcPr>
+            <w:tcW w:type="dxa" w:w="2536"/>
+            <w:tcBorders>
+              <w:top w:val="single" w:color="BFBFBF" w:sz="4"/>
+              <w:left w:val="single" w:color="BFBFBF" w:sz="4"/>
+              <w:bottom w:val="single" w:color="BFBFBF" w:sz="4"/>
+              <w:right w:val="single" w:color="BFBFBF" w:sz="4"/>
+            </w:tcBorders>
+            <w:tcMar>
+              <w:top w:type="dxa" w:w="60"/>
+              <w:left w:type="dxa" w:w="100"/>
+              <w:bottom w:type="dxa" w:w="60"/>
+              <w:right w:type="dxa" w:w="100"/>
+            </w:tcMar>
+          </w:tcPr>
+          <w:p>
+            <w:pPr>
+              <w:spacing w:after="20"/>
+            </w:pPr>
+            <w:r>
+              <w:rPr>
+                <w:sz w:val="19"/>
+                <w:szCs w:val="19"/>
+              </w:rPr>
+              <w:t xml:space="preserve">Docker, Windows'ta WSL 2 üzerinde çalışır.</w:t>
+            </w:r>
+          </w:p>
+        </w:tc>
+        <w:tc>
+          <w:tcPr>
+            <w:tcW w:type="dxa" w:w="4397"/>
+            <w:tcBorders>
+              <w:top w:val="single" w:color="BFBFBF" w:sz="4"/>
+              <w:left w:val="single" w:color="BFBFBF" w:sz="4"/>
+              <w:bottom w:val="single" w:color="BFBFBF" w:sz="4"/>
+              <w:right w:val="single" w:color="BFBFBF" w:sz="4"/>
+            </w:tcBorders>
+            <w:tcMar>
+              <w:top w:type="dxa" w:w="60"/>
+              <w:left w:type="dxa" w:w="100"/>
+              <w:bottom w:type="dxa" w:w="60"/>
+              <w:right w:type="dxa" w:w="100"/>
+            </w:tcMar>
+          </w:tcPr>
+          <w:p>
+            <w:pPr>
+              <w:spacing w:after="20"/>
+            </w:pPr>
+            <w:r>
+              <w:rPr>
+                <w:sz w:val="19"/>
+                <w:szCs w:val="19"/>
+              </w:rPr>
+              <w:t xml:space="preserve">Yönetici PowerShell'de </w:t>
+            </w:r>
+            <w:r>
+              <w:rPr>
+                <w:rFonts w:ascii="Courier New" w:cs="Courier New" w:eastAsia="Courier New" w:hAnsi="Courier New"/>
+                <w:sz w:val="19"/>
+                <w:szCs w:val="19"/>
+              </w:rPr>
+              <w:t xml:space="preserve">wsl --install --no-distribution</w:t>
+            </w:r>
+            <w:r>
+              <w:rPr>
+                <w:sz w:val="19"/>
+                <w:szCs w:val="19"/>
+              </w:rPr>
+              <w:t xml:space="preserve"> (yarım kuruluysa </w:t>
+            </w:r>
+            <w:r>
+              <w:rPr>
+                <w:rFonts w:ascii="Courier New" w:cs="Courier New" w:eastAsia="Courier New" w:hAnsi="Courier New"/>
+                <w:sz w:val="19"/>
+                <w:szCs w:val="19"/>
+              </w:rPr>
+              <w:t xml:space="preserve">wsl --update</w:t>
+            </w:r>
+            <w:r>
+              <w:rPr>
+                <w:sz w:val="19"/>
+                <w:szCs w:val="19"/>
+              </w:rPr>
+              <w:t xml:space="preserve">), sonra bilgisayarı yeniden başlatın. "Sanallaştırma kapalı" derse BIOS/UEFI'de Intel VT-x / AMD SVM'i açın.</w:t>
+            </w:r>
+          </w:p>
+        </w:tc>
+      </w:tr>
+      <w:tr>
+        <w:trPr>
+          <w:cantSplit/>
+        </w:trPr>
+        <w:tc>
+          <w:tcPr>
+            <w:tcW w:type="dxa" w:w="2705"/>
+            <w:tcBorders>
+              <w:top w:val="single" w:color="BFBFBF" w:sz="4"/>
+              <w:left w:val="single" w:color="BFBFBF" w:sz="4"/>
+              <w:bottom w:val="single" w:color="BFBFBF" w:sz="4"/>
+              <w:right w:val="single" w:color="BFBFBF" w:sz="4"/>
+            </w:tcBorders>
+            <w:tcMar>
+              <w:top w:type="dxa" w:w="60"/>
+              <w:left w:type="dxa" w:w="100"/>
+              <w:bottom w:type="dxa" w:w="60"/>
+              <w:right w:type="dxa" w:w="100"/>
+            </w:tcMar>
+          </w:tcPr>
+          <w:p>
+            <w:pPr>
+              <w:spacing w:after="20"/>
+            </w:pPr>
+            <w:r>
+              <w:rPr>
+                <w:sz w:val="19"/>
+                <w:szCs w:val="19"/>
+              </w:rPr>
+              <w:t xml:space="preserve">Docker Desktop "Starting the Docker Engine..." ekranında kalıyor</w:t>
+            </w:r>
+          </w:p>
+        </w:tc>
+        <w:tc>
+          <w:tcPr>
+            <w:tcW w:type="dxa" w:w="2536"/>
+            <w:tcBorders>
+              <w:top w:val="single" w:color="BFBFBF" w:sz="4"/>
+              <w:left w:val="single" w:color="BFBFBF" w:sz="4"/>
+              <w:bottom w:val="single" w:color="BFBFBF" w:sz="4"/>
+              <w:right w:val="single" w:color="BFBFBF" w:sz="4"/>
+            </w:tcBorders>
+            <w:tcMar>
+              <w:top w:type="dxa" w:w="60"/>
+              <w:left w:type="dxa" w:w="100"/>
+              <w:bottom w:type="dxa" w:w="60"/>
+              <w:right w:type="dxa" w:w="100"/>
+            </w:tcMar>
+          </w:tcPr>
+          <w:p>
+            <w:pPr>
+              <w:spacing w:after="20"/>
+            </w:pPr>
+            <w:r>
+              <w:rPr>
+                <w:sz w:val="19"/>
+                <w:szCs w:val="19"/>
+              </w:rPr>
+              <w:t xml:space="preserve">İlk açılışta motor 1–5 dk'da başlar.</w:t>
+            </w:r>
+          </w:p>
+        </w:tc>
+        <w:tc>
+          <w:tcPr>
+            <w:tcW w:type="dxa" w:w="4397"/>
+            <w:tcBorders>
+              <w:top w:val="single" w:color="BFBFBF" w:sz="4"/>
+              <w:left w:val="single" w:color="BFBFBF" w:sz="4"/>
+              <w:bottom w:val="single" w:color="BFBFBF" w:sz="4"/>
+              <w:right w:val="single" w:color="BFBFBF" w:sz="4"/>
+            </w:tcBorders>
+            <w:tcMar>
+              <w:top w:type="dxa" w:w="60"/>
+              <w:left w:type="dxa" w:w="100"/>
+              <w:bottom w:type="dxa" w:w="60"/>
+              <w:right w:type="dxa" w:w="100"/>
+            </w:tcMar>
+          </w:tcPr>
+          <w:p>
+            <w:pPr>
+              <w:spacing w:after="20"/>
+            </w:pPr>
+            <w:r>
+              <w:rPr>
+                <w:sz w:val="19"/>
+                <w:szCs w:val="19"/>
+              </w:rPr>
+              <w:t xml:space="preserve">10 dakikayı geçerse Docker Desktop'ı kapatıp açın (balina simgesi &gt; Quit); olmazsa bilgisayarı yeniden başlatın.</w:t>
             </w:r>
           </w:p>
         </w:tc>
@@ -32158,7 +32778,18 @@
         <w:spacing w:after="60"/>
       </w:pPr>
       <w:r>
-        <w:t xml:space="preserve">Docker Desktop'ı kurup başlatın (ya da Ayarlar'da modu "yerel" yapıp Go ve PostgreSQL kurun, PostgreSQL adresini girin).</w:t>
+        <w:t xml:space="preserve">Docker Desktop'ı kurup başlatın. Windows'ta Docker WSL 2 ister: "WSL is not installed" derse yönetici PowerShell'de </w:t>
+      </w:r>
+      <w:r>
+        <w:rPr>
+          <w:rFonts w:ascii="Courier New" w:cs="Courier New" w:eastAsia="Courier New" w:hAnsi="Courier New"/>
+          <w:sz w:val="19"/>
+          <w:szCs w:val="19"/>
+        </w:rPr>
+        <w:t xml:space="preserve">wsl --install --no-distribution</w:t>
+      </w:r>
+      <w:r>
+        <w:t xml:space="preserve"> çalıştırıp bilgisayarı yeniden başlatın. Docker Desktop'ta sol altta "Engine running" yazınca hazırdır (ilk açılış 1–5 dk). Docker istemiyorsanız Ayarlar'da modu "yerel" yapıp Go ve PostgreSQL kurun, PostgreSQL adresini girin.</w:t>
       </w:r>
     </w:p>
     <w:p>
@@ -32201,7 +32832,7 @@
         <w:t xml:space="preserve">Tek program tara</w:t>
       </w:r>
       <w:r>
-        <w:t xml:space="preserve"> (varsayılan 1371: Bilgisayar Mühendisliği, ~1 dk).</w:t>
+        <w:t xml:space="preserve"> (varsayılan 1371: Bilgisayar Mühendisliği; ilk seferde araç derlendiği için 3–5 dk, sonra ~1 dk).</w:t>
       </w:r>
     </w:p>
     <w:p>

</xml_diff>

<commit_message>
Adım sayfalarına "Bu sayfadakileri sırayla çalıştır" (1.3)
Sayfadaki adımlar önerilenler işaretli bir pencerede gelir, seçilenler
sırayla çalışır. 8a ile 8b birlikte çalışmaz; 9, 10'dan sonra çalışır.
Kapanmış pencereden kalan kaydırmalı çerçeve tema değişiminde hata vermez.

Co-Authored-By: Claude Opus 5.5 <noreply@anthropic.com>
Claude-Session: https://claude.ai/code/session_01Y7HA7zWrzagZQyqvydG6xL
</commit_message>
<xml_diff>
--- a/docs/KULLANIM_KILAVUZU.docx
+++ b/docs/KULLANIM_KILAVUZU.docx
@@ -4877,7 +4877,7 @@
         <w:spacing w:after="120"/>
       </w:pPr>
       <w:r>
-        <w:t xml:space="preserve">Çalıştırmanın yalnızca iki yolu vardır: ana sayfadaki </w:t>
+        <w:t xml:space="preserve">Çalıştırmanın üç yolu vardır: ana sayfadaki </w:t>
       </w:r>
       <w:r>
         <w:rPr>
@@ -4887,7 +4887,7 @@
         <w:t xml:space="preserve">Başlat</w:t>
       </w:r>
       <w:r>
-        <w:t xml:space="preserve"> (sıradaki aşama) ve adım sayfalarındaki </w:t>
+        <w:t xml:space="preserve"> (sıradaki aşama), adım sayfalarındaki </w:t>
       </w:r>
       <w:r>
         <w:rPr>
@@ -4897,7 +4897,17 @@
         <w:t xml:space="preserve">Çalıştır</w:t>
       </w:r>
       <w:r>
-        <w:t xml:space="preserve"> (tek adım). Başka çalıştır düğmesi, seçim kutusu ya da çift tıklama yoktur.</w:t>
+        <w:t xml:space="preserve"> (tek adım) ve adım sayfalarındaki </w:t>
+      </w:r>
+      <w:r>
+        <w:rPr>
+          <w:b/>
+          <w:bCs/>
+        </w:rPr>
+        <w:t xml:space="preserve">Bu sayfadakileri sırayla çalıştır…</w:t>
+      </w:r>
+      <w:r>
+        <w:t xml:space="preserve"> (o sayfanın adımları).</w:t>
       </w:r>
     </w:p>
     <w:p>
@@ -6072,6 +6082,46 @@
       </w:r>
       <w:r>
         <w:t xml:space="preserve"> düğmesine basın. Bir çalışma sürerken düğme pasiftir.</w:t>
+      </w:r>
+    </w:p>
+    <w:p>
+      <w:pPr>
+        <w:pStyle w:val="ListParagraph"/>
+        <w:numPr>
+          <w:ilvl w:val="0"/>
+          <w:numId w:val="2"/>
+        </w:numPr>
+        <w:spacing w:after="60"/>
+      </w:pPr>
+      <w:r>
+        <w:rPr>
+          <w:b/>
+          <w:bCs/>
+        </w:rPr>
+        <w:t xml:space="preserve">Sayfadakilerin hepsi:</w:t>
+      </w:r>
+      <w:r>
+        <w:t xml:space="preserve"> listenin altındaki </w:t>
+      </w:r>
+      <w:r>
+        <w:rPr>
+          <w:b/>
+          <w:bCs/>
+        </w:rPr>
+        <w:t xml:space="preserve">▶▶ Bu sayfadakileri sırayla çalıştır…</w:t>
+      </w:r>
+      <w:r>
+        <w:t xml:space="preserve"> sayfadaki adımları işaretli bir listede gösterir. Önerilenler işaretli gelir; aynı işi iki kez yapan ya da isteğe bağlı adımlar işaretsizdir (ör. Web testi'nde deneme testi; Bologna'da seviye tarama). İşaretleri değiştirip </w:t>
+      </w:r>
+      <w:r>
+        <w:rPr>
+          <w:b/>
+          <w:bCs/>
+        </w:rPr>
+        <w:t xml:space="preserve">Başlat</w:t>
+      </w:r>
+      <w:r>
+        <w:t xml:space="preserve">'a basın; seçilenler listedeki sırayla çalışır. Doğrula ve düzelt'te 8b etiketlemeden sonra ayrıca çalıştırılır.</w:t>
       </w:r>
     </w:p>
     <w:p>

</xml_diff>

<commit_message>
Kalanları sırayla çalıştır etiketlemeyi bildirir; sayfa listesinde hepsi işaretli (1.4)
- Kalanları da sırayla çalıştır etiketlemede durmaz: 8a'yı oluşturur, kullanıcıyı
  bekleyen 8b'yi atlar. Onay penceresi etiketlemenin kullanıcıda olduğunu yazar;
  bitince etiketleme sayfasını açmayı önerir.
- Bu sayfadakileri sırayla çalıştır: hepsi işaretli gelir; işaretsiz kalan
  birkaç adımın nedeni yanında yazar.
- Önizleme betiklerinin yanlışlıkla commit'e giren profil değişikliği geri alındı.

Co-Authored-By: Claude Opus 5.5 <noreply@anthropic.com>
Claude-Session: https://claude.ai/code/session_01Y7HA7zWrzagZQyqvydG6xL
</commit_message>
<xml_diff>
--- a/docs/KULLANIM_KILAVUZU.docx
+++ b/docs/KULLANIM_KILAVUZU.docx
@@ -5880,7 +5880,7 @@
         <w:t xml:space="preserve">Kalanları da sırayla çalıştır</w:t>
       </w:r>
       <w:r>
-        <w:t xml:space="preserve"> sonraki aşamaları da arka arkaya çalıştırır; başlamadan listeyi gösterip onay ister ve sizin yapmanız gereken elle etiketleme aşamasına gelince durur.</w:t>
+        <w:t xml:space="preserve"> sonraki aşamaları da arka arkaya çalıştırır; başlamadan listeyi ve sizin yapmanız gerekenleri gösterip onay ister. Etiketlemede durmaz: etiketleme sayfasını (8a) oluşturur, sizi bekleyen 8b'yi atlayıp taşma düzeltme ve teslimle devam eder; sonunda etiketleme sayfasını açmayı önerir.</w:t>
       </w:r>
     </w:p>
     <w:p>
@@ -6111,7 +6111,7 @@
         <w:t xml:space="preserve">▶▶ Bu sayfadakileri sırayla çalıştır…</w:t>
       </w:r>
       <w:r>
-        <w:t xml:space="preserve"> sayfadaki adımları işaretli bir listede gösterir. Önerilenler işaretli gelir; aynı işi iki kez yapan ya da isteğe bağlı adımlar işaretsizdir (ör. Web testi'nde deneme testi; Bologna'da seviye tarama). İşaretleri değiştirip </w:t>
+        <w:t xml:space="preserve"> sayfadaki adımları bir listede gösterir; hepsi işaretli gelir. Yalnız aynı işi iki kez yapan, ön koşul isteyen ya da sizi bekleyen birkaç adım işaretsizdir ve nedeni yanında yazar (ör. Bologna'da "Seviye tara · Tüm siteyi tara kapsar", "Birim testleri · Go kurulu olmalı"; Doğrula ve düzelt'te 8b). İşaretleri değiştirip </w:t>
       </w:r>
       <w:r>
         <w:rPr>
@@ -6121,7 +6121,7 @@
         <w:t xml:space="preserve">Başlat</w:t>
       </w:r>
       <w:r>
-        <w:t xml:space="preserve">'a basın; seçilenler listedeki sırayla çalışır. Doğrula ve düzelt'te 8b etiketlemeden sonra ayrıca çalıştırılır.</w:t>
+        <w:t xml:space="preserve">'a basın; seçilenler listedeki sırayla çalışır.</w:t>
       </w:r>
     </w:p>
     <w:p>
@@ -9059,17 +9059,27 @@
         <w:t xml:space="preserve">Kalanları da sırayla çalıştır</w:t>
       </w:r>
       <w:r>
-        <w:t xml:space="preserve">, sıradaki aşamadan başlayıp yol haritasının kalanını arka arkaya çalıştırır. Önce çalışacak adımların listesini gösterip onay ister. Elle etiketleme (10–11) sizin işiniz olduğu için oraya gelince durur; etiketlemeyi bitirip yine </w:t>
+        <w:t xml:space="preserve">, sıradaki aşamadan başlayıp yol haritasının kalanını arka arkaya çalıştırır. Önce çalışacak adımların listesini gösterip onay ister; zincirde etiketleme varsa onay penceresi bunu ⚠ ile belirtir. Etiketlemenin kendisi sizin işiniz: zincir etiketleme sayfasını (8a) oluşturur ama sizi beklemez, 8b'yi atlayıp devam eder. Bitince program etiketleme sayfasını açmayı önerir; işaretleyip </w:t>
       </w:r>
       <w:r>
         <w:rPr>
           <w:b/>
           <w:bCs/>
         </w:rPr>
+        <w:t xml:space="preserve">CSV indir</w:t>
+      </w:r>
+      <w:r>
+        <w:t xml:space="preserve">'e basın, sonra ana sayfada </w:t>
+      </w:r>
+      <w:r>
+        <w:rPr>
+          <w:b/>
+          <w:bCs/>
+        </w:rPr>
         <w:t xml:space="preserve">Başlat</w:t>
       </w:r>
       <w:r>
-        <w:t xml:space="preserve">'a basın.</w:t>
+        <w:t xml:space="preserve"> 8b'yi çalıştırır. Teslim paketini etiketlerle birlikte istiyorsanız 8b'den sonra Teslim sayfasından yeniden oluşturun.</w:t>
       </w:r>
     </w:p>
     <w:p>
@@ -9666,7 +9676,7 @@
         <w:t xml:space="preserve">Başlat</w:t>
       </w:r>
       <w:r>
-        <w:t xml:space="preserve"> ile sürdürün; elle etiketleme aşamasında etiketlemeyi yapıp yeniden </w:t>
+        <w:t xml:space="preserve"> ile sürdürün; zincir bitince etiketleme sayfasını işaretleyip </w:t>
       </w:r>
       <w:r>
         <w:rPr>
@@ -9676,7 +9686,7 @@
         <w:t xml:space="preserve">Başlat</w:t>
       </w:r>
       <w:r>
-        <w:t xml:space="preserve">'a basın.</w:t>
+        <w:t xml:space="preserve"> ile 8b'yi çalıştırın.</w:t>
       </w:r>
     </w:p>
     <w:p>

</xml_diff>

<commit_message>
Yapay zekâ bulgusu kutusu raporla aynı sayıyı gösterir; eski rapor tamam sayılmaz (1.4.1)
- rapor.py ozet.json yazar (kesin sayfa-hata, kesin dilim, taşma, http, metin).
- Ana sayfa kutusu ozet.json'dan okur; rapor oylama.csv'den eskiyse ham dilim
  sayısını "rapor eski" notuyla gösterir.
- Hakem ve rapor aşaması, rapor hakem sonuçlarından eskiyse tamam sayılmaz ve
  yalnız ai_rapor'u çalıştırır.

Co-Authored-By: Claude Opus 5.5 <noreply@anthropic.com>
Claude-Session: https://claude.ai/code/session_01Y7HA7zWrzagZQyqvydG6xL
</commit_message>
<xml_diff>
--- a/docs/KULLANIM_KILAVUZU.docx
+++ b/docs/KULLANIM_KILAVUZU.docx
@@ -67,7 +67,7 @@
           <w:sz w:val="22"/>
           <w:szCs w:val="22"/>
         </w:rPr>
-        <w:t xml:space="preserve">Sürüm 1.4  ·  Ekim 2026</w:t>
+        <w:t xml:space="preserve">Sürüm 1.4.1  ·  Ekim 2026</w:t>
       </w:r>
     </w:p>
     <w:p>
@@ -5840,7 +5840,7 @@
         <w:t xml:space="preserve">Özet kutucukları:</w:t>
       </w:r>
       <w:r>
-        <w:t xml:space="preserve"> site haritasındaki sayfa sayısı, test edilen sayfa ve kapsam, kırık sayfa (4xx/5xx), kırık bağlantı, görsel kusur, kesin yapay zekâ bulgusu. Yalnızca üretilmiş çıktılar için kutucuk görünür.</w:t>
+        <w:t xml:space="preserve"> site haritasındaki sayfa sayısı, test edilen sayfa ve kapsam, kırık sayfa (4xx/5xx), kırık bağlantı, görsel kusur, kesin yapay zekâ bulgusu (son rapordaki sayının aynısı: iki modelin bulduğu sayfa-hata çifti; rapor hakemden eskiyse ham dilim sayısı ve "rapor eski" yazar, yol haritası da raporu yeniden üretmeyi önerir). Yalnızca üretilmiş çıktılar için kutucuk görünür.</w:t>
       </w:r>
     </w:p>
     <w:p>

</xml_diff>